<commit_message>
Membuat Halaman i menhadi I-1 pada Bab I
</commit_message>
<xml_diff>
--- a/Files/Proposal.docx
+++ b/Files/Proposal.docx
@@ -222,6 +222,7 @@
           <w:lang w:val="en-US"/>
         </w:rPr>
       </w:pPr>
+      <w:proofErr w:type="gramStart"/>
       <w:r>
         <w:rPr>
           <w:rFonts w:ascii="Times New Roman" w:hAnsi="Times New Roman"/>
@@ -252,6 +253,7 @@
         </w:rPr>
         <w:t xml:space="preserve"> :</w:t>
       </w:r>
+      <w:proofErr w:type="gramEnd"/>
     </w:p>
     <w:p>
       <w:pPr>
@@ -1585,6 +1587,7 @@
               <w:t xml:space="preserve">, </w:t>
             </w:r>
             <w:proofErr w:type="spellStart"/>
+            <w:proofErr w:type="gramStart"/>
             <w:r>
               <w:rPr>
                 <w:rFonts w:ascii="Times New Roman" w:hAnsi="Times New Roman"/>
@@ -1599,6 +1602,7 @@
               <w:t>S.Kom</w:t>
             </w:r>
             <w:proofErr w:type="spellEnd"/>
+            <w:proofErr w:type="gramEnd"/>
             <w:r>
               <w:rPr>
                 <w:rFonts w:ascii="Times New Roman" w:hAnsi="Times New Roman"/>
@@ -3038,6 +3042,7 @@
         <w:t xml:space="preserve">, </w:t>
       </w:r>
       <w:proofErr w:type="spellStart"/>
+      <w:proofErr w:type="gramStart"/>
       <w:r>
         <w:rPr>
           <w:rFonts w:ascii="Times New Roman" w:hAnsi="Times New Roman"/>
@@ -3051,6 +3056,7 @@
         <w:t>S.Kom</w:t>
       </w:r>
       <w:proofErr w:type="spellEnd"/>
+      <w:proofErr w:type="gramEnd"/>
       <w:r>
         <w:rPr>
           <w:rFonts w:ascii="Times New Roman" w:hAnsi="Times New Roman"/>
@@ -3153,7 +3159,33 @@
           <w:szCs w:val="24"/>
           <w:lang w:val="en-US"/>
         </w:rPr>
-        <w:t xml:space="preserve">DEWAN PENGUJI : </w:t>
+        <w:t xml:space="preserve">DEWAN </w:t>
+      </w:r>
+      <w:proofErr w:type="gramStart"/>
+      <w:r>
+        <w:rPr>
+          <w:rFonts w:ascii="Times New Roman" w:hAnsi="Times New Roman"/>
+          <w:b/>
+          <w:bCs/>
+          <w:color w:val="000000"/>
+          <w:sz w:val="28"/>
+          <w:szCs w:val="24"/>
+          <w:lang w:val="en-US"/>
+        </w:rPr>
+        <w:t>PENGUJI :</w:t>
+      </w:r>
+      <w:proofErr w:type="gramEnd"/>
+      <w:r>
+        <w:rPr>
+          <w:rFonts w:ascii="Times New Roman" w:hAnsi="Times New Roman"/>
+          <w:b/>
+          <w:bCs/>
+          <w:color w:val="000000"/>
+          <w:sz w:val="28"/>
+          <w:szCs w:val="24"/>
+          <w:lang w:val="en-US"/>
+        </w:rPr>
+        <w:t xml:space="preserve"> </w:t>
       </w:r>
     </w:p>
     <w:p>
@@ -20484,17 +20516,7 @@
           <w:szCs w:val="24"/>
           <w:lang w:val="en-US"/>
         </w:rPr>
-        <w:t xml:space="preserve"> Arduino Nano</w:t>
-      </w:r>
-      <w:r>
-        <w:rPr>
-          <w:rFonts w:ascii="Times New Roman" w:hAnsi="Times New Roman"/>
-          <w:color w:val="000000"/>
-          <w:sz w:val="24"/>
-          <w:szCs w:val="24"/>
-          <w:lang w:val="en-US"/>
-        </w:rPr>
-        <w:t>”</w:t>
+        <w:t xml:space="preserve"> Arduino Nano”</w:t>
       </w:r>
       <w:r>
         <w:rPr>
@@ -21941,18 +21963,18 @@
           <w:szCs w:val="24"/>
           <w:lang w:val="en-US"/>
         </w:rPr>
-        <w:t xml:space="preserve"> d</w:t>
-      </w:r>
-      <w:proofErr w:type="spellStart"/>
-      <w:r>
-        <w:rPr>
-          <w:rFonts w:ascii="Times New Roman" w:hAnsi="Times New Roman"/>
-          <w:color w:val="000000"/>
-          <w:sz w:val="24"/>
-          <w:szCs w:val="24"/>
-          <w:lang w:val="en-US"/>
-        </w:rPr>
-        <w:t>apat</w:t>
+        <w:t xml:space="preserve"> </w:t>
+      </w:r>
+      <w:proofErr w:type="spellStart"/>
+      <w:r>
+        <w:rPr>
+          <w:rFonts w:ascii="Times New Roman" w:hAnsi="Times New Roman"/>
+          <w:color w:val="000000"/>
+          <w:sz w:val="24"/>
+          <w:szCs w:val="24"/>
+          <w:lang w:val="en-US"/>
+        </w:rPr>
+        <w:t>dapat</w:t>
       </w:r>
       <w:proofErr w:type="spellEnd"/>
       <w:r>
@@ -22682,7 +22704,7 @@
     <w:sectPr>
       <w:pgSz w:w="11907" w:h="16840" w:code="9"/>
       <w:pgMar w:top="1701" w:right="1418" w:bottom="1418" w:left="1701" w:header="709" w:footer="709" w:gutter="0"/>
-      <w:pgNumType w:fmt="lowerRoman" w:start="2"/>
+      <w:pgNumType w:start="1"/>
       <w:cols w:space="708"/>
       <w:docGrid w:linePitch="360"/>
     </w:sectPr>
@@ -22742,6 +22764,13 @@
             <w:rFonts w:ascii="Times New Roman" w:hAnsi="Times New Roman"/>
           </w:rPr>
         </w:pPr>
+        <w:r>
+          <w:rPr>
+            <w:rFonts w:ascii="Times New Roman" w:hAnsi="Times New Roman"/>
+            <w:lang w:val="en-US"/>
+          </w:rPr>
+          <w:t>I-</w:t>
+        </w:r>
         <w:r>
           <w:rPr>
             <w:rFonts w:ascii="Times New Roman" w:hAnsi="Times New Roman"/>
@@ -24241,7 +24270,7 @@
 </file>
 
 <file path=customXml/itemProps1.xml><?xml version="1.0" encoding="utf-8"?>
-<ds:datastoreItem xmlns:ds="http://schemas.openxmlformats.org/officeDocument/2006/customXml" ds:itemID="{9A53DDB7-FA92-4CAD-AA77-D4EA63D60482}">
+<ds:datastoreItem xmlns:ds="http://schemas.openxmlformats.org/officeDocument/2006/customXml" ds:itemID="{0E3719C1-A49B-44A8-8487-4A4542A75951}">
   <ds:schemaRefs>
     <ds:schemaRef ds:uri="http://schemas.openxmlformats.org/officeDocument/2006/bibliography"/>
   </ds:schemaRefs>

</xml_diff>

<commit_message>
Menyelessaikan BAB I, perbaiki halaman Romawi
</commit_message>
<xml_diff>
--- a/Files/Proposal.docx
+++ b/Files/Proposal.docx
@@ -3252,7 +3252,6 @@
         <w:tab/>
         <w:t xml:space="preserve">: </w:t>
       </w:r>
-      <w:proofErr w:type="spellStart"/>
       <w:r>
         <w:rPr>
           <w:rFonts w:ascii="Times New Roman" w:hAnsi="Times New Roman"/>
@@ -3263,9 +3262,9 @@
           <w:szCs w:val="24"/>
           <w:lang w:val="en-US"/>
         </w:rPr>
-        <w:t>Oktaf</w:t>
-      </w:r>
-      <w:proofErr w:type="spellEnd"/>
+        <w:t>&lt;</w:t>
+      </w:r>
+      <w:proofErr w:type="spellStart"/>
       <w:r>
         <w:rPr>
           <w:rFonts w:ascii="Times New Roman" w:hAnsi="Times New Roman"/>
@@ -3276,9 +3275,8 @@
           <w:szCs w:val="24"/>
           <w:lang w:val="en-US"/>
         </w:rPr>
-        <w:t xml:space="preserve"> </w:t>
-      </w:r>
-      <w:proofErr w:type="spellStart"/>
+        <w:t>n</w:t>
+      </w:r>
       <w:r>
         <w:rPr>
           <w:rFonts w:ascii="Times New Roman" w:hAnsi="Times New Roman"/>
@@ -3289,47 +3287,9 @@
           <w:szCs w:val="24"/>
           <w:lang w:val="en-US"/>
         </w:rPr>
-        <w:t>Brillian</w:t>
-      </w:r>
-      <w:proofErr w:type="spellEnd"/>
-      <w:r>
-        <w:rPr>
-          <w:rFonts w:ascii="Times New Roman" w:hAnsi="Times New Roman"/>
-          <w:b/>
-          <w:bCs/>
-          <w:color w:val="000000"/>
-          <w:sz w:val="24"/>
-          <w:szCs w:val="24"/>
-          <w:lang w:val="en-US"/>
-        </w:rPr>
-        <w:t xml:space="preserve"> </w:t>
-      </w:r>
-      <w:proofErr w:type="spellStart"/>
-      <w:r>
-        <w:rPr>
-          <w:rFonts w:ascii="Times New Roman" w:hAnsi="Times New Roman"/>
-          <w:b/>
-          <w:bCs/>
-          <w:color w:val="000000"/>
-          <w:sz w:val="24"/>
-          <w:szCs w:val="24"/>
-          <w:lang w:val="en-US"/>
-        </w:rPr>
-        <w:t>Kharisma</w:t>
-      </w:r>
-      <w:proofErr w:type="spellEnd"/>
-      <w:r>
-        <w:rPr>
-          <w:rFonts w:ascii="Times New Roman" w:hAnsi="Times New Roman"/>
-          <w:b/>
-          <w:bCs/>
-          <w:color w:val="000000"/>
-          <w:sz w:val="24"/>
-          <w:szCs w:val="24"/>
-          <w:lang w:val="en-US"/>
-        </w:rPr>
-        <w:t>, S.T., M.T</w:t>
-      </w:r>
+        <w:t>ama</w:t>
+      </w:r>
+      <w:proofErr w:type="spellEnd"/>
     </w:p>
     <w:p>
       <w:pPr>
@@ -4377,7 +4337,17 @@
           <w:lang w:val="en-US"/>
         </w:rPr>
         <w:tab/>
-        <w:t>I-3</w:t>
+        <w:t>I-</w:t>
+      </w:r>
+      <w:r>
+        <w:rPr>
+          <w:rFonts w:ascii="Times New Roman" w:hAnsi="Times New Roman"/>
+          <w:color w:val="000000"/>
+          <w:sz w:val="24"/>
+          <w:szCs w:val="24"/>
+          <w:lang w:val="en-US"/>
+        </w:rPr>
+        <w:t>4</w:t>
       </w:r>
     </w:p>
     <w:p>
@@ -4459,6 +4429,16 @@
         </w:rPr>
         <w:tab/>
       </w:r>
+      <w:r>
+        <w:rPr>
+          <w:rFonts w:ascii="Times New Roman" w:hAnsi="Times New Roman"/>
+          <w:color w:val="000000"/>
+          <w:sz w:val="24"/>
+          <w:szCs w:val="24"/>
+          <w:lang w:val="en-US"/>
+        </w:rPr>
+        <w:t>I-4</w:t>
+      </w:r>
     </w:p>
     <w:p>
       <w:pPr>
@@ -4527,6 +4507,16 @@
         </w:rPr>
         <w:tab/>
       </w:r>
+      <w:r>
+        <w:rPr>
+          <w:rFonts w:ascii="Times New Roman" w:hAnsi="Times New Roman"/>
+          <w:color w:val="000000"/>
+          <w:sz w:val="24"/>
+          <w:szCs w:val="24"/>
+          <w:lang w:val="en-US"/>
+        </w:rPr>
+        <w:t>I-4</w:t>
+      </w:r>
     </w:p>
     <w:p>
       <w:pPr>
@@ -4606,6 +4596,16 @@
           <w:lang w:val="en-US"/>
         </w:rPr>
         <w:tab/>
+      </w:r>
+      <w:r>
+        <w:rPr>
+          <w:rFonts w:ascii="Times New Roman" w:hAnsi="Times New Roman"/>
+          <w:color w:val="000000"/>
+          <w:sz w:val="24"/>
+          <w:szCs w:val="24"/>
+          <w:lang w:val="en-US"/>
+        </w:rPr>
+        <w:t>I-4</w:t>
       </w:r>
     </w:p>
     <w:p>
@@ -5777,6 +5777,8 @@
       <w:pPr>
         <w:widowControl w:val="0"/>
         <w:tabs>
+          <w:tab w:val="center" w:pos="4394"/>
+          <w:tab w:val="left" w:pos="7050"/>
           <w:tab w:val="left" w:leader="dot" w:pos="8222"/>
           <w:tab w:val="right" w:pos="8788"/>
         </w:tabs>
@@ -5784,7 +5786,6 @@
         <w:autoSpaceDN w:val="0"/>
         <w:adjustRightInd w:val="0"/>
         <w:spacing w:after="0" w:line="360" w:lineRule="auto"/>
-        <w:jc w:val="center"/>
         <w:rPr>
           <w:rFonts w:ascii="Times New Roman" w:hAnsi="Times New Roman"/>
           <w:b/>
@@ -5813,7 +5814,31 @@
           <w:lang w:val="en-US"/>
         </w:rPr>
         <w:lastRenderedPageBreak/>
+        <w:tab/>
+      </w:r>
+      <w:r>
+        <w:rPr>
+          <w:rFonts w:ascii="Times New Roman" w:hAnsi="Times New Roman"/>
+          <w:b/>
+          <w:bCs/>
+          <w:color w:val="000000"/>
+          <w:sz w:val="24"/>
+          <w:szCs w:val="24"/>
+          <w:lang w:val="en-US"/>
+        </w:rPr>
         <w:t>DAFTAR LAMPIRAN</w:t>
+      </w:r>
+      <w:r>
+        <w:rPr>
+          <w:rFonts w:ascii="Times New Roman" w:hAnsi="Times New Roman"/>
+          <w:b/>
+          <w:bCs/>
+          <w:color w:val="000000"/>
+          <w:sz w:val="24"/>
+          <w:szCs w:val="24"/>
+          <w:lang w:val="en-US"/>
+        </w:rPr>
+        <w:tab/>
       </w:r>
     </w:p>
     <w:p>
@@ -22512,9 +22537,296 @@
       <w:pPr>
         <w:pStyle w:val="ListParagraph"/>
         <w:widowControl w:val="0"/>
+        <w:tabs>
+          <w:tab w:val="left" w:leader="dot" w:pos="8222"/>
+          <w:tab w:val="right" w:pos="8788"/>
+        </w:tabs>
+        <w:autoSpaceDE w:val="0"/>
+        <w:autoSpaceDN w:val="0"/>
+        <w:adjustRightInd w:val="0"/>
+        <w:spacing w:after="0" w:line="360" w:lineRule="auto"/>
+        <w:ind w:left="0" w:firstLine="567"/>
+        <w:jc w:val="both"/>
+        <w:rPr>
+          <w:rFonts w:ascii="Times New Roman" w:hAnsi="Times New Roman"/>
+          <w:color w:val="000000"/>
+          <w:sz w:val="24"/>
+          <w:szCs w:val="24"/>
+          <w:lang w:val="en-US"/>
+        </w:rPr>
+      </w:pPr>
+      <w:proofErr w:type="spellStart"/>
+      <w:r>
+        <w:rPr>
+          <w:rFonts w:ascii="Times New Roman" w:hAnsi="Times New Roman"/>
+          <w:color w:val="000000"/>
+          <w:sz w:val="24"/>
+          <w:szCs w:val="24"/>
+          <w:lang w:val="en-US"/>
+        </w:rPr>
+        <w:t>Berdasarkan</w:t>
+      </w:r>
+      <w:proofErr w:type="spellEnd"/>
+      <w:r>
+        <w:rPr>
+          <w:rFonts w:ascii="Times New Roman" w:hAnsi="Times New Roman"/>
+          <w:color w:val="000000"/>
+          <w:sz w:val="24"/>
+          <w:szCs w:val="24"/>
+          <w:lang w:val="en-US"/>
+        </w:rPr>
+        <w:t xml:space="preserve"> </w:t>
+      </w:r>
+      <w:proofErr w:type="spellStart"/>
+      <w:r>
+        <w:rPr>
+          <w:rFonts w:ascii="Times New Roman" w:hAnsi="Times New Roman"/>
+          <w:color w:val="000000"/>
+          <w:sz w:val="24"/>
+          <w:szCs w:val="24"/>
+          <w:lang w:val="en-US"/>
+        </w:rPr>
+        <w:t>latar</w:t>
+      </w:r>
+      <w:proofErr w:type="spellEnd"/>
+      <w:r>
+        <w:rPr>
+          <w:rFonts w:ascii="Times New Roman" w:hAnsi="Times New Roman"/>
+          <w:color w:val="000000"/>
+          <w:sz w:val="24"/>
+          <w:szCs w:val="24"/>
+          <w:lang w:val="en-US"/>
+        </w:rPr>
+        <w:t xml:space="preserve"> </w:t>
+      </w:r>
+      <w:proofErr w:type="spellStart"/>
+      <w:r>
+        <w:rPr>
+          <w:rFonts w:ascii="Times New Roman" w:hAnsi="Times New Roman"/>
+          <w:color w:val="000000"/>
+          <w:sz w:val="24"/>
+          <w:szCs w:val="24"/>
+          <w:lang w:val="en-US"/>
+        </w:rPr>
+        <w:t>belakang</w:t>
+      </w:r>
+      <w:proofErr w:type="spellEnd"/>
+      <w:r>
+        <w:rPr>
+          <w:rFonts w:ascii="Times New Roman" w:hAnsi="Times New Roman"/>
+          <w:color w:val="000000"/>
+          <w:sz w:val="24"/>
+          <w:szCs w:val="24"/>
+          <w:lang w:val="en-US"/>
+        </w:rPr>
+        <w:t xml:space="preserve"> </w:t>
+      </w:r>
+      <w:proofErr w:type="spellStart"/>
+      <w:r>
+        <w:rPr>
+          <w:rFonts w:ascii="Times New Roman" w:hAnsi="Times New Roman"/>
+          <w:color w:val="000000"/>
+          <w:sz w:val="24"/>
+          <w:szCs w:val="24"/>
+          <w:lang w:val="en-US"/>
+        </w:rPr>
+        <w:t>tersebut</w:t>
+      </w:r>
+      <w:proofErr w:type="spellEnd"/>
+      <w:r>
+        <w:rPr>
+          <w:rFonts w:ascii="Times New Roman" w:hAnsi="Times New Roman"/>
+          <w:color w:val="000000"/>
+          <w:sz w:val="24"/>
+          <w:szCs w:val="24"/>
+          <w:lang w:val="en-US"/>
+        </w:rPr>
+        <w:t xml:space="preserve"> </w:t>
+      </w:r>
+      <w:proofErr w:type="spellStart"/>
+      <w:r>
+        <w:rPr>
+          <w:rFonts w:ascii="Times New Roman" w:hAnsi="Times New Roman"/>
+          <w:color w:val="000000"/>
+          <w:sz w:val="24"/>
+          <w:szCs w:val="24"/>
+          <w:lang w:val="en-US"/>
+        </w:rPr>
+        <w:t>maka</w:t>
+      </w:r>
+      <w:proofErr w:type="spellEnd"/>
+      <w:r>
+        <w:rPr>
+          <w:rFonts w:ascii="Times New Roman" w:hAnsi="Times New Roman"/>
+          <w:color w:val="000000"/>
+          <w:sz w:val="24"/>
+          <w:szCs w:val="24"/>
+          <w:lang w:val="en-US"/>
+        </w:rPr>
+        <w:t xml:space="preserve"> </w:t>
+      </w:r>
+      <w:proofErr w:type="spellStart"/>
+      <w:r>
+        <w:rPr>
+          <w:rFonts w:ascii="Times New Roman" w:hAnsi="Times New Roman"/>
+          <w:color w:val="000000"/>
+          <w:sz w:val="24"/>
+          <w:szCs w:val="24"/>
+          <w:lang w:val="en-US"/>
+        </w:rPr>
+        <w:t>permasalahan</w:t>
+      </w:r>
+      <w:proofErr w:type="spellEnd"/>
+      <w:r>
+        <w:rPr>
+          <w:rFonts w:ascii="Times New Roman" w:hAnsi="Times New Roman"/>
+          <w:color w:val="000000"/>
+          <w:sz w:val="24"/>
+          <w:szCs w:val="24"/>
+          <w:lang w:val="en-US"/>
+        </w:rPr>
+        <w:t xml:space="preserve"> yang </w:t>
+      </w:r>
+      <w:proofErr w:type="spellStart"/>
+      <w:r>
+        <w:rPr>
+          <w:rFonts w:ascii="Times New Roman" w:hAnsi="Times New Roman"/>
+          <w:color w:val="000000"/>
+          <w:sz w:val="24"/>
+          <w:szCs w:val="24"/>
+          <w:lang w:val="en-US"/>
+        </w:rPr>
+        <w:t>ingin</w:t>
+      </w:r>
+      <w:proofErr w:type="spellEnd"/>
+      <w:r>
+        <w:rPr>
+          <w:rFonts w:ascii="Times New Roman" w:hAnsi="Times New Roman"/>
+          <w:color w:val="000000"/>
+          <w:sz w:val="24"/>
+          <w:szCs w:val="24"/>
+          <w:lang w:val="en-US"/>
+        </w:rPr>
+        <w:t xml:space="preserve"> </w:t>
+      </w:r>
+      <w:proofErr w:type="spellStart"/>
+      <w:r>
+        <w:rPr>
+          <w:rFonts w:ascii="Times New Roman" w:hAnsi="Times New Roman"/>
+          <w:color w:val="000000"/>
+          <w:sz w:val="24"/>
+          <w:szCs w:val="24"/>
+          <w:lang w:val="en-US"/>
+        </w:rPr>
+        <w:t>diatasi</w:t>
+      </w:r>
+      <w:proofErr w:type="spellEnd"/>
+      <w:r>
+        <w:rPr>
+          <w:rFonts w:ascii="Times New Roman" w:hAnsi="Times New Roman"/>
+          <w:color w:val="000000"/>
+          <w:sz w:val="24"/>
+          <w:szCs w:val="24"/>
+          <w:lang w:val="en-US"/>
+        </w:rPr>
+        <w:t xml:space="preserve"> </w:t>
+      </w:r>
+      <w:proofErr w:type="spellStart"/>
+      <w:r>
+        <w:rPr>
+          <w:rFonts w:ascii="Times New Roman" w:hAnsi="Times New Roman"/>
+          <w:color w:val="000000"/>
+          <w:sz w:val="24"/>
+          <w:szCs w:val="24"/>
+          <w:lang w:val="en-US"/>
+        </w:rPr>
+        <w:t>melalui</w:t>
+      </w:r>
+      <w:proofErr w:type="spellEnd"/>
+      <w:r>
+        <w:rPr>
+          <w:rFonts w:ascii="Times New Roman" w:hAnsi="Times New Roman"/>
+          <w:color w:val="000000"/>
+          <w:sz w:val="24"/>
+          <w:szCs w:val="24"/>
+          <w:lang w:val="en-US"/>
+        </w:rPr>
+        <w:t xml:space="preserve"> </w:t>
+      </w:r>
+      <w:proofErr w:type="spellStart"/>
+      <w:r>
+        <w:rPr>
+          <w:rFonts w:ascii="Times New Roman" w:hAnsi="Times New Roman"/>
+          <w:color w:val="000000"/>
+          <w:sz w:val="24"/>
+          <w:szCs w:val="24"/>
+          <w:lang w:val="en-US"/>
+        </w:rPr>
+        <w:t>penelitian</w:t>
+      </w:r>
+      <w:proofErr w:type="spellEnd"/>
+      <w:r>
+        <w:rPr>
+          <w:rFonts w:ascii="Times New Roman" w:hAnsi="Times New Roman"/>
+          <w:color w:val="000000"/>
+          <w:sz w:val="24"/>
+          <w:szCs w:val="24"/>
+          <w:lang w:val="en-US"/>
+        </w:rPr>
+        <w:t xml:space="preserve"> </w:t>
+      </w:r>
+      <w:proofErr w:type="spellStart"/>
+      <w:r>
+        <w:rPr>
+          <w:rFonts w:ascii="Times New Roman" w:hAnsi="Times New Roman"/>
+          <w:color w:val="000000"/>
+          <w:sz w:val="24"/>
+          <w:szCs w:val="24"/>
+          <w:lang w:val="en-US"/>
+        </w:rPr>
+        <w:t>ini</w:t>
+      </w:r>
+      <w:proofErr w:type="spellEnd"/>
+      <w:r>
+        <w:rPr>
+          <w:rFonts w:ascii="Times New Roman" w:hAnsi="Times New Roman"/>
+          <w:color w:val="000000"/>
+          <w:sz w:val="24"/>
+          <w:szCs w:val="24"/>
+          <w:lang w:val="en-US"/>
+        </w:rPr>
+        <w:t xml:space="preserve"> </w:t>
+      </w:r>
+      <w:proofErr w:type="spellStart"/>
+      <w:r>
+        <w:rPr>
+          <w:rFonts w:ascii="Times New Roman" w:hAnsi="Times New Roman"/>
+          <w:color w:val="000000"/>
+          <w:sz w:val="24"/>
+          <w:szCs w:val="24"/>
+          <w:lang w:val="en-US"/>
+        </w:rPr>
+        <w:t>adalah</w:t>
+      </w:r>
+      <w:proofErr w:type="spellEnd"/>
+      <w:r>
+        <w:rPr>
+          <w:rFonts w:ascii="Times New Roman" w:hAnsi="Times New Roman"/>
+          <w:color w:val="000000"/>
+          <w:sz w:val="24"/>
+          <w:szCs w:val="24"/>
+          <w:lang w:val="en-US"/>
+        </w:rPr>
+        <w:t>:</w:t>
+      </w:r>
+    </w:p>
+    <w:p>
+      <w:pPr>
+        <w:pStyle w:val="ListParagraph"/>
+        <w:widowControl w:val="0"/>
         <w:numPr>
-          <w:ilvl w:val="1"/>
-          <w:numId w:val="5"/>
+          <w:ilvl w:val="0"/>
+          <w:numId w:val="6"/>
         </w:numPr>
         <w:tabs>
           <w:tab w:val="left" w:leader="dot" w:pos="8222"/>
@@ -22524,12 +22836,10 @@
         <w:autoSpaceDN w:val="0"/>
         <w:adjustRightInd w:val="0"/>
         <w:spacing w:after="0" w:line="360" w:lineRule="auto"/>
-        <w:ind w:left="567" w:hanging="567"/>
+        <w:ind w:left="851" w:hanging="284"/>
         <w:jc w:val="both"/>
         <w:rPr>
           <w:rFonts w:ascii="Times New Roman" w:hAnsi="Times New Roman"/>
-          <w:b/>
-          <w:bCs/>
           <w:color w:val="000000"/>
           <w:sz w:val="24"/>
           <w:szCs w:val="24"/>
@@ -22540,42 +22850,541 @@
       <w:r>
         <w:rPr>
           <w:rFonts w:ascii="Times New Roman" w:hAnsi="Times New Roman"/>
-          <w:b/>
-          <w:bCs/>
-          <w:color w:val="000000"/>
-          <w:sz w:val="24"/>
-          <w:szCs w:val="24"/>
-          <w:lang w:val="en-US"/>
-        </w:rPr>
-        <w:t>Tujuan</w:t>
-      </w:r>
-      <w:proofErr w:type="spellEnd"/>
-      <w:r>
-        <w:rPr>
-          <w:rFonts w:ascii="Times New Roman" w:hAnsi="Times New Roman"/>
-          <w:b/>
-          <w:bCs/>
-          <w:color w:val="000000"/>
-          <w:sz w:val="24"/>
-          <w:szCs w:val="24"/>
-          <w:lang w:val="en-US"/>
-        </w:rPr>
-        <w:t xml:space="preserve"> </w:t>
-      </w:r>
-      <w:proofErr w:type="spellStart"/>
-      <w:r>
-        <w:rPr>
-          <w:rFonts w:ascii="Times New Roman" w:hAnsi="Times New Roman"/>
-          <w:b/>
-          <w:bCs/>
-          <w:color w:val="000000"/>
-          <w:sz w:val="24"/>
-          <w:szCs w:val="24"/>
-          <w:lang w:val="en-US"/>
-        </w:rPr>
-        <w:t>Penelitian</w:t>
-      </w:r>
-      <w:proofErr w:type="spellEnd"/>
+          <w:color w:val="000000"/>
+          <w:sz w:val="24"/>
+          <w:szCs w:val="24"/>
+          <w:lang w:val="en-US"/>
+        </w:rPr>
+        <w:t>Bagaimana</w:t>
+      </w:r>
+      <w:proofErr w:type="spellEnd"/>
+      <w:r>
+        <w:rPr>
+          <w:rFonts w:ascii="Times New Roman" w:hAnsi="Times New Roman"/>
+          <w:color w:val="000000"/>
+          <w:sz w:val="24"/>
+          <w:szCs w:val="24"/>
+          <w:lang w:val="en-US"/>
+        </w:rPr>
+        <w:t xml:space="preserve"> </w:t>
+      </w:r>
+      <w:proofErr w:type="spellStart"/>
+      <w:r>
+        <w:rPr>
+          <w:rFonts w:ascii="Times New Roman" w:hAnsi="Times New Roman"/>
+          <w:color w:val="000000"/>
+          <w:sz w:val="24"/>
+          <w:szCs w:val="24"/>
+          <w:lang w:val="en-US"/>
+        </w:rPr>
+        <w:t>cara</w:t>
+      </w:r>
+      <w:proofErr w:type="spellEnd"/>
+      <w:r>
+        <w:rPr>
+          <w:rFonts w:ascii="Times New Roman" w:hAnsi="Times New Roman"/>
+          <w:color w:val="000000"/>
+          <w:sz w:val="24"/>
+          <w:szCs w:val="24"/>
+          <w:lang w:val="en-US"/>
+        </w:rPr>
+        <w:t xml:space="preserve"> </w:t>
+      </w:r>
+      <w:proofErr w:type="spellStart"/>
+      <w:r>
+        <w:rPr>
+          <w:rFonts w:ascii="Times New Roman" w:hAnsi="Times New Roman"/>
+          <w:color w:val="000000"/>
+          <w:sz w:val="24"/>
+          <w:szCs w:val="24"/>
+          <w:lang w:val="en-US"/>
+        </w:rPr>
+        <w:t>merancang</w:t>
+      </w:r>
+      <w:proofErr w:type="spellEnd"/>
+      <w:r>
+        <w:rPr>
+          <w:rFonts w:ascii="Times New Roman" w:hAnsi="Times New Roman"/>
+          <w:color w:val="000000"/>
+          <w:sz w:val="24"/>
+          <w:szCs w:val="24"/>
+          <w:lang w:val="en-US"/>
+        </w:rPr>
+        <w:t xml:space="preserve"> </w:t>
+      </w:r>
+      <w:proofErr w:type="spellStart"/>
+      <w:r>
+        <w:rPr>
+          <w:rFonts w:ascii="Times New Roman" w:hAnsi="Times New Roman"/>
+          <w:color w:val="000000"/>
+          <w:sz w:val="24"/>
+          <w:szCs w:val="24"/>
+          <w:lang w:val="en-US"/>
+        </w:rPr>
+        <w:t>sistem</w:t>
+      </w:r>
+      <w:proofErr w:type="spellEnd"/>
+      <w:r>
+        <w:rPr>
+          <w:rFonts w:ascii="Times New Roman" w:hAnsi="Times New Roman"/>
+          <w:color w:val="000000"/>
+          <w:sz w:val="24"/>
+          <w:szCs w:val="24"/>
+          <w:lang w:val="en-US"/>
+        </w:rPr>
+        <w:t xml:space="preserve"> </w:t>
+      </w:r>
+      <w:proofErr w:type="spellStart"/>
+      <w:r>
+        <w:rPr>
+          <w:rFonts w:ascii="Times New Roman" w:hAnsi="Times New Roman"/>
+          <w:color w:val="000000"/>
+          <w:sz w:val="24"/>
+          <w:szCs w:val="24"/>
+          <w:lang w:val="en-US"/>
+        </w:rPr>
+        <w:t>keamanan</w:t>
+      </w:r>
+      <w:proofErr w:type="spellEnd"/>
+      <w:r>
+        <w:rPr>
+          <w:rFonts w:ascii="Times New Roman" w:hAnsi="Times New Roman"/>
+          <w:color w:val="000000"/>
+          <w:sz w:val="24"/>
+          <w:szCs w:val="24"/>
+          <w:lang w:val="en-US"/>
+        </w:rPr>
+        <w:t xml:space="preserve"> </w:t>
+      </w:r>
+      <w:proofErr w:type="spellStart"/>
+      <w:r>
+        <w:rPr>
+          <w:rFonts w:ascii="Times New Roman" w:hAnsi="Times New Roman"/>
+          <w:color w:val="000000"/>
+          <w:sz w:val="24"/>
+          <w:szCs w:val="24"/>
+          <w:lang w:val="en-US"/>
+        </w:rPr>
+        <w:t>sepeda</w:t>
+      </w:r>
+      <w:proofErr w:type="spellEnd"/>
+      <w:r>
+        <w:rPr>
+          <w:rFonts w:ascii="Times New Roman" w:hAnsi="Times New Roman"/>
+          <w:color w:val="000000"/>
+          <w:sz w:val="24"/>
+          <w:szCs w:val="24"/>
+          <w:lang w:val="en-US"/>
+        </w:rPr>
+        <w:t xml:space="preserve"> motor </w:t>
+      </w:r>
+      <w:proofErr w:type="spellStart"/>
+      <w:r>
+        <w:rPr>
+          <w:rFonts w:ascii="Times New Roman" w:hAnsi="Times New Roman"/>
+          <w:color w:val="000000"/>
+          <w:sz w:val="24"/>
+          <w:szCs w:val="24"/>
+          <w:lang w:val="en-US"/>
+        </w:rPr>
+        <w:t>dengan</w:t>
+      </w:r>
+      <w:proofErr w:type="spellEnd"/>
+      <w:r>
+        <w:rPr>
+          <w:rFonts w:ascii="Times New Roman" w:hAnsi="Times New Roman"/>
+          <w:color w:val="000000"/>
+          <w:sz w:val="24"/>
+          <w:szCs w:val="24"/>
+          <w:lang w:val="en-US"/>
+        </w:rPr>
+        <w:t xml:space="preserve"> </w:t>
+      </w:r>
+      <w:proofErr w:type="spellStart"/>
+      <w:r>
+        <w:rPr>
+          <w:rFonts w:ascii="Times New Roman" w:hAnsi="Times New Roman"/>
+          <w:color w:val="000000"/>
+          <w:sz w:val="24"/>
+          <w:szCs w:val="24"/>
+          <w:lang w:val="en-US"/>
+        </w:rPr>
+        <w:t>fitur</w:t>
+      </w:r>
+      <w:proofErr w:type="spellEnd"/>
+      <w:r>
+        <w:rPr>
+          <w:rFonts w:ascii="Times New Roman" w:hAnsi="Times New Roman"/>
+          <w:color w:val="000000"/>
+          <w:sz w:val="24"/>
+          <w:szCs w:val="24"/>
+          <w:lang w:val="en-US"/>
+        </w:rPr>
+        <w:t xml:space="preserve"> </w:t>
+      </w:r>
+      <w:r>
+        <w:rPr>
+          <w:rFonts w:ascii="Times New Roman" w:hAnsi="Times New Roman"/>
+          <w:i/>
+          <w:iCs/>
+          <w:color w:val="000000"/>
+          <w:sz w:val="24"/>
+          <w:szCs w:val="24"/>
+          <w:lang w:val="en-US"/>
+        </w:rPr>
+        <w:t>early</w:t>
+      </w:r>
+      <w:r>
+        <w:rPr>
+          <w:rFonts w:ascii="Times New Roman" w:hAnsi="Times New Roman"/>
+          <w:color w:val="000000"/>
+          <w:sz w:val="24"/>
+          <w:szCs w:val="24"/>
+          <w:lang w:val="en-US"/>
+        </w:rPr>
+        <w:t xml:space="preserve"> </w:t>
+      </w:r>
+      <w:r>
+        <w:rPr>
+          <w:rFonts w:ascii="Times New Roman" w:hAnsi="Times New Roman"/>
+          <w:i/>
+          <w:iCs/>
+          <w:color w:val="000000"/>
+          <w:sz w:val="24"/>
+          <w:szCs w:val="24"/>
+          <w:lang w:val="en-US"/>
+        </w:rPr>
+        <w:t>warning</w:t>
+      </w:r>
+      <w:r>
+        <w:rPr>
+          <w:rFonts w:ascii="Times New Roman" w:hAnsi="Times New Roman"/>
+          <w:color w:val="000000"/>
+          <w:sz w:val="24"/>
+          <w:szCs w:val="24"/>
+          <w:lang w:val="en-US"/>
+        </w:rPr>
+        <w:t>?</w:t>
+      </w:r>
+    </w:p>
+    <w:p>
+      <w:pPr>
+        <w:pStyle w:val="ListParagraph"/>
+        <w:widowControl w:val="0"/>
+        <w:numPr>
+          <w:ilvl w:val="0"/>
+          <w:numId w:val="6"/>
+        </w:numPr>
+        <w:tabs>
+          <w:tab w:val="left" w:leader="dot" w:pos="8222"/>
+          <w:tab w:val="right" w:pos="8788"/>
+        </w:tabs>
+        <w:autoSpaceDE w:val="0"/>
+        <w:autoSpaceDN w:val="0"/>
+        <w:adjustRightInd w:val="0"/>
+        <w:spacing w:after="0" w:line="360" w:lineRule="auto"/>
+        <w:ind w:left="851" w:hanging="284"/>
+        <w:jc w:val="both"/>
+        <w:rPr>
+          <w:rFonts w:ascii="Times New Roman" w:hAnsi="Times New Roman"/>
+          <w:color w:val="000000"/>
+          <w:sz w:val="24"/>
+          <w:szCs w:val="24"/>
+          <w:lang w:val="en-US"/>
+        </w:rPr>
+      </w:pPr>
+      <w:proofErr w:type="spellStart"/>
+      <w:r>
+        <w:rPr>
+          <w:rFonts w:ascii="Times New Roman" w:hAnsi="Times New Roman"/>
+          <w:color w:val="000000"/>
+          <w:sz w:val="24"/>
+          <w:szCs w:val="24"/>
+          <w:lang w:val="en-US"/>
+        </w:rPr>
+        <w:t>Bagaimana</w:t>
+      </w:r>
+      <w:proofErr w:type="spellEnd"/>
+      <w:r>
+        <w:rPr>
+          <w:rFonts w:ascii="Times New Roman" w:hAnsi="Times New Roman"/>
+          <w:color w:val="000000"/>
+          <w:sz w:val="24"/>
+          <w:szCs w:val="24"/>
+          <w:lang w:val="en-US"/>
+        </w:rPr>
+        <w:t xml:space="preserve"> </w:t>
+      </w:r>
+      <w:proofErr w:type="spellStart"/>
+      <w:r>
+        <w:rPr>
+          <w:rFonts w:ascii="Times New Roman" w:hAnsi="Times New Roman"/>
+          <w:color w:val="000000"/>
+          <w:sz w:val="24"/>
+          <w:szCs w:val="24"/>
+          <w:lang w:val="en-US"/>
+        </w:rPr>
+        <w:t>cara</w:t>
+      </w:r>
+      <w:proofErr w:type="spellEnd"/>
+      <w:r>
+        <w:rPr>
+          <w:rFonts w:ascii="Times New Roman" w:hAnsi="Times New Roman"/>
+          <w:color w:val="000000"/>
+          <w:sz w:val="24"/>
+          <w:szCs w:val="24"/>
+          <w:lang w:val="en-US"/>
+        </w:rPr>
+        <w:t xml:space="preserve"> </w:t>
+      </w:r>
+      <w:proofErr w:type="spellStart"/>
+      <w:r>
+        <w:rPr>
+          <w:rFonts w:ascii="Times New Roman" w:hAnsi="Times New Roman"/>
+          <w:color w:val="000000"/>
+          <w:sz w:val="24"/>
+          <w:szCs w:val="24"/>
+          <w:lang w:val="en-US"/>
+        </w:rPr>
+        <w:t>mengetahui</w:t>
+      </w:r>
+      <w:proofErr w:type="spellEnd"/>
+      <w:r>
+        <w:rPr>
+          <w:rFonts w:ascii="Times New Roman" w:hAnsi="Times New Roman"/>
+          <w:color w:val="000000"/>
+          <w:sz w:val="24"/>
+          <w:szCs w:val="24"/>
+          <w:lang w:val="en-US"/>
+        </w:rPr>
+        <w:t xml:space="preserve"> </w:t>
+      </w:r>
+      <w:proofErr w:type="spellStart"/>
+      <w:r>
+        <w:rPr>
+          <w:rFonts w:ascii="Times New Roman" w:hAnsi="Times New Roman"/>
+          <w:color w:val="000000"/>
+          <w:sz w:val="24"/>
+          <w:szCs w:val="24"/>
+          <w:lang w:val="en-US"/>
+        </w:rPr>
+        <w:t>posisi</w:t>
+      </w:r>
+      <w:proofErr w:type="spellEnd"/>
+      <w:r>
+        <w:rPr>
+          <w:rFonts w:ascii="Times New Roman" w:hAnsi="Times New Roman"/>
+          <w:color w:val="000000"/>
+          <w:sz w:val="24"/>
+          <w:szCs w:val="24"/>
+          <w:lang w:val="en-US"/>
+        </w:rPr>
+        <w:t xml:space="preserve"> </w:t>
+      </w:r>
+      <w:proofErr w:type="spellStart"/>
+      <w:r>
+        <w:rPr>
+          <w:rFonts w:ascii="Times New Roman" w:hAnsi="Times New Roman"/>
+          <w:color w:val="000000"/>
+          <w:sz w:val="24"/>
+          <w:szCs w:val="24"/>
+          <w:lang w:val="en-US"/>
+        </w:rPr>
+        <w:t>dari</w:t>
+      </w:r>
+      <w:proofErr w:type="spellEnd"/>
+      <w:r>
+        <w:rPr>
+          <w:rFonts w:ascii="Times New Roman" w:hAnsi="Times New Roman"/>
+          <w:color w:val="000000"/>
+          <w:sz w:val="24"/>
+          <w:szCs w:val="24"/>
+          <w:lang w:val="en-US"/>
+        </w:rPr>
+        <w:t xml:space="preserve"> </w:t>
+      </w:r>
+      <w:proofErr w:type="spellStart"/>
+      <w:r>
+        <w:rPr>
+          <w:rFonts w:ascii="Times New Roman" w:hAnsi="Times New Roman"/>
+          <w:color w:val="000000"/>
+          <w:sz w:val="24"/>
+          <w:szCs w:val="24"/>
+          <w:lang w:val="en-US"/>
+        </w:rPr>
+        <w:t>kendaraan</w:t>
+      </w:r>
+      <w:proofErr w:type="spellEnd"/>
+      <w:r>
+        <w:rPr>
+          <w:rFonts w:ascii="Times New Roman" w:hAnsi="Times New Roman"/>
+          <w:color w:val="000000"/>
+          <w:sz w:val="24"/>
+          <w:szCs w:val="24"/>
+          <w:lang w:val="en-US"/>
+        </w:rPr>
+        <w:t>?</w:t>
+      </w:r>
+    </w:p>
+    <w:p>
+      <w:pPr>
+        <w:pStyle w:val="ListParagraph"/>
+        <w:widowControl w:val="0"/>
+        <w:numPr>
+          <w:ilvl w:val="0"/>
+          <w:numId w:val="6"/>
+        </w:numPr>
+        <w:tabs>
+          <w:tab w:val="left" w:leader="dot" w:pos="8222"/>
+          <w:tab w:val="right" w:pos="8788"/>
+        </w:tabs>
+        <w:autoSpaceDE w:val="0"/>
+        <w:autoSpaceDN w:val="0"/>
+        <w:adjustRightInd w:val="0"/>
+        <w:spacing w:after="240" w:line="360" w:lineRule="auto"/>
+        <w:ind w:left="851" w:hanging="284"/>
+        <w:contextualSpacing w:val="0"/>
+        <w:jc w:val="both"/>
+        <w:rPr>
+          <w:rFonts w:ascii="Times New Roman" w:hAnsi="Times New Roman"/>
+          <w:color w:val="000000"/>
+          <w:sz w:val="24"/>
+          <w:szCs w:val="24"/>
+          <w:lang w:val="en-US"/>
+        </w:rPr>
+      </w:pPr>
+      <w:proofErr w:type="spellStart"/>
+      <w:r>
+        <w:rPr>
+          <w:rFonts w:ascii="Times New Roman" w:hAnsi="Times New Roman"/>
+          <w:color w:val="000000"/>
+          <w:sz w:val="24"/>
+          <w:szCs w:val="24"/>
+          <w:lang w:val="en-US"/>
+        </w:rPr>
+        <w:t>Bagaimana</w:t>
+      </w:r>
+      <w:proofErr w:type="spellEnd"/>
+      <w:r>
+        <w:rPr>
+          <w:rFonts w:ascii="Times New Roman" w:hAnsi="Times New Roman"/>
+          <w:color w:val="000000"/>
+          <w:sz w:val="24"/>
+          <w:szCs w:val="24"/>
+          <w:lang w:val="en-US"/>
+        </w:rPr>
+        <w:t xml:space="preserve"> </w:t>
+      </w:r>
+      <w:proofErr w:type="spellStart"/>
+      <w:r>
+        <w:rPr>
+          <w:rFonts w:ascii="Times New Roman" w:hAnsi="Times New Roman"/>
+          <w:color w:val="000000"/>
+          <w:sz w:val="24"/>
+          <w:szCs w:val="24"/>
+          <w:lang w:val="en-US"/>
+        </w:rPr>
+        <w:t>cara</w:t>
+      </w:r>
+      <w:proofErr w:type="spellEnd"/>
+      <w:r>
+        <w:rPr>
+          <w:rFonts w:ascii="Times New Roman" w:hAnsi="Times New Roman"/>
+          <w:color w:val="000000"/>
+          <w:sz w:val="24"/>
+          <w:szCs w:val="24"/>
+          <w:lang w:val="en-US"/>
+        </w:rPr>
+        <w:t xml:space="preserve"> </w:t>
+      </w:r>
+      <w:proofErr w:type="spellStart"/>
+      <w:r>
+        <w:rPr>
+          <w:rFonts w:ascii="Times New Roman" w:hAnsi="Times New Roman"/>
+          <w:color w:val="000000"/>
+          <w:sz w:val="24"/>
+          <w:szCs w:val="24"/>
+          <w:lang w:val="en-US"/>
+        </w:rPr>
+        <w:t>mengirimkan</w:t>
+      </w:r>
+      <w:proofErr w:type="spellEnd"/>
+      <w:r>
+        <w:rPr>
+          <w:rFonts w:ascii="Times New Roman" w:hAnsi="Times New Roman"/>
+          <w:color w:val="000000"/>
+          <w:sz w:val="24"/>
+          <w:szCs w:val="24"/>
+          <w:lang w:val="en-US"/>
+        </w:rPr>
+        <w:t xml:space="preserve"> </w:t>
+      </w:r>
+      <w:proofErr w:type="spellStart"/>
+      <w:r>
+        <w:rPr>
+          <w:rFonts w:ascii="Times New Roman" w:hAnsi="Times New Roman"/>
+          <w:color w:val="000000"/>
+          <w:sz w:val="24"/>
+          <w:szCs w:val="24"/>
+          <w:lang w:val="en-US"/>
+        </w:rPr>
+        <w:t>informasi</w:t>
+      </w:r>
+      <w:proofErr w:type="spellEnd"/>
+      <w:r>
+        <w:rPr>
+          <w:rFonts w:ascii="Times New Roman" w:hAnsi="Times New Roman"/>
+          <w:color w:val="000000"/>
+          <w:sz w:val="24"/>
+          <w:szCs w:val="24"/>
+          <w:lang w:val="en-US"/>
+        </w:rPr>
+        <w:t xml:space="preserve"> </w:t>
+      </w:r>
+      <w:proofErr w:type="spellStart"/>
+      <w:r>
+        <w:rPr>
+          <w:rFonts w:ascii="Times New Roman" w:hAnsi="Times New Roman"/>
+          <w:color w:val="000000"/>
+          <w:sz w:val="24"/>
+          <w:szCs w:val="24"/>
+          <w:lang w:val="en-US"/>
+        </w:rPr>
+        <w:t>ke</w:t>
+      </w:r>
+      <w:proofErr w:type="spellEnd"/>
+      <w:r>
+        <w:rPr>
+          <w:rFonts w:ascii="Times New Roman" w:hAnsi="Times New Roman"/>
+          <w:color w:val="000000"/>
+          <w:sz w:val="24"/>
+          <w:szCs w:val="24"/>
+          <w:lang w:val="en-US"/>
+        </w:rPr>
+        <w:t xml:space="preserve"> </w:t>
+      </w:r>
+      <w:proofErr w:type="spellStart"/>
+      <w:r>
+        <w:rPr>
+          <w:rFonts w:ascii="Times New Roman" w:hAnsi="Times New Roman"/>
+          <w:color w:val="000000"/>
+          <w:sz w:val="24"/>
+          <w:szCs w:val="24"/>
+          <w:lang w:val="en-US"/>
+        </w:rPr>
+        <w:t>pengguna</w:t>
+      </w:r>
+      <w:proofErr w:type="spellEnd"/>
+      <w:r>
+        <w:rPr>
+          <w:rFonts w:ascii="Times New Roman" w:hAnsi="Times New Roman"/>
+          <w:color w:val="000000"/>
+          <w:sz w:val="24"/>
+          <w:szCs w:val="24"/>
+          <w:lang w:val="en-US"/>
+        </w:rPr>
+        <w:t>?</w:t>
+      </w:r>
     </w:p>
     <w:p>
       <w:pPr>
@@ -22605,6 +23414,7 @@
           <w:lang w:val="en-US"/>
         </w:rPr>
       </w:pPr>
+      <w:proofErr w:type="spellStart"/>
       <w:r>
         <w:rPr>
           <w:rFonts w:ascii="Times New Roman" w:hAnsi="Times New Roman"/>
@@ -22615,9 +23425,9 @@
           <w:szCs w:val="24"/>
           <w:lang w:val="en-US"/>
         </w:rPr>
-        <w:t xml:space="preserve">Batasan </w:t>
-      </w:r>
-      <w:proofErr w:type="spellStart"/>
+        <w:t>Tujuan</w:t>
+      </w:r>
+      <w:proofErr w:type="spellEnd"/>
       <w:r>
         <w:rPr>
           <w:rFonts w:ascii="Times New Roman" w:hAnsi="Times New Roman"/>
@@ -22628,9 +23438,584 @@
           <w:szCs w:val="24"/>
           <w:lang w:val="en-US"/>
         </w:rPr>
-        <w:t>Masalah</w:t>
-      </w:r>
-      <w:proofErr w:type="spellEnd"/>
+        <w:t xml:space="preserve"> </w:t>
+      </w:r>
+      <w:proofErr w:type="spellStart"/>
+      <w:r>
+        <w:rPr>
+          <w:rFonts w:ascii="Times New Roman" w:hAnsi="Times New Roman"/>
+          <w:b/>
+          <w:bCs/>
+          <w:color w:val="000000"/>
+          <w:sz w:val="24"/>
+          <w:szCs w:val="24"/>
+          <w:lang w:val="en-US"/>
+        </w:rPr>
+        <w:t>Penelitian</w:t>
+      </w:r>
+      <w:proofErr w:type="spellEnd"/>
+    </w:p>
+    <w:p>
+      <w:pPr>
+        <w:pStyle w:val="ListParagraph"/>
+        <w:widowControl w:val="0"/>
+        <w:tabs>
+          <w:tab w:val="left" w:leader="dot" w:pos="8222"/>
+          <w:tab w:val="right" w:pos="8788"/>
+        </w:tabs>
+        <w:autoSpaceDE w:val="0"/>
+        <w:autoSpaceDN w:val="0"/>
+        <w:adjustRightInd w:val="0"/>
+        <w:spacing w:after="0" w:line="360" w:lineRule="auto"/>
+        <w:ind w:left="567"/>
+        <w:jc w:val="both"/>
+        <w:rPr>
+          <w:rFonts w:ascii="Times New Roman" w:hAnsi="Times New Roman"/>
+          <w:color w:val="000000"/>
+          <w:sz w:val="24"/>
+          <w:szCs w:val="24"/>
+          <w:lang w:val="en-US"/>
+        </w:rPr>
+      </w:pPr>
+      <w:proofErr w:type="spellStart"/>
+      <w:r>
+        <w:rPr>
+          <w:rFonts w:ascii="Times New Roman" w:hAnsi="Times New Roman"/>
+          <w:color w:val="000000"/>
+          <w:sz w:val="24"/>
+          <w:szCs w:val="24"/>
+          <w:lang w:val="en-US"/>
+        </w:rPr>
+        <w:t>Tujuan</w:t>
+      </w:r>
+      <w:proofErr w:type="spellEnd"/>
+      <w:r>
+        <w:rPr>
+          <w:rFonts w:ascii="Times New Roman" w:hAnsi="Times New Roman"/>
+          <w:color w:val="000000"/>
+          <w:sz w:val="24"/>
+          <w:szCs w:val="24"/>
+          <w:lang w:val="en-US"/>
+        </w:rPr>
+        <w:t xml:space="preserve"> yang </w:t>
+      </w:r>
+      <w:proofErr w:type="spellStart"/>
+      <w:r>
+        <w:rPr>
+          <w:rFonts w:ascii="Times New Roman" w:hAnsi="Times New Roman"/>
+          <w:color w:val="000000"/>
+          <w:sz w:val="24"/>
+          <w:szCs w:val="24"/>
+          <w:lang w:val="en-US"/>
+        </w:rPr>
+        <w:t>ingin</w:t>
+      </w:r>
+      <w:proofErr w:type="spellEnd"/>
+      <w:r>
+        <w:rPr>
+          <w:rFonts w:ascii="Times New Roman" w:hAnsi="Times New Roman"/>
+          <w:color w:val="000000"/>
+          <w:sz w:val="24"/>
+          <w:szCs w:val="24"/>
+          <w:lang w:val="en-US"/>
+        </w:rPr>
+        <w:t xml:space="preserve"> </w:t>
+      </w:r>
+      <w:proofErr w:type="spellStart"/>
+      <w:r>
+        <w:rPr>
+          <w:rFonts w:ascii="Times New Roman" w:hAnsi="Times New Roman"/>
+          <w:color w:val="000000"/>
+          <w:sz w:val="24"/>
+          <w:szCs w:val="24"/>
+          <w:lang w:val="en-US"/>
+        </w:rPr>
+        <w:t>dicapai</w:t>
+      </w:r>
+      <w:proofErr w:type="spellEnd"/>
+      <w:r>
+        <w:rPr>
+          <w:rFonts w:ascii="Times New Roman" w:hAnsi="Times New Roman"/>
+          <w:color w:val="000000"/>
+          <w:sz w:val="24"/>
+          <w:szCs w:val="24"/>
+          <w:lang w:val="en-US"/>
+        </w:rPr>
+        <w:t xml:space="preserve"> </w:t>
+      </w:r>
+      <w:proofErr w:type="spellStart"/>
+      <w:r>
+        <w:rPr>
+          <w:rFonts w:ascii="Times New Roman" w:hAnsi="Times New Roman"/>
+          <w:color w:val="000000"/>
+          <w:sz w:val="24"/>
+          <w:szCs w:val="24"/>
+          <w:lang w:val="en-US"/>
+        </w:rPr>
+        <w:t>dalam</w:t>
+      </w:r>
+      <w:proofErr w:type="spellEnd"/>
+      <w:r>
+        <w:rPr>
+          <w:rFonts w:ascii="Times New Roman" w:hAnsi="Times New Roman"/>
+          <w:color w:val="000000"/>
+          <w:sz w:val="24"/>
+          <w:szCs w:val="24"/>
+          <w:lang w:val="en-US"/>
+        </w:rPr>
+        <w:t xml:space="preserve"> </w:t>
+      </w:r>
+      <w:proofErr w:type="spellStart"/>
+      <w:r>
+        <w:rPr>
+          <w:rFonts w:ascii="Times New Roman" w:hAnsi="Times New Roman"/>
+          <w:color w:val="000000"/>
+          <w:sz w:val="24"/>
+          <w:szCs w:val="24"/>
+          <w:lang w:val="en-US"/>
+        </w:rPr>
+        <w:t>penelitian</w:t>
+      </w:r>
+      <w:proofErr w:type="spellEnd"/>
+      <w:r>
+        <w:rPr>
+          <w:rFonts w:ascii="Times New Roman" w:hAnsi="Times New Roman"/>
+          <w:color w:val="000000"/>
+          <w:sz w:val="24"/>
+          <w:szCs w:val="24"/>
+          <w:lang w:val="en-US"/>
+        </w:rPr>
+        <w:t xml:space="preserve"> </w:t>
+      </w:r>
+      <w:proofErr w:type="spellStart"/>
+      <w:r>
+        <w:rPr>
+          <w:rFonts w:ascii="Times New Roman" w:hAnsi="Times New Roman"/>
+          <w:color w:val="000000"/>
+          <w:sz w:val="24"/>
+          <w:szCs w:val="24"/>
+          <w:lang w:val="en-US"/>
+        </w:rPr>
+        <w:t>ini</w:t>
+      </w:r>
+      <w:proofErr w:type="spellEnd"/>
+      <w:r>
+        <w:rPr>
+          <w:rFonts w:ascii="Times New Roman" w:hAnsi="Times New Roman"/>
+          <w:color w:val="000000"/>
+          <w:sz w:val="24"/>
+          <w:szCs w:val="24"/>
+          <w:lang w:val="en-US"/>
+        </w:rPr>
+        <w:t xml:space="preserve"> </w:t>
+      </w:r>
+      <w:proofErr w:type="spellStart"/>
+      <w:r>
+        <w:rPr>
+          <w:rFonts w:ascii="Times New Roman" w:hAnsi="Times New Roman"/>
+          <w:color w:val="000000"/>
+          <w:sz w:val="24"/>
+          <w:szCs w:val="24"/>
+          <w:lang w:val="en-US"/>
+        </w:rPr>
+        <w:t>adalah</w:t>
+      </w:r>
+      <w:proofErr w:type="spellEnd"/>
+      <w:r>
+        <w:rPr>
+          <w:rFonts w:ascii="Times New Roman" w:hAnsi="Times New Roman"/>
+          <w:color w:val="000000"/>
+          <w:sz w:val="24"/>
+          <w:szCs w:val="24"/>
+          <w:lang w:val="en-US"/>
+        </w:rPr>
+        <w:t>:</w:t>
+      </w:r>
+    </w:p>
+    <w:p>
+      <w:pPr>
+        <w:pStyle w:val="ListParagraph"/>
+        <w:widowControl w:val="0"/>
+        <w:numPr>
+          <w:ilvl w:val="0"/>
+          <w:numId w:val="7"/>
+        </w:numPr>
+        <w:tabs>
+          <w:tab w:val="left" w:leader="dot" w:pos="8222"/>
+          <w:tab w:val="right" w:pos="8788"/>
+        </w:tabs>
+        <w:autoSpaceDE w:val="0"/>
+        <w:autoSpaceDN w:val="0"/>
+        <w:adjustRightInd w:val="0"/>
+        <w:spacing w:after="0" w:line="360" w:lineRule="auto"/>
+        <w:ind w:left="851" w:hanging="284"/>
+        <w:jc w:val="both"/>
+        <w:rPr>
+          <w:rFonts w:ascii="Times New Roman" w:hAnsi="Times New Roman"/>
+          <w:color w:val="000000"/>
+          <w:sz w:val="24"/>
+          <w:szCs w:val="24"/>
+          <w:lang w:val="en-US"/>
+        </w:rPr>
+      </w:pPr>
+      <w:proofErr w:type="spellStart"/>
+      <w:r>
+        <w:rPr>
+          <w:rFonts w:ascii="Times New Roman" w:hAnsi="Times New Roman"/>
+          <w:color w:val="000000"/>
+          <w:sz w:val="24"/>
+          <w:szCs w:val="24"/>
+          <w:lang w:val="en-US"/>
+        </w:rPr>
+        <w:t>Merancang</w:t>
+      </w:r>
+      <w:proofErr w:type="spellEnd"/>
+      <w:r>
+        <w:rPr>
+          <w:rFonts w:ascii="Times New Roman" w:hAnsi="Times New Roman"/>
+          <w:color w:val="000000"/>
+          <w:sz w:val="24"/>
+          <w:szCs w:val="24"/>
+          <w:lang w:val="en-US"/>
+        </w:rPr>
+        <w:t xml:space="preserve"> dam </w:t>
+      </w:r>
+      <w:proofErr w:type="spellStart"/>
+      <w:r>
+        <w:rPr>
+          <w:rFonts w:ascii="Times New Roman" w:hAnsi="Times New Roman"/>
+          <w:color w:val="000000"/>
+          <w:sz w:val="24"/>
+          <w:szCs w:val="24"/>
+          <w:lang w:val="en-US"/>
+        </w:rPr>
+        <w:t>membangun</w:t>
+      </w:r>
+      <w:proofErr w:type="spellEnd"/>
+      <w:r>
+        <w:rPr>
+          <w:rFonts w:ascii="Times New Roman" w:hAnsi="Times New Roman"/>
+          <w:color w:val="000000"/>
+          <w:sz w:val="24"/>
+          <w:szCs w:val="24"/>
+          <w:lang w:val="en-US"/>
+        </w:rPr>
+        <w:t xml:space="preserve"> prototype </w:t>
+      </w:r>
+      <w:proofErr w:type="spellStart"/>
+      <w:r>
+        <w:rPr>
+          <w:rFonts w:ascii="Times New Roman" w:hAnsi="Times New Roman"/>
+          <w:color w:val="000000"/>
+          <w:sz w:val="24"/>
+          <w:szCs w:val="24"/>
+          <w:lang w:val="en-US"/>
+        </w:rPr>
+        <w:t>sistem</w:t>
+      </w:r>
+      <w:proofErr w:type="spellEnd"/>
+      <w:r>
+        <w:rPr>
+          <w:rFonts w:ascii="Times New Roman" w:hAnsi="Times New Roman"/>
+          <w:color w:val="000000"/>
+          <w:sz w:val="24"/>
+          <w:szCs w:val="24"/>
+          <w:lang w:val="en-US"/>
+        </w:rPr>
+        <w:t xml:space="preserve"> </w:t>
+      </w:r>
+      <w:proofErr w:type="spellStart"/>
+      <w:r>
+        <w:rPr>
+          <w:rFonts w:ascii="Times New Roman" w:hAnsi="Times New Roman"/>
+          <w:color w:val="000000"/>
+          <w:sz w:val="24"/>
+          <w:szCs w:val="24"/>
+          <w:lang w:val="en-US"/>
+        </w:rPr>
+        <w:t>keamanan</w:t>
+      </w:r>
+      <w:proofErr w:type="spellEnd"/>
+      <w:r>
+        <w:rPr>
+          <w:rFonts w:ascii="Times New Roman" w:hAnsi="Times New Roman"/>
+          <w:color w:val="000000"/>
+          <w:sz w:val="24"/>
+          <w:szCs w:val="24"/>
+          <w:lang w:val="en-US"/>
+        </w:rPr>
+        <w:t xml:space="preserve"> pada </w:t>
+      </w:r>
+      <w:proofErr w:type="spellStart"/>
+      <w:r>
+        <w:rPr>
+          <w:rFonts w:ascii="Times New Roman" w:hAnsi="Times New Roman"/>
+          <w:color w:val="000000"/>
+          <w:sz w:val="24"/>
+          <w:szCs w:val="24"/>
+          <w:lang w:val="en-US"/>
+        </w:rPr>
+        <w:t>sepeda</w:t>
+      </w:r>
+      <w:proofErr w:type="spellEnd"/>
+      <w:r>
+        <w:rPr>
+          <w:rFonts w:ascii="Times New Roman" w:hAnsi="Times New Roman"/>
+          <w:color w:val="000000"/>
+          <w:sz w:val="24"/>
+          <w:szCs w:val="24"/>
+          <w:lang w:val="en-US"/>
+        </w:rPr>
+        <w:t xml:space="preserve"> motor </w:t>
+      </w:r>
+      <w:proofErr w:type="spellStart"/>
+      <w:r>
+        <w:rPr>
+          <w:rFonts w:ascii="Times New Roman" w:hAnsi="Times New Roman"/>
+          <w:color w:val="000000"/>
+          <w:sz w:val="24"/>
+          <w:szCs w:val="24"/>
+          <w:lang w:val="en-US"/>
+        </w:rPr>
+        <w:t>menggunakan</w:t>
+      </w:r>
+      <w:proofErr w:type="spellEnd"/>
+      <w:r>
+        <w:rPr>
+          <w:rFonts w:ascii="Times New Roman" w:hAnsi="Times New Roman"/>
+          <w:color w:val="000000"/>
+          <w:sz w:val="24"/>
+          <w:szCs w:val="24"/>
+          <w:lang w:val="en-US"/>
+        </w:rPr>
+        <w:t xml:space="preserve"> </w:t>
+      </w:r>
+      <w:proofErr w:type="spellStart"/>
+      <w:r>
+        <w:rPr>
+          <w:rFonts w:ascii="Times New Roman" w:hAnsi="Times New Roman"/>
+          <w:color w:val="000000"/>
+          <w:sz w:val="24"/>
+          <w:szCs w:val="24"/>
+          <w:lang w:val="en-US"/>
+        </w:rPr>
+        <w:t>mikrokontroler</w:t>
+      </w:r>
+      <w:proofErr w:type="spellEnd"/>
+      <w:r>
+        <w:rPr>
+          <w:rFonts w:ascii="Times New Roman" w:hAnsi="Times New Roman"/>
+          <w:color w:val="000000"/>
+          <w:sz w:val="24"/>
+          <w:szCs w:val="24"/>
+          <w:lang w:val="en-US"/>
+        </w:rPr>
+        <w:t xml:space="preserve"> 32bit.</w:t>
+      </w:r>
+    </w:p>
+    <w:p>
+      <w:pPr>
+        <w:pStyle w:val="ListParagraph"/>
+        <w:widowControl w:val="0"/>
+        <w:numPr>
+          <w:ilvl w:val="0"/>
+          <w:numId w:val="7"/>
+        </w:numPr>
+        <w:tabs>
+          <w:tab w:val="left" w:leader="dot" w:pos="8222"/>
+          <w:tab w:val="right" w:pos="8788"/>
+        </w:tabs>
+        <w:autoSpaceDE w:val="0"/>
+        <w:autoSpaceDN w:val="0"/>
+        <w:adjustRightInd w:val="0"/>
+        <w:spacing w:after="240" w:line="360" w:lineRule="auto"/>
+        <w:ind w:left="851" w:hanging="284"/>
+        <w:contextualSpacing w:val="0"/>
+        <w:jc w:val="both"/>
+        <w:rPr>
+          <w:rFonts w:ascii="Times New Roman" w:hAnsi="Times New Roman"/>
+          <w:color w:val="000000"/>
+          <w:sz w:val="24"/>
+          <w:szCs w:val="24"/>
+          <w:lang w:val="en-US"/>
+        </w:rPr>
+      </w:pPr>
+      <w:proofErr w:type="spellStart"/>
+      <w:r>
+        <w:rPr>
+          <w:rFonts w:ascii="Times New Roman" w:hAnsi="Times New Roman"/>
+          <w:color w:val="000000"/>
+          <w:sz w:val="24"/>
+          <w:szCs w:val="24"/>
+          <w:lang w:val="en-US"/>
+        </w:rPr>
+        <w:t>Merancang</w:t>
+      </w:r>
+      <w:proofErr w:type="spellEnd"/>
+      <w:r>
+        <w:rPr>
+          <w:rFonts w:ascii="Times New Roman" w:hAnsi="Times New Roman"/>
+          <w:color w:val="000000"/>
+          <w:sz w:val="24"/>
+          <w:szCs w:val="24"/>
+          <w:lang w:val="en-US"/>
+        </w:rPr>
+        <w:t xml:space="preserve"> </w:t>
+      </w:r>
+      <w:r>
+        <w:rPr>
+          <w:rFonts w:ascii="Times New Roman" w:hAnsi="Times New Roman"/>
+          <w:i/>
+          <w:iCs/>
+          <w:color w:val="000000"/>
+          <w:sz w:val="24"/>
+          <w:szCs w:val="24"/>
+          <w:lang w:val="en-US"/>
+        </w:rPr>
+        <w:t>interface</w:t>
+      </w:r>
+      <w:r>
+        <w:rPr>
+          <w:rFonts w:ascii="Times New Roman" w:hAnsi="Times New Roman"/>
+          <w:color w:val="000000"/>
+          <w:sz w:val="24"/>
+          <w:szCs w:val="24"/>
+          <w:lang w:val="en-US"/>
+        </w:rPr>
+        <w:t xml:space="preserve"> </w:t>
+      </w:r>
+      <w:proofErr w:type="spellStart"/>
+      <w:r>
+        <w:rPr>
+          <w:rFonts w:ascii="Times New Roman" w:hAnsi="Times New Roman"/>
+          <w:color w:val="000000"/>
+          <w:sz w:val="24"/>
+          <w:szCs w:val="24"/>
+          <w:lang w:val="en-US"/>
+        </w:rPr>
+        <w:t>dari</w:t>
+      </w:r>
+      <w:proofErr w:type="spellEnd"/>
+      <w:r>
+        <w:rPr>
+          <w:rFonts w:ascii="Times New Roman" w:hAnsi="Times New Roman"/>
+          <w:color w:val="000000"/>
+          <w:sz w:val="24"/>
+          <w:szCs w:val="24"/>
+          <w:lang w:val="en-US"/>
+        </w:rPr>
+        <w:t xml:space="preserve"> </w:t>
+      </w:r>
+      <w:r>
+        <w:rPr>
+          <w:rFonts w:ascii="Times New Roman" w:hAnsi="Times New Roman"/>
+          <w:i/>
+          <w:iCs/>
+          <w:color w:val="000000"/>
+          <w:sz w:val="24"/>
+          <w:szCs w:val="24"/>
+          <w:lang w:val="en-US"/>
+        </w:rPr>
+        <w:t>prototype</w:t>
+      </w:r>
+      <w:r>
+        <w:rPr>
+          <w:rFonts w:ascii="Times New Roman" w:hAnsi="Times New Roman"/>
+          <w:color w:val="000000"/>
+          <w:sz w:val="24"/>
+          <w:szCs w:val="24"/>
+          <w:lang w:val="en-US"/>
+        </w:rPr>
+        <w:t xml:space="preserve"> yang </w:t>
+      </w:r>
+      <w:r>
+        <w:rPr>
+          <w:rFonts w:ascii="Times New Roman" w:hAnsi="Times New Roman"/>
+          <w:i/>
+          <w:iCs/>
+          <w:color w:val="000000"/>
+          <w:sz w:val="24"/>
+          <w:szCs w:val="24"/>
+          <w:lang w:val="en-US"/>
+        </w:rPr>
+        <w:t>User</w:t>
+      </w:r>
+      <w:r>
+        <w:rPr>
+          <w:rFonts w:ascii="Times New Roman" w:hAnsi="Times New Roman"/>
+          <w:color w:val="000000"/>
+          <w:sz w:val="24"/>
+          <w:szCs w:val="24"/>
+          <w:lang w:val="en-US"/>
+        </w:rPr>
+        <w:t xml:space="preserve"> </w:t>
+      </w:r>
+      <w:r>
+        <w:rPr>
+          <w:rFonts w:ascii="Times New Roman" w:hAnsi="Times New Roman"/>
+          <w:i/>
+          <w:iCs/>
+          <w:color w:val="000000"/>
+          <w:sz w:val="24"/>
+          <w:szCs w:val="24"/>
+          <w:lang w:val="en-US"/>
+        </w:rPr>
+        <w:t>Friendly</w:t>
+      </w:r>
+      <w:r>
+        <w:rPr>
+          <w:rFonts w:ascii="Times New Roman" w:hAnsi="Times New Roman"/>
+          <w:color w:val="000000"/>
+          <w:sz w:val="24"/>
+          <w:szCs w:val="24"/>
+          <w:lang w:val="en-US"/>
+        </w:rPr>
+        <w:t xml:space="preserve"> dan </w:t>
+      </w:r>
+      <w:proofErr w:type="spellStart"/>
+      <w:r>
+        <w:rPr>
+          <w:rFonts w:ascii="Times New Roman" w:hAnsi="Times New Roman"/>
+          <w:color w:val="000000"/>
+          <w:sz w:val="24"/>
+          <w:szCs w:val="24"/>
+          <w:lang w:val="en-US"/>
+        </w:rPr>
+        <w:t>mudah</w:t>
+      </w:r>
+      <w:proofErr w:type="spellEnd"/>
+      <w:r>
+        <w:rPr>
+          <w:rFonts w:ascii="Times New Roman" w:hAnsi="Times New Roman"/>
+          <w:color w:val="000000"/>
+          <w:sz w:val="24"/>
+          <w:szCs w:val="24"/>
+          <w:lang w:val="en-US"/>
+        </w:rPr>
+        <w:t xml:space="preserve"> </w:t>
+      </w:r>
+      <w:proofErr w:type="spellStart"/>
+      <w:r>
+        <w:rPr>
+          <w:rFonts w:ascii="Times New Roman" w:hAnsi="Times New Roman"/>
+          <w:color w:val="000000"/>
+          <w:sz w:val="24"/>
+          <w:szCs w:val="24"/>
+          <w:lang w:val="en-US"/>
+        </w:rPr>
+        <w:t>digunakan</w:t>
+      </w:r>
+      <w:proofErr w:type="spellEnd"/>
+      <w:r>
+        <w:rPr>
+          <w:rFonts w:ascii="Times New Roman" w:hAnsi="Times New Roman"/>
+          <w:color w:val="000000"/>
+          <w:sz w:val="24"/>
+          <w:szCs w:val="24"/>
+          <w:lang w:val="en-US"/>
+        </w:rPr>
+        <w:t>.</w:t>
+      </w:r>
     </w:p>
     <w:p>
       <w:pPr>
@@ -22660,7 +24045,6 @@
           <w:lang w:val="en-US"/>
         </w:rPr>
       </w:pPr>
-      <w:proofErr w:type="spellStart"/>
       <w:r>
         <w:rPr>
           <w:rFonts w:ascii="Times New Roman" w:hAnsi="Times New Roman"/>
@@ -22671,6 +24055,920 @@
           <w:szCs w:val="24"/>
           <w:lang w:val="en-US"/>
         </w:rPr>
+        <w:t xml:space="preserve">Batasan </w:t>
+      </w:r>
+      <w:proofErr w:type="spellStart"/>
+      <w:r>
+        <w:rPr>
+          <w:rFonts w:ascii="Times New Roman" w:hAnsi="Times New Roman"/>
+          <w:b/>
+          <w:bCs/>
+          <w:color w:val="000000"/>
+          <w:sz w:val="24"/>
+          <w:szCs w:val="24"/>
+          <w:lang w:val="en-US"/>
+        </w:rPr>
+        <w:t>Masalah</w:t>
+      </w:r>
+      <w:proofErr w:type="spellEnd"/>
+    </w:p>
+    <w:p>
+      <w:pPr>
+        <w:pStyle w:val="ListParagraph"/>
+        <w:widowControl w:val="0"/>
+        <w:tabs>
+          <w:tab w:val="left" w:leader="dot" w:pos="8222"/>
+          <w:tab w:val="right" w:pos="8788"/>
+        </w:tabs>
+        <w:autoSpaceDE w:val="0"/>
+        <w:autoSpaceDN w:val="0"/>
+        <w:adjustRightInd w:val="0"/>
+        <w:spacing w:after="0" w:line="360" w:lineRule="auto"/>
+        <w:ind w:left="567"/>
+        <w:jc w:val="both"/>
+        <w:rPr>
+          <w:rFonts w:ascii="Times New Roman" w:hAnsi="Times New Roman"/>
+          <w:color w:val="000000"/>
+          <w:sz w:val="24"/>
+          <w:szCs w:val="24"/>
+          <w:lang w:val="en-US"/>
+        </w:rPr>
+      </w:pPr>
+      <w:r>
+        <w:rPr>
+          <w:rFonts w:ascii="Times New Roman" w:hAnsi="Times New Roman"/>
+          <w:color w:val="000000"/>
+          <w:sz w:val="24"/>
+          <w:szCs w:val="24"/>
+          <w:lang w:val="en-US"/>
+        </w:rPr>
+        <w:t xml:space="preserve">Pada </w:t>
+      </w:r>
+      <w:proofErr w:type="spellStart"/>
+      <w:r>
+        <w:rPr>
+          <w:rFonts w:ascii="Times New Roman" w:hAnsi="Times New Roman"/>
+          <w:color w:val="000000"/>
+          <w:sz w:val="24"/>
+          <w:szCs w:val="24"/>
+          <w:lang w:val="en-US"/>
+        </w:rPr>
+        <w:t>penelitian</w:t>
+      </w:r>
+      <w:proofErr w:type="spellEnd"/>
+      <w:r>
+        <w:rPr>
+          <w:rFonts w:ascii="Times New Roman" w:hAnsi="Times New Roman"/>
+          <w:color w:val="000000"/>
+          <w:sz w:val="24"/>
+          <w:szCs w:val="24"/>
+          <w:lang w:val="en-US"/>
+        </w:rPr>
+        <w:t xml:space="preserve"> </w:t>
+      </w:r>
+      <w:proofErr w:type="spellStart"/>
+      <w:r>
+        <w:rPr>
+          <w:rFonts w:ascii="Times New Roman" w:hAnsi="Times New Roman"/>
+          <w:color w:val="000000"/>
+          <w:sz w:val="24"/>
+          <w:szCs w:val="24"/>
+          <w:lang w:val="en-US"/>
+        </w:rPr>
+        <w:t>ini</w:t>
+      </w:r>
+      <w:proofErr w:type="spellEnd"/>
+      <w:r>
+        <w:rPr>
+          <w:rFonts w:ascii="Times New Roman" w:hAnsi="Times New Roman"/>
+          <w:color w:val="000000"/>
+          <w:sz w:val="24"/>
+          <w:szCs w:val="24"/>
+          <w:lang w:val="en-US"/>
+        </w:rPr>
+        <w:t xml:space="preserve">, </w:t>
+      </w:r>
+      <w:proofErr w:type="spellStart"/>
+      <w:r>
+        <w:rPr>
+          <w:rFonts w:ascii="Times New Roman" w:hAnsi="Times New Roman"/>
+          <w:color w:val="000000"/>
+          <w:sz w:val="24"/>
+          <w:szCs w:val="24"/>
+          <w:lang w:val="en-US"/>
+        </w:rPr>
+        <w:t>dibuat</w:t>
+      </w:r>
+      <w:proofErr w:type="spellEnd"/>
+      <w:r>
+        <w:rPr>
+          <w:rFonts w:ascii="Times New Roman" w:hAnsi="Times New Roman"/>
+          <w:color w:val="000000"/>
+          <w:sz w:val="24"/>
+          <w:szCs w:val="24"/>
+          <w:lang w:val="en-US"/>
+        </w:rPr>
+        <w:t xml:space="preserve"> </w:t>
+      </w:r>
+      <w:proofErr w:type="spellStart"/>
+      <w:r>
+        <w:rPr>
+          <w:rFonts w:ascii="Times New Roman" w:hAnsi="Times New Roman"/>
+          <w:color w:val="000000"/>
+          <w:sz w:val="24"/>
+          <w:szCs w:val="24"/>
+          <w:lang w:val="en-US"/>
+        </w:rPr>
+        <w:t>batasan</w:t>
+      </w:r>
+      <w:proofErr w:type="spellEnd"/>
+      <w:r>
+        <w:rPr>
+          <w:rFonts w:ascii="Times New Roman" w:hAnsi="Times New Roman"/>
+          <w:color w:val="000000"/>
+          <w:sz w:val="24"/>
+          <w:szCs w:val="24"/>
+          <w:lang w:val="en-US"/>
+        </w:rPr>
+        <w:t xml:space="preserve"> </w:t>
+      </w:r>
+      <w:proofErr w:type="spellStart"/>
+      <w:r>
+        <w:rPr>
+          <w:rFonts w:ascii="Times New Roman" w:hAnsi="Times New Roman"/>
+          <w:color w:val="000000"/>
+          <w:sz w:val="24"/>
+          <w:szCs w:val="24"/>
+          <w:lang w:val="en-US"/>
+        </w:rPr>
+        <w:t>permasalahan</w:t>
+      </w:r>
+      <w:proofErr w:type="spellEnd"/>
+      <w:r>
+        <w:rPr>
+          <w:rFonts w:ascii="Times New Roman" w:hAnsi="Times New Roman"/>
+          <w:color w:val="000000"/>
+          <w:sz w:val="24"/>
+          <w:szCs w:val="24"/>
+          <w:lang w:val="en-US"/>
+        </w:rPr>
+        <w:t xml:space="preserve"> </w:t>
+      </w:r>
+      <w:proofErr w:type="spellStart"/>
+      <w:r>
+        <w:rPr>
+          <w:rFonts w:ascii="Times New Roman" w:hAnsi="Times New Roman"/>
+          <w:color w:val="000000"/>
+          <w:sz w:val="24"/>
+          <w:szCs w:val="24"/>
+          <w:lang w:val="en-US"/>
+        </w:rPr>
+        <w:t>sebagai</w:t>
+      </w:r>
+      <w:proofErr w:type="spellEnd"/>
+      <w:r>
+        <w:rPr>
+          <w:rFonts w:ascii="Times New Roman" w:hAnsi="Times New Roman"/>
+          <w:color w:val="000000"/>
+          <w:sz w:val="24"/>
+          <w:szCs w:val="24"/>
+          <w:lang w:val="en-US"/>
+        </w:rPr>
+        <w:t xml:space="preserve"> </w:t>
+      </w:r>
+      <w:proofErr w:type="spellStart"/>
+      <w:r>
+        <w:rPr>
+          <w:rFonts w:ascii="Times New Roman" w:hAnsi="Times New Roman"/>
+          <w:color w:val="000000"/>
+          <w:sz w:val="24"/>
+          <w:szCs w:val="24"/>
+          <w:lang w:val="en-US"/>
+        </w:rPr>
+        <w:t>berikut</w:t>
+      </w:r>
+      <w:proofErr w:type="spellEnd"/>
+      <w:r>
+        <w:rPr>
+          <w:rFonts w:ascii="Times New Roman" w:hAnsi="Times New Roman"/>
+          <w:color w:val="000000"/>
+          <w:sz w:val="24"/>
+          <w:szCs w:val="24"/>
+          <w:lang w:val="en-US"/>
+        </w:rPr>
+        <w:t>:</w:t>
+      </w:r>
+    </w:p>
+    <w:p>
+      <w:pPr>
+        <w:pStyle w:val="ListParagraph"/>
+        <w:widowControl w:val="0"/>
+        <w:numPr>
+          <w:ilvl w:val="0"/>
+          <w:numId w:val="8"/>
+        </w:numPr>
+        <w:tabs>
+          <w:tab w:val="left" w:leader="dot" w:pos="8222"/>
+          <w:tab w:val="right" w:pos="8788"/>
+        </w:tabs>
+        <w:autoSpaceDE w:val="0"/>
+        <w:autoSpaceDN w:val="0"/>
+        <w:adjustRightInd w:val="0"/>
+        <w:spacing w:after="0" w:line="360" w:lineRule="auto"/>
+        <w:ind w:left="851" w:hanging="284"/>
+        <w:jc w:val="both"/>
+        <w:rPr>
+          <w:rFonts w:ascii="Times New Roman" w:hAnsi="Times New Roman"/>
+          <w:color w:val="000000"/>
+          <w:sz w:val="24"/>
+          <w:szCs w:val="24"/>
+          <w:lang w:val="en-US"/>
+        </w:rPr>
+      </w:pPr>
+      <w:proofErr w:type="spellStart"/>
+      <w:r>
+        <w:rPr>
+          <w:rFonts w:ascii="Times New Roman" w:hAnsi="Times New Roman"/>
+          <w:color w:val="000000"/>
+          <w:sz w:val="24"/>
+          <w:szCs w:val="24"/>
+          <w:lang w:val="en-US"/>
+        </w:rPr>
+        <w:t>Sistem</w:t>
+      </w:r>
+      <w:proofErr w:type="spellEnd"/>
+      <w:r>
+        <w:rPr>
+          <w:rFonts w:ascii="Times New Roman" w:hAnsi="Times New Roman"/>
+          <w:color w:val="000000"/>
+          <w:sz w:val="24"/>
+          <w:szCs w:val="24"/>
+          <w:lang w:val="en-US"/>
+        </w:rPr>
+        <w:t xml:space="preserve"> </w:t>
+      </w:r>
+      <w:proofErr w:type="spellStart"/>
+      <w:r>
+        <w:rPr>
+          <w:rFonts w:ascii="Times New Roman" w:hAnsi="Times New Roman"/>
+          <w:color w:val="000000"/>
+          <w:sz w:val="24"/>
+          <w:szCs w:val="24"/>
+          <w:lang w:val="en-US"/>
+        </w:rPr>
+        <w:t>hanya</w:t>
+      </w:r>
+      <w:proofErr w:type="spellEnd"/>
+      <w:r>
+        <w:rPr>
+          <w:rFonts w:ascii="Times New Roman" w:hAnsi="Times New Roman"/>
+          <w:color w:val="000000"/>
+          <w:sz w:val="24"/>
+          <w:szCs w:val="24"/>
+          <w:lang w:val="en-US"/>
+        </w:rPr>
+        <w:t xml:space="preserve"> </w:t>
+      </w:r>
+      <w:proofErr w:type="spellStart"/>
+      <w:r>
+        <w:rPr>
+          <w:rFonts w:ascii="Times New Roman" w:hAnsi="Times New Roman"/>
+          <w:color w:val="000000"/>
+          <w:sz w:val="24"/>
+          <w:szCs w:val="24"/>
+          <w:lang w:val="en-US"/>
+        </w:rPr>
+        <w:t>menggunakan</w:t>
+      </w:r>
+      <w:proofErr w:type="spellEnd"/>
+      <w:r>
+        <w:rPr>
+          <w:rFonts w:ascii="Times New Roman" w:hAnsi="Times New Roman"/>
+          <w:color w:val="000000"/>
+          <w:sz w:val="24"/>
+          <w:szCs w:val="24"/>
+          <w:lang w:val="en-US"/>
+        </w:rPr>
+        <w:t xml:space="preserve"> </w:t>
+      </w:r>
+      <w:proofErr w:type="spellStart"/>
+      <w:r>
+        <w:rPr>
+          <w:rFonts w:ascii="Times New Roman" w:hAnsi="Times New Roman"/>
+          <w:color w:val="000000"/>
+          <w:sz w:val="24"/>
+          <w:szCs w:val="24"/>
+          <w:lang w:val="en-US"/>
+        </w:rPr>
+        <w:t>mikrokontroler</w:t>
+      </w:r>
+      <w:proofErr w:type="spellEnd"/>
+      <w:r>
+        <w:rPr>
+          <w:rFonts w:ascii="Times New Roman" w:hAnsi="Times New Roman"/>
+          <w:color w:val="000000"/>
+          <w:sz w:val="24"/>
+          <w:szCs w:val="24"/>
+          <w:lang w:val="en-US"/>
+        </w:rPr>
+        <w:t xml:space="preserve"> 32bit dan </w:t>
+      </w:r>
+      <w:r>
+        <w:rPr>
+          <w:rFonts w:ascii="Times New Roman" w:hAnsi="Times New Roman"/>
+          <w:i/>
+          <w:iCs/>
+          <w:color w:val="000000"/>
+          <w:sz w:val="24"/>
+          <w:szCs w:val="24"/>
+          <w:lang w:val="en-US"/>
+        </w:rPr>
+        <w:t>gyroscope</w:t>
+      </w:r>
+      <w:r>
+        <w:rPr>
+          <w:rFonts w:ascii="Times New Roman" w:hAnsi="Times New Roman"/>
+          <w:color w:val="000000"/>
+          <w:sz w:val="24"/>
+          <w:szCs w:val="24"/>
+          <w:lang w:val="en-US"/>
+        </w:rPr>
+        <w:t xml:space="preserve"> </w:t>
+      </w:r>
+      <w:proofErr w:type="spellStart"/>
+      <w:r>
+        <w:rPr>
+          <w:rFonts w:ascii="Times New Roman" w:hAnsi="Times New Roman"/>
+          <w:color w:val="000000"/>
+          <w:sz w:val="24"/>
+          <w:szCs w:val="24"/>
+          <w:lang w:val="en-US"/>
+        </w:rPr>
+        <w:t>sebagai</w:t>
+      </w:r>
+      <w:proofErr w:type="spellEnd"/>
+      <w:r>
+        <w:rPr>
+          <w:rFonts w:ascii="Times New Roman" w:hAnsi="Times New Roman"/>
+          <w:color w:val="000000"/>
+          <w:sz w:val="24"/>
+          <w:szCs w:val="24"/>
+          <w:lang w:val="en-US"/>
+        </w:rPr>
+        <w:t xml:space="preserve"> parameter </w:t>
+      </w:r>
+      <w:proofErr w:type="spellStart"/>
+      <w:r>
+        <w:rPr>
+          <w:rFonts w:ascii="Times New Roman" w:hAnsi="Times New Roman"/>
+          <w:color w:val="000000"/>
+          <w:sz w:val="24"/>
+          <w:szCs w:val="24"/>
+          <w:lang w:val="en-US"/>
+        </w:rPr>
+        <w:t>peringatan</w:t>
+      </w:r>
+      <w:proofErr w:type="spellEnd"/>
+      <w:r>
+        <w:rPr>
+          <w:rFonts w:ascii="Times New Roman" w:hAnsi="Times New Roman"/>
+          <w:color w:val="000000"/>
+          <w:sz w:val="24"/>
+          <w:szCs w:val="24"/>
+          <w:lang w:val="en-US"/>
+        </w:rPr>
+        <w:t xml:space="preserve"> </w:t>
+      </w:r>
+      <w:proofErr w:type="spellStart"/>
+      <w:r>
+        <w:rPr>
+          <w:rFonts w:ascii="Times New Roman" w:hAnsi="Times New Roman"/>
+          <w:color w:val="000000"/>
+          <w:sz w:val="24"/>
+          <w:szCs w:val="24"/>
+          <w:lang w:val="en-US"/>
+        </w:rPr>
+        <w:t>dini</w:t>
+      </w:r>
+      <w:proofErr w:type="spellEnd"/>
+      <w:r>
+        <w:rPr>
+          <w:rFonts w:ascii="Times New Roman" w:hAnsi="Times New Roman"/>
+          <w:color w:val="000000"/>
+          <w:sz w:val="24"/>
+          <w:szCs w:val="24"/>
+          <w:lang w:val="en-US"/>
+        </w:rPr>
+        <w:t xml:space="preserve"> </w:t>
+      </w:r>
+      <w:proofErr w:type="spellStart"/>
+      <w:r>
+        <w:rPr>
+          <w:rFonts w:ascii="Times New Roman" w:hAnsi="Times New Roman"/>
+          <w:color w:val="000000"/>
+          <w:sz w:val="24"/>
+          <w:szCs w:val="24"/>
+          <w:lang w:val="en-US"/>
+        </w:rPr>
+        <w:t>kepada</w:t>
+      </w:r>
+      <w:proofErr w:type="spellEnd"/>
+      <w:r>
+        <w:rPr>
+          <w:rFonts w:ascii="Times New Roman" w:hAnsi="Times New Roman"/>
+          <w:color w:val="000000"/>
+          <w:sz w:val="24"/>
+          <w:szCs w:val="24"/>
+          <w:lang w:val="en-US"/>
+        </w:rPr>
+        <w:t xml:space="preserve"> </w:t>
+      </w:r>
+      <w:proofErr w:type="spellStart"/>
+      <w:r>
+        <w:rPr>
+          <w:rFonts w:ascii="Times New Roman" w:hAnsi="Times New Roman"/>
+          <w:color w:val="000000"/>
+          <w:sz w:val="24"/>
+          <w:szCs w:val="24"/>
+          <w:lang w:val="en-US"/>
+        </w:rPr>
+        <w:t>pengguna</w:t>
+      </w:r>
+      <w:proofErr w:type="spellEnd"/>
+      <w:r>
+        <w:rPr>
+          <w:rFonts w:ascii="Times New Roman" w:hAnsi="Times New Roman"/>
+          <w:color w:val="000000"/>
+          <w:sz w:val="24"/>
+          <w:szCs w:val="24"/>
+          <w:lang w:val="en-US"/>
+        </w:rPr>
+        <w:t>.</w:t>
+      </w:r>
+    </w:p>
+    <w:p>
+      <w:pPr>
+        <w:pStyle w:val="ListParagraph"/>
+        <w:widowControl w:val="0"/>
+        <w:numPr>
+          <w:ilvl w:val="0"/>
+          <w:numId w:val="8"/>
+        </w:numPr>
+        <w:tabs>
+          <w:tab w:val="left" w:leader="dot" w:pos="8222"/>
+          <w:tab w:val="right" w:pos="8788"/>
+        </w:tabs>
+        <w:autoSpaceDE w:val="0"/>
+        <w:autoSpaceDN w:val="0"/>
+        <w:adjustRightInd w:val="0"/>
+        <w:spacing w:after="0" w:line="360" w:lineRule="auto"/>
+        <w:ind w:left="851" w:hanging="284"/>
+        <w:jc w:val="both"/>
+        <w:rPr>
+          <w:rFonts w:ascii="Times New Roman" w:hAnsi="Times New Roman"/>
+          <w:color w:val="000000"/>
+          <w:sz w:val="24"/>
+          <w:szCs w:val="24"/>
+          <w:lang w:val="en-US"/>
+        </w:rPr>
+      </w:pPr>
+      <w:proofErr w:type="spellStart"/>
+      <w:r>
+        <w:rPr>
+          <w:rFonts w:ascii="Times New Roman" w:hAnsi="Times New Roman"/>
+          <w:color w:val="000000"/>
+          <w:sz w:val="24"/>
+          <w:szCs w:val="24"/>
+          <w:lang w:val="en-US"/>
+        </w:rPr>
+        <w:t>Koneksi</w:t>
+      </w:r>
+      <w:proofErr w:type="spellEnd"/>
+      <w:r>
+        <w:rPr>
+          <w:rFonts w:ascii="Times New Roman" w:hAnsi="Times New Roman"/>
+          <w:color w:val="000000"/>
+          <w:sz w:val="24"/>
+          <w:szCs w:val="24"/>
+          <w:lang w:val="en-US"/>
+        </w:rPr>
+        <w:t xml:space="preserve"> yang </w:t>
+      </w:r>
+      <w:proofErr w:type="spellStart"/>
+      <w:r>
+        <w:rPr>
+          <w:rFonts w:ascii="Times New Roman" w:hAnsi="Times New Roman"/>
+          <w:color w:val="000000"/>
+          <w:sz w:val="24"/>
+          <w:szCs w:val="24"/>
+          <w:lang w:val="en-US"/>
+        </w:rPr>
+        <w:t>digunakan</w:t>
+      </w:r>
+      <w:proofErr w:type="spellEnd"/>
+      <w:r>
+        <w:rPr>
+          <w:rFonts w:ascii="Times New Roman" w:hAnsi="Times New Roman"/>
+          <w:color w:val="000000"/>
+          <w:sz w:val="24"/>
+          <w:szCs w:val="24"/>
+          <w:lang w:val="en-US"/>
+        </w:rPr>
+        <w:t xml:space="preserve"> </w:t>
+      </w:r>
+      <w:proofErr w:type="spellStart"/>
+      <w:r>
+        <w:rPr>
+          <w:rFonts w:ascii="Times New Roman" w:hAnsi="Times New Roman"/>
+          <w:color w:val="000000"/>
+          <w:sz w:val="24"/>
+          <w:szCs w:val="24"/>
+          <w:lang w:val="en-US"/>
+        </w:rPr>
+        <w:t>adalah</w:t>
+      </w:r>
+      <w:proofErr w:type="spellEnd"/>
+      <w:r>
+        <w:rPr>
+          <w:rFonts w:ascii="Times New Roman" w:hAnsi="Times New Roman"/>
+          <w:color w:val="000000"/>
+          <w:sz w:val="24"/>
+          <w:szCs w:val="24"/>
+          <w:lang w:val="en-US"/>
+        </w:rPr>
+        <w:t xml:space="preserve"> </w:t>
+      </w:r>
+      <w:proofErr w:type="spellStart"/>
+      <w:r>
+        <w:rPr>
+          <w:rFonts w:ascii="Times New Roman" w:hAnsi="Times New Roman"/>
+          <w:color w:val="000000"/>
+          <w:sz w:val="24"/>
+          <w:szCs w:val="24"/>
+          <w:lang w:val="en-US"/>
+        </w:rPr>
+        <w:t>koneksi</w:t>
+      </w:r>
+      <w:proofErr w:type="spellEnd"/>
+      <w:r>
+        <w:rPr>
+          <w:rFonts w:ascii="Times New Roman" w:hAnsi="Times New Roman"/>
+          <w:color w:val="000000"/>
+          <w:sz w:val="24"/>
+          <w:szCs w:val="24"/>
+          <w:lang w:val="en-US"/>
+        </w:rPr>
+        <w:t xml:space="preserve"> </w:t>
+      </w:r>
+      <w:proofErr w:type="spellStart"/>
+      <w:r>
+        <w:rPr>
+          <w:rFonts w:ascii="Times New Roman" w:hAnsi="Times New Roman"/>
+          <w:color w:val="000000"/>
+          <w:sz w:val="24"/>
+          <w:szCs w:val="24"/>
+          <w:lang w:val="en-US"/>
+        </w:rPr>
+        <w:t>gprs</w:t>
+      </w:r>
+      <w:proofErr w:type="spellEnd"/>
+      <w:r>
+        <w:rPr>
+          <w:rFonts w:ascii="Times New Roman" w:hAnsi="Times New Roman"/>
+          <w:color w:val="000000"/>
+          <w:sz w:val="24"/>
+          <w:szCs w:val="24"/>
+          <w:lang w:val="en-US"/>
+        </w:rPr>
+        <w:t>/internet</w:t>
+      </w:r>
+    </w:p>
+    <w:p>
+      <w:pPr>
+        <w:pStyle w:val="ListParagraph"/>
+        <w:widowControl w:val="0"/>
+        <w:numPr>
+          <w:ilvl w:val="0"/>
+          <w:numId w:val="8"/>
+        </w:numPr>
+        <w:tabs>
+          <w:tab w:val="left" w:leader="dot" w:pos="8222"/>
+          <w:tab w:val="right" w:pos="8788"/>
+        </w:tabs>
+        <w:autoSpaceDE w:val="0"/>
+        <w:autoSpaceDN w:val="0"/>
+        <w:adjustRightInd w:val="0"/>
+        <w:spacing w:after="0" w:line="360" w:lineRule="auto"/>
+        <w:ind w:left="851" w:hanging="284"/>
+        <w:jc w:val="both"/>
+        <w:rPr>
+          <w:rFonts w:ascii="Times New Roman" w:hAnsi="Times New Roman"/>
+          <w:color w:val="000000"/>
+          <w:sz w:val="24"/>
+          <w:szCs w:val="24"/>
+          <w:lang w:val="en-US"/>
+        </w:rPr>
+      </w:pPr>
+      <w:proofErr w:type="spellStart"/>
+      <w:r>
+        <w:rPr>
+          <w:rFonts w:ascii="Times New Roman" w:hAnsi="Times New Roman"/>
+          <w:color w:val="000000"/>
+          <w:sz w:val="24"/>
+          <w:szCs w:val="24"/>
+          <w:lang w:val="en-US"/>
+        </w:rPr>
+        <w:t>Aplikasi</w:t>
+      </w:r>
+      <w:proofErr w:type="spellEnd"/>
+      <w:r>
+        <w:rPr>
+          <w:rFonts w:ascii="Times New Roman" w:hAnsi="Times New Roman"/>
+          <w:color w:val="000000"/>
+          <w:sz w:val="24"/>
+          <w:szCs w:val="24"/>
+          <w:lang w:val="en-US"/>
+        </w:rPr>
+        <w:t xml:space="preserve"> android </w:t>
+      </w:r>
+      <w:proofErr w:type="spellStart"/>
+      <w:r>
+        <w:rPr>
+          <w:rFonts w:ascii="Times New Roman" w:hAnsi="Times New Roman"/>
+          <w:color w:val="000000"/>
+          <w:sz w:val="24"/>
+          <w:szCs w:val="24"/>
+          <w:lang w:val="en-US"/>
+        </w:rPr>
+        <w:t>dibuat</w:t>
+      </w:r>
+      <w:proofErr w:type="spellEnd"/>
+      <w:r>
+        <w:rPr>
+          <w:rFonts w:ascii="Times New Roman" w:hAnsi="Times New Roman"/>
+          <w:color w:val="000000"/>
+          <w:sz w:val="24"/>
+          <w:szCs w:val="24"/>
+          <w:lang w:val="en-US"/>
+        </w:rPr>
+        <w:t xml:space="preserve"> </w:t>
+      </w:r>
+      <w:proofErr w:type="spellStart"/>
+      <w:r>
+        <w:rPr>
+          <w:rFonts w:ascii="Times New Roman" w:hAnsi="Times New Roman"/>
+          <w:color w:val="000000"/>
+          <w:sz w:val="24"/>
+          <w:szCs w:val="24"/>
+          <w:lang w:val="en-US"/>
+        </w:rPr>
+        <w:t>mengunakan</w:t>
+      </w:r>
+      <w:proofErr w:type="spellEnd"/>
+      <w:r>
+        <w:rPr>
+          <w:rFonts w:ascii="Times New Roman" w:hAnsi="Times New Roman"/>
+          <w:color w:val="000000"/>
+          <w:sz w:val="24"/>
+          <w:szCs w:val="24"/>
+          <w:lang w:val="en-US"/>
+        </w:rPr>
+        <w:t xml:space="preserve"> android studio </w:t>
+      </w:r>
+      <w:proofErr w:type="spellStart"/>
+      <w:r>
+        <w:rPr>
+          <w:rFonts w:ascii="Times New Roman" w:hAnsi="Times New Roman"/>
+          <w:color w:val="000000"/>
+          <w:sz w:val="24"/>
+          <w:szCs w:val="24"/>
+          <w:lang w:val="en-US"/>
+        </w:rPr>
+        <w:t>dengan</w:t>
+      </w:r>
+      <w:proofErr w:type="spellEnd"/>
+      <w:r>
+        <w:rPr>
+          <w:rFonts w:ascii="Times New Roman" w:hAnsi="Times New Roman"/>
+          <w:color w:val="000000"/>
+          <w:sz w:val="24"/>
+          <w:szCs w:val="24"/>
+          <w:lang w:val="en-US"/>
+        </w:rPr>
+        <w:t xml:space="preserve"> </w:t>
+      </w:r>
+      <w:r>
+        <w:rPr>
+          <w:rFonts w:ascii="Times New Roman" w:hAnsi="Times New Roman"/>
+          <w:i/>
+          <w:iCs/>
+          <w:color w:val="000000"/>
+          <w:sz w:val="24"/>
+          <w:szCs w:val="24"/>
+          <w:lang w:val="en-US"/>
+        </w:rPr>
+        <w:t>Java</w:t>
+      </w:r>
+      <w:r>
+        <w:rPr>
+          <w:rFonts w:ascii="Times New Roman" w:hAnsi="Times New Roman"/>
+          <w:color w:val="000000"/>
+          <w:sz w:val="24"/>
+          <w:szCs w:val="24"/>
+          <w:lang w:val="en-US"/>
+        </w:rPr>
+        <w:t xml:space="preserve"> </w:t>
+      </w:r>
+      <w:r>
+        <w:rPr>
+          <w:rFonts w:ascii="Times New Roman" w:hAnsi="Times New Roman"/>
+          <w:i/>
+          <w:iCs/>
+          <w:color w:val="000000"/>
+          <w:sz w:val="24"/>
+          <w:szCs w:val="24"/>
+          <w:lang w:val="en-US"/>
+        </w:rPr>
+        <w:t>Language</w:t>
+      </w:r>
+    </w:p>
+    <w:p>
+      <w:pPr>
+        <w:pStyle w:val="ListParagraph"/>
+        <w:widowControl w:val="0"/>
+        <w:numPr>
+          <w:ilvl w:val="0"/>
+          <w:numId w:val="8"/>
+        </w:numPr>
+        <w:tabs>
+          <w:tab w:val="left" w:leader="dot" w:pos="8222"/>
+          <w:tab w:val="right" w:pos="8788"/>
+        </w:tabs>
+        <w:autoSpaceDE w:val="0"/>
+        <w:autoSpaceDN w:val="0"/>
+        <w:adjustRightInd w:val="0"/>
+        <w:spacing w:after="240" w:line="360" w:lineRule="auto"/>
+        <w:ind w:left="851" w:hanging="284"/>
+        <w:contextualSpacing w:val="0"/>
+        <w:jc w:val="both"/>
+        <w:rPr>
+          <w:rFonts w:ascii="Times New Roman" w:hAnsi="Times New Roman"/>
+          <w:color w:val="000000"/>
+          <w:sz w:val="24"/>
+          <w:szCs w:val="24"/>
+          <w:lang w:val="en-US"/>
+        </w:rPr>
+      </w:pPr>
+      <w:proofErr w:type="spellStart"/>
+      <w:r>
+        <w:rPr>
+          <w:rFonts w:ascii="Times New Roman" w:hAnsi="Times New Roman"/>
+          <w:color w:val="000000"/>
+          <w:sz w:val="24"/>
+          <w:szCs w:val="24"/>
+          <w:lang w:val="en-US"/>
+        </w:rPr>
+        <w:t>Sistem</w:t>
+      </w:r>
+      <w:proofErr w:type="spellEnd"/>
+      <w:r>
+        <w:rPr>
+          <w:rFonts w:ascii="Times New Roman" w:hAnsi="Times New Roman"/>
+          <w:color w:val="000000"/>
+          <w:sz w:val="24"/>
+          <w:szCs w:val="24"/>
+          <w:lang w:val="en-US"/>
+        </w:rPr>
+        <w:t xml:space="preserve"> </w:t>
+      </w:r>
+      <w:proofErr w:type="spellStart"/>
+      <w:r>
+        <w:rPr>
+          <w:rFonts w:ascii="Times New Roman" w:hAnsi="Times New Roman"/>
+          <w:color w:val="000000"/>
+          <w:sz w:val="24"/>
+          <w:szCs w:val="24"/>
+          <w:lang w:val="en-US"/>
+        </w:rPr>
+        <w:t>memberikan</w:t>
+      </w:r>
+      <w:proofErr w:type="spellEnd"/>
+      <w:r>
+        <w:rPr>
+          <w:rFonts w:ascii="Times New Roman" w:hAnsi="Times New Roman"/>
+          <w:color w:val="000000"/>
+          <w:sz w:val="24"/>
+          <w:szCs w:val="24"/>
+          <w:lang w:val="en-US"/>
+        </w:rPr>
+        <w:t xml:space="preserve"> </w:t>
+      </w:r>
+      <w:proofErr w:type="spellStart"/>
+      <w:r>
+        <w:rPr>
+          <w:rFonts w:ascii="Times New Roman" w:hAnsi="Times New Roman"/>
+          <w:color w:val="000000"/>
+          <w:sz w:val="24"/>
+          <w:szCs w:val="24"/>
+          <w:lang w:val="en-US"/>
+        </w:rPr>
+        <w:t>informasi</w:t>
+      </w:r>
+      <w:proofErr w:type="spellEnd"/>
+      <w:r>
+        <w:rPr>
+          <w:rFonts w:ascii="Times New Roman" w:hAnsi="Times New Roman"/>
+          <w:color w:val="000000"/>
+          <w:sz w:val="24"/>
+          <w:szCs w:val="24"/>
+          <w:lang w:val="en-US"/>
+        </w:rPr>
+        <w:t xml:space="preserve"> </w:t>
+      </w:r>
+      <w:proofErr w:type="spellStart"/>
+      <w:r>
+        <w:rPr>
+          <w:rFonts w:ascii="Times New Roman" w:hAnsi="Times New Roman"/>
+          <w:color w:val="000000"/>
+          <w:sz w:val="24"/>
+          <w:szCs w:val="24"/>
+          <w:lang w:val="en-US"/>
+        </w:rPr>
+        <w:t>melalui</w:t>
+      </w:r>
+      <w:proofErr w:type="spellEnd"/>
+      <w:r>
+        <w:rPr>
+          <w:rFonts w:ascii="Times New Roman" w:hAnsi="Times New Roman"/>
+          <w:color w:val="000000"/>
+          <w:sz w:val="24"/>
+          <w:szCs w:val="24"/>
+          <w:lang w:val="en-US"/>
+        </w:rPr>
+        <w:t xml:space="preserve"> </w:t>
+      </w:r>
+      <w:proofErr w:type="spellStart"/>
+      <w:r>
+        <w:rPr>
+          <w:rFonts w:ascii="Times New Roman" w:hAnsi="Times New Roman"/>
+          <w:color w:val="000000"/>
+          <w:sz w:val="24"/>
+          <w:szCs w:val="24"/>
+          <w:lang w:val="en-US"/>
+        </w:rPr>
+        <w:t>aplikasi</w:t>
+      </w:r>
+      <w:proofErr w:type="spellEnd"/>
+      <w:r>
+        <w:rPr>
+          <w:rFonts w:ascii="Times New Roman" w:hAnsi="Times New Roman"/>
+          <w:color w:val="000000"/>
+          <w:sz w:val="24"/>
+          <w:szCs w:val="24"/>
+          <w:lang w:val="en-US"/>
+        </w:rPr>
+        <w:t xml:space="preserve"> android dan website.</w:t>
+      </w:r>
+    </w:p>
+    <w:p>
+      <w:pPr>
+        <w:pStyle w:val="ListParagraph"/>
+        <w:widowControl w:val="0"/>
+        <w:numPr>
+          <w:ilvl w:val="1"/>
+          <w:numId w:val="5"/>
+        </w:numPr>
+        <w:tabs>
+          <w:tab w:val="left" w:leader="dot" w:pos="8222"/>
+          <w:tab w:val="right" w:pos="8788"/>
+        </w:tabs>
+        <w:autoSpaceDE w:val="0"/>
+        <w:autoSpaceDN w:val="0"/>
+        <w:adjustRightInd w:val="0"/>
+        <w:spacing w:after="0" w:line="360" w:lineRule="auto"/>
+        <w:ind w:left="567" w:hanging="567"/>
+        <w:jc w:val="both"/>
+        <w:rPr>
+          <w:rFonts w:ascii="Times New Roman" w:hAnsi="Times New Roman"/>
+          <w:b/>
+          <w:bCs/>
+          <w:color w:val="000000"/>
+          <w:sz w:val="24"/>
+          <w:szCs w:val="24"/>
+          <w:lang w:val="en-US"/>
+        </w:rPr>
+      </w:pPr>
+      <w:proofErr w:type="spellStart"/>
+      <w:r>
+        <w:rPr>
+          <w:rFonts w:ascii="Times New Roman" w:hAnsi="Times New Roman"/>
+          <w:b/>
+          <w:bCs/>
+          <w:color w:val="000000"/>
+          <w:sz w:val="24"/>
+          <w:szCs w:val="24"/>
+          <w:lang w:val="en-US"/>
+        </w:rPr>
         <w:t>Manfaat</w:t>
       </w:r>
       <w:proofErr w:type="spellEnd"/>
@@ -22700,8 +24998,707 @@
         <w:t>Penelitian</w:t>
       </w:r>
       <w:proofErr w:type="spellEnd"/>
+    </w:p>
+    <w:p>
+      <w:pPr>
+        <w:pStyle w:val="ListParagraph"/>
+        <w:widowControl w:val="0"/>
+        <w:tabs>
+          <w:tab w:val="left" w:leader="dot" w:pos="8222"/>
+          <w:tab w:val="right" w:pos="8788"/>
+        </w:tabs>
+        <w:autoSpaceDE w:val="0"/>
+        <w:autoSpaceDN w:val="0"/>
+        <w:adjustRightInd w:val="0"/>
+        <w:spacing w:after="0" w:line="360" w:lineRule="auto"/>
+        <w:ind w:left="567"/>
+        <w:jc w:val="both"/>
+        <w:rPr>
+          <w:rFonts w:ascii="Times New Roman" w:hAnsi="Times New Roman"/>
+          <w:color w:val="000000"/>
+          <w:sz w:val="24"/>
+          <w:szCs w:val="24"/>
+          <w:lang w:val="en-US"/>
+        </w:rPr>
+      </w:pPr>
+      <w:proofErr w:type="spellStart"/>
+      <w:r>
+        <w:rPr>
+          <w:rFonts w:ascii="Times New Roman" w:hAnsi="Times New Roman"/>
+          <w:color w:val="000000"/>
+          <w:sz w:val="24"/>
+          <w:szCs w:val="24"/>
+          <w:lang w:val="en-US"/>
+        </w:rPr>
+        <w:t>Diharapkan</w:t>
+      </w:r>
+      <w:proofErr w:type="spellEnd"/>
+      <w:r>
+        <w:rPr>
+          <w:rFonts w:ascii="Times New Roman" w:hAnsi="Times New Roman"/>
+          <w:color w:val="000000"/>
+          <w:sz w:val="24"/>
+          <w:szCs w:val="24"/>
+          <w:lang w:val="en-US"/>
+        </w:rPr>
+        <w:t xml:space="preserve"> </w:t>
+      </w:r>
+      <w:proofErr w:type="spellStart"/>
+      <w:r>
+        <w:rPr>
+          <w:rFonts w:ascii="Times New Roman" w:hAnsi="Times New Roman"/>
+          <w:color w:val="000000"/>
+          <w:sz w:val="24"/>
+          <w:szCs w:val="24"/>
+          <w:lang w:val="en-US"/>
+        </w:rPr>
+        <w:t>penelitian</w:t>
+      </w:r>
+      <w:proofErr w:type="spellEnd"/>
+      <w:r>
+        <w:rPr>
+          <w:rFonts w:ascii="Times New Roman" w:hAnsi="Times New Roman"/>
+          <w:color w:val="000000"/>
+          <w:sz w:val="24"/>
+          <w:szCs w:val="24"/>
+          <w:lang w:val="en-US"/>
+        </w:rPr>
+        <w:t xml:space="preserve"> </w:t>
+      </w:r>
+      <w:proofErr w:type="spellStart"/>
+      <w:r>
+        <w:rPr>
+          <w:rFonts w:ascii="Times New Roman" w:hAnsi="Times New Roman"/>
+          <w:color w:val="000000"/>
+          <w:sz w:val="24"/>
+          <w:szCs w:val="24"/>
+          <w:lang w:val="en-US"/>
+        </w:rPr>
+        <w:t>ini</w:t>
+      </w:r>
+      <w:proofErr w:type="spellEnd"/>
+      <w:r>
+        <w:rPr>
+          <w:rFonts w:ascii="Times New Roman" w:hAnsi="Times New Roman"/>
+          <w:color w:val="000000"/>
+          <w:sz w:val="24"/>
+          <w:szCs w:val="24"/>
+          <w:lang w:val="en-US"/>
+        </w:rPr>
+        <w:t xml:space="preserve"> </w:t>
+      </w:r>
+      <w:proofErr w:type="spellStart"/>
+      <w:r>
+        <w:rPr>
+          <w:rFonts w:ascii="Times New Roman" w:hAnsi="Times New Roman"/>
+          <w:color w:val="000000"/>
+          <w:sz w:val="24"/>
+          <w:szCs w:val="24"/>
+          <w:lang w:val="en-US"/>
+        </w:rPr>
+        <w:t>dapat</w:t>
+      </w:r>
+      <w:proofErr w:type="spellEnd"/>
+      <w:r>
+        <w:rPr>
+          <w:rFonts w:ascii="Times New Roman" w:hAnsi="Times New Roman"/>
+          <w:color w:val="000000"/>
+          <w:sz w:val="24"/>
+          <w:szCs w:val="24"/>
+          <w:lang w:val="en-US"/>
+        </w:rPr>
+        <w:t xml:space="preserve"> </w:t>
+      </w:r>
+      <w:proofErr w:type="spellStart"/>
+      <w:r>
+        <w:rPr>
+          <w:rFonts w:ascii="Times New Roman" w:hAnsi="Times New Roman"/>
+          <w:color w:val="000000"/>
+          <w:sz w:val="24"/>
+          <w:szCs w:val="24"/>
+          <w:lang w:val="en-US"/>
+        </w:rPr>
+        <w:t>memerikan</w:t>
+      </w:r>
+      <w:proofErr w:type="spellEnd"/>
+      <w:r>
+        <w:rPr>
+          <w:rFonts w:ascii="Times New Roman" w:hAnsi="Times New Roman"/>
+          <w:color w:val="000000"/>
+          <w:sz w:val="24"/>
+          <w:szCs w:val="24"/>
+          <w:lang w:val="en-US"/>
+        </w:rPr>
+        <w:t xml:space="preserve"> </w:t>
+      </w:r>
+      <w:proofErr w:type="spellStart"/>
+      <w:r>
+        <w:rPr>
+          <w:rFonts w:ascii="Times New Roman" w:hAnsi="Times New Roman"/>
+          <w:color w:val="000000"/>
+          <w:sz w:val="24"/>
+          <w:szCs w:val="24"/>
+          <w:lang w:val="en-US"/>
+        </w:rPr>
+        <w:t>manfaat</w:t>
+      </w:r>
+      <w:proofErr w:type="spellEnd"/>
+      <w:r>
+        <w:rPr>
+          <w:rFonts w:ascii="Times New Roman" w:hAnsi="Times New Roman"/>
+          <w:color w:val="000000"/>
+          <w:sz w:val="24"/>
+          <w:szCs w:val="24"/>
+          <w:lang w:val="en-US"/>
+        </w:rPr>
+        <w:t xml:space="preserve"> </w:t>
+      </w:r>
+      <w:proofErr w:type="spellStart"/>
+      <w:r>
+        <w:rPr>
+          <w:rFonts w:ascii="Times New Roman" w:hAnsi="Times New Roman"/>
+          <w:color w:val="000000"/>
+          <w:sz w:val="24"/>
+          <w:szCs w:val="24"/>
+          <w:lang w:val="en-US"/>
+        </w:rPr>
+        <w:t>sebagai</w:t>
+      </w:r>
+      <w:proofErr w:type="spellEnd"/>
+      <w:r>
+        <w:rPr>
+          <w:rFonts w:ascii="Times New Roman" w:hAnsi="Times New Roman"/>
+          <w:color w:val="000000"/>
+          <w:sz w:val="24"/>
+          <w:szCs w:val="24"/>
+          <w:lang w:val="en-US"/>
+        </w:rPr>
+        <w:t xml:space="preserve"> </w:t>
+      </w:r>
+      <w:proofErr w:type="spellStart"/>
+      <w:r>
+        <w:rPr>
+          <w:rFonts w:ascii="Times New Roman" w:hAnsi="Times New Roman"/>
+          <w:color w:val="000000"/>
+          <w:sz w:val="24"/>
+          <w:szCs w:val="24"/>
+          <w:lang w:val="en-US"/>
+        </w:rPr>
+        <w:t>berikut</w:t>
+      </w:r>
+      <w:proofErr w:type="spellEnd"/>
+      <w:r>
+        <w:rPr>
+          <w:rFonts w:ascii="Times New Roman" w:hAnsi="Times New Roman"/>
+          <w:color w:val="000000"/>
+          <w:sz w:val="24"/>
+          <w:szCs w:val="24"/>
+          <w:lang w:val="en-US"/>
+        </w:rPr>
+        <w:t>:</w:t>
+      </w:r>
+    </w:p>
+    <w:p>
+      <w:pPr>
+        <w:pStyle w:val="ListParagraph"/>
+        <w:widowControl w:val="0"/>
+        <w:numPr>
+          <w:ilvl w:val="0"/>
+          <w:numId w:val="9"/>
+        </w:numPr>
+        <w:tabs>
+          <w:tab w:val="left" w:leader="dot" w:pos="8222"/>
+          <w:tab w:val="right" w:pos="8788"/>
+        </w:tabs>
+        <w:autoSpaceDE w:val="0"/>
+        <w:autoSpaceDN w:val="0"/>
+        <w:adjustRightInd w:val="0"/>
+        <w:spacing w:after="0" w:line="360" w:lineRule="auto"/>
+        <w:ind w:left="851" w:hanging="284"/>
+        <w:jc w:val="both"/>
+        <w:rPr>
+          <w:rFonts w:ascii="Times New Roman" w:hAnsi="Times New Roman"/>
+          <w:color w:val="000000"/>
+          <w:sz w:val="24"/>
+          <w:szCs w:val="24"/>
+          <w:lang w:val="en-US"/>
+        </w:rPr>
+      </w:pPr>
+      <w:proofErr w:type="spellStart"/>
+      <w:r>
+        <w:rPr>
+          <w:rFonts w:ascii="Times New Roman" w:hAnsi="Times New Roman"/>
+          <w:color w:val="000000"/>
+          <w:sz w:val="24"/>
+          <w:szCs w:val="24"/>
+          <w:lang w:val="en-US"/>
+        </w:rPr>
+        <w:t>Meningkatkan</w:t>
+      </w:r>
+      <w:proofErr w:type="spellEnd"/>
+      <w:r>
+        <w:rPr>
+          <w:rFonts w:ascii="Times New Roman" w:hAnsi="Times New Roman"/>
+          <w:color w:val="000000"/>
+          <w:sz w:val="24"/>
+          <w:szCs w:val="24"/>
+          <w:lang w:val="en-US"/>
+        </w:rPr>
+        <w:t xml:space="preserve"> </w:t>
+      </w:r>
+      <w:proofErr w:type="spellStart"/>
+      <w:r>
+        <w:rPr>
+          <w:rFonts w:ascii="Times New Roman" w:hAnsi="Times New Roman"/>
+          <w:color w:val="000000"/>
+          <w:sz w:val="24"/>
+          <w:szCs w:val="24"/>
+          <w:lang w:val="en-US"/>
+        </w:rPr>
+        <w:t>keamanan</w:t>
+      </w:r>
+      <w:proofErr w:type="spellEnd"/>
+      <w:r>
+        <w:rPr>
+          <w:rFonts w:ascii="Times New Roman" w:hAnsi="Times New Roman"/>
+          <w:color w:val="000000"/>
+          <w:sz w:val="24"/>
+          <w:szCs w:val="24"/>
+          <w:lang w:val="en-US"/>
+        </w:rPr>
+        <w:t xml:space="preserve"> </w:t>
+      </w:r>
+      <w:proofErr w:type="spellStart"/>
+      <w:r>
+        <w:rPr>
+          <w:rFonts w:ascii="Times New Roman" w:hAnsi="Times New Roman"/>
+          <w:color w:val="000000"/>
+          <w:sz w:val="24"/>
+          <w:szCs w:val="24"/>
+          <w:lang w:val="en-US"/>
+        </w:rPr>
+        <w:t>sekaligus</w:t>
+      </w:r>
+      <w:proofErr w:type="spellEnd"/>
+      <w:r>
+        <w:rPr>
+          <w:rFonts w:ascii="Times New Roman" w:hAnsi="Times New Roman"/>
+          <w:color w:val="000000"/>
+          <w:sz w:val="24"/>
+          <w:szCs w:val="24"/>
+          <w:lang w:val="en-US"/>
+        </w:rPr>
+        <w:t xml:space="preserve"> </w:t>
+      </w:r>
+      <w:proofErr w:type="spellStart"/>
+      <w:r>
+        <w:rPr>
+          <w:rFonts w:ascii="Times New Roman" w:hAnsi="Times New Roman"/>
+          <w:color w:val="000000"/>
+          <w:sz w:val="24"/>
+          <w:szCs w:val="24"/>
+          <w:lang w:val="en-US"/>
+        </w:rPr>
+        <w:t>dapa</w:t>
+      </w:r>
+      <w:r>
+        <w:rPr>
+          <w:rFonts w:ascii="Times New Roman" w:hAnsi="Times New Roman"/>
+          <w:color w:val="000000"/>
+          <w:sz w:val="24"/>
+          <w:szCs w:val="24"/>
+          <w:lang w:val="en-US"/>
+        </w:rPr>
+        <w:t>t</w:t>
+      </w:r>
+      <w:proofErr w:type="spellEnd"/>
+      <w:r>
+        <w:rPr>
+          <w:rFonts w:ascii="Times New Roman" w:hAnsi="Times New Roman"/>
+          <w:color w:val="000000"/>
+          <w:sz w:val="24"/>
+          <w:szCs w:val="24"/>
+          <w:lang w:val="en-US"/>
+        </w:rPr>
+        <w:t xml:space="preserve"> </w:t>
+      </w:r>
+      <w:proofErr w:type="spellStart"/>
+      <w:r>
+        <w:rPr>
+          <w:rFonts w:ascii="Times New Roman" w:hAnsi="Times New Roman"/>
+          <w:color w:val="000000"/>
+          <w:sz w:val="24"/>
+          <w:szCs w:val="24"/>
+          <w:lang w:val="en-US"/>
+        </w:rPr>
+        <w:t>mencegah</w:t>
+      </w:r>
+      <w:proofErr w:type="spellEnd"/>
+      <w:r>
+        <w:rPr>
+          <w:rFonts w:ascii="Times New Roman" w:hAnsi="Times New Roman"/>
+          <w:color w:val="000000"/>
+          <w:sz w:val="24"/>
+          <w:szCs w:val="24"/>
+          <w:lang w:val="en-US"/>
+        </w:rPr>
+        <w:t xml:space="preserve"> </w:t>
+      </w:r>
+      <w:proofErr w:type="spellStart"/>
+      <w:r>
+        <w:rPr>
+          <w:rFonts w:ascii="Times New Roman" w:hAnsi="Times New Roman"/>
+          <w:color w:val="000000"/>
+          <w:sz w:val="24"/>
+          <w:szCs w:val="24"/>
+          <w:lang w:val="en-US"/>
+        </w:rPr>
+        <w:t>tindakan</w:t>
+      </w:r>
+      <w:proofErr w:type="spellEnd"/>
+      <w:r>
+        <w:rPr>
+          <w:rFonts w:ascii="Times New Roman" w:hAnsi="Times New Roman"/>
+          <w:color w:val="000000"/>
+          <w:sz w:val="24"/>
+          <w:szCs w:val="24"/>
+          <w:lang w:val="en-US"/>
+        </w:rPr>
+        <w:t xml:space="preserve"> </w:t>
+      </w:r>
+      <w:proofErr w:type="spellStart"/>
+      <w:r>
+        <w:rPr>
+          <w:rFonts w:ascii="Times New Roman" w:hAnsi="Times New Roman"/>
+          <w:color w:val="000000"/>
+          <w:sz w:val="24"/>
+          <w:szCs w:val="24"/>
+          <w:lang w:val="en-US"/>
+        </w:rPr>
+        <w:t>pencurian</w:t>
+      </w:r>
+      <w:proofErr w:type="spellEnd"/>
+      <w:r>
+        <w:rPr>
+          <w:rFonts w:ascii="Times New Roman" w:hAnsi="Times New Roman"/>
+          <w:color w:val="000000"/>
+          <w:sz w:val="24"/>
+          <w:szCs w:val="24"/>
+          <w:lang w:val="en-US"/>
+        </w:rPr>
+        <w:t xml:space="preserve"> </w:t>
+      </w:r>
+      <w:proofErr w:type="spellStart"/>
+      <w:r>
+        <w:rPr>
+          <w:rFonts w:ascii="Times New Roman" w:hAnsi="Times New Roman"/>
+          <w:color w:val="000000"/>
+          <w:sz w:val="24"/>
+          <w:szCs w:val="24"/>
+          <w:lang w:val="en-US"/>
+        </w:rPr>
+        <w:t>sepeda</w:t>
+      </w:r>
+      <w:proofErr w:type="spellEnd"/>
+      <w:r>
+        <w:rPr>
+          <w:rFonts w:ascii="Times New Roman" w:hAnsi="Times New Roman"/>
+          <w:color w:val="000000"/>
+          <w:sz w:val="24"/>
+          <w:szCs w:val="24"/>
+          <w:lang w:val="en-US"/>
+        </w:rPr>
+        <w:t xml:space="preserve"> motor</w:t>
+      </w:r>
+    </w:p>
+    <w:p>
+      <w:pPr>
+        <w:pStyle w:val="ListParagraph"/>
+        <w:widowControl w:val="0"/>
+        <w:numPr>
+          <w:ilvl w:val="0"/>
+          <w:numId w:val="9"/>
+        </w:numPr>
+        <w:tabs>
+          <w:tab w:val="left" w:leader="dot" w:pos="8222"/>
+          <w:tab w:val="right" w:pos="8788"/>
+        </w:tabs>
+        <w:autoSpaceDE w:val="0"/>
+        <w:autoSpaceDN w:val="0"/>
+        <w:adjustRightInd w:val="0"/>
+        <w:spacing w:after="0" w:line="360" w:lineRule="auto"/>
+        <w:ind w:left="851" w:hanging="284"/>
+        <w:jc w:val="both"/>
+        <w:rPr>
+          <w:rFonts w:ascii="Times New Roman" w:hAnsi="Times New Roman"/>
+          <w:color w:val="000000"/>
+          <w:sz w:val="24"/>
+          <w:szCs w:val="24"/>
+          <w:lang w:val="en-US"/>
+        </w:rPr>
+      </w:pPr>
+      <w:proofErr w:type="spellStart"/>
+      <w:r>
+        <w:rPr>
+          <w:rFonts w:ascii="Times New Roman" w:hAnsi="Times New Roman"/>
+          <w:color w:val="000000"/>
+          <w:sz w:val="24"/>
+          <w:szCs w:val="24"/>
+          <w:lang w:val="en-US"/>
+        </w:rPr>
+        <w:t>Menurunkan</w:t>
+      </w:r>
+      <w:proofErr w:type="spellEnd"/>
+      <w:r>
+        <w:rPr>
+          <w:rFonts w:ascii="Times New Roman" w:hAnsi="Times New Roman"/>
+          <w:color w:val="000000"/>
+          <w:sz w:val="24"/>
+          <w:szCs w:val="24"/>
+          <w:lang w:val="en-US"/>
+        </w:rPr>
+        <w:t xml:space="preserve"> </w:t>
+      </w:r>
+      <w:proofErr w:type="spellStart"/>
+      <w:r>
+        <w:rPr>
+          <w:rFonts w:ascii="Times New Roman" w:hAnsi="Times New Roman"/>
+          <w:color w:val="000000"/>
+          <w:sz w:val="24"/>
+          <w:szCs w:val="24"/>
+          <w:lang w:val="en-US"/>
+        </w:rPr>
+        <w:t>kasus</w:t>
+      </w:r>
+      <w:proofErr w:type="spellEnd"/>
+      <w:r>
+        <w:rPr>
+          <w:rFonts w:ascii="Times New Roman" w:hAnsi="Times New Roman"/>
+          <w:color w:val="000000"/>
+          <w:sz w:val="24"/>
+          <w:szCs w:val="24"/>
+          <w:lang w:val="en-US"/>
+        </w:rPr>
+        <w:t xml:space="preserve"> </w:t>
+      </w:r>
+      <w:proofErr w:type="spellStart"/>
+      <w:r>
+        <w:rPr>
+          <w:rFonts w:ascii="Times New Roman" w:hAnsi="Times New Roman"/>
+          <w:color w:val="000000"/>
+          <w:sz w:val="24"/>
+          <w:szCs w:val="24"/>
+          <w:lang w:val="en-US"/>
+        </w:rPr>
+        <w:t>kehilangan</w:t>
+      </w:r>
+      <w:proofErr w:type="spellEnd"/>
+      <w:r>
+        <w:rPr>
+          <w:rFonts w:ascii="Times New Roman" w:hAnsi="Times New Roman"/>
+          <w:color w:val="000000"/>
+          <w:sz w:val="24"/>
+          <w:szCs w:val="24"/>
+          <w:lang w:val="en-US"/>
+        </w:rPr>
+        <w:t xml:space="preserve"> </w:t>
+      </w:r>
+      <w:proofErr w:type="spellStart"/>
+      <w:r>
+        <w:rPr>
+          <w:rFonts w:ascii="Times New Roman" w:hAnsi="Times New Roman"/>
+          <w:color w:val="000000"/>
+          <w:sz w:val="24"/>
+          <w:szCs w:val="24"/>
+          <w:lang w:val="en-US"/>
+        </w:rPr>
+        <w:t>sepeda</w:t>
+      </w:r>
+      <w:proofErr w:type="spellEnd"/>
+      <w:r>
+        <w:rPr>
+          <w:rFonts w:ascii="Times New Roman" w:hAnsi="Times New Roman"/>
+          <w:color w:val="000000"/>
+          <w:sz w:val="24"/>
+          <w:szCs w:val="24"/>
+          <w:lang w:val="en-US"/>
+        </w:rPr>
+        <w:t xml:space="preserve"> motor yang </w:t>
+      </w:r>
+      <w:proofErr w:type="spellStart"/>
+      <w:r>
+        <w:rPr>
+          <w:rFonts w:ascii="Times New Roman" w:hAnsi="Times New Roman"/>
+          <w:color w:val="000000"/>
+          <w:sz w:val="24"/>
+          <w:szCs w:val="24"/>
+          <w:lang w:val="en-US"/>
+        </w:rPr>
+        <w:t>disebabkan</w:t>
+      </w:r>
+      <w:proofErr w:type="spellEnd"/>
+      <w:r>
+        <w:rPr>
+          <w:rFonts w:ascii="Times New Roman" w:hAnsi="Times New Roman"/>
+          <w:color w:val="000000"/>
+          <w:sz w:val="24"/>
+          <w:szCs w:val="24"/>
+          <w:lang w:val="en-US"/>
+        </w:rPr>
+        <w:t xml:space="preserve"> oleh </w:t>
+      </w:r>
+      <w:proofErr w:type="spellStart"/>
+      <w:r>
+        <w:rPr>
+          <w:rFonts w:ascii="Times New Roman" w:hAnsi="Times New Roman"/>
+          <w:color w:val="000000"/>
+          <w:sz w:val="24"/>
+          <w:szCs w:val="24"/>
+          <w:lang w:val="en-US"/>
+        </w:rPr>
+        <w:t>kelalaian</w:t>
+      </w:r>
+      <w:proofErr w:type="spellEnd"/>
+      <w:r>
+        <w:rPr>
+          <w:rFonts w:ascii="Times New Roman" w:hAnsi="Times New Roman"/>
+          <w:color w:val="000000"/>
+          <w:sz w:val="24"/>
+          <w:szCs w:val="24"/>
+          <w:lang w:val="en-US"/>
+        </w:rPr>
+        <w:t xml:space="preserve"> </w:t>
+      </w:r>
+      <w:proofErr w:type="spellStart"/>
+      <w:r>
+        <w:rPr>
+          <w:rFonts w:ascii="Times New Roman" w:hAnsi="Times New Roman"/>
+          <w:color w:val="000000"/>
+          <w:sz w:val="24"/>
+          <w:szCs w:val="24"/>
+          <w:lang w:val="en-US"/>
+        </w:rPr>
+        <w:t>pengguna</w:t>
+      </w:r>
+      <w:proofErr w:type="spellEnd"/>
+    </w:p>
+    <w:p>
+      <w:pPr>
+        <w:pStyle w:val="ListParagraph"/>
+        <w:widowControl w:val="0"/>
+        <w:numPr>
+          <w:ilvl w:val="0"/>
+          <w:numId w:val="9"/>
+        </w:numPr>
+        <w:tabs>
+          <w:tab w:val="left" w:leader="dot" w:pos="8222"/>
+          <w:tab w:val="right" w:pos="8788"/>
+        </w:tabs>
+        <w:autoSpaceDE w:val="0"/>
+        <w:autoSpaceDN w:val="0"/>
+        <w:adjustRightInd w:val="0"/>
+        <w:spacing w:after="0" w:line="360" w:lineRule="auto"/>
+        <w:ind w:left="851" w:hanging="284"/>
+        <w:jc w:val="both"/>
+        <w:rPr>
+          <w:rFonts w:ascii="Times New Roman" w:hAnsi="Times New Roman"/>
+          <w:color w:val="000000"/>
+          <w:sz w:val="24"/>
+          <w:szCs w:val="24"/>
+          <w:lang w:val="en-US"/>
+        </w:rPr>
+      </w:pPr>
+      <w:proofErr w:type="spellStart"/>
+      <w:r>
+        <w:rPr>
+          <w:rFonts w:ascii="Times New Roman" w:hAnsi="Times New Roman"/>
+          <w:color w:val="000000"/>
+          <w:sz w:val="24"/>
+          <w:szCs w:val="24"/>
+          <w:lang w:val="en-US"/>
+        </w:rPr>
+        <w:t>Memonitorng</w:t>
+      </w:r>
+      <w:proofErr w:type="spellEnd"/>
+      <w:r>
+        <w:rPr>
+          <w:rFonts w:ascii="Times New Roman" w:hAnsi="Times New Roman"/>
+          <w:color w:val="000000"/>
+          <w:sz w:val="24"/>
+          <w:szCs w:val="24"/>
+          <w:lang w:val="en-US"/>
+        </w:rPr>
+        <w:t xml:space="preserve"> </w:t>
+      </w:r>
+      <w:proofErr w:type="spellStart"/>
+      <w:r>
+        <w:rPr>
+          <w:rFonts w:ascii="Times New Roman" w:hAnsi="Times New Roman"/>
+          <w:color w:val="000000"/>
+          <w:sz w:val="24"/>
+          <w:szCs w:val="24"/>
+          <w:lang w:val="en-US"/>
+        </w:rPr>
+        <w:t>getaran</w:t>
+      </w:r>
+      <w:proofErr w:type="spellEnd"/>
+      <w:r>
+        <w:rPr>
+          <w:rFonts w:ascii="Times New Roman" w:hAnsi="Times New Roman"/>
+          <w:color w:val="000000"/>
+          <w:sz w:val="24"/>
+          <w:szCs w:val="24"/>
+          <w:lang w:val="en-US"/>
+        </w:rPr>
+        <w:t xml:space="preserve"> yang </w:t>
+      </w:r>
+      <w:proofErr w:type="spellStart"/>
+      <w:r>
+        <w:rPr>
+          <w:rFonts w:ascii="Times New Roman" w:hAnsi="Times New Roman"/>
+          <w:color w:val="000000"/>
+          <w:sz w:val="24"/>
+          <w:szCs w:val="24"/>
+          <w:lang w:val="en-US"/>
+        </w:rPr>
+        <w:t>terjadi</w:t>
+      </w:r>
+      <w:proofErr w:type="spellEnd"/>
+      <w:r>
+        <w:rPr>
+          <w:rFonts w:ascii="Times New Roman" w:hAnsi="Times New Roman"/>
+          <w:color w:val="000000"/>
+          <w:sz w:val="24"/>
+          <w:szCs w:val="24"/>
+          <w:lang w:val="en-US"/>
+        </w:rPr>
+        <w:t xml:space="preserve"> pada </w:t>
+      </w:r>
+      <w:proofErr w:type="spellStart"/>
+      <w:r>
+        <w:rPr>
+          <w:rFonts w:ascii="Times New Roman" w:hAnsi="Times New Roman"/>
+          <w:color w:val="000000"/>
+          <w:sz w:val="24"/>
+          <w:szCs w:val="24"/>
+          <w:lang w:val="en-US"/>
+        </w:rPr>
+        <w:t>mesin</w:t>
+      </w:r>
+      <w:proofErr w:type="spellEnd"/>
+      <w:r>
+        <w:rPr>
+          <w:rFonts w:ascii="Times New Roman" w:hAnsi="Times New Roman"/>
+          <w:color w:val="000000"/>
+          <w:sz w:val="24"/>
+          <w:szCs w:val="24"/>
+          <w:lang w:val="en-US"/>
+        </w:rPr>
+        <w:t>.</w:t>
+      </w:r>
     </w:p>
     <w:sectPr>
+      <w:footerReference w:type="default" r:id="rId10"/>
       <w:pgSz w:w="11907" w:h="16840" w:code="9"/>
       <w:pgMar w:top="1701" w:right="1418" w:bottom="1418" w:left="1701" w:header="709" w:footer="709" w:gutter="0"/>
       <w:pgNumType w:start="1"/>
@@ -22745,6 +25742,79 @@
         <w:rFonts w:ascii="Times New Roman" w:hAnsi="Times New Roman"/>
       </w:rPr>
       <w:id w:val="943959168"/>
+      <w:docPartObj>
+        <w:docPartGallery w:val="Page Numbers (Bottom of Page)"/>
+        <w:docPartUnique/>
+      </w:docPartObj>
+    </w:sdtPr>
+    <w:sdtEndPr>
+      <w:rPr>
+        <w:noProof/>
+      </w:rPr>
+    </w:sdtEndPr>
+    <w:sdtContent>
+      <w:p>
+        <w:pPr>
+          <w:pStyle w:val="Footer"/>
+          <w:jc w:val="right"/>
+          <w:rPr>
+            <w:rFonts w:ascii="Times New Roman" w:hAnsi="Times New Roman"/>
+          </w:rPr>
+        </w:pPr>
+        <w:r>
+          <w:rPr>
+            <w:rFonts w:ascii="Times New Roman" w:hAnsi="Times New Roman"/>
+          </w:rPr>
+          <w:fldChar w:fldCharType="begin"/>
+        </w:r>
+        <w:r>
+          <w:rPr>
+            <w:rFonts w:ascii="Times New Roman" w:hAnsi="Times New Roman"/>
+          </w:rPr>
+          <w:instrText xml:space="preserve"> PAGE   \* MERGEFORMAT </w:instrText>
+        </w:r>
+        <w:r>
+          <w:rPr>
+            <w:rFonts w:ascii="Times New Roman" w:hAnsi="Times New Roman"/>
+          </w:rPr>
+          <w:fldChar w:fldCharType="separate"/>
+        </w:r>
+        <w:r>
+          <w:rPr>
+            <w:rFonts w:ascii="Times New Roman" w:hAnsi="Times New Roman"/>
+            <w:noProof/>
+          </w:rPr>
+          <w:t>2</w:t>
+        </w:r>
+        <w:r>
+          <w:rPr>
+            <w:rFonts w:ascii="Times New Roman" w:hAnsi="Times New Roman"/>
+            <w:noProof/>
+          </w:rPr>
+          <w:fldChar w:fldCharType="end"/>
+        </w:r>
+      </w:p>
+    </w:sdtContent>
+  </w:sdt>
+  <w:p>
+    <w:pPr>
+      <w:pStyle w:val="Footer"/>
+      <w:rPr>
+        <w:rFonts w:ascii="Times New Roman" w:hAnsi="Times New Roman"/>
+      </w:rPr>
+    </w:pPr>
+  </w:p>
+</w:ftr>
+</file>
+
+<file path=word/footer2.xml><?xml version="1.0" encoding="utf-8"?>
+<w:ftr xmlns:wpc="http://schemas.microsoft.com/office/word/2010/wordprocessingCanvas" xmlns:cx="http://schemas.microsoft.com/office/drawing/2014/chartex" xmlns:cx1="http://schemas.microsoft.com/office/drawing/2015/9/8/chartex" xmlns:cx2="http://schemas.microsoft.com/office/drawing/2015/10/21/chartex" xmlns:cx3="http://schemas.microsoft.com/office/drawing/2016/5/9/chartex" xmlns:cx4="http://schemas.microsoft.com/office/drawing/2016/5/10/chartex" xmlns:cx5="http://schemas.microsoft.com/office/drawing/2016/5/11/chartex" xmlns:cx6="http://schemas.microsoft.com/office/drawing/2016/5/12/chartex" xmlns:cx7="http://schemas.microsoft.com/office/drawing/2016/5/13/chartex" xmlns:cx8="http://schemas.microsoft.com/office/drawing/2016/5/14/chartex" xmlns:mc="http://schemas.openxmlformats.org/markup-compatibility/2006" xmlns:aink="http://schemas.microsoft.com/office/drawing/2016/ink" xmlns:am3d="http://schemas.microsoft.com/office/drawing/2017/model3d" xmlns:o="urn:schemas-microsoft-com:office:office" xmlns:r="http://schemas.openxmlformats.org/officeDocument/2006/relationships" xmlns:m="http://schemas.openxmlformats.org/officeDocument/2006/math" xmlns:v="urn:schemas-microsoft-com:vml" xmlns:wp14="http://schemas.microsoft.com/office/word/2010/wordprocessingDrawing" xmlns:wp="http://schemas.openxmlformats.org/drawingml/2006/wordprocessingDrawing" xmlns:w10="urn:schemas-microsoft-com:office:word" xmlns:w="http://schemas.openxmlformats.org/wordprocessingml/2006/main" xmlns:w14="http://schemas.microsoft.com/office/word/2010/wordml" xmlns:w15="http://schemas.microsoft.com/office/word/2012/wordml" xmlns:w16cid="http://schemas.microsoft.com/office/word/2016/wordml/cid" xmlns:w16se="http://schemas.microsoft.com/office/word/2015/wordml/symex" xmlns:wpg="http://schemas.microsoft.com/office/word/2010/wordprocessingGroup" xmlns:wpi="http://schemas.microsoft.com/office/word/2010/wordprocessingInk" xmlns:wne="http://schemas.microsoft.com/office/word/2006/wordml" xmlns:wps="http://schemas.microsoft.com/office/word/2010/wordprocessingShape" mc:Ignorable="w14 w15 w16se w16cid wp14">
+  <w:sdt>
+    <w:sdtPr>
+      <w:rPr>
+        <w:rFonts w:ascii="Times New Roman" w:hAnsi="Times New Roman"/>
+      </w:rPr>
+      <w:id w:val="1209683714"/>
       <w:docPartObj>
         <w:docPartGallery w:val="Page Numbers (Bottom of Page)"/>
         <w:docPartUnique/>
@@ -22845,6 +25915,184 @@
 <file path=word/numbering.xml><?xml version="1.0" encoding="utf-8"?>
 <w:numbering xmlns:wpc="http://schemas.microsoft.com/office/word/2010/wordprocessingCanvas" xmlns:cx="http://schemas.microsoft.com/office/drawing/2014/chartex" xmlns:cx1="http://schemas.microsoft.com/office/drawing/2015/9/8/chartex" xmlns:cx2="http://schemas.microsoft.com/office/drawing/2015/10/21/chartex" xmlns:cx3="http://schemas.microsoft.com/office/drawing/2016/5/9/chartex" xmlns:cx4="http://schemas.microsoft.com/office/drawing/2016/5/10/chartex" xmlns:cx5="http://schemas.microsoft.com/office/drawing/2016/5/11/chartex" xmlns:cx6="http://schemas.microsoft.com/office/drawing/2016/5/12/chartex" xmlns:cx7="http://schemas.microsoft.com/office/drawing/2016/5/13/chartex" xmlns:cx8="http://schemas.microsoft.com/office/drawing/2016/5/14/chartex" xmlns:mc="http://schemas.openxmlformats.org/markup-compatibility/2006" xmlns:aink="http://schemas.microsoft.com/office/drawing/2016/ink" xmlns:am3d="http://schemas.microsoft.com/office/drawing/2017/model3d" xmlns:o="urn:schemas-microsoft-com:office:office" xmlns:r="http://schemas.openxmlformats.org/officeDocument/2006/relationships" xmlns:m="http://schemas.openxmlformats.org/officeDocument/2006/math" xmlns:v="urn:schemas-microsoft-com:vml" xmlns:wp14="http://schemas.microsoft.com/office/word/2010/wordprocessingDrawing" xmlns:wp="http://schemas.openxmlformats.org/drawingml/2006/wordprocessingDrawing" xmlns:w10="urn:schemas-microsoft-com:office:word" xmlns:w="http://schemas.openxmlformats.org/wordprocessingml/2006/main" xmlns:w14="http://schemas.microsoft.com/office/word/2010/wordml" xmlns:w15="http://schemas.microsoft.com/office/word/2012/wordml" xmlns:w16cid="http://schemas.microsoft.com/office/word/2016/wordml/cid" xmlns:w16se="http://schemas.microsoft.com/office/word/2015/wordml/symex" xmlns:wpg="http://schemas.microsoft.com/office/word/2010/wordprocessingGroup" xmlns:wpi="http://schemas.microsoft.com/office/word/2010/wordprocessingInk" xmlns:wne="http://schemas.microsoft.com/office/word/2006/wordml" xmlns:wps="http://schemas.microsoft.com/office/word/2010/wordprocessingShape" mc:Ignorable="w14 w15 w16se w16cid wp14">
   <w:abstractNum w:abstractNumId="0" w15:restartNumberingAfterBreak="0">
+    <w:nsid w:val="0C8030C9"/>
+    <w:multiLevelType w:val="hybridMultilevel"/>
+    <w:tmpl w:val="D83640B4"/>
+    <w:lvl w:ilvl="0" w:tplc="273A5914">
+      <w:start w:val="1"/>
+      <w:numFmt w:val="lowerLetter"/>
+      <w:lvlText w:val="%1."/>
+      <w:lvlJc w:val="left"/>
+      <w:pPr>
+        <w:ind w:left="927" w:hanging="360"/>
+      </w:pPr>
+      <w:rPr>
+        <w:rFonts w:hint="default"/>
+      </w:rPr>
+    </w:lvl>
+    <w:lvl w:ilvl="1" w:tplc="04210019" w:tentative="1">
+      <w:start w:val="1"/>
+      <w:numFmt w:val="lowerLetter"/>
+      <w:lvlText w:val="%2."/>
+      <w:lvlJc w:val="left"/>
+      <w:pPr>
+        <w:ind w:left="1647" w:hanging="360"/>
+      </w:pPr>
+    </w:lvl>
+    <w:lvl w:ilvl="2" w:tplc="0421001B" w:tentative="1">
+      <w:start w:val="1"/>
+      <w:numFmt w:val="lowerRoman"/>
+      <w:lvlText w:val="%3."/>
+      <w:lvlJc w:val="right"/>
+      <w:pPr>
+        <w:ind w:left="2367" w:hanging="180"/>
+      </w:pPr>
+    </w:lvl>
+    <w:lvl w:ilvl="3" w:tplc="0421000F" w:tentative="1">
+      <w:start w:val="1"/>
+      <w:numFmt w:val="decimal"/>
+      <w:lvlText w:val="%4."/>
+      <w:lvlJc w:val="left"/>
+      <w:pPr>
+        <w:ind w:left="3087" w:hanging="360"/>
+      </w:pPr>
+    </w:lvl>
+    <w:lvl w:ilvl="4" w:tplc="04210019" w:tentative="1">
+      <w:start w:val="1"/>
+      <w:numFmt w:val="lowerLetter"/>
+      <w:lvlText w:val="%5."/>
+      <w:lvlJc w:val="left"/>
+      <w:pPr>
+        <w:ind w:left="3807" w:hanging="360"/>
+      </w:pPr>
+    </w:lvl>
+    <w:lvl w:ilvl="5" w:tplc="0421001B" w:tentative="1">
+      <w:start w:val="1"/>
+      <w:numFmt w:val="lowerRoman"/>
+      <w:lvlText w:val="%6."/>
+      <w:lvlJc w:val="right"/>
+      <w:pPr>
+        <w:ind w:left="4527" w:hanging="180"/>
+      </w:pPr>
+    </w:lvl>
+    <w:lvl w:ilvl="6" w:tplc="0421000F" w:tentative="1">
+      <w:start w:val="1"/>
+      <w:numFmt w:val="decimal"/>
+      <w:lvlText w:val="%7."/>
+      <w:lvlJc w:val="left"/>
+      <w:pPr>
+        <w:ind w:left="5247" w:hanging="360"/>
+      </w:pPr>
+    </w:lvl>
+    <w:lvl w:ilvl="7" w:tplc="04210019" w:tentative="1">
+      <w:start w:val="1"/>
+      <w:numFmt w:val="lowerLetter"/>
+      <w:lvlText w:val="%8."/>
+      <w:lvlJc w:val="left"/>
+      <w:pPr>
+        <w:ind w:left="5967" w:hanging="360"/>
+      </w:pPr>
+    </w:lvl>
+    <w:lvl w:ilvl="8" w:tplc="0421001B" w:tentative="1">
+      <w:start w:val="1"/>
+      <w:numFmt w:val="lowerRoman"/>
+      <w:lvlText w:val="%9."/>
+      <w:lvlJc w:val="right"/>
+      <w:pPr>
+        <w:ind w:left="6687" w:hanging="180"/>
+      </w:pPr>
+    </w:lvl>
+  </w:abstractNum>
+  <w:abstractNum w:abstractNumId="1" w15:restartNumberingAfterBreak="0">
+    <w:nsid w:val="16184962"/>
+    <w:multiLevelType w:val="hybridMultilevel"/>
+    <w:tmpl w:val="7F1A9D86"/>
+    <w:lvl w:ilvl="0" w:tplc="5DE820D2">
+      <w:start w:val="1"/>
+      <w:numFmt w:val="lowerLetter"/>
+      <w:lvlText w:val="%1."/>
+      <w:lvlJc w:val="left"/>
+      <w:pPr>
+        <w:ind w:left="927" w:hanging="360"/>
+      </w:pPr>
+      <w:rPr>
+        <w:rFonts w:hint="default"/>
+      </w:rPr>
+    </w:lvl>
+    <w:lvl w:ilvl="1" w:tplc="04210019" w:tentative="1">
+      <w:start w:val="1"/>
+      <w:numFmt w:val="lowerLetter"/>
+      <w:lvlText w:val="%2."/>
+      <w:lvlJc w:val="left"/>
+      <w:pPr>
+        <w:ind w:left="1647" w:hanging="360"/>
+      </w:pPr>
+    </w:lvl>
+    <w:lvl w:ilvl="2" w:tplc="0421001B" w:tentative="1">
+      <w:start w:val="1"/>
+      <w:numFmt w:val="lowerRoman"/>
+      <w:lvlText w:val="%3."/>
+      <w:lvlJc w:val="right"/>
+      <w:pPr>
+        <w:ind w:left="2367" w:hanging="180"/>
+      </w:pPr>
+    </w:lvl>
+    <w:lvl w:ilvl="3" w:tplc="0421000F" w:tentative="1">
+      <w:start w:val="1"/>
+      <w:numFmt w:val="decimal"/>
+      <w:lvlText w:val="%4."/>
+      <w:lvlJc w:val="left"/>
+      <w:pPr>
+        <w:ind w:left="3087" w:hanging="360"/>
+      </w:pPr>
+    </w:lvl>
+    <w:lvl w:ilvl="4" w:tplc="04210019" w:tentative="1">
+      <w:start w:val="1"/>
+      <w:numFmt w:val="lowerLetter"/>
+      <w:lvlText w:val="%5."/>
+      <w:lvlJc w:val="left"/>
+      <w:pPr>
+        <w:ind w:left="3807" w:hanging="360"/>
+      </w:pPr>
+    </w:lvl>
+    <w:lvl w:ilvl="5" w:tplc="0421001B" w:tentative="1">
+      <w:start w:val="1"/>
+      <w:numFmt w:val="lowerRoman"/>
+      <w:lvlText w:val="%6."/>
+      <w:lvlJc w:val="right"/>
+      <w:pPr>
+        <w:ind w:left="4527" w:hanging="180"/>
+      </w:pPr>
+    </w:lvl>
+    <w:lvl w:ilvl="6" w:tplc="0421000F" w:tentative="1">
+      <w:start w:val="1"/>
+      <w:numFmt w:val="decimal"/>
+      <w:lvlText w:val="%7."/>
+      <w:lvlJc w:val="left"/>
+      <w:pPr>
+        <w:ind w:left="5247" w:hanging="360"/>
+      </w:pPr>
+    </w:lvl>
+    <w:lvl w:ilvl="7" w:tplc="04210019" w:tentative="1">
+      <w:start w:val="1"/>
+      <w:numFmt w:val="lowerLetter"/>
+      <w:lvlText w:val="%8."/>
+      <w:lvlJc w:val="left"/>
+      <w:pPr>
+        <w:ind w:left="5967" w:hanging="360"/>
+      </w:pPr>
+    </w:lvl>
+    <w:lvl w:ilvl="8" w:tplc="0421001B" w:tentative="1">
+      <w:start w:val="1"/>
+      <w:numFmt w:val="lowerRoman"/>
+      <w:lvlText w:val="%9."/>
+      <w:lvlJc w:val="right"/>
+      <w:pPr>
+        <w:ind w:left="6687" w:hanging="180"/>
+      </w:pPr>
+    </w:lvl>
+  </w:abstractNum>
+  <w:abstractNum w:abstractNumId="2" w15:restartNumberingAfterBreak="0">
     <w:nsid w:val="32D13A6C"/>
     <w:multiLevelType w:val="multilevel"/>
     <w:tmpl w:val="025A7F32"/>
@@ -22957,7 +26205,7 @@
       </w:rPr>
     </w:lvl>
   </w:abstractNum>
-  <w:abstractNum w:abstractNumId="1" w15:restartNumberingAfterBreak="0">
+  <w:abstractNum w:abstractNumId="3" w15:restartNumberingAfterBreak="0">
     <w:nsid w:val="3AB16799"/>
     <w:multiLevelType w:val="multilevel"/>
     <w:tmpl w:val="025A7F32"/>
@@ -23070,7 +26318,7 @@
       </w:rPr>
     </w:lvl>
   </w:abstractNum>
-  <w:abstractNum w:abstractNumId="2" w15:restartNumberingAfterBreak="0">
+  <w:abstractNum w:abstractNumId="4" w15:restartNumberingAfterBreak="0">
     <w:nsid w:val="4BD91A48"/>
     <w:multiLevelType w:val="multilevel"/>
     <w:tmpl w:val="025A7F32"/>
@@ -23183,7 +26431,96 @@
       </w:rPr>
     </w:lvl>
   </w:abstractNum>
-  <w:abstractNum w:abstractNumId="3" w15:restartNumberingAfterBreak="0">
+  <w:abstractNum w:abstractNumId="5" w15:restartNumberingAfterBreak="0">
+    <w:nsid w:val="4DB015BE"/>
+    <w:multiLevelType w:val="hybridMultilevel"/>
+    <w:tmpl w:val="6DDE709C"/>
+    <w:lvl w:ilvl="0" w:tplc="4952346C">
+      <w:start w:val="1"/>
+      <w:numFmt w:val="lowerLetter"/>
+      <w:lvlText w:val="%1."/>
+      <w:lvlJc w:val="left"/>
+      <w:pPr>
+        <w:ind w:left="927" w:hanging="360"/>
+      </w:pPr>
+      <w:rPr>
+        <w:rFonts w:hint="default"/>
+      </w:rPr>
+    </w:lvl>
+    <w:lvl w:ilvl="1" w:tplc="04210019" w:tentative="1">
+      <w:start w:val="1"/>
+      <w:numFmt w:val="lowerLetter"/>
+      <w:lvlText w:val="%2."/>
+      <w:lvlJc w:val="left"/>
+      <w:pPr>
+        <w:ind w:left="1647" w:hanging="360"/>
+      </w:pPr>
+    </w:lvl>
+    <w:lvl w:ilvl="2" w:tplc="0421001B" w:tentative="1">
+      <w:start w:val="1"/>
+      <w:numFmt w:val="lowerRoman"/>
+      <w:lvlText w:val="%3."/>
+      <w:lvlJc w:val="right"/>
+      <w:pPr>
+        <w:ind w:left="2367" w:hanging="180"/>
+      </w:pPr>
+    </w:lvl>
+    <w:lvl w:ilvl="3" w:tplc="0421000F" w:tentative="1">
+      <w:start w:val="1"/>
+      <w:numFmt w:val="decimal"/>
+      <w:lvlText w:val="%4."/>
+      <w:lvlJc w:val="left"/>
+      <w:pPr>
+        <w:ind w:left="3087" w:hanging="360"/>
+      </w:pPr>
+    </w:lvl>
+    <w:lvl w:ilvl="4" w:tplc="04210019" w:tentative="1">
+      <w:start w:val="1"/>
+      <w:numFmt w:val="lowerLetter"/>
+      <w:lvlText w:val="%5."/>
+      <w:lvlJc w:val="left"/>
+      <w:pPr>
+        <w:ind w:left="3807" w:hanging="360"/>
+      </w:pPr>
+    </w:lvl>
+    <w:lvl w:ilvl="5" w:tplc="0421001B" w:tentative="1">
+      <w:start w:val="1"/>
+      <w:numFmt w:val="lowerRoman"/>
+      <w:lvlText w:val="%6."/>
+      <w:lvlJc w:val="right"/>
+      <w:pPr>
+        <w:ind w:left="4527" w:hanging="180"/>
+      </w:pPr>
+    </w:lvl>
+    <w:lvl w:ilvl="6" w:tplc="0421000F" w:tentative="1">
+      <w:start w:val="1"/>
+      <w:numFmt w:val="decimal"/>
+      <w:lvlText w:val="%7."/>
+      <w:lvlJc w:val="left"/>
+      <w:pPr>
+        <w:ind w:left="5247" w:hanging="360"/>
+      </w:pPr>
+    </w:lvl>
+    <w:lvl w:ilvl="7" w:tplc="04210019" w:tentative="1">
+      <w:start w:val="1"/>
+      <w:numFmt w:val="lowerLetter"/>
+      <w:lvlText w:val="%8."/>
+      <w:lvlJc w:val="left"/>
+      <w:pPr>
+        <w:ind w:left="5967" w:hanging="360"/>
+      </w:pPr>
+    </w:lvl>
+    <w:lvl w:ilvl="8" w:tplc="0421001B" w:tentative="1">
+      <w:start w:val="1"/>
+      <w:numFmt w:val="lowerRoman"/>
+      <w:lvlText w:val="%9."/>
+      <w:lvlJc w:val="right"/>
+      <w:pPr>
+        <w:ind w:left="6687" w:hanging="180"/>
+      </w:pPr>
+    </w:lvl>
+  </w:abstractNum>
+  <w:abstractNum w:abstractNumId="6" w15:restartNumberingAfterBreak="0">
     <w:nsid w:val="62965494"/>
     <w:multiLevelType w:val="multilevel"/>
     <w:tmpl w:val="025A7F32"/>
@@ -23296,7 +26633,96 @@
       </w:rPr>
     </w:lvl>
   </w:abstractNum>
-  <w:abstractNum w:abstractNumId="4" w15:restartNumberingAfterBreak="0">
+  <w:abstractNum w:abstractNumId="7" w15:restartNumberingAfterBreak="0">
+    <w:nsid w:val="6E1A1FAD"/>
+    <w:multiLevelType w:val="hybridMultilevel"/>
+    <w:tmpl w:val="7EEC8128"/>
+    <w:lvl w:ilvl="0" w:tplc="54722694">
+      <w:start w:val="1"/>
+      <w:numFmt w:val="lowerLetter"/>
+      <w:lvlText w:val="%1."/>
+      <w:lvlJc w:val="left"/>
+      <w:pPr>
+        <w:ind w:left="927" w:hanging="360"/>
+      </w:pPr>
+      <w:rPr>
+        <w:rFonts w:hint="default"/>
+      </w:rPr>
+    </w:lvl>
+    <w:lvl w:ilvl="1" w:tplc="04210019" w:tentative="1">
+      <w:start w:val="1"/>
+      <w:numFmt w:val="lowerLetter"/>
+      <w:lvlText w:val="%2."/>
+      <w:lvlJc w:val="left"/>
+      <w:pPr>
+        <w:ind w:left="1647" w:hanging="360"/>
+      </w:pPr>
+    </w:lvl>
+    <w:lvl w:ilvl="2" w:tplc="0421001B" w:tentative="1">
+      <w:start w:val="1"/>
+      <w:numFmt w:val="lowerRoman"/>
+      <w:lvlText w:val="%3."/>
+      <w:lvlJc w:val="right"/>
+      <w:pPr>
+        <w:ind w:left="2367" w:hanging="180"/>
+      </w:pPr>
+    </w:lvl>
+    <w:lvl w:ilvl="3" w:tplc="0421000F" w:tentative="1">
+      <w:start w:val="1"/>
+      <w:numFmt w:val="decimal"/>
+      <w:lvlText w:val="%4."/>
+      <w:lvlJc w:val="left"/>
+      <w:pPr>
+        <w:ind w:left="3087" w:hanging="360"/>
+      </w:pPr>
+    </w:lvl>
+    <w:lvl w:ilvl="4" w:tplc="04210019" w:tentative="1">
+      <w:start w:val="1"/>
+      <w:numFmt w:val="lowerLetter"/>
+      <w:lvlText w:val="%5."/>
+      <w:lvlJc w:val="left"/>
+      <w:pPr>
+        <w:ind w:left="3807" w:hanging="360"/>
+      </w:pPr>
+    </w:lvl>
+    <w:lvl w:ilvl="5" w:tplc="0421001B" w:tentative="1">
+      <w:start w:val="1"/>
+      <w:numFmt w:val="lowerRoman"/>
+      <w:lvlText w:val="%6."/>
+      <w:lvlJc w:val="right"/>
+      <w:pPr>
+        <w:ind w:left="4527" w:hanging="180"/>
+      </w:pPr>
+    </w:lvl>
+    <w:lvl w:ilvl="6" w:tplc="0421000F" w:tentative="1">
+      <w:start w:val="1"/>
+      <w:numFmt w:val="decimal"/>
+      <w:lvlText w:val="%7."/>
+      <w:lvlJc w:val="left"/>
+      <w:pPr>
+        <w:ind w:left="5247" w:hanging="360"/>
+      </w:pPr>
+    </w:lvl>
+    <w:lvl w:ilvl="7" w:tplc="04210019" w:tentative="1">
+      <w:start w:val="1"/>
+      <w:numFmt w:val="lowerLetter"/>
+      <w:lvlText w:val="%8."/>
+      <w:lvlJc w:val="left"/>
+      <w:pPr>
+        <w:ind w:left="5967" w:hanging="360"/>
+      </w:pPr>
+    </w:lvl>
+    <w:lvl w:ilvl="8" w:tplc="0421001B" w:tentative="1">
+      <w:start w:val="1"/>
+      <w:numFmt w:val="lowerRoman"/>
+      <w:lvlText w:val="%9."/>
+      <w:lvlJc w:val="right"/>
+      <w:pPr>
+        <w:ind w:left="6687" w:hanging="180"/>
+      </w:pPr>
+    </w:lvl>
+  </w:abstractNum>
+  <w:abstractNum w:abstractNumId="8" w15:restartNumberingAfterBreak="0">
     <w:nsid w:val="7CFB7FA6"/>
     <w:multiLevelType w:val="multilevel"/>
     <w:tmpl w:val="D44CE5CA"/>
@@ -23410,19 +26836,31 @@
     </w:lvl>
   </w:abstractNum>
   <w:num w:numId="1">
+    <w:abstractNumId w:val="4"/>
+  </w:num>
+  <w:num w:numId="2">
     <w:abstractNumId w:val="2"/>
   </w:num>
-  <w:num w:numId="2">
+  <w:num w:numId="3">
+    <w:abstractNumId w:val="6"/>
+  </w:num>
+  <w:num w:numId="4">
+    <w:abstractNumId w:val="3"/>
+  </w:num>
+  <w:num w:numId="5">
+    <w:abstractNumId w:val="8"/>
+  </w:num>
+  <w:num w:numId="6">
+    <w:abstractNumId w:val="5"/>
+  </w:num>
+  <w:num w:numId="7">
     <w:abstractNumId w:val="0"/>
   </w:num>
-  <w:num w:numId="3">
-    <w:abstractNumId w:val="3"/>
-  </w:num>
-  <w:num w:numId="4">
+  <w:num w:numId="8">
     <w:abstractNumId w:val="1"/>
   </w:num>
-  <w:num w:numId="5">
-    <w:abstractNumId w:val="4"/>
+  <w:num w:numId="9">
+    <w:abstractNumId w:val="7"/>
   </w:num>
 </w:numbering>
 </file>
@@ -24270,7 +27708,7 @@
 </file>
 
 <file path=customXml/itemProps1.xml><?xml version="1.0" encoding="utf-8"?>
-<ds:datastoreItem xmlns:ds="http://schemas.openxmlformats.org/officeDocument/2006/customXml" ds:itemID="{0E3719C1-A49B-44A8-8487-4A4542A75951}">
+<ds:datastoreItem xmlns:ds="http://schemas.openxmlformats.org/officeDocument/2006/customXml" ds:itemID="{CB178FDC-7430-4157-B746-2F2AA58D787A}">
   <ds:schemaRefs>
     <ds:schemaRef ds:uri="http://schemas.openxmlformats.org/officeDocument/2006/bibliography"/>
   </ds:schemaRefs>

</xml_diff>

<commit_message>
Menambahkan 2 paragraf terakhir pada BAB I
</commit_message>
<xml_diff>
--- a/Files/Proposal.docx
+++ b/Files/Proposal.docx
@@ -222,7 +222,6 @@
           <w:lang w:val="en-US"/>
         </w:rPr>
       </w:pPr>
-      <w:proofErr w:type="gramStart"/>
       <w:r>
         <w:rPr>
           <w:rFonts w:ascii="Times New Roman" w:hAnsi="Times New Roman"/>
@@ -253,7 +252,6 @@
         </w:rPr>
         <w:t xml:space="preserve"> :</w:t>
       </w:r>
-      <w:proofErr w:type="gramEnd"/>
     </w:p>
     <w:p>
       <w:pPr>
@@ -1587,7 +1585,6 @@
               <w:t xml:space="preserve">, </w:t>
             </w:r>
             <w:proofErr w:type="spellStart"/>
-            <w:proofErr w:type="gramStart"/>
             <w:r>
               <w:rPr>
                 <w:rFonts w:ascii="Times New Roman" w:hAnsi="Times New Roman"/>
@@ -1602,7 +1599,6 @@
               <w:t>S.Kom</w:t>
             </w:r>
             <w:proofErr w:type="spellEnd"/>
-            <w:proofErr w:type="gramEnd"/>
             <w:r>
               <w:rPr>
                 <w:rFonts w:ascii="Times New Roman" w:hAnsi="Times New Roman"/>
@@ -3042,7 +3038,6 @@
         <w:t xml:space="preserve">, </w:t>
       </w:r>
       <w:proofErr w:type="spellStart"/>
-      <w:proofErr w:type="gramStart"/>
       <w:r>
         <w:rPr>
           <w:rFonts w:ascii="Times New Roman" w:hAnsi="Times New Roman"/>
@@ -3056,7 +3051,6 @@
         <w:t>S.Kom</w:t>
       </w:r>
       <w:proofErr w:type="spellEnd"/>
-      <w:proofErr w:type="gramEnd"/>
       <w:r>
         <w:rPr>
           <w:rFonts w:ascii="Times New Roman" w:hAnsi="Times New Roman"/>
@@ -3159,33 +3153,7 @@
           <w:szCs w:val="24"/>
           <w:lang w:val="en-US"/>
         </w:rPr>
-        <w:t xml:space="preserve">DEWAN </w:t>
-      </w:r>
-      <w:proofErr w:type="gramStart"/>
-      <w:r>
-        <w:rPr>
-          <w:rFonts w:ascii="Times New Roman" w:hAnsi="Times New Roman"/>
-          <w:b/>
-          <w:bCs/>
-          <w:color w:val="000000"/>
-          <w:sz w:val="28"/>
-          <w:szCs w:val="24"/>
-          <w:lang w:val="en-US"/>
-        </w:rPr>
-        <w:t>PENGUJI :</w:t>
-      </w:r>
-      <w:proofErr w:type="gramEnd"/>
-      <w:r>
-        <w:rPr>
-          <w:rFonts w:ascii="Times New Roman" w:hAnsi="Times New Roman"/>
-          <w:b/>
-          <w:bCs/>
-          <w:color w:val="000000"/>
-          <w:sz w:val="28"/>
-          <w:szCs w:val="24"/>
-          <w:lang w:val="en-US"/>
-        </w:rPr>
-        <w:t xml:space="preserve"> </w:t>
+        <w:t xml:space="preserve">DEWAN PENGUJI : </w:t>
       </w:r>
     </w:p>
     <w:p>
@@ -21750,60 +21718,18 @@
           <w:szCs w:val="24"/>
           <w:lang w:val="en-US"/>
         </w:rPr>
-        <w:t xml:space="preserve"> </w:t>
-      </w:r>
-      <w:r>
-        <w:rPr>
-          <w:rFonts w:ascii="Times New Roman" w:hAnsi="Times New Roman"/>
-          <w:i/>
-          <w:iCs/>
-          <w:color w:val="000000"/>
-          <w:sz w:val="24"/>
-          <w:szCs w:val="24"/>
-          <w:lang w:val="en-US"/>
-        </w:rPr>
-        <w:t>prototype</w:t>
-      </w:r>
-      <w:r>
-        <w:rPr>
-          <w:rFonts w:ascii="Times New Roman" w:hAnsi="Times New Roman"/>
-          <w:color w:val="000000"/>
-          <w:sz w:val="24"/>
-          <w:szCs w:val="24"/>
-          <w:lang w:val="en-US"/>
-        </w:rPr>
-        <w:t xml:space="preserve"> </w:t>
-      </w:r>
-      <w:proofErr w:type="spellStart"/>
-      <w:r>
-        <w:rPr>
-          <w:rFonts w:ascii="Times New Roman" w:hAnsi="Times New Roman"/>
-          <w:color w:val="000000"/>
-          <w:sz w:val="24"/>
-          <w:szCs w:val="24"/>
-          <w:lang w:val="en-US"/>
-        </w:rPr>
-        <w:t>s</w:t>
-      </w:r>
-      <w:r>
-        <w:rPr>
-          <w:rFonts w:ascii="Times New Roman" w:hAnsi="Times New Roman"/>
-          <w:color w:val="000000"/>
-          <w:sz w:val="24"/>
-          <w:szCs w:val="24"/>
-          <w:lang w:val="en-US"/>
-        </w:rPr>
-        <w:t>i</w:t>
-      </w:r>
-      <w:r>
-        <w:rPr>
-          <w:rFonts w:ascii="Times New Roman" w:hAnsi="Times New Roman"/>
-          <w:color w:val="000000"/>
-          <w:sz w:val="24"/>
-          <w:szCs w:val="24"/>
-          <w:lang w:val="en-US"/>
-        </w:rPr>
-        <w:t>stem</w:t>
+        <w:t xml:space="preserve"> prototype </w:t>
+      </w:r>
+      <w:proofErr w:type="spellStart"/>
+      <w:r>
+        <w:rPr>
+          <w:rFonts w:ascii="Times New Roman" w:hAnsi="Times New Roman"/>
+          <w:color w:val="000000"/>
+          <w:sz w:val="24"/>
+          <w:szCs w:val="24"/>
+          <w:lang w:val="en-US"/>
+        </w:rPr>
+        <w:t>sistem</w:t>
       </w:r>
       <w:proofErr w:type="spellEnd"/>
       <w:r>
@@ -21957,38 +21883,436 @@
           <w:szCs w:val="24"/>
           <w:lang w:val="en-US"/>
         </w:rPr>
-        <w:t>s</w:t>
-      </w:r>
-      <w:r>
-        <w:rPr>
-          <w:rFonts w:ascii="Times New Roman" w:hAnsi="Times New Roman"/>
-          <w:color w:val="000000"/>
-          <w:sz w:val="24"/>
-          <w:szCs w:val="24"/>
-          <w:lang w:val="en-US"/>
-        </w:rPr>
-        <w:t>is</w:t>
-      </w:r>
-      <w:r>
-        <w:rPr>
-          <w:rFonts w:ascii="Times New Roman" w:hAnsi="Times New Roman"/>
-          <w:color w:val="000000"/>
-          <w:sz w:val="24"/>
-          <w:szCs w:val="24"/>
-          <w:lang w:val="en-US"/>
-        </w:rPr>
-        <w:t>tem</w:t>
-      </w:r>
-      <w:proofErr w:type="spellEnd"/>
-      <w:r>
-        <w:rPr>
-          <w:rFonts w:ascii="Times New Roman" w:hAnsi="Times New Roman"/>
-          <w:color w:val="000000"/>
-          <w:sz w:val="24"/>
-          <w:szCs w:val="24"/>
-          <w:lang w:val="en-US"/>
-        </w:rPr>
-        <w:t xml:space="preserve"> </w:t>
+        <w:t>sistem</w:t>
+      </w:r>
+      <w:proofErr w:type="spellEnd"/>
+      <w:r>
+        <w:rPr>
+          <w:rFonts w:ascii="Times New Roman" w:hAnsi="Times New Roman"/>
+          <w:color w:val="000000"/>
+          <w:sz w:val="24"/>
+          <w:szCs w:val="24"/>
+          <w:lang w:val="en-US"/>
+        </w:rPr>
+        <w:t xml:space="preserve"> </w:t>
+      </w:r>
+      <w:proofErr w:type="spellStart"/>
+      <w:r>
+        <w:rPr>
+          <w:rFonts w:ascii="Times New Roman" w:hAnsi="Times New Roman"/>
+          <w:color w:val="000000"/>
+          <w:sz w:val="24"/>
+          <w:szCs w:val="24"/>
+          <w:lang w:val="en-US"/>
+        </w:rPr>
+        <w:t>akan</w:t>
+      </w:r>
+      <w:proofErr w:type="spellEnd"/>
+      <w:r>
+        <w:rPr>
+          <w:rFonts w:ascii="Times New Roman" w:hAnsi="Times New Roman"/>
+          <w:color w:val="000000"/>
+          <w:sz w:val="24"/>
+          <w:szCs w:val="24"/>
+          <w:lang w:val="en-US"/>
+        </w:rPr>
+        <w:t xml:space="preserve"> </w:t>
+      </w:r>
+      <w:proofErr w:type="spellStart"/>
+      <w:r>
+        <w:rPr>
+          <w:rFonts w:ascii="Times New Roman" w:hAnsi="Times New Roman"/>
+          <w:color w:val="000000"/>
+          <w:sz w:val="24"/>
+          <w:szCs w:val="24"/>
+          <w:lang w:val="en-US"/>
+        </w:rPr>
+        <w:t>memberikan</w:t>
+      </w:r>
+      <w:proofErr w:type="spellEnd"/>
+      <w:r>
+        <w:rPr>
+          <w:rFonts w:ascii="Times New Roman" w:hAnsi="Times New Roman"/>
+          <w:color w:val="000000"/>
+          <w:sz w:val="24"/>
+          <w:szCs w:val="24"/>
+          <w:lang w:val="en-US"/>
+        </w:rPr>
+        <w:t xml:space="preserve"> </w:t>
+      </w:r>
+      <w:proofErr w:type="spellStart"/>
+      <w:r>
+        <w:rPr>
+          <w:rFonts w:ascii="Times New Roman" w:hAnsi="Times New Roman"/>
+          <w:color w:val="000000"/>
+          <w:sz w:val="24"/>
+          <w:szCs w:val="24"/>
+          <w:lang w:val="en-US"/>
+        </w:rPr>
+        <w:t>notifokasi</w:t>
+      </w:r>
+      <w:proofErr w:type="spellEnd"/>
+      <w:r>
+        <w:rPr>
+          <w:rFonts w:ascii="Times New Roman" w:hAnsi="Times New Roman"/>
+          <w:color w:val="000000"/>
+          <w:sz w:val="24"/>
+          <w:szCs w:val="24"/>
+          <w:lang w:val="en-US"/>
+        </w:rPr>
+        <w:t>/</w:t>
+      </w:r>
+      <w:proofErr w:type="spellStart"/>
+      <w:r>
+        <w:rPr>
+          <w:rFonts w:ascii="Times New Roman" w:hAnsi="Times New Roman"/>
+          <w:color w:val="000000"/>
+          <w:sz w:val="24"/>
+          <w:szCs w:val="24"/>
+          <w:lang w:val="en-US"/>
+        </w:rPr>
+        <w:t>pemberitahuan</w:t>
+      </w:r>
+      <w:proofErr w:type="spellEnd"/>
+      <w:r>
+        <w:rPr>
+          <w:rFonts w:ascii="Times New Roman" w:hAnsi="Times New Roman"/>
+          <w:color w:val="000000"/>
+          <w:sz w:val="24"/>
+          <w:szCs w:val="24"/>
+          <w:lang w:val="en-US"/>
+        </w:rPr>
+        <w:t xml:space="preserve"> </w:t>
+      </w:r>
+      <w:proofErr w:type="spellStart"/>
+      <w:r>
+        <w:rPr>
+          <w:rFonts w:ascii="Times New Roman" w:hAnsi="Times New Roman"/>
+          <w:color w:val="000000"/>
+          <w:sz w:val="24"/>
+          <w:szCs w:val="24"/>
+          <w:lang w:val="en-US"/>
+        </w:rPr>
+        <w:t>kepada</w:t>
+      </w:r>
+      <w:proofErr w:type="spellEnd"/>
+      <w:r>
+        <w:rPr>
+          <w:rFonts w:ascii="Times New Roman" w:hAnsi="Times New Roman"/>
+          <w:color w:val="000000"/>
+          <w:sz w:val="24"/>
+          <w:szCs w:val="24"/>
+          <w:lang w:val="en-US"/>
+        </w:rPr>
+        <w:t xml:space="preserve"> </w:t>
+      </w:r>
+      <w:proofErr w:type="spellStart"/>
+      <w:r>
+        <w:rPr>
+          <w:rFonts w:ascii="Times New Roman" w:hAnsi="Times New Roman"/>
+          <w:color w:val="000000"/>
+          <w:sz w:val="24"/>
+          <w:szCs w:val="24"/>
+          <w:lang w:val="en-US"/>
+        </w:rPr>
+        <w:t>pemilik</w:t>
+      </w:r>
+      <w:proofErr w:type="spellEnd"/>
+      <w:r>
+        <w:rPr>
+          <w:rFonts w:ascii="Times New Roman" w:hAnsi="Times New Roman"/>
+          <w:color w:val="000000"/>
+          <w:sz w:val="24"/>
+          <w:szCs w:val="24"/>
+          <w:lang w:val="en-US"/>
+        </w:rPr>
+        <w:t xml:space="preserve"> </w:t>
+      </w:r>
+      <w:proofErr w:type="spellStart"/>
+      <w:r>
+        <w:rPr>
+          <w:rFonts w:ascii="Times New Roman" w:hAnsi="Times New Roman"/>
+          <w:color w:val="000000"/>
+          <w:sz w:val="24"/>
+          <w:szCs w:val="24"/>
+          <w:lang w:val="en-US"/>
+        </w:rPr>
+        <w:t>kendaraan</w:t>
+      </w:r>
+      <w:proofErr w:type="spellEnd"/>
+      <w:r>
+        <w:rPr>
+          <w:rFonts w:ascii="Times New Roman" w:hAnsi="Times New Roman"/>
+          <w:color w:val="000000"/>
+          <w:sz w:val="24"/>
+          <w:szCs w:val="24"/>
+          <w:lang w:val="en-US"/>
+        </w:rPr>
+        <w:t xml:space="preserve"> </w:t>
+      </w:r>
+      <w:proofErr w:type="spellStart"/>
+      <w:r>
+        <w:rPr>
+          <w:rFonts w:ascii="Times New Roman" w:hAnsi="Times New Roman"/>
+          <w:color w:val="000000"/>
+          <w:sz w:val="24"/>
+          <w:szCs w:val="24"/>
+          <w:lang w:val="en-US"/>
+        </w:rPr>
+        <w:t>untuk</w:t>
+      </w:r>
+      <w:proofErr w:type="spellEnd"/>
+      <w:r>
+        <w:rPr>
+          <w:rFonts w:ascii="Times New Roman" w:hAnsi="Times New Roman"/>
+          <w:color w:val="000000"/>
+          <w:sz w:val="24"/>
+          <w:szCs w:val="24"/>
+          <w:lang w:val="en-US"/>
+        </w:rPr>
+        <w:t xml:space="preserve"> </w:t>
+      </w:r>
+      <w:proofErr w:type="spellStart"/>
+      <w:r>
+        <w:rPr>
+          <w:rFonts w:ascii="Times New Roman" w:hAnsi="Times New Roman"/>
+          <w:color w:val="000000"/>
+          <w:sz w:val="24"/>
+          <w:szCs w:val="24"/>
+          <w:lang w:val="en-US"/>
+        </w:rPr>
+        <w:t>memeriksa</w:t>
+      </w:r>
+      <w:proofErr w:type="spellEnd"/>
+      <w:r>
+        <w:rPr>
+          <w:rFonts w:ascii="Times New Roman" w:hAnsi="Times New Roman"/>
+          <w:color w:val="000000"/>
+          <w:sz w:val="24"/>
+          <w:szCs w:val="24"/>
+          <w:lang w:val="en-US"/>
+        </w:rPr>
+        <w:t xml:space="preserve"> </w:t>
+      </w:r>
+      <w:proofErr w:type="spellStart"/>
+      <w:r>
+        <w:rPr>
+          <w:rFonts w:ascii="Times New Roman" w:hAnsi="Times New Roman"/>
+          <w:color w:val="000000"/>
+          <w:sz w:val="24"/>
+          <w:szCs w:val="24"/>
+          <w:lang w:val="en-US"/>
+        </w:rPr>
+        <w:t>kembali</w:t>
+      </w:r>
+      <w:proofErr w:type="spellEnd"/>
+      <w:r>
+        <w:rPr>
+          <w:rFonts w:ascii="Times New Roman" w:hAnsi="Times New Roman"/>
+          <w:color w:val="000000"/>
+          <w:sz w:val="24"/>
+          <w:szCs w:val="24"/>
+          <w:lang w:val="en-US"/>
+        </w:rPr>
+        <w:t xml:space="preserve"> </w:t>
+      </w:r>
+      <w:proofErr w:type="spellStart"/>
+      <w:r>
+        <w:rPr>
+          <w:rFonts w:ascii="Times New Roman" w:hAnsi="Times New Roman"/>
+          <w:color w:val="000000"/>
+          <w:sz w:val="24"/>
+          <w:szCs w:val="24"/>
+          <w:lang w:val="en-US"/>
+        </w:rPr>
+        <w:t>kunci</w:t>
+      </w:r>
+      <w:proofErr w:type="spellEnd"/>
+      <w:r>
+        <w:rPr>
+          <w:rFonts w:ascii="Times New Roman" w:hAnsi="Times New Roman"/>
+          <w:color w:val="000000"/>
+          <w:sz w:val="24"/>
+          <w:szCs w:val="24"/>
+          <w:lang w:val="en-US"/>
+        </w:rPr>
+        <w:t xml:space="preserve"> </w:t>
+      </w:r>
+      <w:proofErr w:type="spellStart"/>
+      <w:r>
+        <w:rPr>
+          <w:rFonts w:ascii="Times New Roman" w:hAnsi="Times New Roman"/>
+          <w:color w:val="000000"/>
+          <w:sz w:val="24"/>
+          <w:szCs w:val="24"/>
+          <w:lang w:val="en-US"/>
+        </w:rPr>
+        <w:t>kendaraannya</w:t>
+      </w:r>
+      <w:proofErr w:type="spellEnd"/>
+      <w:r>
+        <w:rPr>
+          <w:rFonts w:ascii="Times New Roman" w:hAnsi="Times New Roman"/>
+          <w:color w:val="000000"/>
+          <w:sz w:val="24"/>
+          <w:szCs w:val="24"/>
+          <w:lang w:val="en-US"/>
+        </w:rPr>
+        <w:t xml:space="preserve">. </w:t>
+      </w:r>
+      <w:proofErr w:type="spellStart"/>
+      <w:r>
+        <w:rPr>
+          <w:rFonts w:ascii="Times New Roman" w:hAnsi="Times New Roman"/>
+          <w:color w:val="000000"/>
+          <w:sz w:val="24"/>
+          <w:szCs w:val="24"/>
+          <w:lang w:val="en-US"/>
+        </w:rPr>
+        <w:t>Disisi</w:t>
+      </w:r>
+      <w:proofErr w:type="spellEnd"/>
+      <w:r>
+        <w:rPr>
+          <w:rFonts w:ascii="Times New Roman" w:hAnsi="Times New Roman"/>
+          <w:color w:val="000000"/>
+          <w:sz w:val="24"/>
+          <w:szCs w:val="24"/>
+          <w:lang w:val="en-US"/>
+        </w:rPr>
+        <w:t xml:space="preserve"> lain </w:t>
+      </w:r>
+      <w:proofErr w:type="spellStart"/>
+      <w:r>
+        <w:rPr>
+          <w:rFonts w:ascii="Times New Roman" w:hAnsi="Times New Roman"/>
+          <w:color w:val="000000"/>
+          <w:sz w:val="24"/>
+          <w:szCs w:val="24"/>
+          <w:lang w:val="en-US"/>
+        </w:rPr>
+        <w:t>sistem</w:t>
+      </w:r>
+      <w:proofErr w:type="spellEnd"/>
+      <w:r>
+        <w:rPr>
+          <w:rFonts w:ascii="Times New Roman" w:hAnsi="Times New Roman"/>
+          <w:color w:val="000000"/>
+          <w:sz w:val="24"/>
+          <w:szCs w:val="24"/>
+          <w:lang w:val="en-US"/>
+        </w:rPr>
+        <w:t xml:space="preserve"> </w:t>
+      </w:r>
+      <w:proofErr w:type="spellStart"/>
+      <w:r>
+        <w:rPr>
+          <w:rFonts w:ascii="Times New Roman" w:hAnsi="Times New Roman"/>
+          <w:color w:val="000000"/>
+          <w:sz w:val="24"/>
+          <w:szCs w:val="24"/>
+          <w:lang w:val="en-US"/>
+        </w:rPr>
+        <w:t>ini</w:t>
+      </w:r>
+      <w:proofErr w:type="spellEnd"/>
+      <w:r>
+        <w:rPr>
+          <w:rFonts w:ascii="Times New Roman" w:hAnsi="Times New Roman"/>
+          <w:color w:val="000000"/>
+          <w:sz w:val="24"/>
+          <w:szCs w:val="24"/>
+          <w:lang w:val="en-US"/>
+        </w:rPr>
+        <w:t xml:space="preserve"> </w:t>
+      </w:r>
+      <w:proofErr w:type="spellStart"/>
+      <w:r>
+        <w:rPr>
+          <w:rFonts w:ascii="Times New Roman" w:hAnsi="Times New Roman"/>
+          <w:color w:val="000000"/>
+          <w:sz w:val="24"/>
+          <w:szCs w:val="24"/>
+          <w:lang w:val="en-US"/>
+        </w:rPr>
+        <w:t>menyematkan</w:t>
+      </w:r>
+      <w:proofErr w:type="spellEnd"/>
+      <w:r>
+        <w:rPr>
+          <w:rFonts w:ascii="Times New Roman" w:hAnsi="Times New Roman"/>
+          <w:color w:val="000000"/>
+          <w:sz w:val="24"/>
+          <w:szCs w:val="24"/>
+          <w:lang w:val="en-US"/>
+        </w:rPr>
+        <w:t xml:space="preserve"> </w:t>
+      </w:r>
+      <w:proofErr w:type="spellStart"/>
+      <w:r>
+        <w:rPr>
+          <w:rFonts w:ascii="Times New Roman" w:hAnsi="Times New Roman"/>
+          <w:color w:val="000000"/>
+          <w:sz w:val="24"/>
+          <w:szCs w:val="24"/>
+          <w:lang w:val="en-US"/>
+        </w:rPr>
+        <w:t>kontrol</w:t>
+      </w:r>
+      <w:proofErr w:type="spellEnd"/>
+      <w:r>
+        <w:rPr>
+          <w:rFonts w:ascii="Times New Roman" w:hAnsi="Times New Roman"/>
+          <w:color w:val="000000"/>
+          <w:sz w:val="24"/>
+          <w:szCs w:val="24"/>
+          <w:lang w:val="en-US"/>
+        </w:rPr>
+        <w:t xml:space="preserve"> pada </w:t>
+      </w:r>
+      <w:proofErr w:type="spellStart"/>
+      <w:r>
+        <w:rPr>
+          <w:rFonts w:ascii="Times New Roman" w:hAnsi="Times New Roman"/>
+          <w:color w:val="000000"/>
+          <w:sz w:val="24"/>
+          <w:szCs w:val="24"/>
+          <w:lang w:val="en-US"/>
+        </w:rPr>
+        <w:t>mesin</w:t>
+      </w:r>
+      <w:proofErr w:type="spellEnd"/>
+      <w:r>
+        <w:rPr>
+          <w:rFonts w:ascii="Times New Roman" w:hAnsi="Times New Roman"/>
+          <w:color w:val="000000"/>
+          <w:sz w:val="24"/>
+          <w:szCs w:val="24"/>
+          <w:lang w:val="en-US"/>
+        </w:rPr>
+        <w:t xml:space="preserve"> dan </w:t>
+      </w:r>
+      <w:proofErr w:type="spellStart"/>
+      <w:r>
+        <w:rPr>
+          <w:rFonts w:ascii="Times New Roman" w:hAnsi="Times New Roman"/>
+          <w:color w:val="000000"/>
+          <w:sz w:val="24"/>
+          <w:szCs w:val="24"/>
+          <w:lang w:val="en-US"/>
+        </w:rPr>
+        <w:t>kelistrikan</w:t>
+      </w:r>
+      <w:proofErr w:type="spellEnd"/>
+      <w:r>
+        <w:rPr>
+          <w:rFonts w:ascii="Times New Roman" w:hAnsi="Times New Roman"/>
+          <w:color w:val="000000"/>
+          <w:sz w:val="24"/>
+          <w:szCs w:val="24"/>
+          <w:lang w:val="en-US"/>
+        </w:rPr>
+        <w:t xml:space="preserve"> yang </w:t>
       </w:r>
       <w:proofErr w:type="spellStart"/>
       <w:r>
@@ -22021,6 +22345,161 @@
           <w:szCs w:val="24"/>
           <w:lang w:val="en-US"/>
         </w:rPr>
+        <w:t>dikendalikan</w:t>
+      </w:r>
+      <w:proofErr w:type="spellEnd"/>
+      <w:r>
+        <w:rPr>
+          <w:rFonts w:ascii="Times New Roman" w:hAnsi="Times New Roman"/>
+          <w:color w:val="000000"/>
+          <w:sz w:val="24"/>
+          <w:szCs w:val="24"/>
+          <w:lang w:val="en-US"/>
+        </w:rPr>
+        <w:t xml:space="preserve"> </w:t>
+      </w:r>
+      <w:proofErr w:type="spellStart"/>
+      <w:r>
+        <w:rPr>
+          <w:rFonts w:ascii="Times New Roman" w:hAnsi="Times New Roman"/>
+          <w:color w:val="000000"/>
+          <w:sz w:val="24"/>
+          <w:szCs w:val="24"/>
+          <w:lang w:val="en-US"/>
+        </w:rPr>
+        <w:t>dari</w:t>
+      </w:r>
+      <w:proofErr w:type="spellEnd"/>
+      <w:r>
+        <w:rPr>
+          <w:rFonts w:ascii="Times New Roman" w:hAnsi="Times New Roman"/>
+          <w:color w:val="000000"/>
+          <w:sz w:val="24"/>
+          <w:szCs w:val="24"/>
+          <w:lang w:val="en-US"/>
+        </w:rPr>
+        <w:t xml:space="preserve"> </w:t>
+      </w:r>
+      <w:proofErr w:type="spellStart"/>
+      <w:r>
+        <w:rPr>
+          <w:rFonts w:ascii="Times New Roman" w:hAnsi="Times New Roman"/>
+          <w:color w:val="000000"/>
+          <w:sz w:val="24"/>
+          <w:szCs w:val="24"/>
+          <w:lang w:val="en-US"/>
+        </w:rPr>
+        <w:t>jarak</w:t>
+      </w:r>
+      <w:proofErr w:type="spellEnd"/>
+      <w:r>
+        <w:rPr>
+          <w:rFonts w:ascii="Times New Roman" w:hAnsi="Times New Roman"/>
+          <w:color w:val="000000"/>
+          <w:sz w:val="24"/>
+          <w:szCs w:val="24"/>
+          <w:lang w:val="en-US"/>
+        </w:rPr>
+        <w:t xml:space="preserve"> </w:t>
+      </w:r>
+      <w:proofErr w:type="spellStart"/>
+      <w:r>
+        <w:rPr>
+          <w:rFonts w:ascii="Times New Roman" w:hAnsi="Times New Roman"/>
+          <w:color w:val="000000"/>
+          <w:sz w:val="24"/>
+          <w:szCs w:val="24"/>
+          <w:lang w:val="en-US"/>
+        </w:rPr>
+        <w:t>jauh</w:t>
+      </w:r>
+      <w:proofErr w:type="spellEnd"/>
+      <w:r>
+        <w:rPr>
+          <w:rFonts w:ascii="Times New Roman" w:hAnsi="Times New Roman"/>
+          <w:color w:val="000000"/>
+          <w:sz w:val="24"/>
+          <w:szCs w:val="24"/>
+          <w:lang w:val="en-US"/>
+        </w:rPr>
+        <w:t xml:space="preserve">. </w:t>
+      </w:r>
+      <w:proofErr w:type="spellStart"/>
+      <w:r>
+        <w:rPr>
+          <w:rFonts w:ascii="Times New Roman" w:hAnsi="Times New Roman"/>
+          <w:color w:val="000000"/>
+          <w:sz w:val="24"/>
+          <w:szCs w:val="24"/>
+          <w:lang w:val="en-US"/>
+        </w:rPr>
+        <w:lastRenderedPageBreak/>
+        <w:t>Sistem</w:t>
+      </w:r>
+      <w:proofErr w:type="spellEnd"/>
+      <w:r>
+        <w:rPr>
+          <w:rFonts w:ascii="Times New Roman" w:hAnsi="Times New Roman"/>
+          <w:color w:val="000000"/>
+          <w:sz w:val="24"/>
+          <w:szCs w:val="24"/>
+          <w:lang w:val="en-US"/>
+        </w:rPr>
+        <w:t xml:space="preserve"> </w:t>
+      </w:r>
+      <w:proofErr w:type="spellStart"/>
+      <w:r>
+        <w:rPr>
+          <w:rFonts w:ascii="Times New Roman" w:hAnsi="Times New Roman"/>
+          <w:color w:val="000000"/>
+          <w:sz w:val="24"/>
+          <w:szCs w:val="24"/>
+          <w:lang w:val="en-US"/>
+        </w:rPr>
+        <w:t>ini</w:t>
+      </w:r>
+      <w:proofErr w:type="spellEnd"/>
+      <w:r>
+        <w:rPr>
+          <w:rFonts w:ascii="Times New Roman" w:hAnsi="Times New Roman"/>
+          <w:color w:val="000000"/>
+          <w:sz w:val="24"/>
+          <w:szCs w:val="24"/>
+          <w:lang w:val="en-US"/>
+        </w:rPr>
+        <w:t xml:space="preserve"> juga </w:t>
+      </w:r>
+      <w:proofErr w:type="spellStart"/>
+      <w:r>
+        <w:rPr>
+          <w:rFonts w:ascii="Times New Roman" w:hAnsi="Times New Roman"/>
+          <w:color w:val="000000"/>
+          <w:sz w:val="24"/>
+          <w:szCs w:val="24"/>
+          <w:lang w:val="en-US"/>
+        </w:rPr>
+        <w:t>dapat</w:t>
+      </w:r>
+      <w:proofErr w:type="spellEnd"/>
+      <w:r>
+        <w:rPr>
+          <w:rFonts w:ascii="Times New Roman" w:hAnsi="Times New Roman"/>
+          <w:color w:val="000000"/>
+          <w:sz w:val="24"/>
+          <w:szCs w:val="24"/>
+          <w:lang w:val="en-US"/>
+        </w:rPr>
+        <w:t xml:space="preserve"> </w:t>
+      </w:r>
+      <w:proofErr w:type="spellStart"/>
+      <w:r>
+        <w:rPr>
+          <w:rFonts w:ascii="Times New Roman" w:hAnsi="Times New Roman"/>
+          <w:color w:val="000000"/>
+          <w:sz w:val="24"/>
+          <w:szCs w:val="24"/>
+          <w:lang w:val="en-US"/>
+        </w:rPr>
         <w:t>melakukan</w:t>
       </w:r>
       <w:proofErr w:type="spellEnd"/>
@@ -22043,51 +22522,568 @@
           <w:szCs w:val="24"/>
           <w:lang w:val="en-US"/>
         </w:rPr>
-        <w:t>kendali</w:t>
-      </w:r>
-      <w:proofErr w:type="spellEnd"/>
-      <w:r>
-        <w:rPr>
-          <w:rFonts w:ascii="Times New Roman" w:hAnsi="Times New Roman"/>
-          <w:color w:val="000000"/>
-          <w:sz w:val="24"/>
-          <w:szCs w:val="24"/>
-          <w:lang w:val="en-US"/>
-        </w:rPr>
-        <w:t xml:space="preserve"> </w:t>
-      </w:r>
-      <w:proofErr w:type="spellStart"/>
-      <w:r>
-        <w:rPr>
-          <w:rFonts w:ascii="Times New Roman" w:hAnsi="Times New Roman"/>
-          <w:color w:val="000000"/>
-          <w:sz w:val="24"/>
-          <w:szCs w:val="24"/>
-          <w:lang w:val="en-US"/>
-        </w:rPr>
-        <w:t>terhadap</w:t>
-      </w:r>
-      <w:proofErr w:type="spellEnd"/>
-      <w:r>
-        <w:rPr>
-          <w:rFonts w:ascii="Times New Roman" w:hAnsi="Times New Roman"/>
-          <w:color w:val="000000"/>
-          <w:sz w:val="24"/>
-          <w:szCs w:val="24"/>
-          <w:lang w:val="en-US"/>
-        </w:rPr>
-        <w:t xml:space="preserve"> </w:t>
-      </w:r>
-      <w:proofErr w:type="spellStart"/>
-      <w:r>
-        <w:rPr>
-          <w:rFonts w:ascii="Times New Roman" w:hAnsi="Times New Roman"/>
-          <w:color w:val="000000"/>
-          <w:sz w:val="24"/>
-          <w:szCs w:val="24"/>
-          <w:lang w:val="en-US"/>
-        </w:rPr>
-        <w:t>mesin</w:t>
+        <w:t>pelacakan</w:t>
+      </w:r>
+      <w:proofErr w:type="spellEnd"/>
+      <w:r>
+        <w:rPr>
+          <w:rFonts w:ascii="Times New Roman" w:hAnsi="Times New Roman"/>
+          <w:color w:val="000000"/>
+          <w:sz w:val="24"/>
+          <w:szCs w:val="24"/>
+          <w:lang w:val="en-US"/>
+        </w:rPr>
+        <w:t xml:space="preserve"> </w:t>
+      </w:r>
+      <w:proofErr w:type="spellStart"/>
+      <w:r>
+        <w:rPr>
+          <w:rFonts w:ascii="Times New Roman" w:hAnsi="Times New Roman"/>
+          <w:color w:val="000000"/>
+          <w:sz w:val="24"/>
+          <w:szCs w:val="24"/>
+          <w:lang w:val="en-US"/>
+        </w:rPr>
+        <w:t>lokasi</w:t>
+      </w:r>
+      <w:proofErr w:type="spellEnd"/>
+      <w:r>
+        <w:rPr>
+          <w:rFonts w:ascii="Times New Roman" w:hAnsi="Times New Roman"/>
+          <w:color w:val="000000"/>
+          <w:sz w:val="24"/>
+          <w:szCs w:val="24"/>
+          <w:lang w:val="en-US"/>
+        </w:rPr>
+        <w:t xml:space="preserve"> </w:t>
+      </w:r>
+      <w:proofErr w:type="spellStart"/>
+      <w:r>
+        <w:rPr>
+          <w:rFonts w:ascii="Times New Roman" w:hAnsi="Times New Roman"/>
+          <w:color w:val="000000"/>
+          <w:sz w:val="24"/>
+          <w:szCs w:val="24"/>
+          <w:lang w:val="en-US"/>
+        </w:rPr>
+        <w:t>dari</w:t>
+      </w:r>
+      <w:proofErr w:type="spellEnd"/>
+      <w:r>
+        <w:rPr>
+          <w:rFonts w:ascii="Times New Roman" w:hAnsi="Times New Roman"/>
+          <w:color w:val="000000"/>
+          <w:sz w:val="24"/>
+          <w:szCs w:val="24"/>
+          <w:lang w:val="en-US"/>
+        </w:rPr>
+        <w:t xml:space="preserve"> </w:t>
+      </w:r>
+      <w:proofErr w:type="spellStart"/>
+      <w:r>
+        <w:rPr>
+          <w:rFonts w:ascii="Times New Roman" w:hAnsi="Times New Roman"/>
+          <w:color w:val="000000"/>
+          <w:sz w:val="24"/>
+          <w:szCs w:val="24"/>
+          <w:lang w:val="en-US"/>
+        </w:rPr>
+        <w:t>kendaraan</w:t>
+      </w:r>
+      <w:proofErr w:type="spellEnd"/>
+      <w:r>
+        <w:rPr>
+          <w:rFonts w:ascii="Times New Roman" w:hAnsi="Times New Roman"/>
+          <w:color w:val="000000"/>
+          <w:sz w:val="24"/>
+          <w:szCs w:val="24"/>
+          <w:lang w:val="en-US"/>
+        </w:rPr>
+        <w:t xml:space="preserve"> yang </w:t>
+      </w:r>
+      <w:proofErr w:type="spellStart"/>
+      <w:r>
+        <w:rPr>
+          <w:rFonts w:ascii="Times New Roman" w:hAnsi="Times New Roman"/>
+          <w:color w:val="000000"/>
+          <w:sz w:val="24"/>
+          <w:szCs w:val="24"/>
+          <w:lang w:val="en-US"/>
+        </w:rPr>
+        <w:t>dipasangkan</w:t>
+      </w:r>
+      <w:proofErr w:type="spellEnd"/>
+      <w:r>
+        <w:rPr>
+          <w:rFonts w:ascii="Times New Roman" w:hAnsi="Times New Roman"/>
+          <w:color w:val="000000"/>
+          <w:sz w:val="24"/>
+          <w:szCs w:val="24"/>
+          <w:lang w:val="en-US"/>
+        </w:rPr>
+        <w:t xml:space="preserve"> juga </w:t>
+      </w:r>
+      <w:proofErr w:type="spellStart"/>
+      <w:r>
+        <w:rPr>
+          <w:rFonts w:ascii="Times New Roman" w:hAnsi="Times New Roman"/>
+          <w:color w:val="000000"/>
+          <w:sz w:val="24"/>
+          <w:szCs w:val="24"/>
+          <w:lang w:val="en-US"/>
+        </w:rPr>
+        <w:t>memberikan</w:t>
+      </w:r>
+      <w:proofErr w:type="spellEnd"/>
+      <w:r>
+        <w:rPr>
+          <w:rFonts w:ascii="Times New Roman" w:hAnsi="Times New Roman"/>
+          <w:color w:val="000000"/>
+          <w:sz w:val="24"/>
+          <w:szCs w:val="24"/>
+          <w:lang w:val="en-US"/>
+        </w:rPr>
+        <w:t xml:space="preserve"> </w:t>
+      </w:r>
+      <w:proofErr w:type="spellStart"/>
+      <w:r>
+        <w:rPr>
+          <w:rFonts w:ascii="Times New Roman" w:hAnsi="Times New Roman"/>
+          <w:color w:val="000000"/>
+          <w:sz w:val="24"/>
+          <w:szCs w:val="24"/>
+          <w:lang w:val="en-US"/>
+        </w:rPr>
+        <w:t>peringatan</w:t>
+      </w:r>
+      <w:proofErr w:type="spellEnd"/>
+      <w:r>
+        <w:rPr>
+          <w:rFonts w:ascii="Times New Roman" w:hAnsi="Times New Roman"/>
+          <w:color w:val="000000"/>
+          <w:sz w:val="24"/>
+          <w:szCs w:val="24"/>
+          <w:lang w:val="en-US"/>
+        </w:rPr>
+        <w:t xml:space="preserve"> </w:t>
+      </w:r>
+      <w:proofErr w:type="spellStart"/>
+      <w:r>
+        <w:rPr>
+          <w:rFonts w:ascii="Times New Roman" w:hAnsi="Times New Roman"/>
+          <w:color w:val="000000"/>
+          <w:sz w:val="24"/>
+          <w:szCs w:val="24"/>
+          <w:lang w:val="en-US"/>
+        </w:rPr>
+        <w:t>dini</w:t>
+      </w:r>
+      <w:proofErr w:type="spellEnd"/>
+      <w:r>
+        <w:rPr>
+          <w:rFonts w:ascii="Times New Roman" w:hAnsi="Times New Roman"/>
+          <w:color w:val="000000"/>
+          <w:sz w:val="24"/>
+          <w:szCs w:val="24"/>
+          <w:lang w:val="en-US"/>
+        </w:rPr>
+        <w:t xml:space="preserve"> </w:t>
+      </w:r>
+      <w:proofErr w:type="spellStart"/>
+      <w:r>
+        <w:rPr>
+          <w:rFonts w:ascii="Times New Roman" w:hAnsi="Times New Roman"/>
+          <w:color w:val="000000"/>
+          <w:sz w:val="24"/>
+          <w:szCs w:val="24"/>
+          <w:lang w:val="en-US"/>
+        </w:rPr>
+        <w:t>ke</w:t>
+      </w:r>
+      <w:proofErr w:type="spellEnd"/>
+      <w:r>
+        <w:rPr>
+          <w:rFonts w:ascii="Times New Roman" w:hAnsi="Times New Roman"/>
+          <w:color w:val="000000"/>
+          <w:sz w:val="24"/>
+          <w:szCs w:val="24"/>
+          <w:lang w:val="en-US"/>
+        </w:rPr>
+        <w:t xml:space="preserve"> </w:t>
+      </w:r>
+      <w:proofErr w:type="spellStart"/>
+      <w:r>
+        <w:rPr>
+          <w:rFonts w:ascii="Times New Roman" w:hAnsi="Times New Roman"/>
+          <w:color w:val="000000"/>
+          <w:sz w:val="24"/>
+          <w:szCs w:val="24"/>
+          <w:lang w:val="en-US"/>
+        </w:rPr>
+        <w:t>pemilik</w:t>
+      </w:r>
+      <w:proofErr w:type="spellEnd"/>
+      <w:r>
+        <w:rPr>
+          <w:rFonts w:ascii="Times New Roman" w:hAnsi="Times New Roman"/>
+          <w:color w:val="000000"/>
+          <w:sz w:val="24"/>
+          <w:szCs w:val="24"/>
+          <w:lang w:val="en-US"/>
+        </w:rPr>
+        <w:t xml:space="preserve"> </w:t>
+      </w:r>
+      <w:proofErr w:type="spellStart"/>
+      <w:r>
+        <w:rPr>
+          <w:rFonts w:ascii="Times New Roman" w:hAnsi="Times New Roman"/>
+          <w:color w:val="000000"/>
+          <w:sz w:val="24"/>
+          <w:szCs w:val="24"/>
+          <w:lang w:val="en-US"/>
+        </w:rPr>
+        <w:t>melalui</w:t>
+      </w:r>
+      <w:proofErr w:type="spellEnd"/>
+      <w:r>
+        <w:rPr>
+          <w:rFonts w:ascii="Times New Roman" w:hAnsi="Times New Roman"/>
+          <w:color w:val="000000"/>
+          <w:sz w:val="24"/>
+          <w:szCs w:val="24"/>
+          <w:lang w:val="en-US"/>
+        </w:rPr>
+        <w:t xml:space="preserve"> </w:t>
+      </w:r>
+      <w:proofErr w:type="spellStart"/>
+      <w:r>
+        <w:rPr>
+          <w:rFonts w:ascii="Times New Roman" w:hAnsi="Times New Roman"/>
+          <w:color w:val="000000"/>
+          <w:sz w:val="24"/>
+          <w:szCs w:val="24"/>
+          <w:lang w:val="en-US"/>
+        </w:rPr>
+        <w:t>aplikasi</w:t>
+      </w:r>
+      <w:proofErr w:type="spellEnd"/>
+      <w:r>
+        <w:rPr>
+          <w:rFonts w:ascii="Times New Roman" w:hAnsi="Times New Roman"/>
+          <w:color w:val="000000"/>
+          <w:sz w:val="24"/>
+          <w:szCs w:val="24"/>
+          <w:lang w:val="en-US"/>
+        </w:rPr>
+        <w:t xml:space="preserve"> yang </w:t>
+      </w:r>
+      <w:proofErr w:type="spellStart"/>
+      <w:r>
+        <w:rPr>
+          <w:rFonts w:ascii="Times New Roman" w:hAnsi="Times New Roman"/>
+          <w:color w:val="000000"/>
+          <w:sz w:val="24"/>
+          <w:szCs w:val="24"/>
+          <w:lang w:val="en-US"/>
+        </w:rPr>
+        <w:t>ada</w:t>
+      </w:r>
+      <w:proofErr w:type="spellEnd"/>
+      <w:r>
+        <w:rPr>
+          <w:rFonts w:ascii="Times New Roman" w:hAnsi="Times New Roman"/>
+          <w:color w:val="000000"/>
+          <w:sz w:val="24"/>
+          <w:szCs w:val="24"/>
+          <w:lang w:val="en-US"/>
+        </w:rPr>
+        <w:t xml:space="preserve"> pada smartphone dan </w:t>
+      </w:r>
+      <w:proofErr w:type="spellStart"/>
+      <w:r>
+        <w:rPr>
+          <w:rFonts w:ascii="Times New Roman" w:hAnsi="Times New Roman"/>
+          <w:color w:val="000000"/>
+          <w:sz w:val="24"/>
+          <w:szCs w:val="24"/>
+          <w:lang w:val="en-US"/>
+        </w:rPr>
+        <w:t>dapat</w:t>
+      </w:r>
+      <w:proofErr w:type="spellEnd"/>
+      <w:r>
+        <w:rPr>
+          <w:rFonts w:ascii="Times New Roman" w:hAnsi="Times New Roman"/>
+          <w:color w:val="000000"/>
+          <w:sz w:val="24"/>
+          <w:szCs w:val="24"/>
+          <w:lang w:val="en-US"/>
+        </w:rPr>
+        <w:t xml:space="preserve"> </w:t>
+      </w:r>
+      <w:proofErr w:type="spellStart"/>
+      <w:r>
+        <w:rPr>
+          <w:rFonts w:ascii="Times New Roman" w:hAnsi="Times New Roman"/>
+          <w:color w:val="000000"/>
+          <w:sz w:val="24"/>
+          <w:szCs w:val="24"/>
+          <w:lang w:val="en-US"/>
+        </w:rPr>
+        <w:t>memantau</w:t>
+      </w:r>
+      <w:proofErr w:type="spellEnd"/>
+      <w:r>
+        <w:rPr>
+          <w:rFonts w:ascii="Times New Roman" w:hAnsi="Times New Roman"/>
+          <w:color w:val="000000"/>
+          <w:sz w:val="24"/>
+          <w:szCs w:val="24"/>
+          <w:lang w:val="en-US"/>
+        </w:rPr>
+        <w:t xml:space="preserve"> </w:t>
+      </w:r>
+      <w:proofErr w:type="spellStart"/>
+      <w:r>
+        <w:rPr>
+          <w:rFonts w:ascii="Times New Roman" w:hAnsi="Times New Roman"/>
+          <w:color w:val="000000"/>
+          <w:sz w:val="24"/>
+          <w:szCs w:val="24"/>
+          <w:lang w:val="en-US"/>
+        </w:rPr>
+        <w:t>keberadaan</w:t>
+      </w:r>
+      <w:proofErr w:type="spellEnd"/>
+      <w:r>
+        <w:rPr>
+          <w:rFonts w:ascii="Times New Roman" w:hAnsi="Times New Roman"/>
+          <w:color w:val="000000"/>
+          <w:sz w:val="24"/>
+          <w:szCs w:val="24"/>
+          <w:lang w:val="en-US"/>
+        </w:rPr>
+        <w:t xml:space="preserve"> </w:t>
+      </w:r>
+      <w:proofErr w:type="spellStart"/>
+      <w:r>
+        <w:rPr>
+          <w:rFonts w:ascii="Times New Roman" w:hAnsi="Times New Roman"/>
+          <w:color w:val="000000"/>
+          <w:sz w:val="24"/>
+          <w:szCs w:val="24"/>
+          <w:lang w:val="en-US"/>
+        </w:rPr>
+        <w:t>dari</w:t>
+      </w:r>
+      <w:proofErr w:type="spellEnd"/>
+      <w:r>
+        <w:rPr>
+          <w:rFonts w:ascii="Times New Roman" w:hAnsi="Times New Roman"/>
+          <w:color w:val="000000"/>
+          <w:sz w:val="24"/>
+          <w:szCs w:val="24"/>
+          <w:lang w:val="en-US"/>
+        </w:rPr>
+        <w:t xml:space="preserve"> </w:t>
+      </w:r>
+      <w:proofErr w:type="spellStart"/>
+      <w:r>
+        <w:rPr>
+          <w:rFonts w:ascii="Times New Roman" w:hAnsi="Times New Roman"/>
+          <w:color w:val="000000"/>
+          <w:sz w:val="24"/>
+          <w:szCs w:val="24"/>
+          <w:lang w:val="en-US"/>
+        </w:rPr>
+        <w:t>sepeda</w:t>
+      </w:r>
+      <w:proofErr w:type="spellEnd"/>
+      <w:r>
+        <w:rPr>
+          <w:rFonts w:ascii="Times New Roman" w:hAnsi="Times New Roman"/>
+          <w:color w:val="000000"/>
+          <w:sz w:val="24"/>
+          <w:szCs w:val="24"/>
+          <w:lang w:val="en-US"/>
+        </w:rPr>
+        <w:t xml:space="preserve"> motor </w:t>
+      </w:r>
+      <w:proofErr w:type="spellStart"/>
+      <w:r>
+        <w:rPr>
+          <w:rFonts w:ascii="Times New Roman" w:hAnsi="Times New Roman"/>
+          <w:color w:val="000000"/>
+          <w:sz w:val="24"/>
+          <w:szCs w:val="24"/>
+          <w:lang w:val="en-US"/>
+        </w:rPr>
+        <w:t>miliknnya</w:t>
+      </w:r>
+      <w:proofErr w:type="spellEnd"/>
+      <w:r>
+        <w:rPr>
+          <w:rFonts w:ascii="Times New Roman" w:hAnsi="Times New Roman"/>
+          <w:color w:val="000000"/>
+          <w:sz w:val="24"/>
+          <w:szCs w:val="24"/>
+          <w:lang w:val="en-US"/>
+        </w:rPr>
+        <w:t>.</w:t>
+      </w:r>
+    </w:p>
+    <w:p>
+      <w:pPr>
+        <w:pStyle w:val="ListParagraph"/>
+        <w:widowControl w:val="0"/>
+        <w:tabs>
+          <w:tab w:val="left" w:leader="dot" w:pos="8222"/>
+          <w:tab w:val="right" w:pos="8788"/>
+        </w:tabs>
+        <w:autoSpaceDE w:val="0"/>
+        <w:autoSpaceDN w:val="0"/>
+        <w:adjustRightInd w:val="0"/>
+        <w:spacing w:after="0" w:line="360" w:lineRule="auto"/>
+        <w:ind w:left="0" w:firstLine="567"/>
+        <w:jc w:val="both"/>
+        <w:rPr>
+          <w:rFonts w:ascii="Times New Roman" w:hAnsi="Times New Roman"/>
+          <w:color w:val="000000"/>
+          <w:sz w:val="24"/>
+          <w:szCs w:val="24"/>
+          <w:lang w:val="en-US"/>
+        </w:rPr>
+      </w:pPr>
+      <w:r>
+        <w:rPr>
+          <w:rFonts w:ascii="Times New Roman" w:hAnsi="Times New Roman"/>
+          <w:color w:val="000000"/>
+          <w:sz w:val="24"/>
+          <w:szCs w:val="24"/>
+          <w:lang w:val="en-US"/>
+        </w:rPr>
+        <w:t xml:space="preserve">Pada </w:t>
+      </w:r>
+      <w:proofErr w:type="spellStart"/>
+      <w:r>
+        <w:rPr>
+          <w:rFonts w:ascii="Times New Roman" w:hAnsi="Times New Roman"/>
+          <w:color w:val="000000"/>
+          <w:sz w:val="24"/>
+          <w:szCs w:val="24"/>
+          <w:lang w:val="en-US"/>
+        </w:rPr>
+        <w:t>penelitian</w:t>
+      </w:r>
+      <w:proofErr w:type="spellEnd"/>
+      <w:r>
+        <w:rPr>
+          <w:rFonts w:ascii="Times New Roman" w:hAnsi="Times New Roman"/>
+          <w:color w:val="000000"/>
+          <w:sz w:val="24"/>
+          <w:szCs w:val="24"/>
+          <w:lang w:val="en-US"/>
+        </w:rPr>
+        <w:t xml:space="preserve"> </w:t>
+      </w:r>
+      <w:proofErr w:type="spellStart"/>
+      <w:r>
+        <w:rPr>
+          <w:rFonts w:ascii="Times New Roman" w:hAnsi="Times New Roman"/>
+          <w:color w:val="000000"/>
+          <w:sz w:val="24"/>
+          <w:szCs w:val="24"/>
+          <w:lang w:val="en-US"/>
+        </w:rPr>
+        <w:t>sebelumya</w:t>
+      </w:r>
+      <w:proofErr w:type="spellEnd"/>
+      <w:r>
+        <w:rPr>
+          <w:rFonts w:ascii="Times New Roman" w:hAnsi="Times New Roman"/>
+          <w:color w:val="000000"/>
+          <w:sz w:val="24"/>
+          <w:szCs w:val="24"/>
+          <w:lang w:val="en-US"/>
+        </w:rPr>
+        <w:t xml:space="preserve"> </w:t>
+      </w:r>
+      <w:proofErr w:type="spellStart"/>
+      <w:r>
+        <w:rPr>
+          <w:rFonts w:ascii="Times New Roman" w:hAnsi="Times New Roman"/>
+          <w:color w:val="000000"/>
+          <w:sz w:val="24"/>
+          <w:szCs w:val="24"/>
+          <w:lang w:val="en-US"/>
+        </w:rPr>
+        <w:t>komunikasi</w:t>
+      </w:r>
+      <w:proofErr w:type="spellEnd"/>
+      <w:r>
+        <w:rPr>
+          <w:rFonts w:ascii="Times New Roman" w:hAnsi="Times New Roman"/>
+          <w:color w:val="000000"/>
+          <w:sz w:val="24"/>
+          <w:szCs w:val="24"/>
+          <w:lang w:val="en-US"/>
+        </w:rPr>
+        <w:t xml:space="preserve"> yang </w:t>
+      </w:r>
+      <w:proofErr w:type="spellStart"/>
+      <w:r>
+        <w:rPr>
+          <w:rFonts w:ascii="Times New Roman" w:hAnsi="Times New Roman"/>
+          <w:color w:val="000000"/>
+          <w:sz w:val="24"/>
+          <w:szCs w:val="24"/>
+          <w:lang w:val="en-US"/>
+        </w:rPr>
+        <w:t>digunakan</w:t>
+      </w:r>
+      <w:proofErr w:type="spellEnd"/>
+      <w:r>
+        <w:rPr>
+          <w:rFonts w:ascii="Times New Roman" w:hAnsi="Times New Roman"/>
+          <w:color w:val="000000"/>
+          <w:sz w:val="24"/>
+          <w:szCs w:val="24"/>
+          <w:lang w:val="en-US"/>
+        </w:rPr>
+        <w:t xml:space="preserve"> </w:t>
+      </w:r>
+      <w:proofErr w:type="spellStart"/>
+      <w:r>
+        <w:rPr>
+          <w:rFonts w:ascii="Times New Roman" w:hAnsi="Times New Roman"/>
+          <w:color w:val="000000"/>
+          <w:sz w:val="24"/>
+          <w:szCs w:val="24"/>
+          <w:lang w:val="en-US"/>
+        </w:rPr>
+        <w:t>antara</w:t>
+      </w:r>
+      <w:proofErr w:type="spellEnd"/>
+      <w:r>
+        <w:rPr>
+          <w:rFonts w:ascii="Times New Roman" w:hAnsi="Times New Roman"/>
+          <w:color w:val="000000"/>
+          <w:sz w:val="24"/>
+          <w:szCs w:val="24"/>
+          <w:lang w:val="en-US"/>
+        </w:rPr>
+        <w:t xml:space="preserve"> </w:t>
+      </w:r>
+      <w:proofErr w:type="spellStart"/>
+      <w:r>
+        <w:rPr>
+          <w:rFonts w:ascii="Times New Roman" w:hAnsi="Times New Roman"/>
+          <w:color w:val="000000"/>
+          <w:sz w:val="24"/>
+          <w:szCs w:val="24"/>
+          <w:lang w:val="en-US"/>
+        </w:rPr>
+        <w:t>perangkat</w:t>
       </w:r>
       <w:proofErr w:type="spellEnd"/>
       <w:r>
@@ -22109,139 +23105,843 @@
           <w:szCs w:val="24"/>
           <w:lang w:val="en-US"/>
         </w:rPr>
-        <w:t>kelistrikan</w:t>
-      </w:r>
-      <w:proofErr w:type="spellEnd"/>
-      <w:r>
-        <w:rPr>
-          <w:rFonts w:ascii="Times New Roman" w:hAnsi="Times New Roman"/>
-          <w:color w:val="000000"/>
-          <w:sz w:val="24"/>
-          <w:szCs w:val="24"/>
-          <w:lang w:val="en-US"/>
-        </w:rPr>
-        <w:t xml:space="preserve"> </w:t>
-      </w:r>
-      <w:proofErr w:type="spellStart"/>
-      <w:r>
-        <w:rPr>
-          <w:rFonts w:ascii="Times New Roman" w:hAnsi="Times New Roman"/>
-          <w:color w:val="000000"/>
-          <w:sz w:val="24"/>
-          <w:szCs w:val="24"/>
-          <w:lang w:val="en-US"/>
-        </w:rPr>
-        <w:t>sepeda</w:t>
-      </w:r>
-      <w:proofErr w:type="spellEnd"/>
-      <w:r>
-        <w:rPr>
-          <w:rFonts w:ascii="Times New Roman" w:hAnsi="Times New Roman"/>
-          <w:color w:val="000000"/>
-          <w:sz w:val="24"/>
-          <w:szCs w:val="24"/>
-          <w:lang w:val="en-US"/>
-        </w:rPr>
-        <w:t xml:space="preserve"> motor juga </w:t>
-      </w:r>
-      <w:proofErr w:type="spellStart"/>
-      <w:r>
-        <w:rPr>
-          <w:rFonts w:ascii="Times New Roman" w:hAnsi="Times New Roman"/>
-          <w:color w:val="000000"/>
-          <w:sz w:val="24"/>
-          <w:szCs w:val="24"/>
-          <w:lang w:val="en-US"/>
-        </w:rPr>
-        <w:t>memberikan</w:t>
-      </w:r>
-      <w:proofErr w:type="spellEnd"/>
-      <w:r>
-        <w:rPr>
-          <w:rFonts w:ascii="Times New Roman" w:hAnsi="Times New Roman"/>
-          <w:color w:val="000000"/>
-          <w:sz w:val="24"/>
-          <w:szCs w:val="24"/>
-          <w:lang w:val="en-US"/>
-        </w:rPr>
-        <w:t xml:space="preserve"> </w:t>
-      </w:r>
-      <w:proofErr w:type="spellStart"/>
-      <w:r>
-        <w:rPr>
-          <w:rFonts w:ascii="Times New Roman" w:hAnsi="Times New Roman"/>
-          <w:color w:val="000000"/>
-          <w:sz w:val="24"/>
-          <w:szCs w:val="24"/>
-          <w:lang w:val="en-US"/>
-        </w:rPr>
-        <w:t>peringatan</w:t>
-      </w:r>
-      <w:proofErr w:type="spellEnd"/>
-      <w:r>
-        <w:rPr>
-          <w:rFonts w:ascii="Times New Roman" w:hAnsi="Times New Roman"/>
-          <w:color w:val="000000"/>
-          <w:sz w:val="24"/>
-          <w:szCs w:val="24"/>
-          <w:lang w:val="en-US"/>
-        </w:rPr>
-        <w:t xml:space="preserve"> </w:t>
-      </w:r>
-      <w:proofErr w:type="spellStart"/>
-      <w:r>
-        <w:rPr>
-          <w:rFonts w:ascii="Times New Roman" w:hAnsi="Times New Roman"/>
-          <w:color w:val="000000"/>
-          <w:sz w:val="24"/>
-          <w:szCs w:val="24"/>
-          <w:lang w:val="en-US"/>
-        </w:rPr>
-        <w:t>dini</w:t>
-      </w:r>
-      <w:proofErr w:type="spellEnd"/>
-      <w:r>
-        <w:rPr>
-          <w:rFonts w:ascii="Times New Roman" w:hAnsi="Times New Roman"/>
-          <w:color w:val="000000"/>
-          <w:sz w:val="24"/>
-          <w:szCs w:val="24"/>
-          <w:lang w:val="en-US"/>
-        </w:rPr>
-        <w:t xml:space="preserve"> </w:t>
-      </w:r>
-      <w:proofErr w:type="spellStart"/>
-      <w:r>
-        <w:rPr>
-          <w:rFonts w:ascii="Times New Roman" w:hAnsi="Times New Roman"/>
-          <w:color w:val="000000"/>
-          <w:sz w:val="24"/>
-          <w:szCs w:val="24"/>
-          <w:lang w:val="en-US"/>
-        </w:rPr>
-        <w:t>ke</w:t>
-      </w:r>
-      <w:proofErr w:type="spellEnd"/>
-      <w:r>
-        <w:rPr>
-          <w:rFonts w:ascii="Times New Roman" w:hAnsi="Times New Roman"/>
-          <w:color w:val="000000"/>
-          <w:sz w:val="24"/>
-          <w:szCs w:val="24"/>
-          <w:lang w:val="en-US"/>
-        </w:rPr>
-        <w:t xml:space="preserve"> </w:t>
-      </w:r>
-      <w:proofErr w:type="spellStart"/>
-      <w:r>
-        <w:rPr>
-          <w:rFonts w:ascii="Times New Roman" w:hAnsi="Times New Roman"/>
-          <w:color w:val="000000"/>
-          <w:sz w:val="24"/>
-          <w:szCs w:val="24"/>
-          <w:lang w:val="en-US"/>
-        </w:rPr>
-        <w:t>pemilik</w:t>
+        <w:t>pengguna</w:t>
+      </w:r>
+      <w:proofErr w:type="spellEnd"/>
+      <w:r>
+        <w:rPr>
+          <w:rFonts w:ascii="Times New Roman" w:hAnsi="Times New Roman"/>
+          <w:color w:val="000000"/>
+          <w:sz w:val="24"/>
+          <w:szCs w:val="24"/>
+          <w:lang w:val="en-US"/>
+        </w:rPr>
+        <w:t xml:space="preserve"> </w:t>
+      </w:r>
+      <w:proofErr w:type="spellStart"/>
+      <w:r>
+        <w:rPr>
+          <w:rFonts w:ascii="Times New Roman" w:hAnsi="Times New Roman"/>
+          <w:color w:val="000000"/>
+          <w:sz w:val="24"/>
+          <w:szCs w:val="24"/>
+          <w:lang w:val="en-US"/>
+        </w:rPr>
+        <w:t>masing</w:t>
+      </w:r>
+      <w:proofErr w:type="spellEnd"/>
+      <w:r>
+        <w:rPr>
+          <w:rFonts w:ascii="Times New Roman" w:hAnsi="Times New Roman"/>
+          <w:color w:val="000000"/>
+          <w:sz w:val="24"/>
+          <w:szCs w:val="24"/>
+          <w:lang w:val="en-US"/>
+        </w:rPr>
+        <w:t xml:space="preserve"> </w:t>
+      </w:r>
+      <w:proofErr w:type="spellStart"/>
+      <w:r>
+        <w:rPr>
+          <w:rFonts w:ascii="Times New Roman" w:hAnsi="Times New Roman"/>
+          <w:color w:val="000000"/>
+          <w:sz w:val="24"/>
+          <w:szCs w:val="24"/>
+          <w:lang w:val="en-US"/>
+        </w:rPr>
+        <w:t>menggunakan</w:t>
+      </w:r>
+      <w:proofErr w:type="spellEnd"/>
+      <w:r>
+        <w:rPr>
+          <w:rFonts w:ascii="Times New Roman" w:hAnsi="Times New Roman"/>
+          <w:color w:val="000000"/>
+          <w:sz w:val="24"/>
+          <w:szCs w:val="24"/>
+          <w:lang w:val="en-US"/>
+        </w:rPr>
+        <w:t xml:space="preserve"> </w:t>
+      </w:r>
+      <w:proofErr w:type="spellStart"/>
+      <w:r>
+        <w:rPr>
+          <w:rFonts w:ascii="Times New Roman" w:hAnsi="Times New Roman"/>
+          <w:color w:val="000000"/>
+          <w:sz w:val="24"/>
+          <w:szCs w:val="24"/>
+          <w:lang w:val="en-US"/>
+        </w:rPr>
+        <w:t>layanan</w:t>
+      </w:r>
+      <w:proofErr w:type="spellEnd"/>
+      <w:r>
+        <w:rPr>
+          <w:rFonts w:ascii="Times New Roman" w:hAnsi="Times New Roman"/>
+          <w:color w:val="000000"/>
+          <w:sz w:val="24"/>
+          <w:szCs w:val="24"/>
+          <w:lang w:val="en-US"/>
+        </w:rPr>
+        <w:t xml:space="preserve"> </w:t>
+      </w:r>
+      <w:proofErr w:type="spellStart"/>
+      <w:r>
+        <w:rPr>
+          <w:rFonts w:ascii="Times New Roman" w:hAnsi="Times New Roman"/>
+          <w:color w:val="000000"/>
+          <w:sz w:val="24"/>
+          <w:szCs w:val="24"/>
+          <w:lang w:val="en-US"/>
+        </w:rPr>
+        <w:t>pesan</w:t>
+      </w:r>
+      <w:proofErr w:type="spellEnd"/>
+      <w:r>
+        <w:rPr>
+          <w:rFonts w:ascii="Times New Roman" w:hAnsi="Times New Roman"/>
+          <w:color w:val="000000"/>
+          <w:sz w:val="24"/>
+          <w:szCs w:val="24"/>
+          <w:lang w:val="en-US"/>
+        </w:rPr>
+        <w:t xml:space="preserve"> </w:t>
+      </w:r>
+      <w:proofErr w:type="spellStart"/>
+      <w:r>
+        <w:rPr>
+          <w:rFonts w:ascii="Times New Roman" w:hAnsi="Times New Roman"/>
+          <w:color w:val="000000"/>
+          <w:sz w:val="24"/>
+          <w:szCs w:val="24"/>
+          <w:lang w:val="en-US"/>
+        </w:rPr>
+        <w:t>singkat</w:t>
+      </w:r>
+      <w:proofErr w:type="spellEnd"/>
+      <w:r>
+        <w:rPr>
+          <w:rFonts w:ascii="Times New Roman" w:hAnsi="Times New Roman"/>
+          <w:color w:val="000000"/>
+          <w:sz w:val="24"/>
+          <w:szCs w:val="24"/>
+          <w:lang w:val="en-US"/>
+        </w:rPr>
+        <w:t xml:space="preserve"> (SMS), dan pada </w:t>
+      </w:r>
+      <w:proofErr w:type="spellStart"/>
+      <w:r>
+        <w:rPr>
+          <w:rFonts w:ascii="Times New Roman" w:hAnsi="Times New Roman"/>
+          <w:color w:val="000000"/>
+          <w:sz w:val="24"/>
+          <w:szCs w:val="24"/>
+          <w:lang w:val="en-US"/>
+        </w:rPr>
+        <w:t>beberapa</w:t>
+      </w:r>
+      <w:proofErr w:type="spellEnd"/>
+      <w:r>
+        <w:rPr>
+          <w:rFonts w:ascii="Times New Roman" w:hAnsi="Times New Roman"/>
+          <w:color w:val="000000"/>
+          <w:sz w:val="24"/>
+          <w:szCs w:val="24"/>
+          <w:lang w:val="en-US"/>
+        </w:rPr>
+        <w:t xml:space="preserve"> </w:t>
+      </w:r>
+      <w:proofErr w:type="spellStart"/>
+      <w:r>
+        <w:rPr>
+          <w:rFonts w:ascii="Times New Roman" w:hAnsi="Times New Roman"/>
+          <w:color w:val="000000"/>
+          <w:sz w:val="24"/>
+          <w:szCs w:val="24"/>
+          <w:lang w:val="en-US"/>
+        </w:rPr>
+        <w:t>penelitian</w:t>
+      </w:r>
+      <w:proofErr w:type="spellEnd"/>
+      <w:r>
+        <w:rPr>
+          <w:rFonts w:ascii="Times New Roman" w:hAnsi="Times New Roman"/>
+          <w:color w:val="000000"/>
+          <w:sz w:val="24"/>
+          <w:szCs w:val="24"/>
+          <w:lang w:val="en-US"/>
+        </w:rPr>
+        <w:t xml:space="preserve"> juga </w:t>
+      </w:r>
+      <w:proofErr w:type="spellStart"/>
+      <w:r>
+        <w:rPr>
+          <w:rFonts w:ascii="Times New Roman" w:hAnsi="Times New Roman"/>
+          <w:color w:val="000000"/>
+          <w:sz w:val="24"/>
+          <w:szCs w:val="24"/>
+          <w:lang w:val="en-US"/>
+        </w:rPr>
+        <w:t>telah</w:t>
+      </w:r>
+      <w:proofErr w:type="spellEnd"/>
+      <w:r>
+        <w:rPr>
+          <w:rFonts w:ascii="Times New Roman" w:hAnsi="Times New Roman"/>
+          <w:color w:val="000000"/>
+          <w:sz w:val="24"/>
+          <w:szCs w:val="24"/>
+          <w:lang w:val="en-US"/>
+        </w:rPr>
+        <w:t xml:space="preserve"> </w:t>
+      </w:r>
+      <w:proofErr w:type="spellStart"/>
+      <w:r>
+        <w:rPr>
+          <w:rFonts w:ascii="Times New Roman" w:hAnsi="Times New Roman"/>
+          <w:color w:val="000000"/>
+          <w:sz w:val="24"/>
+          <w:szCs w:val="24"/>
+          <w:lang w:val="en-US"/>
+        </w:rPr>
+        <w:t>menggunakan</w:t>
+      </w:r>
+      <w:proofErr w:type="spellEnd"/>
+      <w:r>
+        <w:rPr>
+          <w:rFonts w:ascii="Times New Roman" w:hAnsi="Times New Roman"/>
+          <w:color w:val="000000"/>
+          <w:sz w:val="24"/>
+          <w:szCs w:val="24"/>
+          <w:lang w:val="en-US"/>
+        </w:rPr>
+        <w:t xml:space="preserve"> </w:t>
+      </w:r>
+      <w:proofErr w:type="spellStart"/>
+      <w:r>
+        <w:rPr>
+          <w:rFonts w:ascii="Times New Roman" w:hAnsi="Times New Roman"/>
+          <w:color w:val="000000"/>
+          <w:sz w:val="24"/>
+          <w:szCs w:val="24"/>
+          <w:lang w:val="en-US"/>
+        </w:rPr>
+        <w:t>koneksi</w:t>
+      </w:r>
+      <w:proofErr w:type="spellEnd"/>
+      <w:r>
+        <w:rPr>
+          <w:rFonts w:ascii="Times New Roman" w:hAnsi="Times New Roman"/>
+          <w:color w:val="000000"/>
+          <w:sz w:val="24"/>
+          <w:szCs w:val="24"/>
+          <w:lang w:val="en-US"/>
+        </w:rPr>
+        <w:t xml:space="preserve"> internet, </w:t>
+      </w:r>
+      <w:proofErr w:type="spellStart"/>
+      <w:r>
+        <w:rPr>
+          <w:rFonts w:ascii="Times New Roman" w:hAnsi="Times New Roman"/>
+          <w:color w:val="000000"/>
+          <w:sz w:val="24"/>
+          <w:szCs w:val="24"/>
+          <w:lang w:val="en-US"/>
+        </w:rPr>
+        <w:t>namun</w:t>
+      </w:r>
+      <w:proofErr w:type="spellEnd"/>
+      <w:r>
+        <w:rPr>
+          <w:rFonts w:ascii="Times New Roman" w:hAnsi="Times New Roman"/>
+          <w:color w:val="000000"/>
+          <w:sz w:val="24"/>
+          <w:szCs w:val="24"/>
+          <w:lang w:val="en-US"/>
+        </w:rPr>
+        <w:t xml:space="preserve"> </w:t>
+      </w:r>
+      <w:proofErr w:type="spellStart"/>
+      <w:r>
+        <w:rPr>
+          <w:rFonts w:ascii="Times New Roman" w:hAnsi="Times New Roman"/>
+          <w:color w:val="000000"/>
+          <w:sz w:val="24"/>
+          <w:szCs w:val="24"/>
+          <w:lang w:val="en-US"/>
+        </w:rPr>
+        <w:t>masih</w:t>
+      </w:r>
+      <w:proofErr w:type="spellEnd"/>
+      <w:r>
+        <w:rPr>
+          <w:rFonts w:ascii="Times New Roman" w:hAnsi="Times New Roman"/>
+          <w:color w:val="000000"/>
+          <w:sz w:val="24"/>
+          <w:szCs w:val="24"/>
+          <w:lang w:val="en-US"/>
+        </w:rPr>
+        <w:t xml:space="preserve"> </w:t>
+      </w:r>
+      <w:proofErr w:type="spellStart"/>
+      <w:r>
+        <w:rPr>
+          <w:rFonts w:ascii="Times New Roman" w:hAnsi="Times New Roman"/>
+          <w:color w:val="000000"/>
+          <w:sz w:val="24"/>
+          <w:szCs w:val="24"/>
+          <w:lang w:val="en-US"/>
+        </w:rPr>
+        <w:t>menggunakan</w:t>
+      </w:r>
+      <w:proofErr w:type="spellEnd"/>
+      <w:r>
+        <w:rPr>
+          <w:rFonts w:ascii="Times New Roman" w:hAnsi="Times New Roman"/>
+          <w:color w:val="000000"/>
+          <w:sz w:val="24"/>
+          <w:szCs w:val="24"/>
+          <w:lang w:val="en-US"/>
+        </w:rPr>
+        <w:t xml:space="preserve"> </w:t>
+      </w:r>
+      <w:proofErr w:type="spellStart"/>
+      <w:r>
+        <w:rPr>
+          <w:rFonts w:ascii="Times New Roman" w:hAnsi="Times New Roman"/>
+          <w:color w:val="000000"/>
+          <w:sz w:val="24"/>
+          <w:szCs w:val="24"/>
+          <w:lang w:val="en-US"/>
+        </w:rPr>
+        <w:t>komunikasi</w:t>
+      </w:r>
+      <w:proofErr w:type="spellEnd"/>
+      <w:r>
+        <w:rPr>
+          <w:rFonts w:ascii="Times New Roman" w:hAnsi="Times New Roman"/>
+          <w:color w:val="000000"/>
+          <w:sz w:val="24"/>
+          <w:szCs w:val="24"/>
+          <w:lang w:val="en-US"/>
+        </w:rPr>
+        <w:t xml:space="preserve"> </w:t>
+      </w:r>
+      <w:proofErr w:type="spellStart"/>
+      <w:r>
+        <w:rPr>
+          <w:rFonts w:ascii="Times New Roman" w:hAnsi="Times New Roman"/>
+          <w:color w:val="000000"/>
+          <w:sz w:val="24"/>
+          <w:szCs w:val="24"/>
+          <w:lang w:val="en-US"/>
+        </w:rPr>
+        <w:t>WiFi</w:t>
+      </w:r>
+      <w:proofErr w:type="spellEnd"/>
+      <w:r>
+        <w:rPr>
+          <w:rFonts w:ascii="Times New Roman" w:hAnsi="Times New Roman"/>
+          <w:color w:val="000000"/>
+          <w:sz w:val="24"/>
+          <w:szCs w:val="24"/>
+          <w:lang w:val="en-US"/>
+        </w:rPr>
+        <w:t xml:space="preserve"> </w:t>
+      </w:r>
+      <w:proofErr w:type="spellStart"/>
+      <w:r>
+        <w:rPr>
+          <w:rFonts w:ascii="Times New Roman" w:hAnsi="Times New Roman"/>
+          <w:color w:val="000000"/>
+          <w:sz w:val="24"/>
+          <w:szCs w:val="24"/>
+          <w:lang w:val="en-US"/>
+        </w:rPr>
+        <w:t>dimana</w:t>
+      </w:r>
+      <w:proofErr w:type="spellEnd"/>
+      <w:r>
+        <w:rPr>
+          <w:rFonts w:ascii="Times New Roman" w:hAnsi="Times New Roman"/>
+          <w:color w:val="000000"/>
+          <w:sz w:val="24"/>
+          <w:szCs w:val="24"/>
+          <w:lang w:val="en-US"/>
+        </w:rPr>
+        <w:t xml:space="preserve"> </w:t>
+      </w:r>
+      <w:proofErr w:type="spellStart"/>
+      <w:r>
+        <w:rPr>
+          <w:rFonts w:ascii="Times New Roman" w:hAnsi="Times New Roman"/>
+          <w:color w:val="000000"/>
+          <w:sz w:val="24"/>
+          <w:szCs w:val="24"/>
+          <w:lang w:val="en-US"/>
+        </w:rPr>
+        <w:t>metode</w:t>
+      </w:r>
+      <w:proofErr w:type="spellEnd"/>
+      <w:r>
+        <w:rPr>
+          <w:rFonts w:ascii="Times New Roman" w:hAnsi="Times New Roman"/>
+          <w:color w:val="000000"/>
+          <w:sz w:val="24"/>
+          <w:szCs w:val="24"/>
+          <w:lang w:val="en-US"/>
+        </w:rPr>
+        <w:t xml:space="preserve"> </w:t>
+      </w:r>
+      <w:proofErr w:type="spellStart"/>
+      <w:r>
+        <w:rPr>
+          <w:rFonts w:ascii="Times New Roman" w:hAnsi="Times New Roman"/>
+          <w:color w:val="000000"/>
+          <w:sz w:val="24"/>
+          <w:szCs w:val="24"/>
+          <w:lang w:val="en-US"/>
+        </w:rPr>
+        <w:t>ini</w:t>
+      </w:r>
+      <w:proofErr w:type="spellEnd"/>
+      <w:r>
+        <w:rPr>
+          <w:rFonts w:ascii="Times New Roman" w:hAnsi="Times New Roman"/>
+          <w:color w:val="000000"/>
+          <w:sz w:val="24"/>
+          <w:szCs w:val="24"/>
+          <w:lang w:val="en-US"/>
+        </w:rPr>
+        <w:t xml:space="preserve"> </w:t>
+      </w:r>
+      <w:proofErr w:type="spellStart"/>
+      <w:r>
+        <w:rPr>
+          <w:rFonts w:ascii="Times New Roman" w:hAnsi="Times New Roman"/>
+          <w:color w:val="000000"/>
+          <w:sz w:val="24"/>
+          <w:szCs w:val="24"/>
+          <w:lang w:val="en-US"/>
+        </w:rPr>
+        <w:t>kurang</w:t>
+      </w:r>
+      <w:proofErr w:type="spellEnd"/>
+      <w:r>
+        <w:rPr>
+          <w:rFonts w:ascii="Times New Roman" w:hAnsi="Times New Roman"/>
+          <w:color w:val="000000"/>
+          <w:sz w:val="24"/>
+          <w:szCs w:val="24"/>
+          <w:lang w:val="en-US"/>
+        </w:rPr>
+        <w:t xml:space="preserve"> </w:t>
+      </w:r>
+      <w:proofErr w:type="spellStart"/>
+      <w:r>
+        <w:rPr>
+          <w:rFonts w:ascii="Times New Roman" w:hAnsi="Times New Roman"/>
+          <w:color w:val="000000"/>
+          <w:sz w:val="24"/>
+          <w:szCs w:val="24"/>
+          <w:lang w:val="en-US"/>
+        </w:rPr>
+        <w:t>efesien</w:t>
+      </w:r>
+      <w:proofErr w:type="spellEnd"/>
+      <w:r>
+        <w:rPr>
+          <w:rFonts w:ascii="Times New Roman" w:hAnsi="Times New Roman"/>
+          <w:color w:val="000000"/>
+          <w:sz w:val="24"/>
+          <w:szCs w:val="24"/>
+          <w:lang w:val="en-US"/>
+        </w:rPr>
+        <w:t xml:space="preserve"> </w:t>
+      </w:r>
+      <w:proofErr w:type="spellStart"/>
+      <w:r>
+        <w:rPr>
+          <w:rFonts w:ascii="Times New Roman" w:hAnsi="Times New Roman"/>
+          <w:color w:val="000000"/>
+          <w:sz w:val="24"/>
+          <w:szCs w:val="24"/>
+          <w:lang w:val="en-US"/>
+        </w:rPr>
+        <w:t>jika</w:t>
+      </w:r>
+      <w:proofErr w:type="spellEnd"/>
+      <w:r>
+        <w:rPr>
+          <w:rFonts w:ascii="Times New Roman" w:hAnsi="Times New Roman"/>
+          <w:color w:val="000000"/>
+          <w:sz w:val="24"/>
+          <w:szCs w:val="24"/>
+          <w:lang w:val="en-US"/>
+        </w:rPr>
+        <w:t xml:space="preserve"> </w:t>
+      </w:r>
+      <w:proofErr w:type="spellStart"/>
+      <w:r>
+        <w:rPr>
+          <w:rFonts w:ascii="Times New Roman" w:hAnsi="Times New Roman"/>
+          <w:color w:val="000000"/>
+          <w:sz w:val="24"/>
+          <w:szCs w:val="24"/>
+          <w:lang w:val="en-US"/>
+        </w:rPr>
+        <w:t>diterapkan</w:t>
+      </w:r>
+      <w:proofErr w:type="spellEnd"/>
+      <w:r>
+        <w:rPr>
+          <w:rFonts w:ascii="Times New Roman" w:hAnsi="Times New Roman"/>
+          <w:color w:val="000000"/>
+          <w:sz w:val="24"/>
+          <w:szCs w:val="24"/>
+          <w:lang w:val="en-US"/>
+        </w:rPr>
+        <w:t xml:space="preserve"> pada </w:t>
+      </w:r>
+      <w:proofErr w:type="spellStart"/>
+      <w:r>
+        <w:rPr>
+          <w:rFonts w:ascii="Times New Roman" w:hAnsi="Times New Roman"/>
+          <w:color w:val="000000"/>
+          <w:sz w:val="24"/>
+          <w:szCs w:val="24"/>
+          <w:lang w:val="en-US"/>
+        </w:rPr>
+        <w:t>perangkat</w:t>
+      </w:r>
+      <w:proofErr w:type="spellEnd"/>
+      <w:r>
+        <w:rPr>
+          <w:rFonts w:ascii="Times New Roman" w:hAnsi="Times New Roman"/>
+          <w:color w:val="000000"/>
+          <w:sz w:val="24"/>
+          <w:szCs w:val="24"/>
+          <w:lang w:val="en-US"/>
+        </w:rPr>
+        <w:t xml:space="preserve"> </w:t>
+      </w:r>
+      <w:proofErr w:type="spellStart"/>
+      <w:r>
+        <w:rPr>
+          <w:rFonts w:ascii="Times New Roman" w:hAnsi="Times New Roman"/>
+          <w:color w:val="000000"/>
+          <w:sz w:val="24"/>
+          <w:szCs w:val="24"/>
+          <w:lang w:val="en-US"/>
+        </w:rPr>
+        <w:t>bergerak</w:t>
+      </w:r>
+      <w:proofErr w:type="spellEnd"/>
+      <w:r>
+        <w:rPr>
+          <w:rFonts w:ascii="Times New Roman" w:hAnsi="Times New Roman"/>
+          <w:color w:val="000000"/>
+          <w:sz w:val="24"/>
+          <w:szCs w:val="24"/>
+          <w:lang w:val="en-US"/>
+        </w:rPr>
+        <w:t xml:space="preserve">/mobile. </w:t>
+      </w:r>
+      <w:proofErr w:type="spellStart"/>
+      <w:r>
+        <w:rPr>
+          <w:rFonts w:ascii="Times New Roman" w:hAnsi="Times New Roman"/>
+          <w:color w:val="000000"/>
+          <w:sz w:val="24"/>
+          <w:szCs w:val="24"/>
+          <w:lang w:val="en-US"/>
+        </w:rPr>
+        <w:t>Sedangkan</w:t>
+      </w:r>
+      <w:proofErr w:type="spellEnd"/>
+      <w:r>
+        <w:rPr>
+          <w:rFonts w:ascii="Times New Roman" w:hAnsi="Times New Roman"/>
+          <w:color w:val="000000"/>
+          <w:sz w:val="24"/>
+          <w:szCs w:val="24"/>
+          <w:lang w:val="en-US"/>
+        </w:rPr>
+        <w:t xml:space="preserve"> pada </w:t>
+      </w:r>
+      <w:proofErr w:type="spellStart"/>
+      <w:r>
+        <w:rPr>
+          <w:rFonts w:ascii="Times New Roman" w:hAnsi="Times New Roman"/>
+          <w:color w:val="000000"/>
+          <w:sz w:val="24"/>
+          <w:szCs w:val="24"/>
+          <w:lang w:val="en-US"/>
+        </w:rPr>
+        <w:t>penelitian</w:t>
+      </w:r>
+      <w:proofErr w:type="spellEnd"/>
+      <w:r>
+        <w:rPr>
+          <w:rFonts w:ascii="Times New Roman" w:hAnsi="Times New Roman"/>
+          <w:color w:val="000000"/>
+          <w:sz w:val="24"/>
+          <w:szCs w:val="24"/>
+          <w:lang w:val="en-US"/>
+        </w:rPr>
+        <w:t xml:space="preserve"> </w:t>
+      </w:r>
+      <w:proofErr w:type="spellStart"/>
+      <w:r>
+        <w:rPr>
+          <w:rFonts w:ascii="Times New Roman" w:hAnsi="Times New Roman"/>
+          <w:color w:val="000000"/>
+          <w:sz w:val="24"/>
+          <w:szCs w:val="24"/>
+          <w:lang w:val="en-US"/>
+        </w:rPr>
+        <w:t>ini</w:t>
+      </w:r>
+      <w:proofErr w:type="spellEnd"/>
+      <w:r>
+        <w:rPr>
+          <w:rFonts w:ascii="Times New Roman" w:hAnsi="Times New Roman"/>
+          <w:color w:val="000000"/>
+          <w:sz w:val="24"/>
+          <w:szCs w:val="24"/>
+          <w:lang w:val="en-US"/>
+        </w:rPr>
+        <w:t xml:space="preserve"> </w:t>
+      </w:r>
+      <w:proofErr w:type="spellStart"/>
+      <w:r>
+        <w:rPr>
+          <w:rFonts w:ascii="Times New Roman" w:hAnsi="Times New Roman"/>
+          <w:color w:val="000000"/>
+          <w:sz w:val="24"/>
+          <w:szCs w:val="24"/>
+          <w:lang w:val="en-US"/>
+        </w:rPr>
+        <w:t>komunikasi</w:t>
+      </w:r>
+      <w:proofErr w:type="spellEnd"/>
+      <w:r>
+        <w:rPr>
+          <w:rFonts w:ascii="Times New Roman" w:hAnsi="Times New Roman"/>
+          <w:color w:val="000000"/>
+          <w:sz w:val="24"/>
+          <w:szCs w:val="24"/>
+          <w:lang w:val="en-US"/>
+        </w:rPr>
+        <w:t xml:space="preserve"> </w:t>
+      </w:r>
+      <w:proofErr w:type="spellStart"/>
+      <w:r>
+        <w:rPr>
+          <w:rFonts w:ascii="Times New Roman" w:hAnsi="Times New Roman"/>
+          <w:color w:val="000000"/>
+          <w:sz w:val="24"/>
+          <w:szCs w:val="24"/>
+          <w:lang w:val="en-US"/>
+        </w:rPr>
+        <w:t>antara</w:t>
+      </w:r>
+      <w:proofErr w:type="spellEnd"/>
+      <w:r>
+        <w:rPr>
+          <w:rFonts w:ascii="Times New Roman" w:hAnsi="Times New Roman"/>
+          <w:color w:val="000000"/>
+          <w:sz w:val="24"/>
+          <w:szCs w:val="24"/>
+          <w:lang w:val="en-US"/>
+        </w:rPr>
+        <w:t xml:space="preserve"> </w:t>
+      </w:r>
+      <w:proofErr w:type="spellStart"/>
+      <w:r>
+        <w:rPr>
+          <w:rFonts w:ascii="Times New Roman" w:hAnsi="Times New Roman"/>
+          <w:color w:val="000000"/>
+          <w:sz w:val="24"/>
+          <w:szCs w:val="24"/>
+          <w:lang w:val="en-US"/>
+        </w:rPr>
+        <w:t>perangkat</w:t>
+      </w:r>
+      <w:proofErr w:type="spellEnd"/>
+      <w:r>
+        <w:rPr>
+          <w:rFonts w:ascii="Times New Roman" w:hAnsi="Times New Roman"/>
+          <w:color w:val="000000"/>
+          <w:sz w:val="24"/>
+          <w:szCs w:val="24"/>
+          <w:lang w:val="en-US"/>
+        </w:rPr>
+        <w:t xml:space="preserve"> </w:t>
+      </w:r>
+      <w:proofErr w:type="spellStart"/>
+      <w:r>
+        <w:rPr>
+          <w:rFonts w:ascii="Times New Roman" w:hAnsi="Times New Roman"/>
+          <w:color w:val="000000"/>
+          <w:sz w:val="24"/>
+          <w:szCs w:val="24"/>
+          <w:lang w:val="en-US"/>
+        </w:rPr>
+        <w:t>dengan</w:t>
+      </w:r>
+      <w:proofErr w:type="spellEnd"/>
+      <w:r>
+        <w:rPr>
+          <w:rFonts w:ascii="Times New Roman" w:hAnsi="Times New Roman"/>
+          <w:color w:val="000000"/>
+          <w:sz w:val="24"/>
+          <w:szCs w:val="24"/>
+          <w:lang w:val="en-US"/>
+        </w:rPr>
+        <w:t xml:space="preserve"> </w:t>
+      </w:r>
+      <w:proofErr w:type="spellStart"/>
+      <w:r>
+        <w:rPr>
+          <w:rFonts w:ascii="Times New Roman" w:hAnsi="Times New Roman"/>
+          <w:color w:val="000000"/>
+          <w:sz w:val="24"/>
+          <w:szCs w:val="24"/>
+          <w:lang w:val="en-US"/>
+        </w:rPr>
+        <w:t>pengguna</w:t>
+      </w:r>
+      <w:proofErr w:type="spellEnd"/>
+      <w:r>
+        <w:rPr>
+          <w:rFonts w:ascii="Times New Roman" w:hAnsi="Times New Roman"/>
+          <w:color w:val="000000"/>
+          <w:sz w:val="24"/>
+          <w:szCs w:val="24"/>
+          <w:lang w:val="en-US"/>
+        </w:rPr>
+        <w:t xml:space="preserve"> </w:t>
+      </w:r>
+      <w:proofErr w:type="spellStart"/>
+      <w:r>
+        <w:rPr>
+          <w:rFonts w:ascii="Times New Roman" w:hAnsi="Times New Roman"/>
+          <w:color w:val="000000"/>
+          <w:sz w:val="24"/>
+          <w:szCs w:val="24"/>
+          <w:lang w:val="en-US"/>
+        </w:rPr>
+        <w:t>menggunakan</w:t>
+      </w:r>
+      <w:proofErr w:type="spellEnd"/>
+      <w:r>
+        <w:rPr>
+          <w:rFonts w:ascii="Times New Roman" w:hAnsi="Times New Roman"/>
+          <w:color w:val="000000"/>
+          <w:sz w:val="24"/>
+          <w:szCs w:val="24"/>
+          <w:lang w:val="en-US"/>
+        </w:rPr>
+        <w:t xml:space="preserve"> internet </w:t>
+      </w:r>
+      <w:proofErr w:type="spellStart"/>
+      <w:r>
+        <w:rPr>
+          <w:rFonts w:ascii="Times New Roman" w:hAnsi="Times New Roman"/>
+          <w:color w:val="000000"/>
+          <w:sz w:val="24"/>
+          <w:szCs w:val="24"/>
+          <w:lang w:val="en-US"/>
+        </w:rPr>
+        <w:t>dimana</w:t>
+      </w:r>
+      <w:proofErr w:type="spellEnd"/>
+      <w:r>
+        <w:rPr>
+          <w:rFonts w:ascii="Times New Roman" w:hAnsi="Times New Roman"/>
+          <w:color w:val="000000"/>
+          <w:sz w:val="24"/>
+          <w:szCs w:val="24"/>
+          <w:lang w:val="en-US"/>
+        </w:rPr>
+        <w:t xml:space="preserve"> data </w:t>
+      </w:r>
+      <w:proofErr w:type="spellStart"/>
+      <w:r>
+        <w:rPr>
+          <w:rFonts w:ascii="Times New Roman" w:hAnsi="Times New Roman"/>
+          <w:color w:val="000000"/>
+          <w:sz w:val="24"/>
+          <w:szCs w:val="24"/>
+          <w:lang w:val="en-US"/>
+        </w:rPr>
+        <w:t>gprs</w:t>
+      </w:r>
+      <w:proofErr w:type="spellEnd"/>
+      <w:r>
+        <w:rPr>
+          <w:rFonts w:ascii="Times New Roman" w:hAnsi="Times New Roman"/>
+          <w:color w:val="000000"/>
+          <w:sz w:val="24"/>
+          <w:szCs w:val="24"/>
+          <w:lang w:val="en-US"/>
+        </w:rPr>
+        <w:t xml:space="preserve"> </w:t>
+      </w:r>
+      <w:proofErr w:type="spellStart"/>
+      <w:r>
+        <w:rPr>
+          <w:rFonts w:ascii="Times New Roman" w:hAnsi="Times New Roman"/>
+          <w:color w:val="000000"/>
+          <w:sz w:val="24"/>
+          <w:szCs w:val="24"/>
+          <w:lang w:val="en-US"/>
+        </w:rPr>
+        <w:t>langsung</w:t>
+      </w:r>
+      <w:proofErr w:type="spellEnd"/>
+      <w:r>
+        <w:rPr>
+          <w:rFonts w:ascii="Times New Roman" w:hAnsi="Times New Roman"/>
+          <w:color w:val="000000"/>
+          <w:sz w:val="24"/>
+          <w:szCs w:val="24"/>
+          <w:lang w:val="en-US"/>
+        </w:rPr>
+        <w:t xml:space="preserve"> </w:t>
+      </w:r>
+      <w:proofErr w:type="spellStart"/>
+      <w:r>
+        <w:rPr>
+          <w:rFonts w:ascii="Times New Roman" w:hAnsi="Times New Roman"/>
+          <w:color w:val="000000"/>
+          <w:sz w:val="24"/>
+          <w:szCs w:val="24"/>
+          <w:lang w:val="en-US"/>
+        </w:rPr>
+        <w:t>dari</w:t>
+      </w:r>
+      <w:proofErr w:type="spellEnd"/>
+      <w:r>
+        <w:rPr>
+          <w:rFonts w:ascii="Times New Roman" w:hAnsi="Times New Roman"/>
+          <w:color w:val="000000"/>
+          <w:sz w:val="24"/>
+          <w:szCs w:val="24"/>
+          <w:lang w:val="en-US"/>
+        </w:rPr>
+        <w:t xml:space="preserve"> </w:t>
+      </w:r>
+      <w:proofErr w:type="spellStart"/>
+      <w:r>
+        <w:rPr>
+          <w:rFonts w:ascii="Times New Roman" w:hAnsi="Times New Roman"/>
+          <w:color w:val="000000"/>
+          <w:sz w:val="24"/>
+          <w:szCs w:val="24"/>
+          <w:lang w:val="en-US"/>
+        </w:rPr>
+        <w:t>perangkat</w:t>
       </w:r>
       <w:proofErr w:type="spellEnd"/>
       <w:r>
@@ -22285,7 +23985,7 @@
           <w:szCs w:val="24"/>
           <w:lang w:val="en-US"/>
         </w:rPr>
-        <w:t>aplikasi</w:t>
+        <w:t>SIMCard</w:t>
       </w:r>
       <w:proofErr w:type="spellEnd"/>
       <w:r>
@@ -22318,7 +24018,205 @@
           <w:szCs w:val="24"/>
           <w:lang w:val="en-US"/>
         </w:rPr>
-        <w:t xml:space="preserve"> pada smartphone dan </w:t>
+        <w:t xml:space="preserve"> pada </w:t>
+      </w:r>
+      <w:proofErr w:type="spellStart"/>
+      <w:r>
+        <w:rPr>
+          <w:rFonts w:ascii="Times New Roman" w:hAnsi="Times New Roman"/>
+          <w:color w:val="000000"/>
+          <w:sz w:val="24"/>
+          <w:szCs w:val="24"/>
+          <w:lang w:val="en-US"/>
+        </w:rPr>
+        <w:t>perangkat</w:t>
+      </w:r>
+      <w:proofErr w:type="spellEnd"/>
+      <w:r>
+        <w:rPr>
+          <w:rFonts w:ascii="Times New Roman" w:hAnsi="Times New Roman"/>
+          <w:color w:val="000000"/>
+          <w:sz w:val="24"/>
+          <w:szCs w:val="24"/>
+          <w:lang w:val="en-US"/>
+        </w:rPr>
+        <w:t xml:space="preserve">. </w:t>
+      </w:r>
+      <w:proofErr w:type="spellStart"/>
+      <w:r>
+        <w:rPr>
+          <w:rFonts w:ascii="Times New Roman" w:hAnsi="Times New Roman"/>
+          <w:color w:val="000000"/>
+          <w:sz w:val="24"/>
+          <w:szCs w:val="24"/>
+          <w:lang w:val="en-US"/>
+        </w:rPr>
+        <w:t>Mikrokontroler</w:t>
+      </w:r>
+      <w:proofErr w:type="spellEnd"/>
+      <w:r>
+        <w:rPr>
+          <w:rFonts w:ascii="Times New Roman" w:hAnsi="Times New Roman"/>
+          <w:color w:val="000000"/>
+          <w:sz w:val="24"/>
+          <w:szCs w:val="24"/>
+          <w:lang w:val="en-US"/>
+        </w:rPr>
+        <w:t xml:space="preserve"> yang </w:t>
+      </w:r>
+      <w:proofErr w:type="spellStart"/>
+      <w:r>
+        <w:rPr>
+          <w:rFonts w:ascii="Times New Roman" w:hAnsi="Times New Roman"/>
+          <w:color w:val="000000"/>
+          <w:sz w:val="24"/>
+          <w:szCs w:val="24"/>
+          <w:lang w:val="en-US"/>
+        </w:rPr>
+        <w:t>digunakan</w:t>
+      </w:r>
+      <w:proofErr w:type="spellEnd"/>
+      <w:r>
+        <w:rPr>
+          <w:rFonts w:ascii="Times New Roman" w:hAnsi="Times New Roman"/>
+          <w:color w:val="000000"/>
+          <w:sz w:val="24"/>
+          <w:szCs w:val="24"/>
+          <w:lang w:val="en-US"/>
+        </w:rPr>
+        <w:t xml:space="preserve"> pada prototype </w:t>
+      </w:r>
+      <w:proofErr w:type="spellStart"/>
+      <w:r>
+        <w:rPr>
+          <w:rFonts w:ascii="Times New Roman" w:hAnsi="Times New Roman"/>
+          <w:color w:val="000000"/>
+          <w:sz w:val="24"/>
+          <w:szCs w:val="24"/>
+          <w:lang w:val="en-US"/>
+        </w:rPr>
+        <w:t>adalah</w:t>
+      </w:r>
+      <w:proofErr w:type="spellEnd"/>
+      <w:r>
+        <w:rPr>
+          <w:rFonts w:ascii="Times New Roman" w:hAnsi="Times New Roman"/>
+          <w:color w:val="000000"/>
+          <w:sz w:val="24"/>
+          <w:szCs w:val="24"/>
+          <w:lang w:val="en-US"/>
+        </w:rPr>
+        <w:t xml:space="preserve"> </w:t>
+      </w:r>
+      <w:proofErr w:type="spellStart"/>
+      <w:r>
+        <w:rPr>
+          <w:rFonts w:ascii="Times New Roman" w:hAnsi="Times New Roman"/>
+          <w:color w:val="000000"/>
+          <w:sz w:val="24"/>
+          <w:szCs w:val="24"/>
+          <w:lang w:val="en-US"/>
+        </w:rPr>
+        <w:t>mikrokontroler</w:t>
+      </w:r>
+      <w:proofErr w:type="spellEnd"/>
+      <w:r>
+        <w:rPr>
+          <w:rFonts w:ascii="Times New Roman" w:hAnsi="Times New Roman"/>
+          <w:color w:val="000000"/>
+          <w:sz w:val="24"/>
+          <w:szCs w:val="24"/>
+          <w:lang w:val="en-US"/>
+        </w:rPr>
+        <w:t xml:space="preserve"> </w:t>
+      </w:r>
+      <w:proofErr w:type="spellStart"/>
+      <w:r>
+        <w:rPr>
+          <w:rFonts w:ascii="Times New Roman" w:hAnsi="Times New Roman"/>
+          <w:color w:val="000000"/>
+          <w:sz w:val="24"/>
+          <w:szCs w:val="24"/>
+          <w:lang w:val="en-US"/>
+        </w:rPr>
+        <w:t>berbasis</w:t>
+      </w:r>
+      <w:proofErr w:type="spellEnd"/>
+      <w:r>
+        <w:rPr>
+          <w:rFonts w:ascii="Times New Roman" w:hAnsi="Times New Roman"/>
+          <w:color w:val="000000"/>
+          <w:sz w:val="24"/>
+          <w:szCs w:val="24"/>
+          <w:lang w:val="en-US"/>
+        </w:rPr>
+        <w:t xml:space="preserve"> 32bit yang </w:t>
+      </w:r>
+      <w:proofErr w:type="spellStart"/>
+      <w:r>
+        <w:rPr>
+          <w:rFonts w:ascii="Times New Roman" w:hAnsi="Times New Roman"/>
+          <w:color w:val="000000"/>
+          <w:sz w:val="24"/>
+          <w:szCs w:val="24"/>
+          <w:lang w:val="en-US"/>
+        </w:rPr>
+        <w:t>diharapkan</w:t>
+      </w:r>
+      <w:proofErr w:type="spellEnd"/>
+      <w:r>
+        <w:rPr>
+          <w:rFonts w:ascii="Times New Roman" w:hAnsi="Times New Roman"/>
+          <w:color w:val="000000"/>
+          <w:sz w:val="24"/>
+          <w:szCs w:val="24"/>
+          <w:lang w:val="en-US"/>
+        </w:rPr>
+        <w:t xml:space="preserve"> </w:t>
+      </w:r>
+      <w:proofErr w:type="spellStart"/>
+      <w:r>
+        <w:rPr>
+          <w:rFonts w:ascii="Times New Roman" w:hAnsi="Times New Roman"/>
+          <w:color w:val="000000"/>
+          <w:sz w:val="24"/>
+          <w:szCs w:val="24"/>
+          <w:lang w:val="en-US"/>
+        </w:rPr>
+        <w:t>waktu</w:t>
+      </w:r>
+      <w:proofErr w:type="spellEnd"/>
+      <w:r>
+        <w:rPr>
+          <w:rFonts w:ascii="Times New Roman" w:hAnsi="Times New Roman"/>
+          <w:color w:val="000000"/>
+          <w:sz w:val="24"/>
+          <w:szCs w:val="24"/>
+          <w:lang w:val="en-US"/>
+        </w:rPr>
+        <w:t xml:space="preserve"> </w:t>
+      </w:r>
+      <w:proofErr w:type="spellStart"/>
+      <w:r>
+        <w:rPr>
+          <w:rFonts w:ascii="Times New Roman" w:hAnsi="Times New Roman"/>
+          <w:color w:val="000000"/>
+          <w:sz w:val="24"/>
+          <w:szCs w:val="24"/>
+          <w:lang w:val="en-US"/>
+        </w:rPr>
+        <w:t>pemrosesan</w:t>
+      </w:r>
+      <w:proofErr w:type="spellEnd"/>
+      <w:r>
+        <w:rPr>
+          <w:rFonts w:ascii="Times New Roman" w:hAnsi="Times New Roman"/>
+          <w:color w:val="000000"/>
+          <w:sz w:val="24"/>
+          <w:szCs w:val="24"/>
+          <w:lang w:val="en-US"/>
+        </w:rPr>
+        <w:t xml:space="preserve"> </w:t>
       </w:r>
       <w:proofErr w:type="spellStart"/>
       <w:r>
@@ -22351,106 +24249,62 @@
           <w:szCs w:val="24"/>
           <w:lang w:val="en-US"/>
         </w:rPr>
-        <w:t>memantau</w:t>
-      </w:r>
-      <w:proofErr w:type="spellEnd"/>
-      <w:r>
-        <w:rPr>
-          <w:rFonts w:ascii="Times New Roman" w:hAnsi="Times New Roman"/>
-          <w:color w:val="000000"/>
-          <w:sz w:val="24"/>
-          <w:szCs w:val="24"/>
-          <w:lang w:val="en-US"/>
-        </w:rPr>
-        <w:t xml:space="preserve"> </w:t>
-      </w:r>
-      <w:proofErr w:type="spellStart"/>
-      <w:r>
-        <w:rPr>
-          <w:rFonts w:ascii="Times New Roman" w:hAnsi="Times New Roman"/>
-          <w:color w:val="000000"/>
-          <w:sz w:val="24"/>
-          <w:szCs w:val="24"/>
-          <w:lang w:val="en-US"/>
-        </w:rPr>
-        <w:t>keberadaan</w:t>
-      </w:r>
-      <w:proofErr w:type="spellEnd"/>
-      <w:r>
-        <w:rPr>
-          <w:rFonts w:ascii="Times New Roman" w:hAnsi="Times New Roman"/>
-          <w:color w:val="000000"/>
-          <w:sz w:val="24"/>
-          <w:szCs w:val="24"/>
-          <w:lang w:val="en-US"/>
-        </w:rPr>
-        <w:t xml:space="preserve"> </w:t>
-      </w:r>
-      <w:proofErr w:type="spellStart"/>
-      <w:r>
-        <w:rPr>
-          <w:rFonts w:ascii="Times New Roman" w:hAnsi="Times New Roman"/>
-          <w:color w:val="000000"/>
-          <w:sz w:val="24"/>
-          <w:szCs w:val="24"/>
-          <w:lang w:val="en-US"/>
-        </w:rPr>
-        <w:t>dari</w:t>
-      </w:r>
-      <w:proofErr w:type="spellEnd"/>
-      <w:r>
-        <w:rPr>
-          <w:rFonts w:ascii="Times New Roman" w:hAnsi="Times New Roman"/>
-          <w:color w:val="000000"/>
-          <w:sz w:val="24"/>
-          <w:szCs w:val="24"/>
-          <w:lang w:val="en-US"/>
-        </w:rPr>
-        <w:t xml:space="preserve"> </w:t>
-      </w:r>
-      <w:proofErr w:type="spellStart"/>
-      <w:r>
-        <w:rPr>
-          <w:rFonts w:ascii="Times New Roman" w:hAnsi="Times New Roman"/>
-          <w:color w:val="000000"/>
-          <w:sz w:val="24"/>
-          <w:szCs w:val="24"/>
-          <w:lang w:val="en-US"/>
-        </w:rPr>
-        <w:t>sepeda</w:t>
-      </w:r>
-      <w:proofErr w:type="spellEnd"/>
-      <w:r>
-        <w:rPr>
-          <w:rFonts w:ascii="Times New Roman" w:hAnsi="Times New Roman"/>
-          <w:color w:val="000000"/>
-          <w:sz w:val="24"/>
-          <w:szCs w:val="24"/>
-          <w:lang w:val="en-US"/>
-        </w:rPr>
-        <w:t xml:space="preserve"> motor </w:t>
-      </w:r>
-      <w:proofErr w:type="spellStart"/>
-      <w:r>
-        <w:rPr>
-          <w:rFonts w:ascii="Times New Roman" w:hAnsi="Times New Roman"/>
-          <w:color w:val="000000"/>
-          <w:sz w:val="24"/>
-          <w:szCs w:val="24"/>
-          <w:lang w:val="en-US"/>
-        </w:rPr>
-        <w:t>miliknnya</w:t>
-      </w:r>
-      <w:proofErr w:type="spellEnd"/>
-      <w:r>
-        <w:rPr>
-          <w:rFonts w:ascii="Times New Roman" w:hAnsi="Times New Roman"/>
-          <w:color w:val="000000"/>
-          <w:sz w:val="24"/>
-          <w:szCs w:val="24"/>
-          <w:lang w:val="en-US"/>
-        </w:rPr>
-        <w:t>.</w:t>
+        <w:t>dilakukan</w:t>
+      </w:r>
+      <w:proofErr w:type="spellEnd"/>
+      <w:r>
+        <w:rPr>
+          <w:rFonts w:ascii="Times New Roman" w:hAnsi="Times New Roman"/>
+          <w:color w:val="000000"/>
+          <w:sz w:val="24"/>
+          <w:szCs w:val="24"/>
+          <w:lang w:val="en-US"/>
+        </w:rPr>
+        <w:t xml:space="preserve"> </w:t>
+      </w:r>
+      <w:proofErr w:type="spellStart"/>
+      <w:r>
+        <w:rPr>
+          <w:rFonts w:ascii="Times New Roman" w:hAnsi="Times New Roman"/>
+          <w:color w:val="000000"/>
+          <w:sz w:val="24"/>
+          <w:szCs w:val="24"/>
+          <w:lang w:val="en-US"/>
+        </w:rPr>
+        <w:t>lebih</w:t>
+      </w:r>
+      <w:proofErr w:type="spellEnd"/>
+      <w:r>
+        <w:rPr>
+          <w:rFonts w:ascii="Times New Roman" w:hAnsi="Times New Roman"/>
+          <w:color w:val="000000"/>
+          <w:sz w:val="24"/>
+          <w:szCs w:val="24"/>
+          <w:lang w:val="en-US"/>
+        </w:rPr>
+        <w:t xml:space="preserve"> </w:t>
+      </w:r>
+      <w:proofErr w:type="spellStart"/>
+      <w:r>
+        <w:rPr>
+          <w:rFonts w:ascii="Times New Roman" w:hAnsi="Times New Roman"/>
+          <w:color w:val="000000"/>
+          <w:sz w:val="24"/>
+          <w:szCs w:val="24"/>
+          <w:lang w:val="en-US"/>
+        </w:rPr>
+        <w:t>singkat</w:t>
+      </w:r>
+      <w:proofErr w:type="spellEnd"/>
+      <w:r>
+        <w:rPr>
+          <w:rFonts w:ascii="Times New Roman" w:hAnsi="Times New Roman"/>
+          <w:color w:val="000000"/>
+          <w:sz w:val="24"/>
+          <w:szCs w:val="24"/>
+          <w:lang w:val="en-US"/>
+        </w:rPr>
+        <w:t xml:space="preserve">. </w:t>
       </w:r>
       <w:r>
         <w:rPr>
@@ -22502,7 +24356,6 @@
           <w:szCs w:val="24"/>
           <w:lang w:val="en-US"/>
         </w:rPr>
-        <w:lastRenderedPageBreak/>
         <w:t>Rumusan</w:t>
       </w:r>
       <w:proofErr w:type="spellEnd"/>
@@ -24969,6 +26822,7 @@
           <w:szCs w:val="24"/>
           <w:lang w:val="en-US"/>
         </w:rPr>
+        <w:lastRenderedPageBreak/>
         <w:t>Manfaat</w:t>
       </w:r>
       <w:proofErr w:type="spellEnd"/>
@@ -28116,7 +29970,7 @@
 </file>
 
 <file path=customXml/itemProps1.xml><?xml version="1.0" encoding="utf-8"?>
-<ds:datastoreItem xmlns:ds="http://schemas.openxmlformats.org/officeDocument/2006/customXml" ds:itemID="{2B1C8529-B18F-4185-A77B-A8A43E41B9E2}">
+<ds:datastoreItem xmlns:ds="http://schemas.openxmlformats.org/officeDocument/2006/customXml" ds:itemID="{8E4E122E-048B-485B-B7A6-F9226D93ACAA}">
   <ds:schemaRefs>
     <ds:schemaRef ds:uri="http://schemas.openxmlformats.org/officeDocument/2006/bibliography"/>
   </ds:schemaRefs>

</xml_diff>

<commit_message>
Menambahkan prosesor 2.2.1. Xtensa LX6
</commit_message>
<xml_diff>
--- a/Files/Proposal.docx
+++ b/Files/Proposal.docx
@@ -226,6 +226,7 @@
           <w:lang w:val="en-US"/>
         </w:rPr>
       </w:pPr>
+      <w:proofErr w:type="gramStart"/>
       <w:r>
         <w:rPr>
           <w:rFonts w:ascii="Times New Roman" w:hAnsi="Times New Roman"/>
@@ -256,6 +257,7 @@
         </w:rPr>
         <w:t xml:space="preserve"> :</w:t>
       </w:r>
+      <w:proofErr w:type="gramEnd"/>
     </w:p>
     <w:p>
       <w:pPr>
@@ -1602,6 +1604,7 @@
               <w:t xml:space="preserve">, </w:t>
             </w:r>
             <w:proofErr w:type="spellStart"/>
+            <w:proofErr w:type="gramStart"/>
             <w:r>
               <w:rPr>
                 <w:rFonts w:ascii="Times New Roman" w:hAnsi="Times New Roman"/>
@@ -1616,6 +1619,7 @@
               <w:t>S.Kom</w:t>
             </w:r>
             <w:proofErr w:type="spellEnd"/>
+            <w:proofErr w:type="gramEnd"/>
             <w:r>
               <w:rPr>
                 <w:rFonts w:ascii="Times New Roman" w:hAnsi="Times New Roman"/>
@@ -3060,6 +3064,7 @@
         <w:t xml:space="preserve">, </w:t>
       </w:r>
       <w:proofErr w:type="spellStart"/>
+      <w:proofErr w:type="gramStart"/>
       <w:r>
         <w:rPr>
           <w:rFonts w:ascii="Times New Roman" w:hAnsi="Times New Roman"/>
@@ -3073,6 +3078,7 @@
         <w:t>S.Kom</w:t>
       </w:r>
       <w:proofErr w:type="spellEnd"/>
+      <w:proofErr w:type="gramEnd"/>
       <w:r>
         <w:rPr>
           <w:rFonts w:ascii="Times New Roman" w:hAnsi="Times New Roman"/>
@@ -3175,7 +3181,33 @@
           <w:szCs w:val="24"/>
           <w:lang w:val="en-US"/>
         </w:rPr>
-        <w:t xml:space="preserve">DEWAN PENGUJI : </w:t>
+        <w:t xml:space="preserve">DEWAN </w:t>
+      </w:r>
+      <w:proofErr w:type="gramStart"/>
+      <w:r>
+        <w:rPr>
+          <w:rFonts w:ascii="Times New Roman" w:hAnsi="Times New Roman"/>
+          <w:b/>
+          <w:bCs/>
+          <w:color w:val="000000"/>
+          <w:sz w:val="28"/>
+          <w:szCs w:val="24"/>
+          <w:lang w:val="en-US"/>
+        </w:rPr>
+        <w:t>PENGUJI :</w:t>
+      </w:r>
+      <w:proofErr w:type="gramEnd"/>
+      <w:r>
+        <w:rPr>
+          <w:rFonts w:ascii="Times New Roman" w:hAnsi="Times New Roman"/>
+          <w:b/>
+          <w:bCs/>
+          <w:color w:val="000000"/>
+          <w:sz w:val="28"/>
+          <w:szCs w:val="24"/>
+          <w:lang w:val="en-US"/>
+        </w:rPr>
+        <w:t xml:space="preserve"> </w:t>
       </w:r>
     </w:p>
     <w:p>
@@ -42347,7 +42379,7 @@
           <w:szCs w:val="24"/>
           <w:lang w:val="en-US"/>
         </w:rPr>
-        <w:instrText>ADDIN CSL_CITATION {"citationItems":[{"id":"ITEM-1","itemData":{"author":[{"dropping-particle":"","family":"Wikipedia","given":"","non-dropping-particle":"","parse-names":false,"suffix":""}],"container-title":"Wikipedia, Ensiklopedia Bebas","id":"ITEM-1","issued":{"date-parts":[["2018"]]},"title":"Unit Kendali","type":"entry-encyclopedia"},"uris":["http://www.mendeley.com/documents/?uuid=480912bf-5af0-482f-a027-515e65d7153b"]}],"mendeley":{"formattedCitation":"[12]","plainTextFormattedCitation":"[12]"},"properties":{"noteIndex":0},"schema":"https://github.com/citation-style-language/schema/raw/master/csl-citation.json"}</w:instrText>
+        <w:instrText>ADDIN CSL_CITATION {"citationItems":[{"id":"ITEM-1","itemData":{"author":[{"dropping-particle":"","family":"Wikipedia","given":"","non-dropping-particle":"","parse-names":false,"suffix":""}],"container-title":"Wikipedia, Ensiklopedia Bebas","id":"ITEM-1","issued":{"date-parts":[["2018"]]},"title":"Unit Kendali","type":"entry-encyclopedia"},"uris":["http://www.mendeley.com/documents/?uuid=480912bf-5af0-482f-a027-515e65d7153b"]}],"mendeley":{"formattedCitation":"[12]","plainTextFormattedCitation":"[12]","previouslyFormattedCitation":"[12]"},"properties":{"noteIndex":0},"schema":"https://github.com/citation-style-language/schema/raw/master/csl-citation.json"}</w:instrText>
       </w:r>
       <w:r>
         <w:rPr>
@@ -42398,6 +42430,799 @@
         <w:jc w:val="both"/>
         <w:rPr>
           <w:rFonts w:ascii="Times New Roman" w:hAnsi="Times New Roman"/>
+          <w:color w:val="000000"/>
+          <w:sz w:val="24"/>
+          <w:szCs w:val="24"/>
+          <w:lang w:val="en-US"/>
+        </w:rPr>
+      </w:pPr>
+      <w:r>
+        <w:rPr>
+          <w:rFonts w:ascii="Times New Roman" w:hAnsi="Times New Roman"/>
+          <w:color w:val="000000"/>
+          <w:sz w:val="24"/>
+          <w:szCs w:val="24"/>
+          <w:lang w:val="en-US"/>
+        </w:rPr>
+        <w:t xml:space="preserve">Register </w:t>
+      </w:r>
+      <w:proofErr w:type="spellStart"/>
+      <w:r>
+        <w:rPr>
+          <w:rFonts w:ascii="Times New Roman" w:hAnsi="Times New Roman"/>
+          <w:color w:val="000000"/>
+          <w:sz w:val="24"/>
+          <w:szCs w:val="24"/>
+          <w:lang w:val="en-US"/>
+        </w:rPr>
+        <w:t>adalah</w:t>
+      </w:r>
+      <w:proofErr w:type="spellEnd"/>
+      <w:r>
+        <w:rPr>
+          <w:rFonts w:ascii="Times New Roman" w:hAnsi="Times New Roman"/>
+          <w:color w:val="000000"/>
+          <w:sz w:val="24"/>
+          <w:szCs w:val="24"/>
+          <w:lang w:val="en-US"/>
+        </w:rPr>
+        <w:t xml:space="preserve"> </w:t>
+      </w:r>
+      <w:proofErr w:type="spellStart"/>
+      <w:r>
+        <w:rPr>
+          <w:rFonts w:ascii="Times New Roman" w:hAnsi="Times New Roman"/>
+          <w:color w:val="000000"/>
+          <w:sz w:val="24"/>
+          <w:szCs w:val="24"/>
+          <w:lang w:val="en-US"/>
+        </w:rPr>
+        <w:t>memori</w:t>
+      </w:r>
+      <w:proofErr w:type="spellEnd"/>
+      <w:r>
+        <w:rPr>
+          <w:rFonts w:ascii="Times New Roman" w:hAnsi="Times New Roman"/>
+          <w:color w:val="000000"/>
+          <w:sz w:val="24"/>
+          <w:szCs w:val="24"/>
+          <w:lang w:val="en-US"/>
+        </w:rPr>
+        <w:t xml:space="preserve"> </w:t>
+      </w:r>
+      <w:proofErr w:type="spellStart"/>
+      <w:r>
+        <w:rPr>
+          <w:rFonts w:ascii="Times New Roman" w:hAnsi="Times New Roman"/>
+          <w:color w:val="000000"/>
+          <w:sz w:val="24"/>
+          <w:szCs w:val="24"/>
+          <w:lang w:val="en-US"/>
+        </w:rPr>
+        <w:t>berkapasitas</w:t>
+      </w:r>
+      <w:proofErr w:type="spellEnd"/>
+      <w:r>
+        <w:rPr>
+          <w:rFonts w:ascii="Times New Roman" w:hAnsi="Times New Roman"/>
+          <w:color w:val="000000"/>
+          <w:sz w:val="24"/>
+          <w:szCs w:val="24"/>
+          <w:lang w:val="en-US"/>
+        </w:rPr>
+        <w:t xml:space="preserve"> </w:t>
+      </w:r>
+      <w:proofErr w:type="spellStart"/>
+      <w:r>
+        <w:rPr>
+          <w:rFonts w:ascii="Times New Roman" w:hAnsi="Times New Roman"/>
+          <w:color w:val="000000"/>
+          <w:sz w:val="24"/>
+          <w:szCs w:val="24"/>
+          <w:lang w:val="en-US"/>
+        </w:rPr>
+        <w:t>kecil</w:t>
+      </w:r>
+      <w:proofErr w:type="spellEnd"/>
+      <w:r>
+        <w:rPr>
+          <w:rFonts w:ascii="Times New Roman" w:hAnsi="Times New Roman"/>
+          <w:color w:val="000000"/>
+          <w:sz w:val="24"/>
+          <w:szCs w:val="24"/>
+          <w:lang w:val="en-US"/>
+        </w:rPr>
+        <w:t xml:space="preserve"> yang </w:t>
+      </w:r>
+      <w:proofErr w:type="spellStart"/>
+      <w:r>
+        <w:rPr>
+          <w:rFonts w:ascii="Times New Roman" w:hAnsi="Times New Roman"/>
+          <w:color w:val="000000"/>
+          <w:sz w:val="24"/>
+          <w:szCs w:val="24"/>
+          <w:lang w:val="en-US"/>
+        </w:rPr>
+        <w:t>bekerja</w:t>
+      </w:r>
+      <w:proofErr w:type="spellEnd"/>
+      <w:r>
+        <w:rPr>
+          <w:rFonts w:ascii="Times New Roman" w:hAnsi="Times New Roman"/>
+          <w:color w:val="000000"/>
+          <w:sz w:val="24"/>
+          <w:szCs w:val="24"/>
+          <w:lang w:val="en-US"/>
+        </w:rPr>
+        <w:t xml:space="preserve"> </w:t>
+      </w:r>
+      <w:proofErr w:type="spellStart"/>
+      <w:r>
+        <w:rPr>
+          <w:rFonts w:ascii="Times New Roman" w:hAnsi="Times New Roman"/>
+          <w:color w:val="000000"/>
+          <w:sz w:val="24"/>
+          <w:szCs w:val="24"/>
+          <w:lang w:val="en-US"/>
+        </w:rPr>
+        <w:t>dengan</w:t>
+      </w:r>
+      <w:proofErr w:type="spellEnd"/>
+      <w:r>
+        <w:rPr>
+          <w:rFonts w:ascii="Times New Roman" w:hAnsi="Times New Roman"/>
+          <w:color w:val="000000"/>
+          <w:sz w:val="24"/>
+          <w:szCs w:val="24"/>
+          <w:lang w:val="en-US"/>
+        </w:rPr>
+        <w:t xml:space="preserve"> </w:t>
+      </w:r>
+      <w:proofErr w:type="spellStart"/>
+      <w:r>
+        <w:rPr>
+          <w:rFonts w:ascii="Times New Roman" w:hAnsi="Times New Roman"/>
+          <w:color w:val="000000"/>
+          <w:sz w:val="24"/>
+          <w:szCs w:val="24"/>
+          <w:lang w:val="en-US"/>
+        </w:rPr>
+        <w:t>kecepatan</w:t>
+      </w:r>
+      <w:proofErr w:type="spellEnd"/>
+      <w:r>
+        <w:rPr>
+          <w:rFonts w:ascii="Times New Roman" w:hAnsi="Times New Roman"/>
+          <w:color w:val="000000"/>
+          <w:sz w:val="24"/>
+          <w:szCs w:val="24"/>
+          <w:lang w:val="en-US"/>
+        </w:rPr>
+        <w:t xml:space="preserve"> </w:t>
+      </w:r>
+      <w:proofErr w:type="spellStart"/>
+      <w:r>
+        <w:rPr>
+          <w:rFonts w:ascii="Times New Roman" w:hAnsi="Times New Roman"/>
+          <w:color w:val="000000"/>
+          <w:sz w:val="24"/>
+          <w:szCs w:val="24"/>
+          <w:lang w:val="en-US"/>
+        </w:rPr>
+        <w:t>sangat</w:t>
+      </w:r>
+      <w:proofErr w:type="spellEnd"/>
+      <w:r>
+        <w:rPr>
+          <w:rFonts w:ascii="Times New Roman" w:hAnsi="Times New Roman"/>
+          <w:color w:val="000000"/>
+          <w:sz w:val="24"/>
+          <w:szCs w:val="24"/>
+          <w:lang w:val="en-US"/>
+        </w:rPr>
+        <w:t xml:space="preserve"> </w:t>
+      </w:r>
+      <w:proofErr w:type="spellStart"/>
+      <w:r>
+        <w:rPr>
+          <w:rFonts w:ascii="Times New Roman" w:hAnsi="Times New Roman"/>
+          <w:color w:val="000000"/>
+          <w:sz w:val="24"/>
+          <w:szCs w:val="24"/>
+          <w:lang w:val="en-US"/>
+        </w:rPr>
+        <w:t>tinggi</w:t>
+      </w:r>
+      <w:proofErr w:type="spellEnd"/>
+      <w:r>
+        <w:rPr>
+          <w:rFonts w:ascii="Times New Roman" w:hAnsi="Times New Roman"/>
+          <w:color w:val="000000"/>
+          <w:sz w:val="24"/>
+          <w:szCs w:val="24"/>
+          <w:lang w:val="en-US"/>
+        </w:rPr>
+        <w:t xml:space="preserve"> yang </w:t>
+      </w:r>
+      <w:proofErr w:type="spellStart"/>
+      <w:r>
+        <w:rPr>
+          <w:rFonts w:ascii="Times New Roman" w:hAnsi="Times New Roman"/>
+          <w:color w:val="000000"/>
+          <w:sz w:val="24"/>
+          <w:szCs w:val="24"/>
+          <w:lang w:val="en-US"/>
+        </w:rPr>
+        <w:t>digunakan</w:t>
+      </w:r>
+      <w:proofErr w:type="spellEnd"/>
+      <w:r>
+        <w:rPr>
+          <w:rFonts w:ascii="Times New Roman" w:hAnsi="Times New Roman"/>
+          <w:color w:val="000000"/>
+          <w:sz w:val="24"/>
+          <w:szCs w:val="24"/>
+          <w:lang w:val="en-US"/>
+        </w:rPr>
+        <w:t xml:space="preserve"> </w:t>
+      </w:r>
+      <w:proofErr w:type="spellStart"/>
+      <w:r>
+        <w:rPr>
+          <w:rFonts w:ascii="Times New Roman" w:hAnsi="Times New Roman"/>
+          <w:color w:val="000000"/>
+          <w:sz w:val="24"/>
+          <w:szCs w:val="24"/>
+          <w:lang w:val="en-US"/>
+        </w:rPr>
+        <w:t>untuk</w:t>
+      </w:r>
+      <w:proofErr w:type="spellEnd"/>
+      <w:r>
+        <w:rPr>
+          <w:rFonts w:ascii="Times New Roman" w:hAnsi="Times New Roman"/>
+          <w:color w:val="000000"/>
+          <w:sz w:val="24"/>
+          <w:szCs w:val="24"/>
+          <w:lang w:val="en-US"/>
+        </w:rPr>
+        <w:t xml:space="preserve"> </w:t>
+      </w:r>
+      <w:proofErr w:type="spellStart"/>
+      <w:r>
+        <w:rPr>
+          <w:rFonts w:ascii="Times New Roman" w:hAnsi="Times New Roman"/>
+          <w:color w:val="000000"/>
+          <w:sz w:val="24"/>
+          <w:szCs w:val="24"/>
+          <w:lang w:val="en-US"/>
+        </w:rPr>
+        <w:t>melakukan</w:t>
+      </w:r>
+      <w:proofErr w:type="spellEnd"/>
+      <w:r>
+        <w:rPr>
+          <w:rFonts w:ascii="Times New Roman" w:hAnsi="Times New Roman"/>
+          <w:color w:val="000000"/>
+          <w:sz w:val="24"/>
+          <w:szCs w:val="24"/>
+          <w:lang w:val="en-US"/>
+        </w:rPr>
+        <w:t xml:space="preserve"> </w:t>
+      </w:r>
+      <w:proofErr w:type="spellStart"/>
+      <w:r>
+        <w:rPr>
+          <w:rFonts w:ascii="Times New Roman" w:hAnsi="Times New Roman"/>
+          <w:color w:val="000000"/>
+          <w:sz w:val="24"/>
+          <w:szCs w:val="24"/>
+          <w:lang w:val="en-US"/>
+        </w:rPr>
+        <w:t>eksekusi</w:t>
+      </w:r>
+      <w:proofErr w:type="spellEnd"/>
+      <w:r>
+        <w:rPr>
+          <w:rFonts w:ascii="Times New Roman" w:hAnsi="Times New Roman"/>
+          <w:color w:val="000000"/>
+          <w:sz w:val="24"/>
+          <w:szCs w:val="24"/>
+          <w:lang w:val="en-US"/>
+        </w:rPr>
+        <w:t xml:space="preserve"> </w:t>
+      </w:r>
+      <w:proofErr w:type="spellStart"/>
+      <w:r>
+        <w:rPr>
+          <w:rFonts w:ascii="Times New Roman" w:hAnsi="Times New Roman"/>
+          <w:color w:val="000000"/>
+          <w:sz w:val="24"/>
+          <w:szCs w:val="24"/>
+          <w:lang w:val="en-US"/>
+        </w:rPr>
+        <w:t>terhadap</w:t>
+      </w:r>
+      <w:proofErr w:type="spellEnd"/>
+      <w:r>
+        <w:rPr>
+          <w:rFonts w:ascii="Times New Roman" w:hAnsi="Times New Roman"/>
+          <w:color w:val="000000"/>
+          <w:sz w:val="24"/>
+          <w:szCs w:val="24"/>
+          <w:lang w:val="en-US"/>
+        </w:rPr>
+        <w:t xml:space="preserve"> program-program </w:t>
+      </w:r>
+      <w:proofErr w:type="spellStart"/>
+      <w:r>
+        <w:rPr>
+          <w:rFonts w:ascii="Times New Roman" w:hAnsi="Times New Roman"/>
+          <w:color w:val="000000"/>
+          <w:sz w:val="24"/>
+          <w:szCs w:val="24"/>
+          <w:lang w:val="en-US"/>
+        </w:rPr>
+        <w:t>komputer</w:t>
+      </w:r>
+      <w:proofErr w:type="spellEnd"/>
+      <w:r>
+        <w:rPr>
+          <w:rFonts w:ascii="Times New Roman" w:hAnsi="Times New Roman"/>
+          <w:color w:val="000000"/>
+          <w:sz w:val="24"/>
+          <w:szCs w:val="24"/>
+          <w:lang w:val="en-US"/>
+        </w:rPr>
+        <w:t xml:space="preserve"> </w:t>
+      </w:r>
+      <w:proofErr w:type="spellStart"/>
+      <w:r>
+        <w:rPr>
+          <w:rFonts w:ascii="Times New Roman" w:hAnsi="Times New Roman"/>
+          <w:color w:val="000000"/>
+          <w:sz w:val="24"/>
+          <w:szCs w:val="24"/>
+          <w:lang w:val="en-US"/>
+        </w:rPr>
+        <w:lastRenderedPageBreak/>
+        <w:t>dengan</w:t>
+      </w:r>
+      <w:proofErr w:type="spellEnd"/>
+      <w:r>
+        <w:rPr>
+          <w:rFonts w:ascii="Times New Roman" w:hAnsi="Times New Roman"/>
+          <w:color w:val="000000"/>
+          <w:sz w:val="24"/>
+          <w:szCs w:val="24"/>
+          <w:lang w:val="en-US"/>
+        </w:rPr>
+        <w:t xml:space="preserve"> </w:t>
+      </w:r>
+      <w:proofErr w:type="spellStart"/>
+      <w:r>
+        <w:rPr>
+          <w:rFonts w:ascii="Times New Roman" w:hAnsi="Times New Roman"/>
+          <w:color w:val="000000"/>
+          <w:sz w:val="24"/>
+          <w:szCs w:val="24"/>
+          <w:lang w:val="en-US"/>
+        </w:rPr>
+        <w:t>menyediakan</w:t>
+      </w:r>
+      <w:proofErr w:type="spellEnd"/>
+      <w:r>
+        <w:rPr>
+          <w:rFonts w:ascii="Times New Roman" w:hAnsi="Times New Roman"/>
+          <w:color w:val="000000"/>
+          <w:sz w:val="24"/>
+          <w:szCs w:val="24"/>
+          <w:lang w:val="en-US"/>
+        </w:rPr>
+        <w:t xml:space="preserve"> </w:t>
+      </w:r>
+      <w:proofErr w:type="spellStart"/>
+      <w:r>
+        <w:rPr>
+          <w:rFonts w:ascii="Times New Roman" w:hAnsi="Times New Roman"/>
+          <w:color w:val="000000"/>
+          <w:sz w:val="24"/>
+          <w:szCs w:val="24"/>
+          <w:lang w:val="en-US"/>
+        </w:rPr>
+        <w:t>akses</w:t>
+      </w:r>
+      <w:proofErr w:type="spellEnd"/>
+      <w:r>
+        <w:rPr>
+          <w:rFonts w:ascii="Times New Roman" w:hAnsi="Times New Roman"/>
+          <w:color w:val="000000"/>
+          <w:sz w:val="24"/>
+          <w:szCs w:val="24"/>
+          <w:lang w:val="en-US"/>
+        </w:rPr>
+        <w:t xml:space="preserve"> yang </w:t>
+      </w:r>
+      <w:proofErr w:type="spellStart"/>
+      <w:r>
+        <w:rPr>
+          <w:rFonts w:ascii="Times New Roman" w:hAnsi="Times New Roman"/>
+          <w:color w:val="000000"/>
+          <w:sz w:val="24"/>
+          <w:szCs w:val="24"/>
+          <w:lang w:val="en-US"/>
+        </w:rPr>
+        <w:t>cepat</w:t>
+      </w:r>
+      <w:proofErr w:type="spellEnd"/>
+      <w:r>
+        <w:rPr>
+          <w:rFonts w:ascii="Times New Roman" w:hAnsi="Times New Roman"/>
+          <w:color w:val="000000"/>
+          <w:sz w:val="24"/>
+          <w:szCs w:val="24"/>
+          <w:lang w:val="en-US"/>
+        </w:rPr>
+        <w:t xml:space="preserve"> </w:t>
+      </w:r>
+      <w:proofErr w:type="spellStart"/>
+      <w:r>
+        <w:rPr>
+          <w:rFonts w:ascii="Times New Roman" w:hAnsi="Times New Roman"/>
+          <w:color w:val="000000"/>
+          <w:sz w:val="24"/>
+          <w:szCs w:val="24"/>
+          <w:lang w:val="en-US"/>
+        </w:rPr>
+        <w:t>terhadap</w:t>
+      </w:r>
+      <w:proofErr w:type="spellEnd"/>
+      <w:r>
+        <w:rPr>
+          <w:rFonts w:ascii="Times New Roman" w:hAnsi="Times New Roman"/>
+          <w:color w:val="000000"/>
+          <w:sz w:val="24"/>
+          <w:szCs w:val="24"/>
+          <w:lang w:val="en-US"/>
+        </w:rPr>
+        <w:t xml:space="preserve"> </w:t>
+      </w:r>
+      <w:proofErr w:type="spellStart"/>
+      <w:r>
+        <w:rPr>
+          <w:rFonts w:ascii="Times New Roman" w:hAnsi="Times New Roman"/>
+          <w:color w:val="000000"/>
+          <w:sz w:val="24"/>
+          <w:szCs w:val="24"/>
+          <w:lang w:val="en-US"/>
+        </w:rPr>
+        <w:t>nilai-nilai</w:t>
+      </w:r>
+      <w:proofErr w:type="spellEnd"/>
+      <w:r>
+        <w:rPr>
+          <w:rFonts w:ascii="Times New Roman" w:hAnsi="Times New Roman"/>
+          <w:color w:val="000000"/>
+          <w:sz w:val="24"/>
+          <w:szCs w:val="24"/>
+          <w:lang w:val="en-US"/>
+        </w:rPr>
+        <w:t xml:space="preserve"> yang </w:t>
+      </w:r>
+      <w:proofErr w:type="spellStart"/>
+      <w:r>
+        <w:rPr>
+          <w:rFonts w:ascii="Times New Roman" w:hAnsi="Times New Roman"/>
+          <w:color w:val="000000"/>
+          <w:sz w:val="24"/>
+          <w:szCs w:val="24"/>
+          <w:lang w:val="en-US"/>
+        </w:rPr>
+        <w:t>umum</w:t>
+      </w:r>
+      <w:proofErr w:type="spellEnd"/>
+      <w:r>
+        <w:rPr>
+          <w:rFonts w:ascii="Times New Roman" w:hAnsi="Times New Roman"/>
+          <w:color w:val="000000"/>
+          <w:sz w:val="24"/>
+          <w:szCs w:val="24"/>
+          <w:lang w:val="en-US"/>
+        </w:rPr>
+        <w:t xml:space="preserve"> </w:t>
+      </w:r>
+      <w:proofErr w:type="spellStart"/>
+      <w:r>
+        <w:rPr>
+          <w:rFonts w:ascii="Times New Roman" w:hAnsi="Times New Roman"/>
+          <w:color w:val="000000"/>
+          <w:sz w:val="24"/>
+          <w:szCs w:val="24"/>
+          <w:lang w:val="en-US"/>
+        </w:rPr>
+        <w:t>digunakan</w:t>
+      </w:r>
+      <w:proofErr w:type="spellEnd"/>
+      <w:r>
+        <w:rPr>
+          <w:rFonts w:ascii="Times New Roman" w:hAnsi="Times New Roman"/>
+          <w:color w:val="000000"/>
+          <w:sz w:val="24"/>
+          <w:szCs w:val="24"/>
+          <w:lang w:val="en-US"/>
+        </w:rPr>
+        <w:t>. Register u</w:t>
+      </w:r>
+      <w:proofErr w:type="spellStart"/>
+      <w:r>
+        <w:rPr>
+          <w:rFonts w:ascii="Times New Roman" w:hAnsi="Times New Roman"/>
+          <w:color w:val="000000"/>
+          <w:sz w:val="24"/>
+          <w:szCs w:val="24"/>
+          <w:lang w:val="en-US"/>
+        </w:rPr>
+        <w:t>mumnya</w:t>
+      </w:r>
+      <w:proofErr w:type="spellEnd"/>
+      <w:r>
+        <w:rPr>
+          <w:rFonts w:ascii="Times New Roman" w:hAnsi="Times New Roman"/>
+          <w:color w:val="000000"/>
+          <w:sz w:val="24"/>
+          <w:szCs w:val="24"/>
+          <w:lang w:val="en-US"/>
+        </w:rPr>
+        <w:t xml:space="preserve"> </w:t>
+      </w:r>
+      <w:proofErr w:type="spellStart"/>
+      <w:r>
+        <w:rPr>
+          <w:rFonts w:ascii="Times New Roman" w:hAnsi="Times New Roman"/>
+          <w:color w:val="000000"/>
+          <w:sz w:val="24"/>
+          <w:szCs w:val="24"/>
+          <w:lang w:val="en-US"/>
+        </w:rPr>
+        <w:t>diukur</w:t>
+      </w:r>
+      <w:proofErr w:type="spellEnd"/>
+      <w:r>
+        <w:rPr>
+          <w:rFonts w:ascii="Times New Roman" w:hAnsi="Times New Roman"/>
+          <w:color w:val="000000"/>
+          <w:sz w:val="24"/>
+          <w:szCs w:val="24"/>
+          <w:lang w:val="en-US"/>
+        </w:rPr>
+        <w:t xml:space="preserve"> </w:t>
+      </w:r>
+      <w:proofErr w:type="spellStart"/>
+      <w:r>
+        <w:rPr>
+          <w:rFonts w:ascii="Times New Roman" w:hAnsi="Times New Roman"/>
+          <w:color w:val="000000"/>
+          <w:sz w:val="24"/>
+          <w:szCs w:val="24"/>
+          <w:lang w:val="en-US"/>
+        </w:rPr>
+        <w:t>dengan</w:t>
+      </w:r>
+      <w:proofErr w:type="spellEnd"/>
+      <w:r>
+        <w:rPr>
+          <w:rFonts w:ascii="Times New Roman" w:hAnsi="Times New Roman"/>
+          <w:color w:val="000000"/>
+          <w:sz w:val="24"/>
+          <w:szCs w:val="24"/>
+          <w:lang w:val="en-US"/>
+        </w:rPr>
+        <w:t xml:space="preserve"> </w:t>
+      </w:r>
+      <w:proofErr w:type="spellStart"/>
+      <w:r>
+        <w:rPr>
+          <w:rFonts w:ascii="Times New Roman" w:hAnsi="Times New Roman"/>
+          <w:color w:val="000000"/>
+          <w:sz w:val="24"/>
+          <w:szCs w:val="24"/>
+          <w:lang w:val="en-US"/>
+        </w:rPr>
+        <w:t>satuan</w:t>
+      </w:r>
+      <w:proofErr w:type="spellEnd"/>
+      <w:r>
+        <w:rPr>
+          <w:rFonts w:ascii="Times New Roman" w:hAnsi="Times New Roman"/>
+          <w:color w:val="000000"/>
+          <w:sz w:val="24"/>
+          <w:szCs w:val="24"/>
+          <w:lang w:val="en-US"/>
+        </w:rPr>
+        <w:t xml:space="preserve"> bit yang </w:t>
+      </w:r>
+      <w:proofErr w:type="spellStart"/>
+      <w:r>
+        <w:rPr>
+          <w:rFonts w:ascii="Times New Roman" w:hAnsi="Times New Roman"/>
+          <w:color w:val="000000"/>
+          <w:sz w:val="24"/>
+          <w:szCs w:val="24"/>
+          <w:lang w:val="en-US"/>
+        </w:rPr>
+        <w:t>dapat</w:t>
+      </w:r>
+      <w:proofErr w:type="spellEnd"/>
+      <w:r>
+        <w:rPr>
+          <w:rFonts w:ascii="Times New Roman" w:hAnsi="Times New Roman"/>
+          <w:color w:val="000000"/>
+          <w:sz w:val="24"/>
+          <w:szCs w:val="24"/>
+          <w:lang w:val="en-US"/>
+        </w:rPr>
+        <w:t xml:space="preserve"> </w:t>
+      </w:r>
+      <w:proofErr w:type="spellStart"/>
+      <w:r>
+        <w:rPr>
+          <w:rFonts w:ascii="Times New Roman" w:hAnsi="Times New Roman"/>
+          <w:color w:val="000000"/>
+          <w:sz w:val="24"/>
+          <w:szCs w:val="24"/>
+          <w:lang w:val="en-US"/>
+        </w:rPr>
+        <w:t>ditampung</w:t>
+      </w:r>
+      <w:proofErr w:type="spellEnd"/>
+      <w:r>
+        <w:rPr>
+          <w:rFonts w:ascii="Times New Roman" w:hAnsi="Times New Roman"/>
+          <w:color w:val="000000"/>
+          <w:sz w:val="24"/>
+          <w:szCs w:val="24"/>
+          <w:lang w:val="en-US"/>
+        </w:rPr>
+        <w:t xml:space="preserve"> </w:t>
+      </w:r>
+      <w:proofErr w:type="spellStart"/>
+      <w:r>
+        <w:rPr>
+          <w:rFonts w:ascii="Times New Roman" w:hAnsi="Times New Roman"/>
+          <w:color w:val="000000"/>
+          <w:sz w:val="24"/>
+          <w:szCs w:val="24"/>
+          <w:lang w:val="en-US"/>
+        </w:rPr>
+        <w:t>olehnya</w:t>
+      </w:r>
+      <w:proofErr w:type="spellEnd"/>
+      <w:r>
+        <w:rPr>
+          <w:rFonts w:ascii="Times New Roman" w:hAnsi="Times New Roman"/>
+          <w:color w:val="000000"/>
+          <w:sz w:val="24"/>
+          <w:szCs w:val="24"/>
+          <w:lang w:val="en-US"/>
+        </w:rPr>
+        <w:t xml:space="preserve">, </w:t>
+      </w:r>
+      <w:proofErr w:type="spellStart"/>
+      <w:r>
+        <w:rPr>
+          <w:rFonts w:ascii="Times New Roman" w:hAnsi="Times New Roman"/>
+          <w:color w:val="000000"/>
+          <w:sz w:val="24"/>
+          <w:szCs w:val="24"/>
+          <w:lang w:val="en-US"/>
+        </w:rPr>
+        <w:t>seperti</w:t>
+      </w:r>
+      <w:proofErr w:type="spellEnd"/>
+      <w:r>
+        <w:rPr>
+          <w:rFonts w:ascii="Times New Roman" w:hAnsi="Times New Roman"/>
+          <w:color w:val="000000"/>
+          <w:sz w:val="24"/>
+          <w:szCs w:val="24"/>
+          <w:lang w:val="en-US"/>
+        </w:rPr>
+        <w:t xml:space="preserve"> "register 8-bit", "register 16-bit", "register 32-bit", </w:t>
+      </w:r>
+      <w:proofErr w:type="spellStart"/>
+      <w:r>
+        <w:rPr>
+          <w:rFonts w:ascii="Times New Roman" w:hAnsi="Times New Roman"/>
+          <w:color w:val="000000"/>
+          <w:sz w:val="24"/>
+          <w:szCs w:val="24"/>
+          <w:lang w:val="en-US"/>
+        </w:rPr>
+        <w:t>atau</w:t>
+      </w:r>
+      <w:proofErr w:type="spellEnd"/>
+      <w:r>
+        <w:rPr>
+          <w:rFonts w:ascii="Times New Roman" w:hAnsi="Times New Roman"/>
+          <w:color w:val="000000"/>
+          <w:sz w:val="24"/>
+          <w:szCs w:val="24"/>
+          <w:lang w:val="en-US"/>
+        </w:rPr>
+        <w:t xml:space="preserve"> "register 64-bit" dan lain-lain.</w:t>
+      </w:r>
+      <w:r>
+        <w:rPr>
+          <w:rFonts w:ascii="Times New Roman" w:hAnsi="Times New Roman"/>
+          <w:color w:val="000000"/>
+          <w:sz w:val="24"/>
+          <w:szCs w:val="24"/>
+          <w:lang w:val="en-US"/>
+        </w:rPr>
+        <w:fldChar w:fldCharType="begin" w:fldLock="1"/>
+      </w:r>
+      <w:r>
+        <w:rPr>
+          <w:rFonts w:ascii="Times New Roman" w:hAnsi="Times New Roman"/>
+          <w:color w:val="000000"/>
+          <w:sz w:val="24"/>
+          <w:szCs w:val="24"/>
+          <w:lang w:val="en-US"/>
+        </w:rPr>
+        <w:instrText>ADDIN CSL_CITATION {"citationItems":[{"id":"ITEM-1","itemData":{"author":[{"dropping-particle":"","family":"Wikipedia","given":"","non-dropping-particle":"","parse-names":false,"suffix":""}],"container-title":"Wikipedia, Ensiklopedia Bebas","id":"ITEM-1","issued":{"date-parts":[["2019"]]},"title":"Register prosesor","type":"entry-encyclopedia"},"uris":["http://www.mendeley.com/documents/?uuid=49550432-4a5b-4f0c-9b5f-9654909612d1"]}],"mendeley":{"formattedCitation":"[13]","plainTextFormattedCitation":"[13]","previouslyFormattedCitation":"[13]"},"properties":{"noteIndex":0},"schema":"https://github.com/citation-style-language/schema/raw/master/csl-citation.json"}</w:instrText>
+      </w:r>
+      <w:r>
+        <w:rPr>
+          <w:rFonts w:ascii="Times New Roman" w:hAnsi="Times New Roman"/>
+          <w:color w:val="000000"/>
+          <w:sz w:val="24"/>
+          <w:szCs w:val="24"/>
+          <w:lang w:val="en-US"/>
+        </w:rPr>
+        <w:fldChar w:fldCharType="separate"/>
+      </w:r>
+      <w:r>
+        <w:rPr>
+          <w:rFonts w:ascii="Times New Roman" w:hAnsi="Times New Roman"/>
+          <w:noProof/>
+          <w:color w:val="000000"/>
+          <w:sz w:val="24"/>
+          <w:szCs w:val="24"/>
+          <w:lang w:val="en-US"/>
+        </w:rPr>
+        <w:t>[13]</w:t>
+      </w:r>
+      <w:r>
+        <w:rPr>
+          <w:rFonts w:ascii="Times New Roman" w:hAnsi="Times New Roman"/>
+          <w:color w:val="000000"/>
+          <w:sz w:val="24"/>
+          <w:szCs w:val="24"/>
+          <w:lang w:val="en-US"/>
+        </w:rPr>
+        <w:fldChar w:fldCharType="end"/>
+      </w:r>
+    </w:p>
+    <w:p>
+      <w:pPr>
+        <w:pStyle w:val="ListParagraph"/>
+        <w:widowControl w:val="0"/>
+        <w:numPr>
+          <w:ilvl w:val="2"/>
+          <w:numId w:val="10"/>
+        </w:numPr>
+        <w:tabs>
+          <w:tab w:val="left" w:leader="dot" w:pos="8222"/>
+          <w:tab w:val="right" w:pos="8788"/>
+        </w:tabs>
+        <w:autoSpaceDE w:val="0"/>
+        <w:autoSpaceDN w:val="0"/>
+        <w:adjustRightInd w:val="0"/>
+        <w:spacing w:after="0" w:line="360" w:lineRule="auto"/>
+        <w:ind w:left="1134" w:hanging="567"/>
+        <w:jc w:val="both"/>
+        <w:rPr>
+          <w:rFonts w:ascii="Times New Roman" w:hAnsi="Times New Roman"/>
           <w:b/>
           <w:bCs/>
           <w:color w:val="000000"/>
@@ -42406,15 +43231,127 @@
           <w:lang w:val="en-US"/>
         </w:rPr>
       </w:pPr>
-      <w:r>
-        <w:rPr>
-          <w:rFonts w:ascii="Times New Roman" w:hAnsi="Times New Roman"/>
-          <w:color w:val="000000"/>
-          <w:sz w:val="24"/>
-          <w:szCs w:val="24"/>
-          <w:lang w:val="en-US"/>
-        </w:rPr>
-        <w:t xml:space="preserve">Register </w:t>
+      <w:proofErr w:type="spellStart"/>
+      <w:r>
+        <w:rPr>
+          <w:rFonts w:ascii="Times New Roman" w:hAnsi="Times New Roman"/>
+          <w:b/>
+          <w:bCs/>
+          <w:color w:val="000000"/>
+          <w:sz w:val="24"/>
+          <w:szCs w:val="24"/>
+          <w:lang w:val="en-US"/>
+        </w:rPr>
+        <w:t>P</w:t>
+      </w:r>
+      <w:r>
+        <w:rPr>
+          <w:rFonts w:ascii="Times New Roman" w:hAnsi="Times New Roman"/>
+          <w:b/>
+          <w:bCs/>
+          <w:color w:val="000000"/>
+          <w:sz w:val="24"/>
+          <w:szCs w:val="24"/>
+          <w:lang w:val="en-US"/>
+        </w:rPr>
+        <w:t>r</w:t>
+      </w:r>
+      <w:r>
+        <w:rPr>
+          <w:rFonts w:ascii="Times New Roman" w:hAnsi="Times New Roman"/>
+          <w:b/>
+          <w:bCs/>
+          <w:color w:val="000000"/>
+          <w:sz w:val="24"/>
+          <w:szCs w:val="24"/>
+          <w:lang w:val="en-US"/>
+        </w:rPr>
+        <w:t>osesor</w:t>
+      </w:r>
+      <w:proofErr w:type="spellEnd"/>
+      <w:r>
+        <w:rPr>
+          <w:rFonts w:ascii="Times New Roman" w:hAnsi="Times New Roman"/>
+          <w:b/>
+          <w:bCs/>
+          <w:color w:val="000000"/>
+          <w:sz w:val="24"/>
+          <w:szCs w:val="24"/>
+          <w:lang w:val="en-US"/>
+        </w:rPr>
+        <w:t xml:space="preserve"> </w:t>
+      </w:r>
+      <w:proofErr w:type="spellStart"/>
+      <w:r>
+        <w:rPr>
+          <w:rFonts w:ascii="Times New Roman" w:hAnsi="Times New Roman"/>
+          <w:b/>
+          <w:bCs/>
+          <w:color w:val="000000"/>
+          <w:sz w:val="24"/>
+          <w:szCs w:val="24"/>
+          <w:lang w:val="en-US"/>
+        </w:rPr>
+        <w:t>Xtensa</w:t>
+      </w:r>
+      <w:proofErr w:type="spellEnd"/>
+      <w:r>
+        <w:rPr>
+          <w:rFonts w:ascii="Times New Roman" w:hAnsi="Times New Roman"/>
+          <w:b/>
+          <w:bCs/>
+          <w:color w:val="000000"/>
+          <w:sz w:val="24"/>
+          <w:szCs w:val="24"/>
+          <w:lang w:val="en-US"/>
+        </w:rPr>
+        <w:t xml:space="preserve"> LX6</w:t>
+      </w:r>
+    </w:p>
+    <w:p>
+      <w:pPr>
+        <w:pStyle w:val="ListParagraph"/>
+        <w:widowControl w:val="0"/>
+        <w:tabs>
+          <w:tab w:val="left" w:leader="dot" w:pos="8222"/>
+          <w:tab w:val="right" w:pos="8788"/>
+        </w:tabs>
+        <w:autoSpaceDE w:val="0"/>
+        <w:autoSpaceDN w:val="0"/>
+        <w:adjustRightInd w:val="0"/>
+        <w:spacing w:after="240" w:line="360" w:lineRule="auto"/>
+        <w:ind w:left="567" w:firstLine="567"/>
+        <w:contextualSpacing w:val="0"/>
+        <w:jc w:val="both"/>
+        <w:rPr>
+          <w:rFonts w:ascii="Times New Roman" w:hAnsi="Times New Roman"/>
+          <w:color w:val="000000"/>
+          <w:sz w:val="24"/>
+          <w:szCs w:val="24"/>
+          <w:lang w:val="en-US"/>
+        </w:rPr>
+      </w:pPr>
+      <w:proofErr w:type="spellStart"/>
+      <w:r>
+        <w:rPr>
+          <w:rFonts w:ascii="Times New Roman" w:hAnsi="Times New Roman"/>
+          <w:color w:val="000000"/>
+          <w:sz w:val="24"/>
+          <w:szCs w:val="24"/>
+          <w:lang w:val="en-US"/>
+        </w:rPr>
+        <w:t>Xtensa</w:t>
+      </w:r>
+      <w:proofErr w:type="spellEnd"/>
+      <w:r>
+        <w:rPr>
+          <w:rFonts w:ascii="Times New Roman" w:hAnsi="Times New Roman"/>
+          <w:color w:val="000000"/>
+          <w:sz w:val="24"/>
+          <w:szCs w:val="24"/>
+          <w:lang w:val="en-US"/>
+        </w:rPr>
+        <w:t xml:space="preserve"> LX6 </w:t>
       </w:r>
       <w:proofErr w:type="spellStart"/>
       <w:r>
@@ -42447,51 +43384,7 @@
           <w:szCs w:val="24"/>
           <w:lang w:val="en-US"/>
         </w:rPr>
-        <w:t>memori</w:t>
-      </w:r>
-      <w:proofErr w:type="spellEnd"/>
-      <w:r>
-        <w:rPr>
-          <w:rFonts w:ascii="Times New Roman" w:hAnsi="Times New Roman"/>
-          <w:color w:val="000000"/>
-          <w:sz w:val="24"/>
-          <w:szCs w:val="24"/>
-          <w:lang w:val="en-US"/>
-        </w:rPr>
-        <w:t xml:space="preserve"> </w:t>
-      </w:r>
-      <w:proofErr w:type="spellStart"/>
-      <w:r>
-        <w:rPr>
-          <w:rFonts w:ascii="Times New Roman" w:hAnsi="Times New Roman"/>
-          <w:color w:val="000000"/>
-          <w:sz w:val="24"/>
-          <w:szCs w:val="24"/>
-          <w:lang w:val="en-US"/>
-        </w:rPr>
-        <w:t>berkapasitas</w:t>
-      </w:r>
-      <w:proofErr w:type="spellEnd"/>
-      <w:r>
-        <w:rPr>
-          <w:rFonts w:ascii="Times New Roman" w:hAnsi="Times New Roman"/>
-          <w:color w:val="000000"/>
-          <w:sz w:val="24"/>
-          <w:szCs w:val="24"/>
-          <w:lang w:val="en-US"/>
-        </w:rPr>
-        <w:t xml:space="preserve"> </w:t>
-      </w:r>
-      <w:proofErr w:type="spellStart"/>
-      <w:r>
-        <w:rPr>
-          <w:rFonts w:ascii="Times New Roman" w:hAnsi="Times New Roman"/>
-          <w:color w:val="000000"/>
-          <w:sz w:val="24"/>
-          <w:szCs w:val="24"/>
-          <w:lang w:val="en-US"/>
-        </w:rPr>
-        <w:t>kecil</w:t>
+        <w:t>mikroprosesor</w:t>
       </w:r>
       <w:proofErr w:type="spellEnd"/>
       <w:r>
@@ -42513,9 +43406,249 @@
           <w:szCs w:val="24"/>
           <w:lang w:val="en-US"/>
         </w:rPr>
-        <w:t>bekerja</w:t>
-      </w:r>
-      <w:proofErr w:type="spellEnd"/>
+        <w:t>dikeluarkan</w:t>
+      </w:r>
+      <w:proofErr w:type="spellEnd"/>
+      <w:r>
+        <w:rPr>
+          <w:rFonts w:ascii="Times New Roman" w:hAnsi="Times New Roman"/>
+          <w:color w:val="000000"/>
+          <w:sz w:val="24"/>
+          <w:szCs w:val="24"/>
+          <w:lang w:val="en-US"/>
+        </w:rPr>
+        <w:t xml:space="preserve"> oleh </w:t>
+      </w:r>
+      <w:proofErr w:type="spellStart"/>
+      <w:r>
+        <w:rPr>
+          <w:rFonts w:ascii="Times New Roman" w:hAnsi="Times New Roman"/>
+          <w:color w:val="000000"/>
+          <w:sz w:val="24"/>
+          <w:szCs w:val="24"/>
+          <w:lang w:val="en-US"/>
+        </w:rPr>
+        <w:t>Tensilica</w:t>
+      </w:r>
+      <w:proofErr w:type="spellEnd"/>
+      <w:r>
+        <w:rPr>
+          <w:rFonts w:ascii="Times New Roman" w:hAnsi="Times New Roman"/>
+          <w:color w:val="000000"/>
+          <w:sz w:val="24"/>
+          <w:szCs w:val="24"/>
+          <w:lang w:val="en-US"/>
+        </w:rPr>
+        <w:t xml:space="preserve"> yang </w:t>
+      </w:r>
+      <w:proofErr w:type="spellStart"/>
+      <w:r>
+        <w:rPr>
+          <w:rFonts w:ascii="Times New Roman" w:hAnsi="Times New Roman"/>
+          <w:color w:val="000000"/>
+          <w:sz w:val="24"/>
+          <w:szCs w:val="24"/>
+          <w:lang w:val="en-US"/>
+        </w:rPr>
+        <w:t>sekarang</w:t>
+      </w:r>
+      <w:proofErr w:type="spellEnd"/>
+      <w:r>
+        <w:rPr>
+          <w:rFonts w:ascii="Times New Roman" w:hAnsi="Times New Roman"/>
+          <w:color w:val="000000"/>
+          <w:sz w:val="24"/>
+          <w:szCs w:val="24"/>
+          <w:lang w:val="en-US"/>
+        </w:rPr>
+        <w:t xml:space="preserve"> </w:t>
+      </w:r>
+      <w:proofErr w:type="spellStart"/>
+      <w:r>
+        <w:rPr>
+          <w:rFonts w:ascii="Times New Roman" w:hAnsi="Times New Roman"/>
+          <w:color w:val="000000"/>
+          <w:sz w:val="24"/>
+          <w:szCs w:val="24"/>
+          <w:lang w:val="en-US"/>
+        </w:rPr>
+        <w:t>telah</w:t>
+      </w:r>
+      <w:proofErr w:type="spellEnd"/>
+      <w:r>
+        <w:rPr>
+          <w:rFonts w:ascii="Times New Roman" w:hAnsi="Times New Roman"/>
+          <w:color w:val="000000"/>
+          <w:sz w:val="24"/>
+          <w:szCs w:val="24"/>
+          <w:lang w:val="en-US"/>
+        </w:rPr>
+        <w:t xml:space="preserve"> </w:t>
+      </w:r>
+      <w:proofErr w:type="spellStart"/>
+      <w:r>
+        <w:rPr>
+          <w:rFonts w:ascii="Times New Roman" w:hAnsi="Times New Roman"/>
+          <w:color w:val="000000"/>
+          <w:sz w:val="24"/>
+          <w:szCs w:val="24"/>
+          <w:lang w:val="en-US"/>
+        </w:rPr>
+        <w:t>diakuisisi</w:t>
+      </w:r>
+      <w:proofErr w:type="spellEnd"/>
+      <w:r>
+        <w:rPr>
+          <w:rFonts w:ascii="Times New Roman" w:hAnsi="Times New Roman"/>
+          <w:color w:val="000000"/>
+          <w:sz w:val="24"/>
+          <w:szCs w:val="24"/>
+          <w:lang w:val="en-US"/>
+        </w:rPr>
+        <w:t xml:space="preserve"> oleh </w:t>
+      </w:r>
+      <w:proofErr w:type="spellStart"/>
+      <w:r>
+        <w:rPr>
+          <w:rFonts w:ascii="Times New Roman" w:hAnsi="Times New Roman"/>
+          <w:color w:val="000000"/>
+          <w:sz w:val="24"/>
+          <w:szCs w:val="24"/>
+          <w:lang w:val="en-US"/>
+        </w:rPr>
+        <w:t>perusahaan</w:t>
+      </w:r>
+      <w:proofErr w:type="spellEnd"/>
+      <w:r>
+        <w:rPr>
+          <w:rFonts w:ascii="Times New Roman" w:hAnsi="Times New Roman"/>
+          <w:color w:val="000000"/>
+          <w:sz w:val="24"/>
+          <w:szCs w:val="24"/>
+          <w:lang w:val="en-US"/>
+        </w:rPr>
+        <w:t xml:space="preserve"> </w:t>
+      </w:r>
+      <w:r>
+        <w:rPr>
+          <w:rFonts w:ascii="Times New Roman" w:hAnsi="Times New Roman"/>
+          <w:color w:val="000000"/>
+          <w:sz w:val="24"/>
+          <w:szCs w:val="24"/>
+          <w:lang w:val="en-US"/>
+        </w:rPr>
+        <w:t xml:space="preserve">Cadence </w:t>
+      </w:r>
+      <w:r>
+        <w:rPr>
+          <w:rFonts w:ascii="Times New Roman" w:hAnsi="Times New Roman"/>
+          <w:color w:val="000000"/>
+          <w:sz w:val="24"/>
+          <w:szCs w:val="24"/>
+          <w:lang w:val="en-US"/>
+        </w:rPr>
+        <w:t xml:space="preserve">yang </w:t>
+      </w:r>
+      <w:proofErr w:type="spellStart"/>
+      <w:r>
+        <w:rPr>
+          <w:rFonts w:ascii="Times New Roman" w:hAnsi="Times New Roman"/>
+          <w:color w:val="000000"/>
+          <w:sz w:val="24"/>
+          <w:szCs w:val="24"/>
+          <w:lang w:val="en-US"/>
+        </w:rPr>
+        <w:t>memberikan</w:t>
+      </w:r>
+      <w:proofErr w:type="spellEnd"/>
+      <w:r>
+        <w:rPr>
+          <w:rFonts w:ascii="Times New Roman" w:hAnsi="Times New Roman"/>
+          <w:color w:val="000000"/>
+          <w:sz w:val="24"/>
+          <w:szCs w:val="24"/>
+          <w:lang w:val="en-US"/>
+        </w:rPr>
+        <w:t xml:space="preserve"> </w:t>
+      </w:r>
+      <w:proofErr w:type="spellStart"/>
+      <w:r>
+        <w:rPr>
+          <w:rFonts w:ascii="Times New Roman" w:hAnsi="Times New Roman"/>
+          <w:color w:val="000000"/>
+          <w:sz w:val="24"/>
+          <w:szCs w:val="24"/>
+          <w:lang w:val="en-US"/>
+        </w:rPr>
+        <w:t>rancang</w:t>
+      </w:r>
+      <w:r>
+        <w:rPr>
+          <w:rFonts w:ascii="Times New Roman" w:hAnsi="Times New Roman"/>
+          <w:color w:val="000000"/>
+          <w:sz w:val="24"/>
+          <w:szCs w:val="24"/>
+          <w:lang w:val="en-US"/>
+        </w:rPr>
+        <w:t>an</w:t>
+      </w:r>
+      <w:proofErr w:type="spellEnd"/>
+      <w:r>
+        <w:rPr>
+          <w:rFonts w:ascii="Times New Roman" w:hAnsi="Times New Roman"/>
+          <w:color w:val="000000"/>
+          <w:sz w:val="24"/>
+          <w:szCs w:val="24"/>
+          <w:lang w:val="en-US"/>
+        </w:rPr>
+        <w:t xml:space="preserve"> </w:t>
+      </w:r>
+      <w:r>
+        <w:rPr>
+          <w:rFonts w:ascii="Times New Roman" w:hAnsi="Times New Roman"/>
+          <w:color w:val="000000"/>
+          <w:sz w:val="24"/>
+          <w:szCs w:val="24"/>
+          <w:lang w:val="en-US"/>
+        </w:rPr>
+        <w:t>pada SoC (</w:t>
+      </w:r>
+      <w:proofErr w:type="spellStart"/>
+      <w:r>
+        <w:rPr>
+          <w:rFonts w:ascii="Times New Roman" w:hAnsi="Times New Roman"/>
+          <w:i/>
+          <w:iCs/>
+          <w:color w:val="000000"/>
+          <w:sz w:val="24"/>
+          <w:szCs w:val="24"/>
+          <w:lang w:val="en-US"/>
+        </w:rPr>
+        <w:t>sistem</w:t>
+      </w:r>
+      <w:proofErr w:type="spellEnd"/>
+      <w:r>
+        <w:rPr>
+          <w:rFonts w:ascii="Times New Roman" w:hAnsi="Times New Roman"/>
+          <w:i/>
+          <w:iCs/>
+          <w:color w:val="000000"/>
+          <w:sz w:val="24"/>
+          <w:szCs w:val="24"/>
+          <w:lang w:val="en-US"/>
+        </w:rPr>
+        <w:t>-on-chip</w:t>
+      </w:r>
+      <w:r>
+        <w:rPr>
+          <w:rFonts w:ascii="Times New Roman" w:hAnsi="Times New Roman"/>
+          <w:color w:val="000000"/>
+          <w:sz w:val="24"/>
+          <w:szCs w:val="24"/>
+          <w:lang w:val="en-US"/>
+        </w:rPr>
+        <w:t>)</w:t>
+      </w:r>
       <w:r>
         <w:rPr>
           <w:rFonts w:ascii="Times New Roman" w:hAnsi="Times New Roman"/>
@@ -42546,62 +43679,84 @@
           <w:szCs w:val="24"/>
           <w:lang w:val="en-US"/>
         </w:rPr>
-        <w:t xml:space="preserve"> </w:t>
-      </w:r>
-      <w:proofErr w:type="spellStart"/>
-      <w:r>
-        <w:rPr>
-          <w:rFonts w:ascii="Times New Roman" w:hAnsi="Times New Roman"/>
-          <w:color w:val="000000"/>
-          <w:sz w:val="24"/>
-          <w:szCs w:val="24"/>
-          <w:lang w:val="en-US"/>
-        </w:rPr>
-        <w:t>kecepatan</w:t>
-      </w:r>
-      <w:proofErr w:type="spellEnd"/>
-      <w:r>
-        <w:rPr>
-          <w:rFonts w:ascii="Times New Roman" w:hAnsi="Times New Roman"/>
-          <w:color w:val="000000"/>
-          <w:sz w:val="24"/>
-          <w:szCs w:val="24"/>
-          <w:lang w:val="en-US"/>
-        </w:rPr>
-        <w:t xml:space="preserve"> </w:t>
-      </w:r>
-      <w:proofErr w:type="spellStart"/>
-      <w:r>
-        <w:rPr>
-          <w:rFonts w:ascii="Times New Roman" w:hAnsi="Times New Roman"/>
-          <w:color w:val="000000"/>
-          <w:sz w:val="24"/>
-          <w:szCs w:val="24"/>
-          <w:lang w:val="en-US"/>
-        </w:rPr>
-        <w:t>sangat</w:t>
-      </w:r>
-      <w:proofErr w:type="spellEnd"/>
-      <w:r>
-        <w:rPr>
-          <w:rFonts w:ascii="Times New Roman" w:hAnsi="Times New Roman"/>
-          <w:color w:val="000000"/>
-          <w:sz w:val="24"/>
-          <w:szCs w:val="24"/>
-          <w:lang w:val="en-US"/>
-        </w:rPr>
-        <w:t xml:space="preserve"> </w:t>
-      </w:r>
-      <w:proofErr w:type="spellStart"/>
-      <w:r>
-        <w:rPr>
-          <w:rFonts w:ascii="Times New Roman" w:hAnsi="Times New Roman"/>
-          <w:color w:val="000000"/>
-          <w:sz w:val="24"/>
-          <w:szCs w:val="24"/>
-          <w:lang w:val="en-US"/>
-        </w:rPr>
-        <w:t>tinggi</w:t>
+        <w:t xml:space="preserve"> inti </w:t>
+      </w:r>
+      <w:proofErr w:type="spellStart"/>
+      <w:r>
+        <w:rPr>
+          <w:rFonts w:ascii="Times New Roman" w:hAnsi="Times New Roman"/>
+          <w:color w:val="000000"/>
+          <w:sz w:val="24"/>
+          <w:szCs w:val="24"/>
+          <w:lang w:val="en-US"/>
+        </w:rPr>
+        <w:t>prosesor</w:t>
+      </w:r>
+      <w:proofErr w:type="spellEnd"/>
+      <w:r>
+        <w:rPr>
+          <w:rFonts w:ascii="Times New Roman" w:hAnsi="Times New Roman"/>
+          <w:color w:val="000000"/>
+          <w:sz w:val="24"/>
+          <w:szCs w:val="24"/>
+          <w:lang w:val="en-US"/>
+        </w:rPr>
+        <w:t xml:space="preserve"> </w:t>
+      </w:r>
+      <w:proofErr w:type="spellStart"/>
+      <w:r>
+        <w:rPr>
+          <w:rFonts w:ascii="Times New Roman" w:hAnsi="Times New Roman"/>
+          <w:color w:val="000000"/>
+          <w:sz w:val="24"/>
+          <w:szCs w:val="24"/>
+          <w:lang w:val="en-US"/>
+        </w:rPr>
+        <w:t>pertama</w:t>
+      </w:r>
+      <w:proofErr w:type="spellEnd"/>
+      <w:r>
+        <w:rPr>
+          <w:rFonts w:ascii="Times New Roman" w:hAnsi="Times New Roman"/>
+          <w:color w:val="000000"/>
+          <w:sz w:val="24"/>
+          <w:szCs w:val="24"/>
+          <w:lang w:val="en-US"/>
+        </w:rPr>
+        <w:t xml:space="preserve"> dan </w:t>
+      </w:r>
+      <w:proofErr w:type="spellStart"/>
+      <w:r>
+        <w:rPr>
+          <w:rFonts w:ascii="Times New Roman" w:hAnsi="Times New Roman"/>
+          <w:color w:val="000000"/>
+          <w:sz w:val="24"/>
+          <w:szCs w:val="24"/>
+          <w:lang w:val="en-US"/>
+        </w:rPr>
+        <w:t>satu-satunya</w:t>
+      </w:r>
+      <w:proofErr w:type="spellEnd"/>
+      <w:r>
+        <w:rPr>
+          <w:rFonts w:ascii="Times New Roman" w:hAnsi="Times New Roman"/>
+          <w:color w:val="000000"/>
+          <w:sz w:val="24"/>
+          <w:szCs w:val="24"/>
+          <w:lang w:val="en-US"/>
+        </w:rPr>
+        <w:t xml:space="preserve"> </w:t>
+      </w:r>
+      <w:proofErr w:type="spellStart"/>
+      <w:r>
+        <w:rPr>
+          <w:rFonts w:ascii="Times New Roman" w:hAnsi="Times New Roman"/>
+          <w:color w:val="000000"/>
+          <w:sz w:val="24"/>
+          <w:szCs w:val="24"/>
+          <w:lang w:val="en-US"/>
+        </w:rPr>
+        <w:t>didunia</w:t>
       </w:r>
       <w:proofErr w:type="spellEnd"/>
       <w:r>
@@ -42623,7 +43778,457 @@
           <w:szCs w:val="24"/>
           <w:lang w:val="en-US"/>
         </w:rPr>
-        <w:t>digunakan</w:t>
+        <w:t>dapat</w:t>
+      </w:r>
+      <w:proofErr w:type="spellEnd"/>
+      <w:r>
+        <w:rPr>
+          <w:rFonts w:ascii="Times New Roman" w:hAnsi="Times New Roman"/>
+          <w:color w:val="000000"/>
+          <w:sz w:val="24"/>
+          <w:szCs w:val="24"/>
+          <w:lang w:val="en-US"/>
+        </w:rPr>
+        <w:t xml:space="preserve"> </w:t>
+      </w:r>
+      <w:proofErr w:type="spellStart"/>
+      <w:r>
+        <w:rPr>
+          <w:rFonts w:ascii="Times New Roman" w:hAnsi="Times New Roman"/>
+          <w:color w:val="000000"/>
+          <w:sz w:val="24"/>
+          <w:szCs w:val="24"/>
+          <w:lang w:val="en-US"/>
+        </w:rPr>
+        <w:t>dikonfigurasi</w:t>
+      </w:r>
+      <w:proofErr w:type="spellEnd"/>
+      <w:r>
+        <w:rPr>
+          <w:rFonts w:ascii="Times New Roman" w:hAnsi="Times New Roman"/>
+          <w:color w:val="000000"/>
+          <w:sz w:val="24"/>
+          <w:szCs w:val="24"/>
+          <w:lang w:val="en-US"/>
+        </w:rPr>
+        <w:t>,</w:t>
+      </w:r>
+      <w:r>
+        <w:rPr>
+          <w:rFonts w:ascii="Times New Roman" w:hAnsi="Times New Roman"/>
+          <w:color w:val="000000"/>
+          <w:sz w:val="24"/>
+          <w:szCs w:val="24"/>
+          <w:lang w:val="en-US"/>
+        </w:rPr>
+        <w:t xml:space="preserve"> </w:t>
+      </w:r>
+      <w:proofErr w:type="spellStart"/>
+      <w:r>
+        <w:rPr>
+          <w:rFonts w:ascii="Times New Roman" w:hAnsi="Times New Roman"/>
+          <w:color w:val="000000"/>
+          <w:sz w:val="24"/>
+          <w:szCs w:val="24"/>
+          <w:lang w:val="en-US"/>
+        </w:rPr>
+        <w:t>dikembangkan</w:t>
+      </w:r>
+      <w:proofErr w:type="spellEnd"/>
+      <w:r>
+        <w:rPr>
+          <w:rFonts w:ascii="Times New Roman" w:hAnsi="Times New Roman"/>
+          <w:color w:val="000000"/>
+          <w:sz w:val="24"/>
+          <w:szCs w:val="24"/>
+          <w:lang w:val="en-US"/>
+        </w:rPr>
+        <w:t xml:space="preserve"> dan </w:t>
+      </w:r>
+      <w:proofErr w:type="spellStart"/>
+      <w:r>
+        <w:rPr>
+          <w:rFonts w:ascii="Times New Roman" w:hAnsi="Times New Roman"/>
+          <w:color w:val="000000"/>
+          <w:sz w:val="24"/>
+          <w:szCs w:val="24"/>
+          <w:lang w:val="en-US"/>
+        </w:rPr>
+        <w:t>didukung</w:t>
+      </w:r>
+      <w:proofErr w:type="spellEnd"/>
+      <w:r>
+        <w:rPr>
+          <w:rFonts w:ascii="Times New Roman" w:hAnsi="Times New Roman"/>
+          <w:color w:val="000000"/>
+          <w:sz w:val="24"/>
+          <w:szCs w:val="24"/>
+          <w:lang w:val="en-US"/>
+        </w:rPr>
+        <w:t xml:space="preserve"> </w:t>
+      </w:r>
+      <w:proofErr w:type="spellStart"/>
+      <w:r>
+        <w:rPr>
+          <w:rFonts w:ascii="Times New Roman" w:hAnsi="Times New Roman"/>
+          <w:color w:val="000000"/>
+          <w:sz w:val="24"/>
+          <w:szCs w:val="24"/>
+          <w:lang w:val="en-US"/>
+        </w:rPr>
+        <w:t>penuh</w:t>
+      </w:r>
+      <w:proofErr w:type="spellEnd"/>
+      <w:r>
+        <w:rPr>
+          <w:rFonts w:ascii="Times New Roman" w:hAnsi="Times New Roman"/>
+          <w:color w:val="000000"/>
+          <w:sz w:val="24"/>
+          <w:szCs w:val="24"/>
+          <w:lang w:val="en-US"/>
+        </w:rPr>
+        <w:t xml:space="preserve"> oleh </w:t>
+      </w:r>
+      <w:proofErr w:type="spellStart"/>
+      <w:r>
+        <w:rPr>
+          <w:rFonts w:ascii="Times New Roman" w:hAnsi="Times New Roman"/>
+          <w:color w:val="000000"/>
+          <w:sz w:val="24"/>
+          <w:szCs w:val="24"/>
+          <w:lang w:val="en-US"/>
+        </w:rPr>
+        <w:t>generasi</w:t>
+      </w:r>
+      <w:proofErr w:type="spellEnd"/>
+      <w:r>
+        <w:rPr>
+          <w:rFonts w:ascii="Times New Roman" w:hAnsi="Times New Roman"/>
+          <w:color w:val="000000"/>
+          <w:sz w:val="24"/>
+          <w:szCs w:val="24"/>
+          <w:lang w:val="en-US"/>
+        </w:rPr>
+        <w:t xml:space="preserve"> </w:t>
+      </w:r>
+      <w:proofErr w:type="spellStart"/>
+      <w:r>
+        <w:rPr>
+          <w:rFonts w:ascii="Times New Roman" w:hAnsi="Times New Roman"/>
+          <w:color w:val="000000"/>
+          <w:sz w:val="24"/>
+          <w:szCs w:val="24"/>
+          <w:lang w:val="en-US"/>
+        </w:rPr>
+        <w:t>pembuatan</w:t>
+      </w:r>
+      <w:proofErr w:type="spellEnd"/>
+      <w:r>
+        <w:rPr>
+          <w:rFonts w:ascii="Times New Roman" w:hAnsi="Times New Roman"/>
+          <w:color w:val="000000"/>
+          <w:sz w:val="24"/>
+          <w:szCs w:val="24"/>
+          <w:lang w:val="en-US"/>
+        </w:rPr>
+        <w:t xml:space="preserve"> </w:t>
+      </w:r>
+      <w:proofErr w:type="spellStart"/>
+      <w:r>
+        <w:rPr>
+          <w:rFonts w:ascii="Times New Roman" w:hAnsi="Times New Roman"/>
+          <w:color w:val="000000"/>
+          <w:sz w:val="24"/>
+          <w:szCs w:val="24"/>
+          <w:lang w:val="en-US"/>
+        </w:rPr>
+        <w:t>perangkat</w:t>
+      </w:r>
+      <w:proofErr w:type="spellEnd"/>
+      <w:r>
+        <w:rPr>
+          <w:rFonts w:ascii="Times New Roman" w:hAnsi="Times New Roman"/>
+          <w:color w:val="000000"/>
+          <w:sz w:val="24"/>
+          <w:szCs w:val="24"/>
+          <w:lang w:val="en-US"/>
+        </w:rPr>
+        <w:t xml:space="preserve"> </w:t>
+      </w:r>
+      <w:proofErr w:type="spellStart"/>
+      <w:r>
+        <w:rPr>
+          <w:rFonts w:ascii="Times New Roman" w:hAnsi="Times New Roman"/>
+          <w:color w:val="000000"/>
+          <w:sz w:val="24"/>
+          <w:szCs w:val="24"/>
+          <w:lang w:val="en-US"/>
+        </w:rPr>
+        <w:t>keras</w:t>
+      </w:r>
+      <w:proofErr w:type="spellEnd"/>
+      <w:r>
+        <w:rPr>
+          <w:rFonts w:ascii="Times New Roman" w:hAnsi="Times New Roman"/>
+          <w:color w:val="000000"/>
+          <w:sz w:val="24"/>
+          <w:szCs w:val="24"/>
+          <w:lang w:val="en-US"/>
+        </w:rPr>
+        <w:t xml:space="preserve"> dan </w:t>
+      </w:r>
+      <w:proofErr w:type="spellStart"/>
+      <w:r>
+        <w:rPr>
+          <w:rFonts w:ascii="Times New Roman" w:hAnsi="Times New Roman"/>
+          <w:color w:val="000000"/>
+          <w:sz w:val="24"/>
+          <w:szCs w:val="24"/>
+          <w:lang w:val="en-US"/>
+        </w:rPr>
+        <w:t>perangkat</w:t>
+      </w:r>
+      <w:proofErr w:type="spellEnd"/>
+      <w:r>
+        <w:rPr>
+          <w:rFonts w:ascii="Times New Roman" w:hAnsi="Times New Roman"/>
+          <w:color w:val="000000"/>
+          <w:sz w:val="24"/>
+          <w:szCs w:val="24"/>
+          <w:lang w:val="en-US"/>
+        </w:rPr>
+        <w:t xml:space="preserve"> </w:t>
+      </w:r>
+      <w:proofErr w:type="spellStart"/>
+      <w:r>
+        <w:rPr>
+          <w:rFonts w:ascii="Times New Roman" w:hAnsi="Times New Roman"/>
+          <w:color w:val="000000"/>
+          <w:sz w:val="24"/>
+          <w:szCs w:val="24"/>
+          <w:lang w:val="en-US"/>
+        </w:rPr>
+        <w:t>lunak</w:t>
+      </w:r>
+      <w:proofErr w:type="spellEnd"/>
+      <w:r>
+        <w:rPr>
+          <w:rFonts w:ascii="Times New Roman" w:hAnsi="Times New Roman"/>
+          <w:color w:val="000000"/>
+          <w:sz w:val="24"/>
+          <w:szCs w:val="24"/>
+          <w:lang w:val="en-US"/>
+        </w:rPr>
+        <w:t xml:space="preserve"> </w:t>
+      </w:r>
+      <w:proofErr w:type="spellStart"/>
+      <w:r>
+        <w:rPr>
+          <w:rFonts w:ascii="Times New Roman" w:hAnsi="Times New Roman"/>
+          <w:color w:val="000000"/>
+          <w:sz w:val="24"/>
+          <w:szCs w:val="24"/>
+          <w:lang w:val="en-US"/>
+        </w:rPr>
+        <w:t>otomatis</w:t>
+      </w:r>
+      <w:proofErr w:type="spellEnd"/>
+      <w:r>
+        <w:rPr>
+          <w:rFonts w:ascii="Times New Roman" w:hAnsi="Times New Roman"/>
+          <w:color w:val="000000"/>
+          <w:sz w:val="24"/>
+          <w:szCs w:val="24"/>
+          <w:lang w:val="en-US"/>
+        </w:rPr>
+        <w:t xml:space="preserve">. </w:t>
+      </w:r>
+      <w:proofErr w:type="spellStart"/>
+      <w:r>
+        <w:rPr>
+          <w:rFonts w:ascii="Times New Roman" w:hAnsi="Times New Roman"/>
+          <w:color w:val="000000"/>
+          <w:sz w:val="24"/>
+          <w:szCs w:val="24"/>
+          <w:lang w:val="en-US"/>
+        </w:rPr>
+        <w:t>Prosesor</w:t>
+      </w:r>
+      <w:proofErr w:type="spellEnd"/>
+      <w:r>
+        <w:rPr>
+          <w:rFonts w:ascii="Times New Roman" w:hAnsi="Times New Roman"/>
+          <w:color w:val="000000"/>
+          <w:sz w:val="24"/>
+          <w:szCs w:val="24"/>
+          <w:lang w:val="en-US"/>
+        </w:rPr>
+        <w:t xml:space="preserve"> </w:t>
+      </w:r>
+      <w:proofErr w:type="spellStart"/>
+      <w:r>
+        <w:rPr>
+          <w:rFonts w:ascii="Times New Roman" w:hAnsi="Times New Roman"/>
+          <w:color w:val="000000"/>
+          <w:sz w:val="24"/>
+          <w:szCs w:val="24"/>
+          <w:lang w:val="en-US"/>
+        </w:rPr>
+        <w:t>Xtensa</w:t>
+      </w:r>
+      <w:proofErr w:type="spellEnd"/>
+      <w:r>
+        <w:rPr>
+          <w:rFonts w:ascii="Times New Roman" w:hAnsi="Times New Roman"/>
+          <w:color w:val="000000"/>
+          <w:sz w:val="24"/>
+          <w:szCs w:val="24"/>
+          <w:lang w:val="en-US"/>
+        </w:rPr>
+        <w:t xml:space="preserve"> LX6 m</w:t>
+      </w:r>
+      <w:proofErr w:type="spellStart"/>
+      <w:r>
+        <w:rPr>
+          <w:rFonts w:ascii="Times New Roman" w:hAnsi="Times New Roman"/>
+          <w:color w:val="000000"/>
+          <w:sz w:val="24"/>
+          <w:szCs w:val="24"/>
+          <w:lang w:val="en-US"/>
+        </w:rPr>
+        <w:t>emungkinkan</w:t>
+      </w:r>
+      <w:proofErr w:type="spellEnd"/>
+      <w:r>
+        <w:rPr>
+          <w:rFonts w:ascii="Times New Roman" w:hAnsi="Times New Roman"/>
+          <w:color w:val="000000"/>
+          <w:sz w:val="24"/>
+          <w:szCs w:val="24"/>
+          <w:lang w:val="en-US"/>
+        </w:rPr>
+        <w:t xml:space="preserve"> </w:t>
+      </w:r>
+      <w:proofErr w:type="spellStart"/>
+      <w:r>
+        <w:rPr>
+          <w:rFonts w:ascii="Times New Roman" w:hAnsi="Times New Roman"/>
+          <w:color w:val="000000"/>
+          <w:sz w:val="24"/>
+          <w:szCs w:val="24"/>
+          <w:lang w:val="en-US"/>
+        </w:rPr>
+        <w:t>perancang</w:t>
+      </w:r>
+      <w:proofErr w:type="spellEnd"/>
+      <w:r>
+        <w:rPr>
+          <w:rFonts w:ascii="Times New Roman" w:hAnsi="Times New Roman"/>
+          <w:color w:val="000000"/>
+          <w:sz w:val="24"/>
+          <w:szCs w:val="24"/>
+          <w:lang w:val="en-US"/>
+        </w:rPr>
+        <w:t xml:space="preserve"> SoC m</w:t>
+      </w:r>
+      <w:proofErr w:type="spellStart"/>
+      <w:r>
+        <w:rPr>
+          <w:rFonts w:ascii="Times New Roman" w:hAnsi="Times New Roman"/>
+          <w:color w:val="000000"/>
+          <w:sz w:val="24"/>
+          <w:szCs w:val="24"/>
+          <w:lang w:val="en-US"/>
+        </w:rPr>
+        <w:t>enambah</w:t>
+      </w:r>
+      <w:proofErr w:type="spellEnd"/>
+      <w:r>
+        <w:rPr>
+          <w:rFonts w:ascii="Times New Roman" w:hAnsi="Times New Roman"/>
+          <w:color w:val="000000"/>
+          <w:sz w:val="24"/>
+          <w:szCs w:val="24"/>
+          <w:lang w:val="en-US"/>
+        </w:rPr>
+        <w:t xml:space="preserve"> </w:t>
+      </w:r>
+      <w:proofErr w:type="spellStart"/>
+      <w:r>
+        <w:rPr>
+          <w:rFonts w:ascii="Times New Roman" w:hAnsi="Times New Roman"/>
+          <w:color w:val="000000"/>
+          <w:sz w:val="24"/>
+          <w:szCs w:val="24"/>
+          <w:lang w:val="en-US"/>
+        </w:rPr>
+        <w:t>fleksibilitas</w:t>
+      </w:r>
+      <w:proofErr w:type="spellEnd"/>
+      <w:r>
+        <w:rPr>
+          <w:rFonts w:ascii="Times New Roman" w:hAnsi="Times New Roman"/>
+          <w:color w:val="000000"/>
+          <w:sz w:val="24"/>
+          <w:szCs w:val="24"/>
+          <w:lang w:val="en-US"/>
+        </w:rPr>
+        <w:t xml:space="preserve"> dan </w:t>
+      </w:r>
+      <w:proofErr w:type="spellStart"/>
+      <w:r>
+        <w:rPr>
+          <w:rFonts w:ascii="Times New Roman" w:hAnsi="Times New Roman"/>
+          <w:color w:val="000000"/>
+          <w:sz w:val="24"/>
+          <w:szCs w:val="24"/>
+          <w:lang w:val="en-US"/>
+        </w:rPr>
+        <w:t>penggunaan</w:t>
+      </w:r>
+      <w:proofErr w:type="spellEnd"/>
+      <w:r>
+        <w:rPr>
+          <w:rFonts w:ascii="Times New Roman" w:hAnsi="Times New Roman"/>
+          <w:color w:val="000000"/>
+          <w:sz w:val="24"/>
+          <w:szCs w:val="24"/>
+          <w:lang w:val="en-US"/>
+        </w:rPr>
+        <w:t xml:space="preserve"> </w:t>
+      </w:r>
+      <w:proofErr w:type="spellStart"/>
+      <w:r>
+        <w:rPr>
+          <w:rFonts w:ascii="Times New Roman" w:hAnsi="Times New Roman"/>
+          <w:color w:val="000000"/>
+          <w:sz w:val="24"/>
+          <w:szCs w:val="24"/>
+          <w:lang w:val="en-US"/>
+        </w:rPr>
+        <w:t>jangka</w:t>
+      </w:r>
+      <w:proofErr w:type="spellEnd"/>
+      <w:r>
+        <w:rPr>
+          <w:rFonts w:ascii="Times New Roman" w:hAnsi="Times New Roman"/>
+          <w:color w:val="000000"/>
+          <w:sz w:val="24"/>
+          <w:szCs w:val="24"/>
+          <w:lang w:val="en-US"/>
+        </w:rPr>
+        <w:t xml:space="preserve"> </w:t>
+      </w:r>
+      <w:proofErr w:type="spellStart"/>
+      <w:r>
+        <w:rPr>
+          <w:rFonts w:ascii="Times New Roman" w:hAnsi="Times New Roman"/>
+          <w:color w:val="000000"/>
+          <w:sz w:val="24"/>
+          <w:szCs w:val="24"/>
+          <w:lang w:val="en-US"/>
+        </w:rPr>
+        <w:t>panjang</w:t>
       </w:r>
       <w:proofErr w:type="spellEnd"/>
       <w:r>
@@ -42667,140 +44272,227 @@
           <w:szCs w:val="24"/>
           <w:lang w:val="en-US"/>
         </w:rPr>
-        <w:t>melakukan</w:t>
-      </w:r>
-      <w:proofErr w:type="spellEnd"/>
-      <w:r>
-        <w:rPr>
-          <w:rFonts w:ascii="Times New Roman" w:hAnsi="Times New Roman"/>
-          <w:color w:val="000000"/>
-          <w:sz w:val="24"/>
-          <w:szCs w:val="24"/>
-          <w:lang w:val="en-US"/>
-        </w:rPr>
-        <w:t xml:space="preserve"> </w:t>
-      </w:r>
-      <w:proofErr w:type="spellStart"/>
-      <w:r>
-        <w:rPr>
-          <w:rFonts w:ascii="Times New Roman" w:hAnsi="Times New Roman"/>
-          <w:color w:val="000000"/>
-          <w:sz w:val="24"/>
-          <w:szCs w:val="24"/>
-          <w:lang w:val="en-US"/>
-        </w:rPr>
-        <w:t>eksekusi</w:t>
-      </w:r>
-      <w:proofErr w:type="spellEnd"/>
-      <w:r>
-        <w:rPr>
-          <w:rFonts w:ascii="Times New Roman" w:hAnsi="Times New Roman"/>
-          <w:color w:val="000000"/>
-          <w:sz w:val="24"/>
-          <w:szCs w:val="24"/>
-          <w:lang w:val="en-US"/>
-        </w:rPr>
-        <w:t xml:space="preserve"> </w:t>
-      </w:r>
-      <w:proofErr w:type="spellStart"/>
-      <w:r>
-        <w:rPr>
-          <w:rFonts w:ascii="Times New Roman" w:hAnsi="Times New Roman"/>
-          <w:color w:val="000000"/>
-          <w:sz w:val="24"/>
-          <w:szCs w:val="24"/>
-          <w:lang w:val="en-US"/>
-        </w:rPr>
-        <w:t>terhadap</w:t>
-      </w:r>
-      <w:proofErr w:type="spellEnd"/>
-      <w:r>
-        <w:rPr>
-          <w:rFonts w:ascii="Times New Roman" w:hAnsi="Times New Roman"/>
-          <w:color w:val="000000"/>
-          <w:sz w:val="24"/>
-          <w:szCs w:val="24"/>
-          <w:lang w:val="en-US"/>
-        </w:rPr>
-        <w:t xml:space="preserve"> program-program </w:t>
-      </w:r>
-      <w:proofErr w:type="spellStart"/>
-      <w:r>
-        <w:rPr>
-          <w:rFonts w:ascii="Times New Roman" w:hAnsi="Times New Roman"/>
-          <w:color w:val="000000"/>
-          <w:sz w:val="24"/>
-          <w:szCs w:val="24"/>
-          <w:lang w:val="en-US"/>
-        </w:rPr>
-        <w:t>komputer</w:t>
-      </w:r>
-      <w:proofErr w:type="spellEnd"/>
-      <w:r>
-        <w:rPr>
-          <w:rFonts w:ascii="Times New Roman" w:hAnsi="Times New Roman"/>
-          <w:color w:val="000000"/>
-          <w:sz w:val="24"/>
-          <w:szCs w:val="24"/>
-          <w:lang w:val="en-US"/>
-        </w:rPr>
-        <w:t xml:space="preserve"> </w:t>
-      </w:r>
-      <w:proofErr w:type="spellStart"/>
-      <w:r>
-        <w:rPr>
-          <w:rFonts w:ascii="Times New Roman" w:hAnsi="Times New Roman"/>
-          <w:color w:val="000000"/>
-          <w:sz w:val="24"/>
-          <w:szCs w:val="24"/>
-          <w:lang w:val="en-US"/>
-        </w:rPr>
-        <w:lastRenderedPageBreak/>
-        <w:t>dengan</w:t>
-      </w:r>
-      <w:proofErr w:type="spellEnd"/>
-      <w:r>
-        <w:rPr>
-          <w:rFonts w:ascii="Times New Roman" w:hAnsi="Times New Roman"/>
-          <w:color w:val="000000"/>
-          <w:sz w:val="24"/>
-          <w:szCs w:val="24"/>
-          <w:lang w:val="en-US"/>
-        </w:rPr>
-        <w:t xml:space="preserve"> </w:t>
-      </w:r>
-      <w:proofErr w:type="spellStart"/>
-      <w:r>
-        <w:rPr>
-          <w:rFonts w:ascii="Times New Roman" w:hAnsi="Times New Roman"/>
-          <w:color w:val="000000"/>
-          <w:sz w:val="24"/>
-          <w:szCs w:val="24"/>
-          <w:lang w:val="en-US"/>
-        </w:rPr>
-        <w:t>menyediakan</w:t>
-      </w:r>
-      <w:proofErr w:type="spellEnd"/>
-      <w:r>
-        <w:rPr>
-          <w:rFonts w:ascii="Times New Roman" w:hAnsi="Times New Roman"/>
-          <w:color w:val="000000"/>
-          <w:sz w:val="24"/>
-          <w:szCs w:val="24"/>
-          <w:lang w:val="en-US"/>
-        </w:rPr>
-        <w:t xml:space="preserve"> </w:t>
-      </w:r>
-      <w:proofErr w:type="spellStart"/>
-      <w:r>
-        <w:rPr>
-          <w:rFonts w:ascii="Times New Roman" w:hAnsi="Times New Roman"/>
-          <w:color w:val="000000"/>
-          <w:sz w:val="24"/>
-          <w:szCs w:val="24"/>
-          <w:lang w:val="en-US"/>
-        </w:rPr>
-        <w:t>akses</w:t>
+        <w:t>desain</w:t>
+      </w:r>
+      <w:proofErr w:type="spellEnd"/>
+      <w:r>
+        <w:rPr>
+          <w:rFonts w:ascii="Times New Roman" w:hAnsi="Times New Roman"/>
+          <w:color w:val="000000"/>
+          <w:sz w:val="24"/>
+          <w:szCs w:val="24"/>
+          <w:lang w:val="en-US"/>
+        </w:rPr>
+        <w:t xml:space="preserve"> </w:t>
+      </w:r>
+      <w:proofErr w:type="spellStart"/>
+      <w:r>
+        <w:rPr>
+          <w:rFonts w:ascii="Times New Roman" w:hAnsi="Times New Roman"/>
+          <w:color w:val="000000"/>
+          <w:sz w:val="24"/>
+          <w:szCs w:val="24"/>
+          <w:lang w:val="en-US"/>
+        </w:rPr>
+        <w:t>mereka</w:t>
+      </w:r>
+      <w:proofErr w:type="spellEnd"/>
+      <w:r>
+        <w:rPr>
+          <w:rFonts w:ascii="Times New Roman" w:hAnsi="Times New Roman"/>
+          <w:color w:val="000000"/>
+          <w:sz w:val="24"/>
+          <w:szCs w:val="24"/>
+          <w:lang w:val="en-US"/>
+        </w:rPr>
+        <w:t xml:space="preserve"> </w:t>
+      </w:r>
+      <w:proofErr w:type="spellStart"/>
+      <w:r>
+        <w:rPr>
+          <w:rFonts w:ascii="Times New Roman" w:hAnsi="Times New Roman"/>
+          <w:color w:val="000000"/>
+          <w:sz w:val="24"/>
+          <w:szCs w:val="24"/>
+          <w:lang w:val="en-US"/>
+        </w:rPr>
+        <w:t>melalui</w:t>
+      </w:r>
+      <w:proofErr w:type="spellEnd"/>
+      <w:r>
+        <w:rPr>
+          <w:rFonts w:ascii="Times New Roman" w:hAnsi="Times New Roman"/>
+          <w:color w:val="000000"/>
+          <w:sz w:val="24"/>
+          <w:szCs w:val="24"/>
+          <w:lang w:val="en-US"/>
+        </w:rPr>
+        <w:t xml:space="preserve"> </w:t>
+      </w:r>
+      <w:proofErr w:type="spellStart"/>
+      <w:r>
+        <w:rPr>
+          <w:rFonts w:ascii="Times New Roman" w:hAnsi="Times New Roman"/>
+          <w:color w:val="000000"/>
+          <w:sz w:val="24"/>
+          <w:szCs w:val="24"/>
+          <w:lang w:val="en-US"/>
+        </w:rPr>
+        <w:t>programabilitas</w:t>
+      </w:r>
+      <w:proofErr w:type="spellEnd"/>
+      <w:r>
+        <w:rPr>
+          <w:rFonts w:ascii="Times New Roman" w:hAnsi="Times New Roman"/>
+          <w:color w:val="000000"/>
+          <w:sz w:val="24"/>
+          <w:szCs w:val="24"/>
+          <w:lang w:val="en-US"/>
+        </w:rPr>
+        <w:t xml:space="preserve"> </w:t>
+      </w:r>
+      <w:proofErr w:type="spellStart"/>
+      <w:r>
+        <w:rPr>
+          <w:rFonts w:ascii="Times New Roman" w:hAnsi="Times New Roman"/>
+          <w:color w:val="000000"/>
+          <w:sz w:val="24"/>
+          <w:szCs w:val="24"/>
+          <w:lang w:val="en-US"/>
+        </w:rPr>
+        <w:t>perangkat</w:t>
+      </w:r>
+      <w:proofErr w:type="spellEnd"/>
+      <w:r>
+        <w:rPr>
+          <w:rFonts w:ascii="Times New Roman" w:hAnsi="Times New Roman"/>
+          <w:color w:val="000000"/>
+          <w:sz w:val="24"/>
+          <w:szCs w:val="24"/>
+          <w:lang w:val="en-US"/>
+        </w:rPr>
+        <w:t xml:space="preserve"> </w:t>
+      </w:r>
+      <w:proofErr w:type="spellStart"/>
+      <w:r>
+        <w:rPr>
+          <w:rFonts w:ascii="Times New Roman" w:hAnsi="Times New Roman"/>
+          <w:color w:val="000000"/>
+          <w:sz w:val="24"/>
+          <w:szCs w:val="24"/>
+          <w:lang w:val="en-US"/>
+        </w:rPr>
+        <w:t>lunak</w:t>
+      </w:r>
+      <w:proofErr w:type="spellEnd"/>
+      <w:r>
+        <w:rPr>
+          <w:rFonts w:ascii="Times New Roman" w:hAnsi="Times New Roman"/>
+          <w:color w:val="000000"/>
+          <w:sz w:val="24"/>
+          <w:szCs w:val="24"/>
+          <w:lang w:val="en-US"/>
+        </w:rPr>
+        <w:t xml:space="preserve"> </w:t>
+      </w:r>
+      <w:proofErr w:type="spellStart"/>
+      <w:r>
+        <w:rPr>
+          <w:rFonts w:ascii="Times New Roman" w:hAnsi="Times New Roman"/>
+          <w:color w:val="000000"/>
+          <w:sz w:val="24"/>
+          <w:szCs w:val="24"/>
+          <w:lang w:val="en-US"/>
+        </w:rPr>
+        <w:t>serta</w:t>
+      </w:r>
+      <w:proofErr w:type="spellEnd"/>
+      <w:r>
+        <w:rPr>
+          <w:rFonts w:ascii="Times New Roman" w:hAnsi="Times New Roman"/>
+          <w:color w:val="000000"/>
+          <w:sz w:val="24"/>
+          <w:szCs w:val="24"/>
+          <w:lang w:val="en-US"/>
+        </w:rPr>
+        <w:t xml:space="preserve"> </w:t>
+      </w:r>
+      <w:proofErr w:type="spellStart"/>
+      <w:r>
+        <w:rPr>
+          <w:rFonts w:ascii="Times New Roman" w:hAnsi="Times New Roman"/>
+          <w:color w:val="000000"/>
+          <w:sz w:val="24"/>
+          <w:szCs w:val="24"/>
+          <w:lang w:val="en-US"/>
+        </w:rPr>
+        <w:t>diferensiasi</w:t>
+      </w:r>
+      <w:proofErr w:type="spellEnd"/>
+      <w:r>
+        <w:rPr>
+          <w:rFonts w:ascii="Times New Roman" w:hAnsi="Times New Roman"/>
+          <w:color w:val="000000"/>
+          <w:sz w:val="24"/>
+          <w:szCs w:val="24"/>
+          <w:lang w:val="en-US"/>
+        </w:rPr>
+        <w:t xml:space="preserve"> </w:t>
+      </w:r>
+      <w:proofErr w:type="spellStart"/>
+      <w:r>
+        <w:rPr>
+          <w:rFonts w:ascii="Times New Roman" w:hAnsi="Times New Roman"/>
+          <w:color w:val="000000"/>
+          <w:sz w:val="24"/>
+          <w:szCs w:val="24"/>
+          <w:lang w:val="en-US"/>
+        </w:rPr>
+        <w:t>melalui</w:t>
+      </w:r>
+      <w:proofErr w:type="spellEnd"/>
+      <w:r>
+        <w:rPr>
+          <w:rFonts w:ascii="Times New Roman" w:hAnsi="Times New Roman"/>
+          <w:color w:val="000000"/>
+          <w:sz w:val="24"/>
+          <w:szCs w:val="24"/>
+          <w:lang w:val="en-US"/>
+        </w:rPr>
+        <w:t xml:space="preserve"> </w:t>
+      </w:r>
+      <w:proofErr w:type="spellStart"/>
+      <w:r>
+        <w:rPr>
+          <w:rFonts w:ascii="Times New Roman" w:hAnsi="Times New Roman"/>
+          <w:color w:val="000000"/>
+          <w:sz w:val="24"/>
+          <w:szCs w:val="24"/>
+          <w:lang w:val="en-US"/>
+        </w:rPr>
+        <w:t>implementasi</w:t>
+      </w:r>
+      <w:proofErr w:type="spellEnd"/>
+      <w:r>
+        <w:rPr>
+          <w:rFonts w:ascii="Times New Roman" w:hAnsi="Times New Roman"/>
+          <w:color w:val="000000"/>
+          <w:sz w:val="24"/>
+          <w:szCs w:val="24"/>
+          <w:lang w:val="en-US"/>
+        </w:rPr>
+        <w:t xml:space="preserve"> </w:t>
+      </w:r>
+      <w:proofErr w:type="spellStart"/>
+      <w:r>
+        <w:rPr>
+          <w:rFonts w:ascii="Times New Roman" w:hAnsi="Times New Roman"/>
+          <w:color w:val="000000"/>
+          <w:sz w:val="24"/>
+          <w:szCs w:val="24"/>
+          <w:lang w:val="en-US"/>
+        </w:rPr>
+        <w:t>prosesor</w:t>
       </w:r>
       <w:proofErr w:type="spellEnd"/>
       <w:r>
@@ -42822,304 +44514,84 @@
           <w:szCs w:val="24"/>
           <w:lang w:val="en-US"/>
         </w:rPr>
-        <w:t>cepat</w:t>
-      </w:r>
-      <w:proofErr w:type="spellEnd"/>
-      <w:r>
-        <w:rPr>
-          <w:rFonts w:ascii="Times New Roman" w:hAnsi="Times New Roman"/>
-          <w:color w:val="000000"/>
-          <w:sz w:val="24"/>
-          <w:szCs w:val="24"/>
-          <w:lang w:val="en-US"/>
-        </w:rPr>
-        <w:t xml:space="preserve"> </w:t>
-      </w:r>
-      <w:proofErr w:type="spellStart"/>
-      <w:r>
-        <w:rPr>
-          <w:rFonts w:ascii="Times New Roman" w:hAnsi="Times New Roman"/>
-          <w:color w:val="000000"/>
-          <w:sz w:val="24"/>
-          <w:szCs w:val="24"/>
-          <w:lang w:val="en-US"/>
-        </w:rPr>
-        <w:t>terhadap</w:t>
-      </w:r>
-      <w:proofErr w:type="spellEnd"/>
-      <w:r>
-        <w:rPr>
-          <w:rFonts w:ascii="Times New Roman" w:hAnsi="Times New Roman"/>
-          <w:color w:val="000000"/>
-          <w:sz w:val="24"/>
-          <w:szCs w:val="24"/>
-          <w:lang w:val="en-US"/>
-        </w:rPr>
-        <w:t xml:space="preserve"> </w:t>
-      </w:r>
-      <w:proofErr w:type="spellStart"/>
-      <w:r>
-        <w:rPr>
-          <w:rFonts w:ascii="Times New Roman" w:hAnsi="Times New Roman"/>
-          <w:color w:val="000000"/>
-          <w:sz w:val="24"/>
-          <w:szCs w:val="24"/>
-          <w:lang w:val="en-US"/>
-        </w:rPr>
-        <w:t>nilai-nilai</w:t>
-      </w:r>
-      <w:proofErr w:type="spellEnd"/>
-      <w:r>
-        <w:rPr>
-          <w:rFonts w:ascii="Times New Roman" w:hAnsi="Times New Roman"/>
-          <w:color w:val="000000"/>
-          <w:sz w:val="24"/>
-          <w:szCs w:val="24"/>
-          <w:lang w:val="en-US"/>
-        </w:rPr>
-        <w:t xml:space="preserve"> yang </w:t>
-      </w:r>
-      <w:proofErr w:type="spellStart"/>
-      <w:r>
-        <w:rPr>
-          <w:rFonts w:ascii="Times New Roman" w:hAnsi="Times New Roman"/>
-          <w:color w:val="000000"/>
-          <w:sz w:val="24"/>
-          <w:szCs w:val="24"/>
-          <w:lang w:val="en-US"/>
-        </w:rPr>
-        <w:t>umum</w:t>
-      </w:r>
-      <w:proofErr w:type="spellEnd"/>
-      <w:r>
-        <w:rPr>
-          <w:rFonts w:ascii="Times New Roman" w:hAnsi="Times New Roman"/>
-          <w:color w:val="000000"/>
-          <w:sz w:val="24"/>
-          <w:szCs w:val="24"/>
-          <w:lang w:val="en-US"/>
-        </w:rPr>
-        <w:t xml:space="preserve"> </w:t>
-      </w:r>
-      <w:proofErr w:type="spellStart"/>
-      <w:r>
-        <w:rPr>
-          <w:rFonts w:ascii="Times New Roman" w:hAnsi="Times New Roman"/>
-          <w:color w:val="000000"/>
-          <w:sz w:val="24"/>
-          <w:szCs w:val="24"/>
-          <w:lang w:val="en-US"/>
-        </w:rPr>
-        <w:t>digunakan</w:t>
-      </w:r>
-      <w:proofErr w:type="spellEnd"/>
-      <w:r>
-        <w:rPr>
-          <w:rFonts w:ascii="Times New Roman" w:hAnsi="Times New Roman"/>
-          <w:color w:val="000000"/>
-          <w:sz w:val="24"/>
-          <w:szCs w:val="24"/>
-          <w:lang w:val="en-US"/>
-        </w:rPr>
-        <w:t>. Register u</w:t>
-      </w:r>
-      <w:proofErr w:type="spellStart"/>
-      <w:r>
-        <w:rPr>
-          <w:rFonts w:ascii="Times New Roman" w:hAnsi="Times New Roman"/>
-          <w:color w:val="000000"/>
-          <w:sz w:val="24"/>
-          <w:szCs w:val="24"/>
-          <w:lang w:val="en-US"/>
-        </w:rPr>
-        <w:t>mumnya</w:t>
-      </w:r>
-      <w:proofErr w:type="spellEnd"/>
-      <w:r>
-        <w:rPr>
-          <w:rFonts w:ascii="Times New Roman" w:hAnsi="Times New Roman"/>
-          <w:color w:val="000000"/>
-          <w:sz w:val="24"/>
-          <w:szCs w:val="24"/>
-          <w:lang w:val="en-US"/>
-        </w:rPr>
-        <w:t xml:space="preserve"> </w:t>
-      </w:r>
-      <w:proofErr w:type="spellStart"/>
-      <w:r>
-        <w:rPr>
-          <w:rFonts w:ascii="Times New Roman" w:hAnsi="Times New Roman"/>
-          <w:color w:val="000000"/>
-          <w:sz w:val="24"/>
-          <w:szCs w:val="24"/>
-          <w:lang w:val="en-US"/>
-        </w:rPr>
-        <w:t>diukur</w:t>
-      </w:r>
-      <w:proofErr w:type="spellEnd"/>
-      <w:r>
-        <w:rPr>
-          <w:rFonts w:ascii="Times New Roman" w:hAnsi="Times New Roman"/>
-          <w:color w:val="000000"/>
-          <w:sz w:val="24"/>
-          <w:szCs w:val="24"/>
-          <w:lang w:val="en-US"/>
-        </w:rPr>
-        <w:t xml:space="preserve"> </w:t>
-      </w:r>
-      <w:proofErr w:type="spellStart"/>
-      <w:r>
-        <w:rPr>
-          <w:rFonts w:ascii="Times New Roman" w:hAnsi="Times New Roman"/>
-          <w:color w:val="000000"/>
-          <w:sz w:val="24"/>
-          <w:szCs w:val="24"/>
-          <w:lang w:val="en-US"/>
-        </w:rPr>
-        <w:t>dengan</w:t>
-      </w:r>
-      <w:proofErr w:type="spellEnd"/>
-      <w:r>
-        <w:rPr>
-          <w:rFonts w:ascii="Times New Roman" w:hAnsi="Times New Roman"/>
-          <w:color w:val="000000"/>
-          <w:sz w:val="24"/>
-          <w:szCs w:val="24"/>
-          <w:lang w:val="en-US"/>
-        </w:rPr>
-        <w:t xml:space="preserve"> </w:t>
-      </w:r>
-      <w:proofErr w:type="spellStart"/>
-      <w:r>
-        <w:rPr>
-          <w:rFonts w:ascii="Times New Roman" w:hAnsi="Times New Roman"/>
-          <w:color w:val="000000"/>
-          <w:sz w:val="24"/>
-          <w:szCs w:val="24"/>
-          <w:lang w:val="en-US"/>
-        </w:rPr>
-        <w:t>satuan</w:t>
-      </w:r>
-      <w:proofErr w:type="spellEnd"/>
-      <w:r>
-        <w:rPr>
-          <w:rFonts w:ascii="Times New Roman" w:hAnsi="Times New Roman"/>
-          <w:color w:val="000000"/>
-          <w:sz w:val="24"/>
-          <w:szCs w:val="24"/>
-          <w:lang w:val="en-US"/>
-        </w:rPr>
-        <w:t xml:space="preserve"> bit yang </w:t>
-      </w:r>
-      <w:proofErr w:type="spellStart"/>
-      <w:r>
-        <w:rPr>
-          <w:rFonts w:ascii="Times New Roman" w:hAnsi="Times New Roman"/>
-          <w:color w:val="000000"/>
-          <w:sz w:val="24"/>
-          <w:szCs w:val="24"/>
-          <w:lang w:val="en-US"/>
-        </w:rPr>
-        <w:t>dapat</w:t>
-      </w:r>
-      <w:proofErr w:type="spellEnd"/>
-      <w:r>
-        <w:rPr>
-          <w:rFonts w:ascii="Times New Roman" w:hAnsi="Times New Roman"/>
-          <w:color w:val="000000"/>
-          <w:sz w:val="24"/>
-          <w:szCs w:val="24"/>
-          <w:lang w:val="en-US"/>
-        </w:rPr>
-        <w:t xml:space="preserve"> </w:t>
-      </w:r>
-      <w:proofErr w:type="spellStart"/>
-      <w:r>
-        <w:rPr>
-          <w:rFonts w:ascii="Times New Roman" w:hAnsi="Times New Roman"/>
-          <w:color w:val="000000"/>
-          <w:sz w:val="24"/>
-          <w:szCs w:val="24"/>
-          <w:lang w:val="en-US"/>
-        </w:rPr>
-        <w:t>ditampung</w:t>
-      </w:r>
-      <w:proofErr w:type="spellEnd"/>
-      <w:r>
-        <w:rPr>
-          <w:rFonts w:ascii="Times New Roman" w:hAnsi="Times New Roman"/>
-          <w:color w:val="000000"/>
-          <w:sz w:val="24"/>
-          <w:szCs w:val="24"/>
-          <w:lang w:val="en-US"/>
-        </w:rPr>
-        <w:t xml:space="preserve"> </w:t>
-      </w:r>
-      <w:proofErr w:type="spellStart"/>
-      <w:r>
-        <w:rPr>
-          <w:rFonts w:ascii="Times New Roman" w:hAnsi="Times New Roman"/>
-          <w:color w:val="000000"/>
-          <w:sz w:val="24"/>
-          <w:szCs w:val="24"/>
-          <w:lang w:val="en-US"/>
-        </w:rPr>
-        <w:t>olehnya</w:t>
-      </w:r>
-      <w:proofErr w:type="spellEnd"/>
-      <w:r>
-        <w:rPr>
-          <w:rFonts w:ascii="Times New Roman" w:hAnsi="Times New Roman"/>
-          <w:color w:val="000000"/>
-          <w:sz w:val="24"/>
-          <w:szCs w:val="24"/>
-          <w:lang w:val="en-US"/>
-        </w:rPr>
-        <w:t xml:space="preserve">, </w:t>
-      </w:r>
-      <w:proofErr w:type="spellStart"/>
-      <w:r>
-        <w:rPr>
-          <w:rFonts w:ascii="Times New Roman" w:hAnsi="Times New Roman"/>
-          <w:color w:val="000000"/>
-          <w:sz w:val="24"/>
-          <w:szCs w:val="24"/>
-          <w:lang w:val="en-US"/>
-        </w:rPr>
-        <w:t>seperti</w:t>
-      </w:r>
-      <w:proofErr w:type="spellEnd"/>
-      <w:r>
-        <w:rPr>
-          <w:rFonts w:ascii="Times New Roman" w:hAnsi="Times New Roman"/>
-          <w:color w:val="000000"/>
-          <w:sz w:val="24"/>
-          <w:szCs w:val="24"/>
-          <w:lang w:val="en-US"/>
-        </w:rPr>
-        <w:t xml:space="preserve"> "register 8-bit", "register 16-bit", "register 32-bit", </w:t>
-      </w:r>
-      <w:proofErr w:type="spellStart"/>
-      <w:r>
-        <w:rPr>
-          <w:rFonts w:ascii="Times New Roman" w:hAnsi="Times New Roman"/>
-          <w:color w:val="000000"/>
-          <w:sz w:val="24"/>
-          <w:szCs w:val="24"/>
-          <w:lang w:val="en-US"/>
-        </w:rPr>
-        <w:t>atau</w:t>
-      </w:r>
-      <w:proofErr w:type="spellEnd"/>
-      <w:r>
-        <w:rPr>
-          <w:rFonts w:ascii="Times New Roman" w:hAnsi="Times New Roman"/>
-          <w:color w:val="000000"/>
-          <w:sz w:val="24"/>
-          <w:szCs w:val="24"/>
-          <w:lang w:val="en-US"/>
-        </w:rPr>
-        <w:t xml:space="preserve"> "register 64-bit" dan lain-lain.</w:t>
+        <w:t>dirancang</w:t>
+      </w:r>
+      <w:proofErr w:type="spellEnd"/>
+      <w:r>
+        <w:rPr>
+          <w:rFonts w:ascii="Times New Roman" w:hAnsi="Times New Roman"/>
+          <w:color w:val="000000"/>
+          <w:sz w:val="24"/>
+          <w:szCs w:val="24"/>
+          <w:lang w:val="en-US"/>
+        </w:rPr>
+        <w:t xml:space="preserve"> </w:t>
+      </w:r>
+      <w:proofErr w:type="spellStart"/>
+      <w:r>
+        <w:rPr>
+          <w:rFonts w:ascii="Times New Roman" w:hAnsi="Times New Roman"/>
+          <w:color w:val="000000"/>
+          <w:sz w:val="24"/>
+          <w:szCs w:val="24"/>
+          <w:lang w:val="en-US"/>
+        </w:rPr>
+        <w:t>untuk</w:t>
+      </w:r>
+      <w:proofErr w:type="spellEnd"/>
+      <w:r>
+        <w:rPr>
+          <w:rFonts w:ascii="Times New Roman" w:hAnsi="Times New Roman"/>
+          <w:color w:val="000000"/>
+          <w:sz w:val="24"/>
+          <w:szCs w:val="24"/>
+          <w:lang w:val="en-US"/>
+        </w:rPr>
+        <w:t xml:space="preserve"> </w:t>
+      </w:r>
+      <w:proofErr w:type="spellStart"/>
+      <w:r>
+        <w:rPr>
+          <w:rFonts w:ascii="Times New Roman" w:hAnsi="Times New Roman"/>
+          <w:color w:val="000000"/>
+          <w:sz w:val="24"/>
+          <w:szCs w:val="24"/>
+          <w:lang w:val="en-US"/>
+        </w:rPr>
+        <w:t>aplikasi</w:t>
+      </w:r>
+      <w:proofErr w:type="spellEnd"/>
+      <w:r>
+        <w:rPr>
+          <w:rFonts w:ascii="Times New Roman" w:hAnsi="Times New Roman"/>
+          <w:color w:val="000000"/>
+          <w:sz w:val="24"/>
+          <w:szCs w:val="24"/>
+          <w:lang w:val="en-US"/>
+        </w:rPr>
+        <w:t xml:space="preserve"> </w:t>
+      </w:r>
+      <w:proofErr w:type="spellStart"/>
+      <w:r>
+        <w:rPr>
+          <w:rFonts w:ascii="Times New Roman" w:hAnsi="Times New Roman"/>
+          <w:color w:val="000000"/>
+          <w:sz w:val="24"/>
+          <w:szCs w:val="24"/>
+          <w:lang w:val="en-US"/>
+        </w:rPr>
+        <w:t>spesifik</w:t>
+      </w:r>
+      <w:proofErr w:type="spellEnd"/>
+      <w:r>
+        <w:rPr>
+          <w:rFonts w:ascii="Times New Roman" w:hAnsi="Times New Roman"/>
+          <w:color w:val="000000"/>
+          <w:sz w:val="24"/>
+          <w:szCs w:val="24"/>
+          <w:lang w:val="en-US"/>
+        </w:rPr>
+        <w:t>.</w:t>
       </w:r>
       <w:r>
         <w:rPr>
@@ -43139,7 +44611,7 @@
           <w:szCs w:val="24"/>
           <w:lang w:val="en-US"/>
         </w:rPr>
-        <w:instrText>ADDIN CSL_CITATION {"citationItems":[{"id":"ITEM-1","itemData":{"author":[{"dropping-particle":"","family":"Wikipedia","given":"","non-dropping-particle":"","parse-names":false,"suffix":""}],"container-title":"Wikipedia, Ensiklopedia Bebas","id":"ITEM-1","issued":{"date-parts":[["2019"]]},"title":"Register prosesor","type":"entry-encyclopedia"},"uris":["http://www.mendeley.com/documents/?uuid=49550432-4a5b-4f0c-9b5f-9654909612d1"]}],"mendeley":{"formattedCitation":"[13]","plainTextFormattedCitation":"[13]","previouslyFormattedCitation":"[12]"},"properties":{"noteIndex":0},"schema":"https://github.com/citation-style-language/schema/raw/master/csl-citation.json"}</w:instrText>
+        <w:instrText>ADDIN CSL_CITATION {"citationItems":[{"id":"ITEM-1","itemData":{"abstract":"Cadence provides system-on-chip (SoC) designers with the world's first and only configurable and extensible processor cores fully supported by automatic hardware and software generation. Cadence ® Tensilica ® Xtensa ® processors, such as the Xtensa LX6 dataplane processing units (DPUs), enable SoC designers to add flexibility and longevity to their designs through software programmability as well as differentiation through processor implementations tailored for the specific application. Xtensa LX6 Customizable DPU High performance with flexible I/Os and wide data fetches Features • Highly efficient, small, low-power 32-bit base architecture • Configurable over a wide range of pre-verified options including 10 different digital signal processing (DSP) choices • Extend with designer-defined, application-specific instructions, execution units, register files, and I/Os • Virtually unlimited I/O bandwidth with multiple, wide, designer-defined FIFO, GPIO, and lookup interfaces • Selectable 5-or 7-stage pipeline depth for core instruction set architecture (ISA), plus extended DSP pipelines up to 11 stages • Local memories configurable up to 8MB with option for memory parity or ECC • Up to 128b-wide flexible-length instruction extensions (FLIX) instructions • Multi-core on-chip debug (OCD) with break-in/break-out • Dual-load/stores each up to wide with data cache support and multi-bank RAM support • Power domains for power shut-off • Semantic and memory data gating • Compatible interfaces for ARM ® CoreSight ™ debug and trace technology • IEEE 754-compliant single-/double-precision scalar floating-point unit • Complete matching software development tool chain automatically generated for each core Benefits • Develop hardware for complex dataplane processing significantly faster compared to pure RTL methods • High-bandwidth data flow through processor with flexible I/O interfaces that are independent of the system bus • Quickly and easily scale hardware architecture with task-customized processors • Lower verification effort with pre-verified, correct-by-construction RTL generation • Post-silicon programmability • Accurate high-speed processor and system simulation models automatically created for software development • Simplified multi-core debugging • Huge bandwidth, more parallelism to reduce cycle counts • Low-leakage power design • Dynamic power savings • Easy integration into an ARM CoreSight interface-based debug and trace infrastructure • Single-/double-p…","author":[{"dropping-particle":"","family":"Cadence Design Systems","given":"","non-dropping-particle":"","parse-names":false,"suffix":""}],"id":"ITEM-1","issued":{"date-parts":[["2014"]]},"number-of-pages":"13","title":"Xtensa LX6 Customizable DPU","type":"report"},"uris":["http://www.mendeley.com/documents/?uuid=9bb5ae87-aa98-4bc3-80aa-705b8a25555e"]}],"mendeley":{"formattedCitation":"[14]","plainTextFormattedCitation":"[14]"},"properties":{"noteIndex":0},"schema":"https://github.com/citation-style-language/schema/raw/master/csl-citation.json"}</w:instrText>
       </w:r>
       <w:r>
         <w:rPr>
@@ -43160,7 +44632,7 @@
           <w:szCs w:val="24"/>
           <w:lang w:val="en-US"/>
         </w:rPr>
-        <w:t>[13]</w:t>
+        <w:t>[14]</w:t>
       </w:r>
       <w:r>
         <w:rPr>
@@ -43221,6 +44693,30 @@
       <w:pPr>
         <w:pStyle w:val="ListParagraph"/>
         <w:widowControl w:val="0"/>
+        <w:tabs>
+          <w:tab w:val="left" w:leader="dot" w:pos="8222"/>
+          <w:tab w:val="right" w:pos="8788"/>
+        </w:tabs>
+        <w:autoSpaceDE w:val="0"/>
+        <w:autoSpaceDN w:val="0"/>
+        <w:adjustRightInd w:val="0"/>
+        <w:spacing w:after="0" w:line="360" w:lineRule="auto"/>
+        <w:ind w:left="567"/>
+        <w:contextualSpacing w:val="0"/>
+        <w:jc w:val="both"/>
+        <w:rPr>
+          <w:rFonts w:ascii="Times New Roman" w:hAnsi="Times New Roman"/>
+          <w:color w:val="000000"/>
+          <w:sz w:val="24"/>
+          <w:szCs w:val="24"/>
+          <w:lang w:val="en-US"/>
+        </w:rPr>
+      </w:pPr>
+    </w:p>
+    <w:p>
+      <w:pPr>
+        <w:pStyle w:val="ListParagraph"/>
+        <w:widowControl w:val="0"/>
         <w:numPr>
           <w:ilvl w:val="2"/>
           <w:numId w:val="10"/>
@@ -44196,7 +45692,7 @@
           <w:szCs w:val="24"/>
           <w:lang w:val="en-US"/>
         </w:rPr>
-        <w:instrText>ADDIN CSL_CITATION {"citationItems":[{"id":"ITEM-1","itemData":{"abstract":"ESP32 is a single 2.4 GHz Wi-Fi-and-Bluetooth combo chip designed with the TSMC ultra-low-power 40 nm technology. It is designed to achieve the best power and RF performance, showing robustness, versatility and reliability in a wide variety of applications and power scenarios.","author":[{"dropping-particle":"","family":"Espressif","given":"","non-dropping-particle":"","parse-names":false,"suffix":""}],"collection-title":"v3.4","container-title":"ESP32 Series Datasheet","id":"ITEM-1","issued":{"date-parts":[["2020"]]},"number-of-pages":"1-61","publisher-place":"Shanghai","title":"ESP32 Series Datasheet","type":"report"},"uris":["http://www.mendeley.com/documents/?uuid=96676edf-58a1-44c9-a802-30ebab8a0da7"]}],"mendeley":{"formattedCitation":"[14]","plainTextFormattedCitation":"[14]","previouslyFormattedCitation":"[13]"},"properties":{"noteIndex":0},"schema":"https://github.com/citation-style-language/schema/raw/master/csl-citation.json"}</w:instrText>
+        <w:instrText>ADDIN CSL_CITATION {"citationItems":[{"id":"ITEM-1","itemData":{"abstract":"ESP32 is a single 2.4 GHz Wi-Fi-and-Bluetooth combo chip designed with the TSMC ultra-low-power 40 nm technology. It is designed to achieve the best power and RF performance, showing robustness, versatility and reliability in a wide variety of applications and power scenarios.","author":[{"dropping-particle":"","family":"Espressif","given":"","non-dropping-particle":"","parse-names":false,"suffix":""}],"collection-title":"v3.4","container-title":"ESP32 Series Datasheet","id":"ITEM-1","issued":{"date-parts":[["2020"]]},"number-of-pages":"1-61","publisher-place":"Shanghai","title":"ESP32 Series Datasheet","type":"report"},"uris":["http://www.mendeley.com/documents/?uuid=96676edf-58a1-44c9-a802-30ebab8a0da7"]}],"mendeley":{"formattedCitation":"[15]","plainTextFormattedCitation":"[15]","previouslyFormattedCitation":"[14]"},"properties":{"noteIndex":0},"schema":"https://github.com/citation-style-language/schema/raw/master/csl-citation.json"}</w:instrText>
       </w:r>
       <w:r>
         <w:rPr>
@@ -44217,7 +45713,7 @@
           <w:szCs w:val="24"/>
           <w:lang w:val="en-US"/>
         </w:rPr>
-        <w:t>[14]</w:t>
+        <w:t>[15]</w:t>
       </w:r>
       <w:r>
         <w:rPr>
@@ -45375,6 +46871,7 @@
         <w:rPr>
           <w:noProof/>
         </w:rPr>
+        <w:lastRenderedPageBreak/>
         <w:drawing>
           <wp:inline distT="0" distB="0" distL="0" distR="0" wp14:anchorId="5CC284C8" wp14:editId="12D79874">
             <wp:extent cx="2880000" cy="2432795"/>
@@ -45458,7 +46955,7 @@
           <w:szCs w:val="24"/>
           <w:lang w:val="en-US"/>
         </w:rPr>
-        <w:instrText>ADDIN CSL_CITATION {"citationItems":[{"id":"ITEM-1","itemData":{"abstract":"ESP32 is a single 2.4 GHz Wi-Fi-and-Bluetooth combo chip designed with the TSMC ultra-low-power 40 nm technology. It is designed to achieve the best power and RF performance, showing robustness, versatility and reliability in a wide variety of applications and power scenarios.","author":[{"dropping-particle":"","family":"Espressif","given":"","non-dropping-particle":"","parse-names":false,"suffix":""}],"collection-title":"v3.4","container-title":"ESP32 Series Datasheet","id":"ITEM-1","issued":{"date-parts":[["2020"]]},"number-of-pages":"1-61","publisher-place":"Shanghai","title":"ESP32 Series Datasheet","type":"report"},"uris":["http://www.mendeley.com/documents/?uuid=96676edf-58a1-44c9-a802-30ebab8a0da7"]}],"mendeley":{"formattedCitation":"[14]","plainTextFormattedCitation":"[14]","previouslyFormattedCitation":"[13]"},"properties":{"noteIndex":0},"schema":"https://github.com/citation-style-language/schema/raw/master/csl-citation.json"}</w:instrText>
+        <w:instrText>ADDIN CSL_CITATION {"citationItems":[{"id":"ITEM-1","itemData":{"abstract":"ESP32 is a single 2.4 GHz Wi-Fi-and-Bluetooth combo chip designed with the TSMC ultra-low-power 40 nm technology. It is designed to achieve the best power and RF performance, showing robustness, versatility and reliability in a wide variety of applications and power scenarios.","author":[{"dropping-particle":"","family":"Espressif","given":"","non-dropping-particle":"","parse-names":false,"suffix":""}],"collection-title":"v3.4","container-title":"ESP32 Series Datasheet","id":"ITEM-1","issued":{"date-parts":[["2020"]]},"number-of-pages":"1-61","publisher-place":"Shanghai","title":"ESP32 Series Datasheet","type":"report"},"uris":["http://www.mendeley.com/documents/?uuid=96676edf-58a1-44c9-a802-30ebab8a0da7"]}],"mendeley":{"formattedCitation":"[15]","plainTextFormattedCitation":"[15]","previouslyFormattedCitation":"[14]"},"properties":{"noteIndex":0},"schema":"https://github.com/citation-style-language/schema/raw/master/csl-citation.json"}</w:instrText>
       </w:r>
       <w:r>
         <w:rPr>
@@ -45479,7 +46976,7 @@
           <w:szCs w:val="24"/>
           <w:lang w:val="en-US"/>
         </w:rPr>
-        <w:t>[14]</w:t>
+        <w:t>[15]</w:t>
       </w:r>
       <w:r>
         <w:rPr>
@@ -45514,7 +47011,6 @@
         <w:rPr>
           <w:noProof/>
         </w:rPr>
-        <w:lastRenderedPageBreak/>
         <w:drawing>
           <wp:inline distT="0" distB="0" distL="0" distR="0" wp14:anchorId="65812A77" wp14:editId="3D6FD387">
             <wp:extent cx="3240000" cy="3233684"/>
@@ -45598,7 +47094,7 @@
           <w:szCs w:val="24"/>
           <w:lang w:val="en-US"/>
         </w:rPr>
-        <w:instrText>ADDIN CSL_CITATION {"citationItems":[{"id":"ITEM-1","itemData":{"abstract":"ESP32 is a single 2.4 GHz Wi-Fi-and-Bluetooth combo chip designed with the TSMC ultra-low-power 40 nm technology. It is designed to achieve the best power and RF performance, showing robustness, versatility and reliability in a wide variety of applications and power scenarios.","author":[{"dropping-particle":"","family":"Espressif","given":"","non-dropping-particle":"","parse-names":false,"suffix":""}],"collection-title":"v3.4","container-title":"ESP32 Series Datasheet","id":"ITEM-1","issued":{"date-parts":[["2020"]]},"number-of-pages":"1-61","publisher-place":"Shanghai","title":"ESP32 Series Datasheet","type":"report"},"uris":["http://www.mendeley.com/documents/?uuid=96676edf-58a1-44c9-a802-30ebab8a0da7"]}],"mendeley":{"formattedCitation":"[14]","plainTextFormattedCitation":"[14]","previouslyFormattedCitation":"[13]"},"properties":{"noteIndex":0},"schema":"https://github.com/citation-style-language/schema/raw/master/csl-citation.json"}</w:instrText>
+        <w:instrText>ADDIN CSL_CITATION {"citationItems":[{"id":"ITEM-1","itemData":{"abstract":"ESP32 is a single 2.4 GHz Wi-Fi-and-Bluetooth combo chip designed with the TSMC ultra-low-power 40 nm technology. It is designed to achieve the best power and RF performance, showing robustness, versatility and reliability in a wide variety of applications and power scenarios.","author":[{"dropping-particle":"","family":"Espressif","given":"","non-dropping-particle":"","parse-names":false,"suffix":""}],"collection-title":"v3.4","container-title":"ESP32 Series Datasheet","id":"ITEM-1","issued":{"date-parts":[["2020"]]},"number-of-pages":"1-61","publisher-place":"Shanghai","title":"ESP32 Series Datasheet","type":"report"},"uris":["http://www.mendeley.com/documents/?uuid=96676edf-58a1-44c9-a802-30ebab8a0da7"]}],"mendeley":{"formattedCitation":"[15]","plainTextFormattedCitation":"[15]","previouslyFormattedCitation":"[14]"},"properties":{"noteIndex":0},"schema":"https://github.com/citation-style-language/schema/raw/master/csl-citation.json"}</w:instrText>
       </w:r>
       <w:r>
         <w:rPr>
@@ -45619,7 +47115,7 @@
           <w:szCs w:val="24"/>
           <w:lang w:val="en-US"/>
         </w:rPr>
-        <w:t>[14]</w:t>
+        <w:t>[15]</w:t>
       </w:r>
       <w:r>
         <w:rPr>
@@ -46677,7 +48173,18 @@
           <w:szCs w:val="24"/>
           <w:lang w:val="en-US"/>
         </w:rPr>
-        <w:t xml:space="preserve"> Regulator LDO internal </w:t>
+        <w:t xml:space="preserve"> Regulator </w:t>
+      </w:r>
+      <w:r>
+        <w:rPr>
+          <w:rFonts w:ascii="Times New Roman" w:hAnsi="Times New Roman"/>
+          <w:color w:val="000000"/>
+          <w:sz w:val="24"/>
+          <w:szCs w:val="24"/>
+          <w:lang w:val="en-US"/>
+        </w:rPr>
+        <w:lastRenderedPageBreak/>
+        <w:t xml:space="preserve">LDO internal </w:t>
       </w:r>
       <w:proofErr w:type="spellStart"/>
       <w:r>
@@ -46791,7 +48298,6 @@
         <w:rPr>
           <w:noProof/>
         </w:rPr>
-        <w:lastRenderedPageBreak/>
         <w:drawing>
           <wp:inline distT="0" distB="0" distL="0" distR="0" wp14:anchorId="6941CB1F" wp14:editId="1C1A5AA7">
             <wp:extent cx="3409950" cy="3067050"/>
@@ -48373,6 +49879,95 @@
       </w:rPr>
     </w:lvl>
   </w:abstractNum>
+  <w:abstractNum w:abstractNumId="12" w15:restartNumberingAfterBreak="0">
+    <w:nsid w:val="7FAD5D11"/>
+    <w:multiLevelType w:val="hybridMultilevel"/>
+    <w:tmpl w:val="70D2B4D6"/>
+    <w:lvl w:ilvl="0" w:tplc="73D65D36">
+      <w:start w:val="1"/>
+      <w:numFmt w:val="lowerLetter"/>
+      <w:lvlText w:val="%1."/>
+      <w:lvlJc w:val="left"/>
+      <w:pPr>
+        <w:ind w:left="1494" w:hanging="360"/>
+      </w:pPr>
+      <w:rPr>
+        <w:rFonts w:hint="default"/>
+      </w:rPr>
+    </w:lvl>
+    <w:lvl w:ilvl="1" w:tplc="04210019" w:tentative="1">
+      <w:start w:val="1"/>
+      <w:numFmt w:val="lowerLetter"/>
+      <w:lvlText w:val="%2."/>
+      <w:lvlJc w:val="left"/>
+      <w:pPr>
+        <w:ind w:left="2214" w:hanging="360"/>
+      </w:pPr>
+    </w:lvl>
+    <w:lvl w:ilvl="2" w:tplc="0421001B" w:tentative="1">
+      <w:start w:val="1"/>
+      <w:numFmt w:val="lowerRoman"/>
+      <w:lvlText w:val="%3."/>
+      <w:lvlJc w:val="right"/>
+      <w:pPr>
+        <w:ind w:left="2934" w:hanging="180"/>
+      </w:pPr>
+    </w:lvl>
+    <w:lvl w:ilvl="3" w:tplc="0421000F" w:tentative="1">
+      <w:start w:val="1"/>
+      <w:numFmt w:val="decimal"/>
+      <w:lvlText w:val="%4."/>
+      <w:lvlJc w:val="left"/>
+      <w:pPr>
+        <w:ind w:left="3654" w:hanging="360"/>
+      </w:pPr>
+    </w:lvl>
+    <w:lvl w:ilvl="4" w:tplc="04210019" w:tentative="1">
+      <w:start w:val="1"/>
+      <w:numFmt w:val="lowerLetter"/>
+      <w:lvlText w:val="%5."/>
+      <w:lvlJc w:val="left"/>
+      <w:pPr>
+        <w:ind w:left="4374" w:hanging="360"/>
+      </w:pPr>
+    </w:lvl>
+    <w:lvl w:ilvl="5" w:tplc="0421001B" w:tentative="1">
+      <w:start w:val="1"/>
+      <w:numFmt w:val="lowerRoman"/>
+      <w:lvlText w:val="%6."/>
+      <w:lvlJc w:val="right"/>
+      <w:pPr>
+        <w:ind w:left="5094" w:hanging="180"/>
+      </w:pPr>
+    </w:lvl>
+    <w:lvl w:ilvl="6" w:tplc="0421000F" w:tentative="1">
+      <w:start w:val="1"/>
+      <w:numFmt w:val="decimal"/>
+      <w:lvlText w:val="%7."/>
+      <w:lvlJc w:val="left"/>
+      <w:pPr>
+        <w:ind w:left="5814" w:hanging="360"/>
+      </w:pPr>
+    </w:lvl>
+    <w:lvl w:ilvl="7" w:tplc="04210019" w:tentative="1">
+      <w:start w:val="1"/>
+      <w:numFmt w:val="lowerLetter"/>
+      <w:lvlText w:val="%8."/>
+      <w:lvlJc w:val="left"/>
+      <w:pPr>
+        <w:ind w:left="6534" w:hanging="360"/>
+      </w:pPr>
+    </w:lvl>
+    <w:lvl w:ilvl="8" w:tplc="0421001B" w:tentative="1">
+      <w:start w:val="1"/>
+      <w:numFmt w:val="lowerRoman"/>
+      <w:lvlText w:val="%9."/>
+      <w:lvlJc w:val="right"/>
+      <w:pPr>
+        <w:ind w:left="7254" w:hanging="180"/>
+      </w:pPr>
+    </w:lvl>
+  </w:abstractNum>
   <w:num w:numId="1">
     <w:abstractNumId w:val="7"/>
   </w:num>
@@ -48408,6 +50003,9 @@
   </w:num>
   <w:num w:numId="12">
     <w:abstractNumId w:val="4"/>
+  </w:num>
+  <w:num w:numId="13">
+    <w:abstractNumId w:val="12"/>
   </w:num>
 </w:numbering>
 </file>
@@ -49265,7 +50863,7 @@
 </file>
 
 <file path=customXml/itemProps1.xml><?xml version="1.0" encoding="utf-8"?>
-<ds:datastoreItem xmlns:ds="http://schemas.openxmlformats.org/officeDocument/2006/customXml" ds:itemID="{B888E760-411C-4220-BA2A-D4E47BBFDAE6}">
+<ds:datastoreItem xmlns:ds="http://schemas.openxmlformats.org/officeDocument/2006/customXml" ds:itemID="{3CC11A17-9998-4254-B2C4-790A99CB993B}">
   <ds:schemaRefs>
     <ds:schemaRef ds:uri="http://schemas.openxmlformats.org/officeDocument/2006/bibliography"/>
   </ds:schemaRefs>

</xml_diff>